<commit_message>
Update Indexus overview documentation and assets
Replit-Commit-Author: Agent
</commit_message>
<xml_diff>
--- a/indexus_overview.docx
+++ b/indexus_overview.docx
@@ -53,7 +53,7 @@
           <w:b w:val="false"/>
           <w:bCs w:val="false"/>
         </w:rPr>
-        <w:t xml:space="preserve"> revízia oproti májovému prehľadu; aktuálna implementácia CRM, Nexus Pulse, Mission a nadväzujúceho obchodno-laboratórneho procesu.</w:t>
+        <w:t xml:space="preserve"> revízia oproti májovému prehľadu; aktuálna implementácia CRM, Nexus Pulse, Mission, obchodno-laboratórneho procesu a kompletný plán migrácie ISCBC.</w:t>
       </w:r>
     </w:p>
     <w:p>
@@ -75,7 +75,7 @@
           <w:b w:val="false"/>
           <w:bCs w:val="false"/>
         </w:rPr>
-        <w:t xml:space="preserve"> aktuálny zdrojový kód a regresné testy, stavový dokument Pricing Engine V2, potvrdenie prevádzky Nexus Pulse/Mission vlastníkom systému.</w:t>
+        <w:t xml:space="preserve"> aktuálny zdrojový kód, vykonané cielené regresné overenia a existujúce testovacie rutiny, stavový dokument Pricing Engine V2 a dokumentácia migrácie ISCBC → INDEXUS.</w:t>
       </w:r>
     </w:p>
     <w:p>
@@ -128,15 +128,15 @@
           <w:b/>
           <w:bCs/>
         </w:rPr>
-        <w:t xml:space="preserve">Nexus Pulse a Mission sú podľa potvrdenia vlastníka systému plne funkčné v používanom pracovnom flow.</w:t>
-      </w:r>
-      <w:r>
-        <w:rPr>
-          <w:rFonts w:ascii="Calibri" w:cs="Calibri" w:eastAsia="Calibri" w:hAnsi="Calibri"/>
-          <w:b w:val="false"/>
-          <w:bCs w:val="false"/>
-        </w:rPr>
-        <w:t xml:space="preserve"> Existencia jednotlivých funkcií bola porovnaná s aktuálnym kódom.</w:t>
+        <w:t xml:space="preserve">Nexus Pulse a Mission boli implementované; ich kľúčové mechanizmy boli overované sadou testovacích rutín.</w:t>
+      </w:r>
+      <w:r>
+        <w:rPr>
+          <w:rFonts w:ascii="Calibri" w:cs="Calibri" w:eastAsia="Calibri" w:hAnsi="Calibri"/>
+          <w:b w:val="false"/>
+          <w:bCs w:val="false"/>
+        </w:rPr>
+        <w:t xml:space="preserve"> Cielené vykonané regresné overenia, rozsah automatizovaných scenárov a limity testov sú uvedené v kapitole 12. Implementácia bola porovnaná s aktuálnym kódom.</w:t>
       </w:r>
     </w:p>
     <w:p>
@@ -316,7 +316,7 @@
                 <w:b w:val="false"/>
                 <w:bCs w:val="false"/>
               </w:rPr>
-              <w:t xml:space="preserve">Funkčné — potvrdené vlastníkom</w:t>
+              <w:t xml:space="preserve">Implementované a cielene testované</w:t>
             </w:r>
           </w:p>
         </w:tc>
@@ -342,7 +342,7 @@
                 <w:b w:val="false"/>
                 <w:bCs w:val="false"/>
               </w:rPr>
-              <w:t xml:space="preserve">Vlastník potvrdil používaný pracovný flow; nejde o nové nezávislé overenie produkcie.</w:t>
+              <w:t xml:space="preserve">Funkcia existuje a jej konkrétne scenáre boli overené vykonanými testami; rozsah a výsledky sú uvedené v kapitole 12. Neznamená to univerzálnu produkčnú akceptáciu.</w:t>
             </w:r>
           </w:p>
         </w:tc>
@@ -686,7 +686,7 @@
                 <w:b w:val="false"/>
                 <w:bCs w:val="false"/>
               </w:rPr>
-              <w:t xml:space="preserve">Funkčné — potvrdené vlastníkom; implementácia a regresné testy v repozitári</w:t>
+              <w:t xml:space="preserve">Implementované a cielene testované; podrobnosti v kapitole 12</w:t>
             </w:r>
           </w:p>
         </w:tc>
@@ -1294,6 +1294,89 @@
                 <w:bCs w:val="false"/>
               </w:rPr>
               <w:t xml:space="preserve">Zjednotiť spracovanie, autorizáciu laboratória, históriu výsledkov a obchodné následky.</w:t>
+            </w:r>
+          </w:p>
+        </w:tc>
+      </w:tr>
+      <w:tr>
+        <w:trPr>
+          <w:tblHeader w:val="false"/>
+        </w:trPr>
+        <w:tc>
+          <w:tcPr>
+            <w:tcW w:type="pct" w:w="33.333333333333336%"/>
+            <w:shd w:fill="FFFFFF"/>
+            <w:tcMar>
+              <w:top w:type="dxa" w:w="85"/>
+              <w:left w:type="dxa" w:w="100"/>
+              <w:bottom w:type="dxa" w:w="85"/>
+              <w:right w:type="dxa" w:w="100"/>
+            </w:tcMar>
+          </w:tcPr>
+          <w:p>
+            <w:pPr>
+              <w:pStyle w:val="TableText"/>
+              <w:spacing w:after="60"/>
+            </w:pPr>
+            <w:r>
+              <w:rPr>
+                <w:rFonts w:ascii="Calibri" w:cs="Calibri" w:eastAsia="Calibri" w:hAnsi="Calibri"/>
+                <w:b w:val="false"/>
+                <w:bCs w:val="false"/>
+              </w:rPr>
+              <w:t xml:space="preserve">Migrácia ISCBC</w:t>
+            </w:r>
+          </w:p>
+        </w:tc>
+        <w:tc>
+          <w:tcPr>
+            <w:tcW w:type="pct" w:w="33.333333333333336%"/>
+            <w:shd w:fill="FFFFFF"/>
+            <w:tcMar>
+              <w:top w:type="dxa" w:w="85"/>
+              <w:left w:type="dxa" w:w="100"/>
+              <w:bottom w:type="dxa" w:w="85"/>
+              <w:right w:type="dxa" w:w="100"/>
+            </w:tcMar>
+          </w:tcPr>
+          <w:p>
+            <w:pPr>
+              <w:pStyle w:val="TableText"/>
+              <w:spacing w:after="60"/>
+            </w:pPr>
+            <w:r>
+              <w:rPr>
+                <w:rFonts w:ascii="Calibri" w:cs="Calibri" w:eastAsia="Calibri" w:hAnsi="Calibri"/>
+                <w:b w:val="false"/>
+                <w:bCs w:val="false"/>
+              </w:rPr>
+              <w:t xml:space="preserve">Implementované migračné skripty a mapovania; rozsah v kapitole 11</w:t>
+            </w:r>
+          </w:p>
+        </w:tc>
+        <w:tc>
+          <w:tcPr>
+            <w:tcW w:type="pct" w:w="33.333333333333336%"/>
+            <w:shd w:fill="FFFFFF"/>
+            <w:tcMar>
+              <w:top w:type="dxa" w:w="85"/>
+              <w:left w:type="dxa" w:w="100"/>
+              <w:bottom w:type="dxa" w:w="85"/>
+              <w:right w:type="dxa" w:w="100"/>
+            </w:tcMar>
+          </w:tcPr>
+          <w:p>
+            <w:pPr>
+              <w:pStyle w:val="TableText"/>
+              <w:spacing w:after="60"/>
+            </w:pPr>
+            <w:r>
+              <w:rPr>
+                <w:rFonts w:ascii="Calibri" w:cs="Calibri" w:eastAsia="Calibri" w:hAnsi="Calibri"/>
+                <w:b w:val="false"/>
+                <w:bCs w:val="false"/>
+              </w:rPr>
+              <w:t xml:space="preserve">Zjednotiť migračnú cestu, doplniť otvorené domény, vykonať reconciliáciu a riadené prepnutie.</w:t>
             </w:r>
           </w:p>
         </w:tc>
@@ -4464,7 +4547,7 @@
           <w:b w:val="false"/>
           <w:bCs w:val="false"/>
         </w:rPr>
-        <w:t xml:space="preserve">Staré tvrdenie o nefunkčnom ARI/telefónii sa nepoužíva ako aktuálny stav: nahrádza ho vyššie uvedené potvrdenie funkčného Pulse/Mission a popis dnešnej implementácie. Staré plány obsahujú aj rozhodnutia, ktoré sa odvtedy implementovali; nepreberajú sa bez porovnania.</w:t>
+        <w:t xml:space="preserve">Staré tvrdenie o nefunkčnom ARI/telefónii sa nepoužíva ako aktuálny stav: nahrádza ho aktuálny popis implementácie Pulse/Mission a konkrétne regresné overenia v kapitole 12. Staré plány obsahujú aj rozhodnutia, ktoré sa odvtedy implementovali; nepreberajú sa bez porovnania.</w:t>
       </w:r>
     </w:p>
     <w:p>
@@ -5665,6 +5748,3780 @@
           <w:bCs w:val="false"/>
         </w:rPr>
         <w:t xml:space="preserve"> komunikačné a agentúrne jadro je funkčné. Cenový engine a obchodno-laboratórne moduly sú už významne implementované. Aktuálne sme pred dokončením ich spoločného, auditovateľného end-to-end procesu; najvyššou prioritou je cenová verzia a snapshot, bezpečné laboratórne spracovanie a fakturácia z rovnakého podkladu.</w:t>
+      </w:r>
+    </w:p>
+    <w:p>
+      <w:pPr>
+        <w:pStyle w:val="Heading1"/>
+        <w:keepNext/>
+        <w:spacing w:after="130" w:before="260"/>
+      </w:pPr>
+      <w:r>
+        <w:t xml:space="preserve">11. Migrácia ISCBC → INDEXUS — rozsah a realizačný plán</w:t>
+      </w:r>
+    </w:p>
+    <w:p>
+      <w:pPr>
+        <w:pStyle w:val="Heading2"/>
+        <w:keepNext/>
+        <w:spacing w:after="130" w:before="260"/>
+      </w:pPr>
+      <w:r>
+        <w:t xml:space="preserve">11.1 Čo už máme pripravené</w:t>
+      </w:r>
+    </w:p>
+    <w:p>
+      <w:pPr>
+        <w:spacing w:after="110" w:line="265"/>
+      </w:pPr>
+      <w:r>
+        <w:rPr>
+          <w:rFonts w:ascii="Calibri" w:cs="Calibri" w:eastAsia="Calibri" w:hAnsi="Calibri"/>
+          <w:b w:val="false"/>
+          <w:bCs w:val="false"/>
+        </w:rPr>
+        <w:t xml:space="preserve">Migrácia nie je nový projekt začínajúci analýzou od nuly. Existujú implementované importné skripty, mapovania identifikátorov, prevody stavov a kontrolné rutiny. Primárny prevádzkový podklad je docs/migration-iscbc-to-indexus.md (migračná vetva v20.5). Širšiu inventúru zdroja obsahuje script/migration/README-MIGRATION-ANALYSIS.md; postupy čistenia a obnovy sú v script/migration/MIGRATION-PROCEDURES.md.</w:t>
+      </w:r>
+    </w:p>
+    <w:p>
+      <w:pPr>
+        <w:spacing w:after="110" w:line="265"/>
+      </w:pPr>
+      <w:r>
+        <w:rPr>
+          <w:rFonts w:ascii="Calibri" w:cs="Calibri" w:eastAsia="Calibri" w:hAnsi="Calibri"/>
+          <w:b w:val="false"/>
+          <w:bCs w:val="false"/>
+        </w:rPr>
+        <w:t xml:space="preserve">Zdrojom je legacy ISCBC na Microsoft SQL Serveri, databáza CBC. Cieľom je existujúci PostgreSQL INDEXUS. Migrácia musí zachovať pôvodné identifikátory, krajinu, vlastníctvo údajov, historické ceny, dátumy a vzájomné väzby. Nemá spätne prepočítať staré zmluvy dnešným cenníkom ani znovu odoslať historické e-maily, SMS či faktúry.</w:t>
+      </w:r>
+    </w:p>
+    <w:p>
+      <w:pPr>
+        <w:spacing w:after="110" w:line="265"/>
+      </w:pPr>
+      <w:r>
+        <w:rPr>
+          <w:rFonts w:ascii="Calibri" w:cs="Calibri" w:eastAsia="Calibri" w:hAnsi="Calibri"/>
+          <w:b/>
+          <w:bCs/>
+        </w:rPr>
+        <w:t xml:space="preserve">Rozlišujeme tri výsledky:</w:t>
+      </w:r>
+      <w:r>
+        <w:rPr>
+          <w:rFonts w:ascii="Calibri" w:cs="Calibri" w:eastAsia="Calibri" w:hAnsi="Calibri"/>
+          <w:b w:val="false"/>
+          <w:bCs w:val="false"/>
+        </w:rPr>
+        <w:t xml:space="preserve"> technický import dát, overenú zhodu so zdrojom a použiteľnosť dát v novom pracovnom procese. Až všetky tri znamenajú dokončenú migráciu. Dostupnosť importéra sama osebe nepotvrdzuje aktuálny obsah produkcie.</w:t>
+      </w:r>
+    </w:p>
+    <w:p>
+      <w:pPr>
+        <w:pStyle w:val="Heading2"/>
+        <w:keepNext/>
+        <w:spacing w:after="130" w:before="260"/>
+      </w:pPr>
+      <w:r>
+        <w:t xml:space="preserve">11.2 Migračný katalóg — čo vieme preniesť</w:t>
+      </w:r>
+    </w:p>
+    <w:tbl>
+      <w:tblPr>
+        <w:tblW w:type="pct" w:w="100%"/>
+        <w:tblBorders>
+          <w:top w:val="single" w:color="auto" w:sz="4"/>
+          <w:left w:val="single" w:color="auto" w:sz="4"/>
+          <w:bottom w:val="single" w:color="auto" w:sz="4"/>
+          <w:right w:val="single" w:color="auto" w:sz="4"/>
+          <w:insideH w:val="single" w:color="auto" w:sz="4"/>
+          <w:insideV w:val="single" w:color="auto" w:sz="4"/>
+        </w:tblBorders>
+      </w:tblPr>
+      <w:tblGrid>
+        <w:gridCol w:w="100"/>
+        <w:gridCol w:w="100"/>
+        <w:gridCol w:w="100"/>
+      </w:tblGrid>
+      <w:tr>
+        <w:trPr>
+          <w:tblHeader/>
+        </w:trPr>
+        <w:tc>
+          <w:tcPr>
+            <w:tcW w:type="pct" w:w="33.333333333333336%"/>
+            <w:shd w:fill="E2E8F0"/>
+            <w:tcMar>
+              <w:top w:type="dxa" w:w="85"/>
+              <w:left w:type="dxa" w:w="100"/>
+              <w:bottom w:type="dxa" w:w="85"/>
+              <w:right w:type="dxa" w:w="100"/>
+            </w:tcMar>
+          </w:tcPr>
+          <w:p>
+            <w:pPr>
+              <w:pStyle w:val="TableText"/>
+              <w:spacing w:after="60"/>
+            </w:pPr>
+            <w:r>
+              <w:rPr>
+                <w:rFonts w:ascii="Calibri" w:cs="Calibri" w:eastAsia="Calibri" w:hAnsi="Calibri"/>
+                <w:b w:val="false"/>
+                <w:bCs w:val="false"/>
+              </w:rPr>
+              <w:t xml:space="preserve">Doména</w:t>
+            </w:r>
+          </w:p>
+        </w:tc>
+        <w:tc>
+          <w:tcPr>
+            <w:tcW w:type="pct" w:w="33.333333333333336%"/>
+            <w:shd w:fill="E2E8F0"/>
+            <w:tcMar>
+              <w:top w:type="dxa" w:w="85"/>
+              <w:left w:type="dxa" w:w="100"/>
+              <w:bottom w:type="dxa" w:w="85"/>
+              <w:right w:type="dxa" w:w="100"/>
+            </w:tcMar>
+          </w:tcPr>
+          <w:p>
+            <w:pPr>
+              <w:pStyle w:val="TableText"/>
+              <w:spacing w:after="60"/>
+            </w:pPr>
+            <w:r>
+              <w:rPr>
+                <w:rFonts w:ascii="Calibri" w:cs="Calibri" w:eastAsia="Calibri" w:hAnsi="Calibri"/>
+                <w:b w:val="false"/>
+                <w:bCs w:val="false"/>
+              </w:rPr>
+              <w:t xml:space="preserve">Implementovaná schopnosť / cieľ</w:t>
+            </w:r>
+          </w:p>
+        </w:tc>
+        <w:tc>
+          <w:tcPr>
+            <w:tcW w:type="pct" w:w="33.333333333333336%"/>
+            <w:shd w:fill="E2E8F0"/>
+            <w:tcMar>
+              <w:top w:type="dxa" w:w="85"/>
+              <w:left w:type="dxa" w:w="100"/>
+              <w:bottom w:type="dxa" w:w="85"/>
+              <w:right w:type="dxa" w:w="100"/>
+            </w:tcMar>
+          </w:tcPr>
+          <w:p>
+            <w:pPr>
+              <w:pStyle w:val="TableText"/>
+              <w:spacing w:after="60"/>
+            </w:pPr>
+            <w:r>
+              <w:rPr>
+                <w:rFonts w:ascii="Calibri" w:cs="Calibri" w:eastAsia="Calibri" w:hAnsi="Calibri"/>
+                <w:b w:val="false"/>
+                <w:bCs w:val="false"/>
+              </w:rPr>
+              <w:t xml:space="preserve">Podmienka dokončenia</w:t>
+            </w:r>
+          </w:p>
+        </w:tc>
+      </w:tr>
+      <w:tr>
+        <w:trPr>
+          <w:tblHeader w:val="false"/>
+        </w:trPr>
+        <w:tc>
+          <w:tcPr>
+            <w:tcW w:type="pct" w:w="33.333333333333336%"/>
+            <w:shd w:fill="FFFFFF"/>
+            <w:tcMar>
+              <w:top w:type="dxa" w:w="85"/>
+              <w:left w:type="dxa" w:w="100"/>
+              <w:bottom w:type="dxa" w:w="85"/>
+              <w:right w:type="dxa" w:w="100"/>
+            </w:tcMar>
+          </w:tcPr>
+          <w:p>
+            <w:pPr>
+              <w:pStyle w:val="TableText"/>
+              <w:spacing w:after="60"/>
+            </w:pPr>
+            <w:r>
+              <w:rPr>
+                <w:rFonts w:ascii="Calibri" w:cs="Calibri" w:eastAsia="Calibri" w:hAnsi="Calibri"/>
+                <w:b w:val="false"/>
+                <w:bCs w:val="false"/>
+              </w:rPr>
+              <w:t xml:space="preserve">Nemocnice a referenčné údaje</w:t>
+            </w:r>
+          </w:p>
+        </w:tc>
+        <w:tc>
+          <w:tcPr>
+            <w:tcW w:type="pct" w:w="33.333333333333336%"/>
+            <w:shd w:fill="FFFFFF"/>
+            <w:tcMar>
+              <w:top w:type="dxa" w:w="85"/>
+              <w:left w:type="dxa" w:w="100"/>
+              <w:bottom w:type="dxa" w:w="85"/>
+              <w:right w:type="dxa" w:w="100"/>
+            </w:tcMar>
+          </w:tcPr>
+          <w:p>
+            <w:pPr>
+              <w:pStyle w:val="TableText"/>
+              <w:spacing w:after="60"/>
+            </w:pPr>
+            <w:r>
+              <w:rPr>
+                <w:rFonts w:ascii="Calibri" w:cs="Calibri" w:eastAsia="Calibri" w:hAnsi="Calibri"/>
+                <w:b w:val="false"/>
+                <w:bCs w:val="false"/>
+              </w:rPr>
+              <w:t xml:space="preserve">Import nemocníc, kategórií a adries; vo fázovej vetve aj referencie potrebné pre ďalšie importy.</w:t>
+            </w:r>
+          </w:p>
+        </w:tc>
+        <w:tc>
+          <w:tcPr>
+            <w:tcW w:type="pct" w:w="33.333333333333336%"/>
+            <w:shd w:fill="FFFFFF"/>
+            <w:tcMar>
+              <w:top w:type="dxa" w:w="85"/>
+              <w:left w:type="dxa" w:w="100"/>
+              <w:bottom w:type="dxa" w:w="85"/>
+              <w:right w:type="dxa" w:w="100"/>
+            </w:tcMar>
+          </w:tcPr>
+          <w:p>
+            <w:pPr>
+              <w:pStyle w:val="TableText"/>
+              <w:spacing w:after="60"/>
+            </w:pPr>
+            <w:r>
+              <w:rPr>
+                <w:rFonts w:ascii="Calibri" w:cs="Calibri" w:eastAsia="Calibri" w:hAnsi="Calibri"/>
+                <w:b w:val="false"/>
+                <w:bCs w:val="false"/>
+              </w:rPr>
+              <w:t xml:space="preserve">Skontrolovať krajiny, referencie a jednoznačné mapovanie; nepreberať automaticky všetky legacy číselníky.</w:t>
+            </w:r>
+          </w:p>
+        </w:tc>
+      </w:tr>
+      <w:tr>
+        <w:trPr>
+          <w:tblHeader w:val="false"/>
+        </w:trPr>
+        <w:tc>
+          <w:tcPr>
+            <w:tcW w:type="pct" w:w="33.333333333333336%"/>
+            <w:shd w:fill="FFFFFF"/>
+            <w:tcMar>
+              <w:top w:type="dxa" w:w="85"/>
+              <w:left w:type="dxa" w:w="100"/>
+              <w:bottom w:type="dxa" w:w="85"/>
+              <w:right w:type="dxa" w:w="100"/>
+            </w:tcMar>
+          </w:tcPr>
+          <w:p>
+            <w:pPr>
+              <w:pStyle w:val="TableText"/>
+              <w:spacing w:after="60"/>
+            </w:pPr>
+            <w:r>
+              <w:rPr>
+                <w:rFonts w:ascii="Calibri" w:cs="Calibri" w:eastAsia="Calibri" w:hAnsi="Calibri"/>
+                <w:b w:val="false"/>
+                <w:bCs w:val="false"/>
+              </w:rPr>
+              <w:t xml:space="preserve">Spolupracovníci</w:t>
+            </w:r>
+          </w:p>
+        </w:tc>
+        <w:tc>
+          <w:tcPr>
+            <w:tcW w:type="pct" w:w="33.333333333333336%"/>
+            <w:shd w:fill="FFFFFF"/>
+            <w:tcMar>
+              <w:top w:type="dxa" w:w="85"/>
+              <w:left w:type="dxa" w:w="100"/>
+              <w:bottom w:type="dxa" w:w="85"/>
+              <w:right w:type="dxa" w:w="100"/>
+            </w:tcMar>
+          </w:tcPr>
+          <w:p>
+            <w:pPr>
+              <w:pStyle w:val="TableText"/>
+              <w:spacing w:after="60"/>
+            </w:pPr>
+            <w:r>
+              <w:rPr>
+                <w:rFonts w:ascii="Calibri" w:cs="Calibri" w:eastAsia="Calibri" w:hAnsi="Calibri"/>
+                <w:b w:val="false"/>
+                <w:bCs w:val="false"/>
+              </w:rPr>
+              <w:t xml:space="preserve">Osoby, kontakty, adresy, dohody a aktivity pri odberoch do evidencie spolupracovníkov a súvisiacich tabuliek.</w:t>
+            </w:r>
+          </w:p>
+        </w:tc>
+        <w:tc>
+          <w:tcPr>
+            <w:tcW w:type="pct" w:w="33.333333333333336%"/>
+            <w:shd w:fill="FFFFFF"/>
+            <w:tcMar>
+              <w:top w:type="dxa" w:w="85"/>
+              <w:left w:type="dxa" w:w="100"/>
+              <w:bottom w:type="dxa" w:w="85"/>
+              <w:right w:type="dxa" w:w="100"/>
+            </w:tcMar>
+          </w:tcPr>
+          <w:p>
+            <w:pPr>
+              <w:pStyle w:val="TableText"/>
+              <w:spacing w:after="60"/>
+            </w:pPr>
+            <w:r>
+              <w:rPr>
+                <w:rFonts w:ascii="Calibri" w:cs="Calibri" w:eastAsia="Calibri" w:hAnsi="Calibri"/>
+                <w:b w:val="false"/>
+                <w:bCs w:val="false"/>
+              </w:rPr>
+              <w:t xml:space="preserve">Zachovať väzby na odbery a dohody. Samostatný synchronizačný skript overiť voči plnému historickému importu.</w:t>
+            </w:r>
+          </w:p>
+        </w:tc>
+      </w:tr>
+      <w:tr>
+        <w:trPr>
+          <w:tblHeader w:val="false"/>
+        </w:trPr>
+        <w:tc>
+          <w:tcPr>
+            <w:tcW w:type="pct" w:w="33.333333333333336%"/>
+            <w:shd w:fill="FFFFFF"/>
+            <w:tcMar>
+              <w:top w:type="dxa" w:w="85"/>
+              <w:left w:type="dxa" w:w="100"/>
+              <w:bottom w:type="dxa" w:w="85"/>
+              <w:right w:type="dxa" w:w="100"/>
+            </w:tcMar>
+          </w:tcPr>
+          <w:p>
+            <w:pPr>
+              <w:pStyle w:val="TableText"/>
+              <w:spacing w:after="60"/>
+            </w:pPr>
+            <w:r>
+              <w:rPr>
+                <w:rFonts w:ascii="Calibri" w:cs="Calibri" w:eastAsia="Calibri" w:hAnsi="Calibri"/>
+                <w:b w:val="false"/>
+                <w:bCs w:val="false"/>
+              </w:rPr>
+              <w:t xml:space="preserve">Zákazníci</w:t>
+            </w:r>
+          </w:p>
+        </w:tc>
+        <w:tc>
+          <w:tcPr>
+            <w:tcW w:type="pct" w:w="33.333333333333336%"/>
+            <w:shd w:fill="FFFFFF"/>
+            <w:tcMar>
+              <w:top w:type="dxa" w:w="85"/>
+              <w:left w:type="dxa" w:w="100"/>
+              <w:bottom w:type="dxa" w:w="85"/>
+              <w:right w:type="dxa" w:w="100"/>
+            </w:tcMar>
+          </w:tcPr>
+          <w:p>
+            <w:pPr>
+              <w:pStyle w:val="TableText"/>
+              <w:spacing w:after="60"/>
+            </w:pPr>
+            <w:r>
+              <w:rPr>
+                <w:rFonts w:ascii="Calibri" w:cs="Calibri" w:eastAsia="Calibri" w:hAnsi="Calibri"/>
+                <w:b w:val="false"/>
+                <w:bCs w:val="false"/>
+              </w:rPr>
+              <w:t xml:space="preserve">Klienti, osobné a kontaktné údaje, adresy a stavy do zákazníckej evidencie.</w:t>
+            </w:r>
+          </w:p>
+        </w:tc>
+        <w:tc>
+          <w:tcPr>
+            <w:tcW w:type="pct" w:w="33.333333333333336%"/>
+            <w:shd w:fill="FFFFFF"/>
+            <w:tcMar>
+              <w:top w:type="dxa" w:w="85"/>
+              <w:left w:type="dxa" w:w="100"/>
+              <w:bottom w:type="dxa" w:w="85"/>
+              <w:right w:type="dxa" w:w="100"/>
+            </w:tcMar>
+          </w:tcPr>
+          <w:p>
+            <w:pPr>
+              <w:pStyle w:val="TableText"/>
+              <w:spacing w:after="60"/>
+            </w:pPr>
+            <w:r>
+              <w:rPr>
+                <w:rFonts w:ascii="Calibri" w:cs="Calibri" w:eastAsia="Calibri" w:hAnsi="Calibri"/>
+                <w:b w:val="false"/>
+                <w:bCs w:val="false"/>
+              </w:rPr>
+              <w:t xml:space="preserve">Kontrola identity, krajiny a duplicít; žiadne zlučovanie len podľa spoločného telefónu alebo e-mailu.</w:t>
+            </w:r>
+          </w:p>
+        </w:tc>
+      </w:tr>
+      <w:tr>
+        <w:trPr>
+          <w:tblHeader w:val="false"/>
+        </w:trPr>
+        <w:tc>
+          <w:tcPr>
+            <w:tcW w:type="pct" w:w="33.333333333333336%"/>
+            <w:shd w:fill="FFFFFF"/>
+            <w:tcMar>
+              <w:top w:type="dxa" w:w="85"/>
+              <w:left w:type="dxa" w:w="100"/>
+              <w:bottom w:type="dxa" w:w="85"/>
+              <w:right w:type="dxa" w:w="100"/>
+            </w:tcMar>
+          </w:tcPr>
+          <w:p>
+            <w:pPr>
+              <w:pStyle w:val="TableText"/>
+              <w:spacing w:after="60"/>
+            </w:pPr>
+            <w:r>
+              <w:rPr>
+                <w:rFonts w:ascii="Calibri" w:cs="Calibri" w:eastAsia="Calibri" w:hAnsi="Calibri"/>
+                <w:b w:val="false"/>
+                <w:bCs w:val="false"/>
+              </w:rPr>
+              <w:t xml:space="preserve">Potenciálni zákazníci a prípady</w:t>
+            </w:r>
+          </w:p>
+        </w:tc>
+        <w:tc>
+          <w:tcPr>
+            <w:tcW w:type="pct" w:w="33.333333333333336%"/>
+            <w:shd w:fill="FFFFFF"/>
+            <w:tcMar>
+              <w:top w:type="dxa" w:w="85"/>
+              <w:left w:type="dxa" w:w="100"/>
+              <w:bottom w:type="dxa" w:w="85"/>
+              <w:right w:type="dxa" w:w="100"/>
+            </w:tcMar>
+          </w:tcPr>
+          <w:p>
+            <w:pPr>
+              <w:pStyle w:val="TableText"/>
+              <w:spacing w:after="60"/>
+            </w:pPr>
+            <w:r>
+              <w:rPr>
+                <w:rFonts w:ascii="Calibri" w:cs="Calibri" w:eastAsia="Calibri" w:hAnsi="Calibri"/>
+                <w:b w:val="false"/>
+                <w:bCs w:val="false"/>
+              </w:rPr>
+              <w:t xml:space="preserve">Potenciálni klienti bez zmluvy; súvisiace údaje o prípadoch a účastníkoch odberu.</w:t>
+            </w:r>
+          </w:p>
+        </w:tc>
+        <w:tc>
+          <w:tcPr>
+            <w:tcW w:type="pct" w:w="33.333333333333336%"/>
+            <w:shd w:fill="FFFFFF"/>
+            <w:tcMar>
+              <w:top w:type="dxa" w:w="85"/>
+              <w:left w:type="dxa" w:w="100"/>
+              <w:bottom w:type="dxa" w:w="85"/>
+              <w:right w:type="dxa" w:w="100"/>
+            </w:tcMar>
+          </w:tcPr>
+          <w:p>
+            <w:pPr>
+              <w:pStyle w:val="TableText"/>
+              <w:spacing w:after="60"/>
+            </w:pPr>
+            <w:r>
+              <w:rPr>
+                <w:rFonts w:ascii="Calibri" w:cs="Calibri" w:eastAsia="Calibri" w:hAnsi="Calibri"/>
+                <w:b w:val="false"/>
+                <w:bCs w:val="false"/>
+              </w:rPr>
+              <w:t xml:space="preserve">Oddeliť potenciálny prípad od existujúceho zákazníka a zachovať rodinné väzby bez nechcených duplicít.</w:t>
+            </w:r>
+          </w:p>
+        </w:tc>
+      </w:tr>
+      <w:tr>
+        <w:trPr>
+          <w:tblHeader w:val="false"/>
+        </w:trPr>
+        <w:tc>
+          <w:tcPr>
+            <w:tcW w:type="pct" w:w="33.333333333333336%"/>
+            <w:shd w:fill="FFFFFF"/>
+            <w:tcMar>
+              <w:top w:type="dxa" w:w="85"/>
+              <w:left w:type="dxa" w:w="100"/>
+              <w:bottom w:type="dxa" w:w="85"/>
+              <w:right w:type="dxa" w:w="100"/>
+            </w:tcMar>
+          </w:tcPr>
+          <w:p>
+            <w:pPr>
+              <w:pStyle w:val="TableText"/>
+              <w:spacing w:after="60"/>
+            </w:pPr>
+            <w:r>
+              <w:rPr>
+                <w:rFonts w:ascii="Calibri" w:cs="Calibri" w:eastAsia="Calibri" w:hAnsi="Calibri"/>
+                <w:b w:val="false"/>
+                <w:bCs w:val="false"/>
+              </w:rPr>
+              <w:t xml:space="preserve">Odbery</w:t>
+            </w:r>
+          </w:p>
+        </w:tc>
+        <w:tc>
+          <w:tcPr>
+            <w:tcW w:type="pct" w:w="33.333333333333336%"/>
+            <w:shd w:fill="FFFFFF"/>
+            <w:tcMar>
+              <w:top w:type="dxa" w:w="85"/>
+              <w:left w:type="dxa" w:w="100"/>
+              <w:bottom w:type="dxa" w:w="85"/>
+              <w:right w:type="dxa" w:w="100"/>
+            </w:tcMar>
+          </w:tcPr>
+          <w:p>
+            <w:pPr>
+              <w:pStyle w:val="TableText"/>
+              <w:spacing w:after="60"/>
+            </w:pPr>
+            <w:r>
+              <w:rPr>
+                <w:rFonts w:ascii="Calibri" w:cs="Calibri" w:eastAsia="Calibri" w:hAnsi="Calibri"/>
+                <w:b w:val="false"/>
+                <w:bCs w:val="false"/>
+              </w:rPr>
+              <w:t xml:space="preserve">Záznamy odberov, identifikátory, dátumy, stavy a dostupné väzby na zákazníkov a partnerov.</w:t>
+            </w:r>
+          </w:p>
+        </w:tc>
+        <w:tc>
+          <w:tcPr>
+            <w:tcW w:type="pct" w:w="33.333333333333336%"/>
+            <w:shd w:fill="FFFFFF"/>
+            <w:tcMar>
+              <w:top w:type="dxa" w:w="85"/>
+              <w:left w:type="dxa" w:w="100"/>
+              <w:bottom w:type="dxa" w:w="85"/>
+              <w:right w:type="dxa" w:w="100"/>
+            </w:tcMar>
+          </w:tcPr>
+          <w:p>
+            <w:pPr>
+              <w:pStyle w:val="TableText"/>
+              <w:spacing w:after="60"/>
+            </w:pPr>
+            <w:r>
+              <w:rPr>
+                <w:rFonts w:ascii="Calibri" w:cs="Calibri" w:eastAsia="Calibri" w:hAnsi="Calibri"/>
+                <w:b w:val="false"/>
+                <w:bCs w:val="false"/>
+              </w:rPr>
+              <w:t xml:space="preserve">Doplniť a overiť väzby na zmluvu, produkt, laboratórium a spolupracovníkov po importe závislých entít.</w:t>
+            </w:r>
+          </w:p>
+        </w:tc>
+      </w:tr>
+      <w:tr>
+        <w:trPr>
+          <w:tblHeader w:val="false"/>
+        </w:trPr>
+        <w:tc>
+          <w:tcPr>
+            <w:tcW w:type="pct" w:w="33.333333333333336%"/>
+            <w:shd w:fill="FFFFFF"/>
+            <w:tcMar>
+              <w:top w:type="dxa" w:w="85"/>
+              <w:left w:type="dxa" w:w="100"/>
+              <w:bottom w:type="dxa" w:w="85"/>
+              <w:right w:type="dxa" w:w="100"/>
+            </w:tcMar>
+          </w:tcPr>
+          <w:p>
+            <w:pPr>
+              <w:pStyle w:val="TableText"/>
+              <w:spacing w:after="60"/>
+            </w:pPr>
+            <w:r>
+              <w:rPr>
+                <w:rFonts w:ascii="Calibri" w:cs="Calibri" w:eastAsia="Calibri" w:hAnsi="Calibri"/>
+                <w:b w:val="false"/>
+                <w:bCs w:val="false"/>
+              </w:rPr>
+              <w:t xml:space="preserve">Laboratórne výsledky</w:t>
+            </w:r>
+          </w:p>
+        </w:tc>
+        <w:tc>
+          <w:tcPr>
+            <w:tcW w:type="pct" w:w="33.333333333333336%"/>
+            <w:shd w:fill="FFFFFF"/>
+            <w:tcMar>
+              <w:top w:type="dxa" w:w="85"/>
+              <w:left w:type="dxa" w:w="100"/>
+              <w:bottom w:type="dxa" w:w="85"/>
+              <w:right w:type="dxa" w:w="100"/>
+            </w:tcMar>
+          </w:tcPr>
+          <w:p>
+            <w:pPr>
+              <w:pStyle w:val="TableText"/>
+              <w:spacing w:after="60"/>
+            </w:pPr>
+            <w:r>
+              <w:rPr>
+                <w:rFonts w:ascii="Calibri" w:cs="Calibri" w:eastAsia="Calibri" w:hAnsi="Calibri"/>
+                <w:b w:val="false"/>
+                <w:bCs w:val="false"/>
+              </w:rPr>
+              <w:t xml:space="preserve">Historické LabResults do collection_lab_results vrátane väzby na odber.</w:t>
+            </w:r>
+          </w:p>
+        </w:tc>
+        <w:tc>
+          <w:tcPr>
+            <w:tcW w:type="pct" w:w="33.333333333333336%"/>
+            <w:shd w:fill="FFFFFF"/>
+            <w:tcMar>
+              <w:top w:type="dxa" w:w="85"/>
+              <w:left w:type="dxa" w:w="100"/>
+              <w:bottom w:type="dxa" w:w="85"/>
+              <w:right w:type="dxa" w:w="100"/>
+            </w:tcMar>
+          </w:tcPr>
+          <w:p>
+            <w:pPr>
+              <w:pStyle w:val="TableText"/>
+              <w:spacing w:after="60"/>
+            </w:pPr>
+            <w:r>
+              <w:rPr>
+                <w:rFonts w:ascii="Calibri" w:cs="Calibri" w:eastAsia="Calibri" w:hAnsi="Calibri"/>
+                <w:b w:val="false"/>
+                <w:bCs w:val="false"/>
+              </w:rPr>
+              <w:t xml:space="preserve">Viac výsledkov k odberu môže byť legitímna história; overiť jednotky, stav, verzie a význam údajov pre V2.</w:t>
+            </w:r>
+          </w:p>
+        </w:tc>
+      </w:tr>
+      <w:tr>
+        <w:trPr>
+          <w:tblHeader w:val="false"/>
+        </w:trPr>
+        <w:tc>
+          <w:tcPr>
+            <w:tcW w:type="pct" w:w="33.333333333333336%"/>
+            <w:shd w:fill="FFFFFF"/>
+            <w:tcMar>
+              <w:top w:type="dxa" w:w="85"/>
+              <w:left w:type="dxa" w:w="100"/>
+              <w:bottom w:type="dxa" w:w="85"/>
+              <w:right w:type="dxa" w:w="100"/>
+            </w:tcMar>
+          </w:tcPr>
+          <w:p>
+            <w:pPr>
+              <w:pStyle w:val="TableText"/>
+              <w:spacing w:after="60"/>
+            </w:pPr>
+            <w:r>
+              <w:rPr>
+                <w:rFonts w:ascii="Calibri" w:cs="Calibri" w:eastAsia="Calibri" w:hAnsi="Calibri"/>
+                <w:b w:val="false"/>
+                <w:bCs w:val="false"/>
+              </w:rPr>
+              <w:t xml:space="preserve">Poznámky</w:t>
+            </w:r>
+          </w:p>
+        </w:tc>
+        <w:tc>
+          <w:tcPr>
+            <w:tcW w:type="pct" w:w="33.333333333333336%"/>
+            <w:shd w:fill="FFFFFF"/>
+            <w:tcMar>
+              <w:top w:type="dxa" w:w="85"/>
+              <w:left w:type="dxa" w:w="100"/>
+              <w:bottom w:type="dxa" w:w="85"/>
+              <w:right w:type="dxa" w:w="100"/>
+            </w:tcMar>
+          </w:tcPr>
+          <w:p>
+            <w:pPr>
+              <w:pStyle w:val="TableText"/>
+              <w:spacing w:after="60"/>
+            </w:pPr>
+            <w:r>
+              <w:rPr>
+                <w:rFonts w:ascii="Calibri" w:cs="Calibri" w:eastAsia="Calibri" w:hAnsi="Calibri"/>
+                <w:b w:val="false"/>
+                <w:bCs w:val="false"/>
+              </w:rPr>
+              <w:t xml:space="preserve">ClientRemarks do customer_notes.</w:t>
+            </w:r>
+          </w:p>
+        </w:tc>
+        <w:tc>
+          <w:tcPr>
+            <w:tcW w:type="pct" w:w="33.333333333333336%"/>
+            <w:shd w:fill="FFFFFF"/>
+            <w:tcMar>
+              <w:top w:type="dxa" w:w="85"/>
+              <w:left w:type="dxa" w:w="100"/>
+              <w:bottom w:type="dxa" w:w="85"/>
+              <w:right w:type="dxa" w:w="100"/>
+            </w:tcMar>
+          </w:tcPr>
+          <w:p>
+            <w:pPr>
+              <w:pStyle w:val="TableText"/>
+              <w:spacing w:after="60"/>
+            </w:pPr>
+            <w:r>
+              <w:rPr>
+                <w:rFonts w:ascii="Calibri" w:cs="Calibri" w:eastAsia="Calibri" w:hAnsi="Calibri"/>
+                <w:b w:val="false"/>
+                <w:bCs w:val="false"/>
+              </w:rPr>
+              <w:t xml:space="preserve">Zachovať autora, čas a dostupný kontext; nevydávať importovanú poznámku za nový úkon agenta.</w:t>
+            </w:r>
+          </w:p>
+        </w:tc>
+      </w:tr>
+      <w:tr>
+        <w:trPr>
+          <w:tblHeader w:val="false"/>
+        </w:trPr>
+        <w:tc>
+          <w:tcPr>
+            <w:tcW w:type="pct" w:w="33.333333333333336%"/>
+            <w:shd w:fill="FFFFFF"/>
+            <w:tcMar>
+              <w:top w:type="dxa" w:w="85"/>
+              <w:left w:type="dxa" w:w="100"/>
+              <w:bottom w:type="dxa" w:w="85"/>
+              <w:right w:type="dxa" w:w="100"/>
+            </w:tcMar>
+          </w:tcPr>
+          <w:p>
+            <w:pPr>
+              <w:pStyle w:val="TableText"/>
+              <w:spacing w:after="60"/>
+            </w:pPr>
+            <w:r>
+              <w:rPr>
+                <w:rFonts w:ascii="Calibri" w:cs="Calibri" w:eastAsia="Calibri" w:hAnsi="Calibri"/>
+                <w:b w:val="false"/>
+                <w:bCs w:val="false"/>
+              </w:rPr>
+              <w:t xml:space="preserve">Telefonická komunikácia</w:t>
+            </w:r>
+          </w:p>
+        </w:tc>
+        <w:tc>
+          <w:tcPr>
+            <w:tcW w:type="pct" w:w="33.333333333333336%"/>
+            <w:shd w:fill="FFFFFF"/>
+            <w:tcMar>
+              <w:top w:type="dxa" w:w="85"/>
+              <w:left w:type="dxa" w:w="100"/>
+              <w:bottom w:type="dxa" w:w="85"/>
+              <w:right w:type="dxa" w:w="100"/>
+            </w:tcMar>
+          </w:tcPr>
+          <w:p>
+            <w:pPr>
+              <w:pStyle w:val="TableText"/>
+              <w:spacing w:after="60"/>
+            </w:pPr>
+            <w:r>
+              <w:rPr>
+                <w:rFonts w:ascii="Calibri" w:cs="Calibri" w:eastAsia="Calibri" w:hAnsi="Calibri"/>
+                <w:b w:val="false"/>
+                <w:bCs w:val="false"/>
+              </w:rPr>
+              <w:t xml:space="preserve">PhoneCommunications do communication_messages.</w:t>
+            </w:r>
+          </w:p>
+        </w:tc>
+        <w:tc>
+          <w:tcPr>
+            <w:tcW w:type="pct" w:w="33.333333333333336%"/>
+            <w:shd w:fill="FFFFFF"/>
+            <w:tcMar>
+              <w:top w:type="dxa" w:w="85"/>
+              <w:left w:type="dxa" w:w="100"/>
+              <w:bottom w:type="dxa" w:w="85"/>
+              <w:right w:type="dxa" w:w="100"/>
+            </w:tcMar>
+          </w:tcPr>
+          <w:p>
+            <w:pPr>
+              <w:pStyle w:val="TableText"/>
+              <w:spacing w:after="60"/>
+            </w:pPr>
+            <w:r>
+              <w:rPr>
+                <w:rFonts w:ascii="Calibri" w:cs="Calibri" w:eastAsia="Calibri" w:hAnsi="Calibri"/>
+                <w:b w:val="false"/>
+                <w:bCs w:val="false"/>
+              </w:rPr>
+              <w:t xml:space="preserve">Odlišovať historickú aktivitu od nového Pulse hovoru. Prenos metadát nedokazuje prenos zvukových nahrávok.</w:t>
+            </w:r>
+          </w:p>
+        </w:tc>
+      </w:tr>
+      <w:tr>
+        <w:trPr>
+          <w:tblHeader w:val="false"/>
+        </w:trPr>
+        <w:tc>
+          <w:tcPr>
+            <w:tcW w:type="pct" w:w="33.333333333333336%"/>
+            <w:shd w:fill="FFFFFF"/>
+            <w:tcMar>
+              <w:top w:type="dxa" w:w="85"/>
+              <w:left w:type="dxa" w:w="100"/>
+              <w:bottom w:type="dxa" w:w="85"/>
+              <w:right w:type="dxa" w:w="100"/>
+            </w:tcMar>
+          </w:tcPr>
+          <w:p>
+            <w:pPr>
+              <w:pStyle w:val="TableText"/>
+              <w:spacing w:after="60"/>
+            </w:pPr>
+            <w:r>
+              <w:rPr>
+                <w:rFonts w:ascii="Calibri" w:cs="Calibri" w:eastAsia="Calibri" w:hAnsi="Calibri"/>
+                <w:b w:val="false"/>
+                <w:bCs w:val="false"/>
+              </w:rPr>
+              <w:t xml:space="preserve">Zmluvy</w:t>
+            </w:r>
+          </w:p>
+        </w:tc>
+        <w:tc>
+          <w:tcPr>
+            <w:tcW w:type="pct" w:w="33.333333333333336%"/>
+            <w:shd w:fill="FFFFFF"/>
+            <w:tcMar>
+              <w:top w:type="dxa" w:w="85"/>
+              <w:left w:type="dxa" w:w="100"/>
+              <w:bottom w:type="dxa" w:w="85"/>
+              <w:right w:type="dxa" w:w="100"/>
+            </w:tcMar>
+          </w:tcPr>
+          <w:p>
+            <w:pPr>
+              <w:pStyle w:val="TableText"/>
+              <w:spacing w:after="60"/>
+            </w:pPr>
+            <w:r>
+              <w:rPr>
+                <w:rFonts w:ascii="Calibri" w:cs="Calibri" w:eastAsia="Calibri" w:hAnsi="Calibri"/>
+                <w:b w:val="false"/>
+                <w:bCs w:val="false"/>
+              </w:rPr>
+              <w:t xml:space="preserve">Zmluvy, stavy, služby, historické ceny, príplatky, zálohy a platobné podklady; contract_instances a historické customer_documents/JSON.</w:t>
+            </w:r>
+          </w:p>
+        </w:tc>
+        <w:tc>
+          <w:tcPr>
+            <w:tcW w:type="pct" w:w="33.333333333333336%"/>
+            <w:shd w:fill="FFFFFF"/>
+            <w:tcMar>
+              <w:top w:type="dxa" w:w="85"/>
+              <w:left w:type="dxa" w:w="100"/>
+              <w:bottom w:type="dxa" w:w="85"/>
+              <w:right w:type="dxa" w:w="100"/>
+            </w:tcMar>
+          </w:tcPr>
+          <w:p>
+            <w:pPr>
+              <w:pStyle w:val="TableText"/>
+              <w:spacing w:after="60"/>
+            </w:pPr>
+            <w:r>
+              <w:rPr>
+                <w:rFonts w:ascii="Calibri" w:cs="Calibri" w:eastAsia="Calibri" w:hAnsi="Calibri"/>
+                <w:b w:val="false"/>
+                <w:bCs w:val="false"/>
+              </w:rPr>
+              <w:t xml:space="preserve">Rozlíšiť hodnoty uložené v archíve od polí používaných aplikáciou; historický JSON nie je automaticky V2 cenový snapshot.</w:t>
+            </w:r>
+          </w:p>
+        </w:tc>
+      </w:tr>
+      <w:tr>
+        <w:trPr>
+          <w:tblHeader w:val="false"/>
+        </w:trPr>
+        <w:tc>
+          <w:tcPr>
+            <w:tcW w:type="pct" w:w="33.333333333333336%"/>
+            <w:shd w:fill="FFFFFF"/>
+            <w:tcMar>
+              <w:top w:type="dxa" w:w="85"/>
+              <w:left w:type="dxa" w:w="100"/>
+              <w:bottom w:type="dxa" w:w="85"/>
+              <w:right w:type="dxa" w:w="100"/>
+            </w:tcMar>
+          </w:tcPr>
+          <w:p>
+            <w:pPr>
+              <w:pStyle w:val="TableText"/>
+              <w:spacing w:after="60"/>
+            </w:pPr>
+            <w:r>
+              <w:rPr>
+                <w:rFonts w:ascii="Calibri" w:cs="Calibri" w:eastAsia="Calibri" w:hAnsi="Calibri"/>
+                <w:b w:val="false"/>
+                <w:bCs w:val="false"/>
+              </w:rPr>
+              <w:t xml:space="preserve">Faktúry a finančná história</w:t>
+            </w:r>
+          </w:p>
+        </w:tc>
+        <w:tc>
+          <w:tcPr>
+            <w:tcW w:type="pct" w:w="33.333333333333336%"/>
+            <w:shd w:fill="FFFFFF"/>
+            <w:tcMar>
+              <w:top w:type="dxa" w:w="85"/>
+              <w:left w:type="dxa" w:w="100"/>
+              <w:bottom w:type="dxa" w:w="85"/>
+              <w:right w:type="dxa" w:w="100"/>
+            </w:tcMar>
+          </w:tcPr>
+          <w:p>
+            <w:pPr>
+              <w:pStyle w:val="TableText"/>
+              <w:spacing w:after="60"/>
+            </w:pPr>
+            <w:r>
+              <w:rPr>
+                <w:rFonts w:ascii="Calibri" w:cs="Calibri" w:eastAsia="Calibri" w:hAnsi="Calibri"/>
+                <w:b w:val="false"/>
+                <w:bCs w:val="false"/>
+              </w:rPr>
+              <w:t xml:space="preserve">Importné cesty pre faktúry, položky, realizované a plánované platby; v20 uchováva rozsiahle historické údaje aj v dokumentoch/JSON.</w:t>
+            </w:r>
+          </w:p>
+        </w:tc>
+        <w:tc>
+          <w:tcPr>
+            <w:tcW w:type="pct" w:w="33.333333333333336%"/>
+            <w:shd w:fill="FFFFFF"/>
+            <w:tcMar>
+              <w:top w:type="dxa" w:w="85"/>
+              <w:left w:type="dxa" w:w="100"/>
+              <w:bottom w:type="dxa" w:w="85"/>
+              <w:right w:type="dxa" w:w="100"/>
+            </w:tcMar>
+          </w:tcPr>
+          <w:p>
+            <w:pPr>
+              <w:pStyle w:val="TableText"/>
+              <w:spacing w:after="60"/>
+            </w:pPr>
+            <w:r>
+              <w:rPr>
+                <w:rFonts w:ascii="Calibri" w:cs="Calibri" w:eastAsia="Calibri" w:hAnsi="Calibri"/>
+                <w:b w:val="false"/>
+                <w:bCs w:val="false"/>
+              </w:rPr>
+              <w:t xml:space="preserve">Overiť konkrétnu vetvu importu: archív faktúry nemusí vytvoriť aktívne invoice_items ani korektné párovanie platieb.</w:t>
+            </w:r>
+          </w:p>
+        </w:tc>
+      </w:tr>
+      <w:tr>
+        <w:trPr>
+          <w:tblHeader w:val="false"/>
+        </w:trPr>
+        <w:tc>
+          <w:tcPr>
+            <w:tcW w:type="pct" w:w="33.333333333333336%"/>
+            <w:shd w:fill="FFFFFF"/>
+            <w:tcMar>
+              <w:top w:type="dxa" w:w="85"/>
+              <w:left w:type="dxa" w:w="100"/>
+              <w:bottom w:type="dxa" w:w="85"/>
+              <w:right w:type="dxa" w:w="100"/>
+            </w:tcMar>
+          </w:tcPr>
+          <w:p>
+            <w:pPr>
+              <w:pStyle w:val="TableText"/>
+              <w:spacing w:after="60"/>
+            </w:pPr>
+            <w:r>
+              <w:rPr>
+                <w:rFonts w:ascii="Calibri" w:cs="Calibri" w:eastAsia="Calibri" w:hAnsi="Calibri"/>
+                <w:b w:val="false"/>
+                <w:bCs w:val="false"/>
+              </w:rPr>
+              <w:t xml:space="preserve">Splátky a plánované faktúry</w:t>
+            </w:r>
+          </w:p>
+        </w:tc>
+        <w:tc>
+          <w:tcPr>
+            <w:tcW w:type="pct" w:w="33.333333333333336%"/>
+            <w:shd w:fill="FFFFFF"/>
+            <w:tcMar>
+              <w:top w:type="dxa" w:w="85"/>
+              <w:left w:type="dxa" w:w="100"/>
+              <w:bottom w:type="dxa" w:w="85"/>
+              <w:right w:type="dxa" w:w="100"/>
+            </w:tcMar>
+          </w:tcPr>
+          <w:p>
+            <w:pPr>
+              <w:pStyle w:val="TableText"/>
+              <w:spacing w:after="60"/>
+            </w:pPr>
+            <w:r>
+              <w:rPr>
+                <w:rFonts w:ascii="Calibri" w:cs="Calibri" w:eastAsia="Calibri" w:hAnsi="Calibri"/>
+                <w:b w:val="false"/>
+                <w:bCs w:val="false"/>
+              </w:rPr>
+              <w:t xml:space="preserve">Podklady zo scheduled payments a zmluvných harmonogramov do historických údajov a scheduled_invoices.</w:t>
+            </w:r>
+          </w:p>
+        </w:tc>
+        <w:tc>
+          <w:tcPr>
+            <w:tcW w:type="pct" w:w="33.333333333333336%"/>
+            <w:shd w:fill="FFFFFF"/>
+            <w:tcMar>
+              <w:top w:type="dxa" w:w="85"/>
+              <w:left w:type="dxa" w:w="100"/>
+              <w:bottom w:type="dxa" w:w="85"/>
+              <w:right w:type="dxa" w:w="100"/>
+            </w:tcMar>
+          </w:tcPr>
+          <w:p>
+            <w:pPr>
+              <w:pStyle w:val="TableText"/>
+              <w:spacing w:after="60"/>
+            </w:pPr>
+            <w:r>
+              <w:rPr>
+                <w:rFonts w:ascii="Calibri" w:cs="Calibri" w:eastAsia="Calibri" w:hAnsi="Calibri"/>
+                <w:b w:val="false"/>
+                <w:bCs w:val="false"/>
+              </w:rPr>
+              <w:t xml:space="preserve">Neprevziať historický splnený termín ako nový pokyn na fakturáciu; overiť otvorené a už realizované záväzky.</w:t>
+            </w:r>
+          </w:p>
+        </w:tc>
+      </w:tr>
+      <w:tr>
+        <w:trPr>
+          <w:tblHeader w:val="false"/>
+        </w:trPr>
+        <w:tc>
+          <w:tcPr>
+            <w:tcW w:type="pct" w:w="33.333333333333336%"/>
+            <w:shd w:fill="FFFFFF"/>
+            <w:tcMar>
+              <w:top w:type="dxa" w:w="85"/>
+              <w:left w:type="dxa" w:w="100"/>
+              <w:bottom w:type="dxa" w:w="85"/>
+              <w:right w:type="dxa" w:w="100"/>
+            </w:tcMar>
+          </w:tcPr>
+          <w:p>
+            <w:pPr>
+              <w:pStyle w:val="TableText"/>
+              <w:spacing w:after="60"/>
+            </w:pPr>
+            <w:r>
+              <w:rPr>
+                <w:rFonts w:ascii="Calibri" w:cs="Calibri" w:eastAsia="Calibri" w:hAnsi="Calibri"/>
+                <w:b w:val="false"/>
+                <w:bCs w:val="false"/>
+              </w:rPr>
+              <w:t xml:space="preserve">Pohľadávky a vymáhanie</w:t>
+            </w:r>
+          </w:p>
+        </w:tc>
+        <w:tc>
+          <w:tcPr>
+            <w:tcW w:type="pct" w:w="33.333333333333336%"/>
+            <w:shd w:fill="FFFFFF"/>
+            <w:tcMar>
+              <w:top w:type="dxa" w:w="85"/>
+              <w:left w:type="dxa" w:w="100"/>
+              <w:bottom w:type="dxa" w:w="85"/>
+              <w:right w:type="dxa" w:w="100"/>
+            </w:tcMar>
+          </w:tcPr>
+          <w:p>
+            <w:pPr>
+              <w:pStyle w:val="TableText"/>
+              <w:spacing w:after="60"/>
+            </w:pPr>
+            <w:r>
+              <w:rPr>
+                <w:rFonts w:ascii="Calibri" w:cs="Calibri" w:eastAsia="Calibri" w:hAnsi="Calibri"/>
+                <w:b w:val="false"/>
+                <w:bCs w:val="false"/>
+              </w:rPr>
+              <w:t xml:space="preserve">Import piatich zdrojových dlžníckych evidencií do customer_debt_collection.</w:t>
+            </w:r>
+          </w:p>
+        </w:tc>
+        <w:tc>
+          <w:tcPr>
+            <w:tcW w:type="pct" w:w="33.333333333333336%"/>
+            <w:shd w:fill="FFFFFF"/>
+            <w:tcMar>
+              <w:top w:type="dxa" w:w="85"/>
+              <w:left w:type="dxa" w:w="100"/>
+              <w:bottom w:type="dxa" w:w="85"/>
+              <w:right w:type="dxa" w:w="100"/>
+            </w:tcMar>
+          </w:tcPr>
+          <w:p>
+            <w:pPr>
+              <w:pStyle w:val="TableText"/>
+              <w:spacing w:after="60"/>
+            </w:pPr>
+            <w:r>
+              <w:rPr>
+                <w:rFonts w:ascii="Calibri" w:cs="Calibri" w:eastAsia="Calibri" w:hAnsi="Calibri"/>
+                <w:b w:val="false"/>
+                <w:bCs w:val="false"/>
+              </w:rPr>
+              <w:t xml:space="preserve">Zhodnosť dlžnej sumy a stavu musí byť preukázaná voči faktúram a úhradám, nie iba počtom záznamov.</w:t>
+            </w:r>
+          </w:p>
+        </w:tc>
+      </w:tr>
+      <w:tr>
+        <w:trPr>
+          <w:tblHeader w:val="false"/>
+        </w:trPr>
+        <w:tc>
+          <w:tcPr>
+            <w:tcW w:type="pct" w:w="33.333333333333336%"/>
+            <w:shd w:fill="FFFFFF"/>
+            <w:tcMar>
+              <w:top w:type="dxa" w:w="85"/>
+              <w:left w:type="dxa" w:w="100"/>
+              <w:bottom w:type="dxa" w:w="85"/>
+              <w:right w:type="dxa" w:w="100"/>
+            </w:tcMar>
+          </w:tcPr>
+          <w:p>
+            <w:pPr>
+              <w:pStyle w:val="TableText"/>
+              <w:spacing w:after="60"/>
+            </w:pPr>
+            <w:r>
+              <w:rPr>
+                <w:rFonts w:ascii="Calibri" w:cs="Calibri" w:eastAsia="Calibri" w:hAnsi="Calibri"/>
+                <w:b w:val="false"/>
+                <w:bCs w:val="false"/>
+              </w:rPr>
+              <w:t xml:space="preserve">Normalizácia kontaktov</w:t>
+            </w:r>
+          </w:p>
+        </w:tc>
+        <w:tc>
+          <w:tcPr>
+            <w:tcW w:type="pct" w:w="33.333333333333336%"/>
+            <w:shd w:fill="FFFFFF"/>
+            <w:tcMar>
+              <w:top w:type="dxa" w:w="85"/>
+              <w:left w:type="dxa" w:w="100"/>
+              <w:bottom w:type="dxa" w:w="85"/>
+              <w:right w:type="dxa" w:w="100"/>
+            </w:tcMar>
+          </w:tcPr>
+          <w:p>
+            <w:pPr>
+              <w:pStyle w:val="TableText"/>
+              <w:spacing w:after="60"/>
+            </w:pPr>
+            <w:r>
+              <w:rPr>
+                <w:rFonts w:ascii="Calibri" w:cs="Calibri" w:eastAsia="Calibri" w:hAnsi="Calibri"/>
+                <w:b w:val="false"/>
+                <w:bCs w:val="false"/>
+              </w:rPr>
+              <w:t xml:space="preserve">consolidate-contacts.cjs obsahuje normalizáciu a detekciu duplicít.</w:t>
+            </w:r>
+          </w:p>
+        </w:tc>
+        <w:tc>
+          <w:tcPr>
+            <w:tcW w:type="pct" w:w="33.333333333333336%"/>
+            <w:shd w:fill="FFFFFF"/>
+            <w:tcMar>
+              <w:top w:type="dxa" w:w="85"/>
+              <w:left w:type="dxa" w:w="100"/>
+              <w:bottom w:type="dxa" w:w="85"/>
+              <w:right w:type="dxa" w:w="100"/>
+            </w:tcMar>
+          </w:tcPr>
+          <w:p>
+            <w:pPr>
+              <w:pStyle w:val="TableText"/>
+              <w:spacing w:after="60"/>
+            </w:pPr>
+            <w:r>
+              <w:rPr>
+                <w:rFonts w:ascii="Calibri" w:cs="Calibri" w:eastAsia="Calibri" w:hAnsi="Calibri"/>
+                <w:b w:val="false"/>
+                <w:bCs w:val="false"/>
+              </w:rPr>
+              <w:t xml:space="preserve">Pravidlá schváliť vopred; uchovať pôvodnú hodnotu a audit úpravy, neprepísať bez kontroly novšie INDEXUS údaje.</w:t>
+            </w:r>
+          </w:p>
+        </w:tc>
+      </w:tr>
+    </w:tbl>
+    <w:p>
+      <w:pPr>
+        <w:spacing w:after="90"/>
+      </w:pPr>
+    </w:p>
+    <w:p>
+      <w:pPr>
+        <w:spacing w:after="110" w:line="265"/>
+      </w:pPr>
+      <w:r>
+        <w:rPr>
+          <w:rFonts w:ascii="Calibri" w:cs="Calibri" w:eastAsia="Calibri" w:hAnsi="Calibri"/>
+          <w:b/>
+          <w:bCs/>
+        </w:rPr>
+        <w:t xml:space="preserve">Dôležité:</w:t>
+      </w:r>
+      <w:r>
+        <w:rPr>
+          <w:rFonts w:ascii="Calibri" w:cs="Calibri" w:eastAsia="Calibri" w:hAnsi="Calibri"/>
+          <w:b w:val="false"/>
+          <w:bCs w:val="false"/>
+        </w:rPr>
+        <w:t xml:space="preserve"> nevyhlasujeme, že každé pole každej legacy tabuľky už má aktívny ekvivalent v INDEXUS. Časť dát má implementovanú historickú reprezentáciu; ich zapojenie do nového obchodného procesu je samostatná integračná práca.</w:t>
+      </w:r>
+    </w:p>
+    <w:p>
+      <w:pPr>
+        <w:pStyle w:val="Heading2"/>
+        <w:keepNext/>
+        <w:spacing w:after="130" w:before="260"/>
+      </w:pPr>
+      <w:r>
+        <w:t xml:space="preserve">11.3 Otvorené alebo samostatne riešené domény</w:t>
+      </w:r>
+    </w:p>
+    <w:p>
+      <w:pPr>
+        <w:pStyle w:val="ListParagraph"/>
+        <w:numPr>
+          <w:ilvl w:val="0"/>
+          <w:numId w:val="1"/>
+        </w:numPr>
+        <w:spacing w:after="110" w:line="265"/>
+      </w:pPr>
+      <w:r>
+        <w:rPr>
+          <w:rFonts w:ascii="Calibri" w:cs="Calibri" w:eastAsia="Calibri" w:hAnsi="Calibri"/>
+          <w:b/>
+          <w:bCs/>
+        </w:rPr>
+        <w:t xml:space="preserve">Súbory, podpísané dokumenty a prílohy:</w:t>
+      </w:r>
+      <w:r>
+        <w:rPr>
+          <w:rFonts w:ascii="Calibri" w:cs="Calibri" w:eastAsia="Calibri" w:hAnsi="Calibri"/>
+          <w:b w:val="false"/>
+          <w:bCs w:val="false"/>
+        </w:rPr>
+        <w:t xml:space="preserve"> širšia analýza počíta so samostatným prenosom súborového úložiska. Databázový customer_documents/JSON nie je dôkaz prenosu PDF, skenov alebo binárnych príloh. Potrebný je manifest, kontrolný súčet, mapovanie vlastníka, prístupových práv a overenie otvorenia súboru.</w:t>
+      </w:r>
+    </w:p>
+    <w:p>
+      <w:pPr>
+        <w:pStyle w:val="ListParagraph"/>
+        <w:numPr>
+          <w:ilvl w:val="0"/>
+          <w:numId w:val="1"/>
+        </w:numPr>
+        <w:spacing w:after="110" w:line="265"/>
+      </w:pPr>
+      <w:r>
+        <w:rPr>
+          <w:rFonts w:ascii="Calibri" w:cs="Calibri" w:eastAsia="Calibri" w:hAnsi="Calibri"/>
+          <w:b/>
+          <w:bCs/>
+        </w:rPr>
+        <w:t xml:space="preserve">Odmeny spolupracovníkov, doprava a kuriéri:</w:t>
+      </w:r>
+      <w:r>
+        <w:rPr>
+          <w:rFonts w:ascii="Calibri" w:cs="Calibri" w:eastAsia="Calibri" w:hAnsi="Calibri"/>
+          <w:b w:val="false"/>
+          <w:bCs w:val="false"/>
+        </w:rPr>
+        <w:t xml:space="preserve"> uvedené v širšej analýze; kompletná vykonateľná cesta nebola v audite doložená. Pred zaradením do hotového rozsahu treba potvrdiť cieľový model, mapovanie a importér.</w:t>
+      </w:r>
+    </w:p>
+    <w:p>
+      <w:pPr>
+        <w:pStyle w:val="ListParagraph"/>
+        <w:numPr>
+          <w:ilvl w:val="0"/>
+          <w:numId w:val="1"/>
+        </w:numPr>
+        <w:spacing w:after="110" w:line="265"/>
+      </w:pPr>
+      <w:r>
+        <w:rPr>
+          <w:rFonts w:ascii="Calibri" w:cs="Calibri" w:eastAsia="Calibri" w:hAnsi="Calibri"/>
+          <w:b/>
+          <w:bCs/>
+        </w:rPr>
+        <w:t xml:space="preserve">Úplný audit zmien a ďalšie komunikačné archívy:</w:t>
+      </w:r>
+      <w:r>
+        <w:rPr>
+          <w:rFonts w:ascii="Calibri" w:cs="Calibri" w:eastAsia="Calibri" w:hAnsi="Calibri"/>
+          <w:b w:val="false"/>
+          <w:bCs w:val="false"/>
+        </w:rPr>
+        <w:t xml:space="preserve"> import poznámok a telefonických záznamov nepokrýva automaticky všetky auditné udalosti, e-maily, SMS a nahrávky. Každý archív vyžaduje osobitnú inventúru zdroja a dôkaz migrácie.</w:t>
+      </w:r>
+    </w:p>
+    <w:p>
+      <w:pPr>
+        <w:pStyle w:val="ListParagraph"/>
+        <w:numPr>
+          <w:ilvl w:val="0"/>
+          <w:numId w:val="1"/>
+        </w:numPr>
+        <w:spacing w:after="110" w:line="265"/>
+      </w:pPr>
+      <w:r>
+        <w:rPr>
+          <w:rFonts w:ascii="Calibri" w:cs="Calibri" w:eastAsia="Calibri" w:hAnsi="Calibri"/>
+          <w:b/>
+          <w:bCs/>
+        </w:rPr>
+        <w:t xml:space="preserve">Produkty, historické cenníky a meny:</w:t>
+      </w:r>
+      <w:r>
+        <w:rPr>
+          <w:rFonts w:ascii="Calibri" w:cs="Calibri" w:eastAsia="Calibri" w:hAnsi="Calibri"/>
+          <w:b w:val="false"/>
+          <w:bCs w:val="false"/>
+        </w:rPr>
+        <w:t xml:space="preserve"> referenčné importy nie sú automatickým prevodom legacy cien do Pricing Engine V2. Treba explicitné priradenie historických podmienok alebo nemenný legacy snapshot; existujúci importér V2 sa nesmie bez kontroly použiť na používaný cenník.</w:t>
+      </w:r>
+    </w:p>
+    <w:p>
+      <w:pPr>
+        <w:pStyle w:val="ListParagraph"/>
+        <w:numPr>
+          <w:ilvl w:val="0"/>
+          <w:numId w:val="1"/>
+        </w:numPr>
+        <w:spacing w:after="110" w:line="265"/>
+      </w:pPr>
+      <w:r>
+        <w:rPr>
+          <w:rFonts w:ascii="Calibri" w:cs="Calibri" w:eastAsia="Calibri" w:hAnsi="Calibri"/>
+          <w:b/>
+          <w:bCs/>
+        </w:rPr>
+        <w:t xml:space="preserve">Účtovné integrácie a kompletné číselníky:</w:t>
+      </w:r>
+      <w:r>
+        <w:rPr>
+          <w:rFonts w:ascii="Calibri" w:cs="Calibri" w:eastAsia="Calibri" w:hAnsi="Calibri"/>
+          <w:b w:val="false"/>
+          <w:bCs w:val="false"/>
+        </w:rPr>
+        <w:t xml:space="preserve"> inventúra zdrojových tabuliek je širšia než preukázaný prevádzkový import. Každá doména dostane rozhodnutie: aktívne migrovať, zachovať iba v archíve alebo vedome neprenášať.</w:t>
+      </w:r>
+    </w:p>
+    <w:p>
+      <w:pPr>
+        <w:pStyle w:val="ListParagraph"/>
+        <w:numPr>
+          <w:ilvl w:val="0"/>
+          <w:numId w:val="1"/>
+        </w:numPr>
+        <w:spacing w:after="110" w:line="265"/>
+      </w:pPr>
+      <w:r>
+        <w:rPr>
+          <w:rFonts w:ascii="Calibri" w:cs="Calibri" w:eastAsia="Calibri" w:hAnsi="Calibri"/>
+          <w:b/>
+          <w:bCs/>
+        </w:rPr>
+        <w:t xml:space="preserve">Legacy používateľské rozhranie:</w:t>
+      </w:r>
+      <w:r>
+        <w:rPr>
+          <w:rFonts w:ascii="Calibri" w:cs="Calibri" w:eastAsia="Calibri" w:hAnsi="Calibri"/>
+          <w:b w:val="false"/>
+          <w:bCs w:val="false"/>
+        </w:rPr>
+        <w:t xml:space="preserve"> staré UI/BSP konfigurácie, lokalizácie, dashboardové widgety, testovacie/záložné tabuľky a prechodné odosielacie fronty sa nemigrujú ako aktívne údaje. Prístupy a roly sa nastavia podľa bezpečnostného modelu INDEXUS; staré prihlasovacie údaje sa nekopírujú do dokumentácie ani logov.</w:t>
+      </w:r>
+    </w:p>
+    <w:p>
+      <w:pPr>
+        <w:pStyle w:val="Heading2"/>
+        <w:keepNext/>
+        <w:spacing w:after="130" w:before="260"/>
+      </w:pPr>
+      <w:r>
+        <w:t xml:space="preserve">11.4 Použiteľné nástroje a ich hranice</w:t>
+      </w:r>
+    </w:p>
+    <w:p>
+      <w:pPr>
+        <w:spacing w:after="110" w:line="265"/>
+      </w:pPr>
+      <w:r>
+        <w:rPr>
+          <w:rFonts w:ascii="Calibri" w:cs="Calibri" w:eastAsia="Calibri" w:hAnsi="Calibri"/>
+          <w:b w:val="false"/>
+          <w:bCs w:val="false"/>
+        </w:rPr>
+        <w:t xml:space="preserve">Hlavná prevádzková vetva používa script/migration/test-migration-20.cjs. Napriek názvu obsahuje skutočné zápisy do cieľovej databázy — </w:t>
+      </w:r>
+      <w:r>
+        <w:rPr>
+          <w:rFonts w:ascii="Calibri" w:cs="Calibri" w:eastAsia="Calibri" w:hAnsi="Calibri"/>
+          <w:b/>
+          <w:bCs/>
+        </w:rPr>
+        <w:t xml:space="preserve">nie je to read-only test</w:t>
+      </w:r>
+      <w:r>
+        <w:rPr>
+          <w:rFonts w:ascii="Calibri" w:cs="Calibri" w:eastAsia="Calibri" w:hAnsi="Calibri"/>
+          <w:b w:val="false"/>
+          <w:bCs w:val="false"/>
+        </w:rPr>
+        <w:t xml:space="preserve">. Dokumentácia popisuje postupné kroky, dávkovanie, oddelený import zmlúv/faktúr a označenie prenesených záznamov pomocou legacy_id, data_source a podľa domény created_by.</w:t>
+      </w:r>
+    </w:p>
+    <w:p>
+      <w:pPr>
+        <w:spacing w:after="110" w:line="265"/>
+      </w:pPr>
+      <w:r>
+        <w:rPr>
+          <w:rFonts w:ascii="Calibri" w:cs="Calibri" w:eastAsia="Calibri" w:hAnsi="Calibri"/>
+          <w:b w:val="false"/>
+          <w:bCs w:val="false"/>
+        </w:rPr>
+        <w:t xml:space="preserve">Existuje aj fázová rodina: run-migration.sh, migrate-phase1-reference.cjs, migrate-phase2-core.cjs, migrate-phase3-collections.cjs a migrate-phase4-invoices.cjs v script/migration/. Tieto vetvy sa nesmú bez porovnania kombinovať nad rovnakými dátami. Pred produkčným použitím treba zvoliť jednu autoritatívnu cestu a zosúladiť jej výstupy s aktuálnou schémou, najmä pri zmluvách, fakturačných položkách a úhradách.</w:t>
+      </w:r>
+    </w:p>
+    <w:p>
+      <w:pPr>
+        <w:spacing w:after="110" w:line="265"/>
+      </w:pPr>
+      <w:r>
+        <w:rPr>
+          <w:rFonts w:ascii="Calibri" w:cs="Calibri" w:eastAsia="Calibri" w:hAnsi="Calibri"/>
+          <w:b w:val="false"/>
+          <w:bCs w:val="false"/>
+        </w:rPr>
+        <w:t xml:space="preserve">verify-migration.cjs porovnáva počty vybraných zdrojových a cieľových evidencií. Nie je úplným dôkazom finančnej zhody, správnych väzieb ani bezpečnej opakovateľnosti importu. Obsahuje aj vzorky osobných údajov; jeho surový výstup sa neposiela do chatu. Zdieľajú sa iba anonymizované agregácie. Prehľadový SQL z kapitoly 9 nenahrádza samostatnú zdrojovo-cieľovú reconciliáciu ISCBC.</w:t>
+      </w:r>
+    </w:p>
+    <w:p>
+      <w:pPr>
+        <w:pStyle w:val="Heading2"/>
+        <w:keepNext/>
+        <w:spacing w:after="130" w:before="260"/>
+      </w:pPr>
+      <w:r>
+        <w:t xml:space="preserve">11.5 Etapy riadenej migrácie</w:t>
+      </w:r>
+    </w:p>
+    <w:p>
+      <w:pPr>
+        <w:spacing w:after="110" w:line="265"/>
+      </w:pPr>
+      <w:r>
+        <w:rPr>
+          <w:rFonts w:ascii="Calibri" w:cs="Calibri" w:eastAsia="Calibri" w:hAnsi="Calibri"/>
+          <w:b/>
+          <w:bCs/>
+        </w:rPr>
+        <w:t xml:space="preserve">M0 — Inventúra a schválenie rozsahu.</w:t>
+      </w:r>
+      <w:r>
+        <w:rPr>
+          <w:rFonts w:ascii="Calibri" w:cs="Calibri" w:eastAsia="Calibri" w:hAnsi="Calibri"/>
+          <w:b w:val="false"/>
+          <w:bCs w:val="false"/>
+        </w:rPr>
+        <w:t xml:space="preserve"> Zaznamenať verziu aplikácie, zdrojovej a cieľovej schémy, krajiny, časový rozsah a dátový objem. Pre každú doménu uviesť zdroj, cieľ, transformačné pravidlá, vlastníka kontroly a spôsob akceptácie. Výstup: schválený migračný katalóg vrátane archívov a výnimiek.</w:t>
+      </w:r>
+    </w:p>
+    <w:p>
+      <w:pPr>
+        <w:spacing w:after="110" w:line="265"/>
+      </w:pPr>
+      <w:r>
+        <w:rPr>
+          <w:rFonts w:ascii="Calibri" w:cs="Calibri" w:eastAsia="Calibri" w:hAnsi="Calibri"/>
+          <w:b/>
+          <w:bCs/>
+        </w:rPr>
+        <w:t xml:space="preserve">M1 — Mapovanie a historická kontinuita.</w:t>
+      </w:r>
+      <w:r>
+        <w:rPr>
+          <w:rFonts w:ascii="Calibri" w:cs="Calibri" w:eastAsia="Calibri" w:hAnsi="Calibri"/>
+          <w:b w:val="false"/>
+          <w:bCs w:val="false"/>
+        </w:rPr>
+        <w:t xml:space="preserve"> Zostaviť jednoznačné mapy zdrojových identifikátorov na INDEXUS ID. Schváliť stavy, krajiny, meny, časové pásma, číselné rady, produkty a cenové verzie. Rozhodnúť konflikt medzi starou hodnotou a novšou ručnou úpravou v INDEXUS. Výstup: žiadna nejednoznačná väzba bez evidovanej výnimky.</w:t>
+      </w:r>
+    </w:p>
+    <w:p>
+      <w:pPr>
+        <w:spacing w:after="110" w:line="265"/>
+      </w:pPr>
+      <w:r>
+        <w:rPr>
+          <w:rFonts w:ascii="Calibri" w:cs="Calibri" w:eastAsia="Calibri" w:hAnsi="Calibri"/>
+          <w:b/>
+          <w:bCs/>
+        </w:rPr>
+        <w:t xml:space="preserve">M2 — Príprava a obnova.</w:t>
+      </w:r>
+      <w:r>
+        <w:rPr>
+          <w:rFonts w:ascii="Calibri" w:cs="Calibri" w:eastAsia="Calibri" w:hAnsi="Calibri"/>
+          <w:b w:val="false"/>
+          <w:bCs w:val="false"/>
+        </w:rPr>
+        <w:t xml:space="preserve"> Overiť zálohu a skutočne nacvičiť obnovu na kontrolovanom prostredí. Použiť minimálne oprávnenia, oddelené spojenia a bezpečné prihlasovanie. Vypnúť následné automatizácie importu, odosielanie správ a generovanie dokladov. Výstup: schválený návratový postup a import bez vonkajších účinkov.</w:t>
+      </w:r>
+    </w:p>
+    <w:p>
+      <w:pPr>
+        <w:spacing w:after="110" w:line="265"/>
+      </w:pPr>
+      <w:r>
+        <w:rPr>
+          <w:rFonts w:ascii="Calibri" w:cs="Calibri" w:eastAsia="Calibri" w:hAnsi="Calibri"/>
+          <w:b/>
+          <w:bCs/>
+        </w:rPr>
+        <w:t xml:space="preserve">M3 — Reprezentatívny pilot.</w:t>
+      </w:r>
+      <w:r>
+        <w:rPr>
+          <w:rFonts w:ascii="Calibri" w:cs="Calibri" w:eastAsia="Calibri" w:hAnsi="Calibri"/>
+          <w:b w:val="false"/>
+          <w:bCs w:val="false"/>
+        </w:rPr>
+        <w:t xml:space="preserve"> Na oddelenej kópii preniesť vzorku každej krajiny a typu prípadu: nový/potenciálny klient, historická zmluva, úplný/neúplný odber, opravený výsledok, uhradená/neuhradená faktúra, splátka a príloha. Vzorka musí zachovať závislosti, nestačí náhodný limit riadkov každej tabuľky. Výstup: rovnaký prípad dohľadateľný od zákazníka po finančný zostatok.</w:t>
+      </w:r>
+    </w:p>
+    <w:p>
+      <w:pPr>
+        <w:spacing w:after="110" w:line="265"/>
+      </w:pPr>
+      <w:r>
+        <w:rPr>
+          <w:rFonts w:ascii="Calibri" w:cs="Calibri" w:eastAsia="Calibri" w:hAnsi="Calibri"/>
+          <w:b/>
+          <w:bCs/>
+        </w:rPr>
+        <w:t xml:space="preserve">M4 — Dávkový import v poradí závislostí.</w:t>
+      </w:r>
+      <w:r>
+        <w:rPr>
+          <w:rFonts w:ascii="Calibri" w:cs="Calibri" w:eastAsia="Calibri" w:hAnsi="Calibri"/>
+          <w:b w:val="false"/>
+          <w:bCs w:val="false"/>
+        </w:rPr>
+        <w:t xml:space="preserve"> Referencie → nemocnice a spolupracovníci → zákazníci → zmluvy a ich cenové podklady → odbery, účastníci a výsledky → dokumenty, komunikácia a poznámky → faktúry, položky, platby, harmonogramy a pohľadávky. Prevádzková v20 dokumentácia má odbery pred zmluvami; ak zostane toto poradie, následné doplnenie a kontrola zmluvných väzieb je povinný explicitný krok. Veľké domény spracovať samostatne, s kontrolnými bodmi a logom dávok.</w:t>
+      </w:r>
+    </w:p>
+    <w:p>
+      <w:pPr>
+        <w:spacing w:after="110" w:line="265"/>
+      </w:pPr>
+      <w:r>
+        <w:rPr>
+          <w:rFonts w:ascii="Calibri" w:cs="Calibri" w:eastAsia="Calibri" w:hAnsi="Calibri"/>
+          <w:b/>
+          <w:bCs/>
+        </w:rPr>
+        <w:t xml:space="preserve">M5 — Reconciliácia a opakovaný beh.</w:t>
+      </w:r>
+      <w:r>
+        <w:rPr>
+          <w:rFonts w:ascii="Calibri" w:cs="Calibri" w:eastAsia="Calibri" w:hAnsi="Calibri"/>
+          <w:b w:val="false"/>
+          <w:bCs w:val="false"/>
+        </w:rPr>
+        <w:t xml:space="preserve"> Porovnať oprávnený zdrojový rozsah s cieľom po doménach, krajinách a stavoch. Testovať prerušenie a opakovanie dávky: nevzniknú duplicity, nové doklady ani prepis novších údajov. Kontrolovať unikátnosť legacy identít, neexistujúce referencie, zachovanie cien, príloh a histórie. Výstup: reprodukovateľný kontrolný protokol, nie iba hlásenie skriptu o dokončení.</w:t>
+      </w:r>
+    </w:p>
+    <w:p>
+      <w:pPr>
+        <w:spacing w:after="110" w:line="265"/>
+      </w:pPr>
+      <w:r>
+        <w:rPr>
+          <w:rFonts w:ascii="Calibri" w:cs="Calibri" w:eastAsia="Calibri" w:hAnsi="Calibri"/>
+          <w:b/>
+          <w:bCs/>
+        </w:rPr>
+        <w:t xml:space="preserve">M6 — Obchodná akceptácia.</w:t>
+      </w:r>
+      <w:r>
+        <w:rPr>
+          <w:rFonts w:ascii="Calibri" w:cs="Calibri" w:eastAsia="Calibri" w:hAnsi="Calibri"/>
+          <w:b w:val="false"/>
+          <w:bCs w:val="false"/>
+        </w:rPr>
+        <w:t xml:space="preserve"> Back Office, financie a laboratórna prevádzka overia reálne typy prípadov v UI. Osobitne sa skúša pokračovanie historickej zmluvy v novom systéme, nová faktúra po migrácii a oprava lab výsledku bez prepisu vydaného dokladu. Výstup: žiadna blokujúca dátová alebo funkčná chyba.</w:t>
+      </w:r>
+    </w:p>
+    <w:p>
+      <w:pPr>
+        <w:spacing w:after="110" w:line="265"/>
+      </w:pPr>
+      <w:r>
+        <w:rPr>
+          <w:rFonts w:ascii="Calibri" w:cs="Calibri" w:eastAsia="Calibri" w:hAnsi="Calibri"/>
+          <w:b/>
+          <w:bCs/>
+        </w:rPr>
+        <w:t xml:space="preserve">M7 — Finálny prenos zmien a prepnutie.</w:t>
+      </w:r>
+      <w:r>
+        <w:rPr>
+          <w:rFonts w:ascii="Calibri" w:cs="Calibri" w:eastAsia="Calibri" w:hAnsi="Calibri"/>
+          <w:b w:val="false"/>
+          <w:bCs w:val="false"/>
+        </w:rPr>
+        <w:t xml:space="preserve"> Dohodnúť servisné okno a zastaviť zápisy do legacy. Zaznamenať hranicu posledných zmien a vykonať overený delta prenos vrátane zmien stavov a riešenia zmazaných záznamov. Dostupný spolupracovnícky sync nie je univerzálny delta mechanizmus celej databázy; ten treba pre každú doménu doložiť alebo nahradiť schváleným finálnym exportom počas odstávky. Po reconciliácii povoliť INDEXUS ako jediný zapisujúci systém.</w:t>
+      </w:r>
+    </w:p>
+    <w:p>
+      <w:pPr>
+        <w:spacing w:after="110" w:line="265"/>
+      </w:pPr>
+      <w:r>
+        <w:rPr>
+          <w:rFonts w:ascii="Calibri" w:cs="Calibri" w:eastAsia="Calibri" w:hAnsi="Calibri"/>
+          <w:b/>
+          <w:bCs/>
+        </w:rPr>
+        <w:t xml:space="preserve">M8 — Stabilizácia a odovzdanie.</w:t>
+      </w:r>
+      <w:r>
+        <w:rPr>
+          <w:rFonts w:ascii="Calibri" w:cs="Calibri" w:eastAsia="Calibri" w:hAnsi="Calibri"/>
+          <w:b w:val="false"/>
+          <w:bCs w:val="false"/>
+        </w:rPr>
+        <w:t xml:space="preserve"> Monitorovať chyby, neúplné väzby, fronty, splatnosti a finančné zostatky. ISCBC ponechať dočasne read-only podľa schválenej retenčnej politiky. Odovzdať mapovania, výnimky, návody, prevádzkový dohľad a výsledky kontrol. Legacy vypnúť až po vyriešení závislostí a archívneho prístupu.</w:t>
+      </w:r>
+    </w:p>
+    <w:p>
+      <w:pPr>
+        <w:pStyle w:val="Heading2"/>
+        <w:keepNext/>
+        <w:spacing w:after="130" w:before="260"/>
+      </w:pPr>
+      <w:r>
+        <w:t xml:space="preserve">11.6 Akceptačné podmienky a návrat</w:t>
+      </w:r>
+    </w:p>
+    <w:tbl>
+      <w:tblPr>
+        <w:tblW w:type="pct" w:w="100%"/>
+        <w:tblBorders>
+          <w:top w:val="single" w:color="auto" w:sz="4"/>
+          <w:left w:val="single" w:color="auto" w:sz="4"/>
+          <w:bottom w:val="single" w:color="auto" w:sz="4"/>
+          <w:right w:val="single" w:color="auto" w:sz="4"/>
+          <w:insideH w:val="single" w:color="auto" w:sz="4"/>
+          <w:insideV w:val="single" w:color="auto" w:sz="4"/>
+        </w:tblBorders>
+      </w:tblPr>
+      <w:tblGrid>
+        <w:gridCol w:w="100"/>
+        <w:gridCol w:w="100"/>
+      </w:tblGrid>
+      <w:tr>
+        <w:trPr>
+          <w:tblHeader/>
+        </w:trPr>
+        <w:tc>
+          <w:tcPr>
+            <w:tcW w:type="pct" w:w="50%"/>
+            <w:shd w:fill="E2E8F0"/>
+            <w:tcMar>
+              <w:top w:type="dxa" w:w="85"/>
+              <w:left w:type="dxa" w:w="100"/>
+              <w:bottom w:type="dxa" w:w="85"/>
+              <w:right w:type="dxa" w:w="100"/>
+            </w:tcMar>
+          </w:tcPr>
+          <w:p>
+            <w:pPr>
+              <w:pStyle w:val="TableText"/>
+              <w:spacing w:after="60"/>
+            </w:pPr>
+            <w:r>
+              <w:rPr>
+                <w:rFonts w:ascii="Calibri" w:cs="Calibri" w:eastAsia="Calibri" w:hAnsi="Calibri"/>
+                <w:b w:val="false"/>
+                <w:bCs w:val="false"/>
+              </w:rPr>
+              <w:t xml:space="preserve">Kontrola</w:t>
+            </w:r>
+          </w:p>
+        </w:tc>
+        <w:tc>
+          <w:tcPr>
+            <w:tcW w:type="pct" w:w="50%"/>
+            <w:shd w:fill="E2E8F0"/>
+            <w:tcMar>
+              <w:top w:type="dxa" w:w="85"/>
+              <w:left w:type="dxa" w:w="100"/>
+              <w:bottom w:type="dxa" w:w="85"/>
+              <w:right w:type="dxa" w:w="100"/>
+            </w:tcMar>
+          </w:tcPr>
+          <w:p>
+            <w:pPr>
+              <w:pStyle w:val="TableText"/>
+              <w:spacing w:after="60"/>
+            </w:pPr>
+            <w:r>
+              <w:rPr>
+                <w:rFonts w:ascii="Calibri" w:cs="Calibri" w:eastAsia="Calibri" w:hAnsi="Calibri"/>
+                <w:b w:val="false"/>
+                <w:bCs w:val="false"/>
+              </w:rPr>
+              <w:t xml:space="preserve">Podmienka prijatia</w:t>
+            </w:r>
+          </w:p>
+        </w:tc>
+      </w:tr>
+      <w:tr>
+        <w:trPr>
+          <w:tblHeader w:val="false"/>
+        </w:trPr>
+        <w:tc>
+          <w:tcPr>
+            <w:tcW w:type="pct" w:w="50%"/>
+            <w:shd w:fill="FFFFFF"/>
+            <w:tcMar>
+              <w:top w:type="dxa" w:w="85"/>
+              <w:left w:type="dxa" w:w="100"/>
+              <w:bottom w:type="dxa" w:w="85"/>
+              <w:right w:type="dxa" w:w="100"/>
+            </w:tcMar>
+          </w:tcPr>
+          <w:p>
+            <w:pPr>
+              <w:pStyle w:val="TableText"/>
+              <w:spacing w:after="60"/>
+            </w:pPr>
+            <w:r>
+              <w:rPr>
+                <w:rFonts w:ascii="Calibri" w:cs="Calibri" w:eastAsia="Calibri" w:hAnsi="Calibri"/>
+                <w:b w:val="false"/>
+                <w:bCs w:val="false"/>
+              </w:rPr>
+              <w:t xml:space="preserve">Úplnosť</w:t>
+            </w:r>
+          </w:p>
+        </w:tc>
+        <w:tc>
+          <w:tcPr>
+            <w:tcW w:type="pct" w:w="50%"/>
+            <w:shd w:fill="FFFFFF"/>
+            <w:tcMar>
+              <w:top w:type="dxa" w:w="85"/>
+              <w:left w:type="dxa" w:w="100"/>
+              <w:bottom w:type="dxa" w:w="85"/>
+              <w:right w:type="dxa" w:w="100"/>
+            </w:tcMar>
+          </w:tcPr>
+          <w:p>
+            <w:pPr>
+              <w:pStyle w:val="TableText"/>
+              <w:spacing w:after="60"/>
+            </w:pPr>
+            <w:r>
+              <w:rPr>
+                <w:rFonts w:ascii="Calibri" w:cs="Calibri" w:eastAsia="Calibri" w:hAnsi="Calibri"/>
+                <w:b w:val="false"/>
+                <w:bCs w:val="false"/>
+              </w:rPr>
+              <w:t xml:space="preserve">Každý záznam schváleného zdrojového rozsahu má cieľ alebo zdôvodnenú výnimku; rozdiel nie je skrytý súhrnným počtom.</w:t>
+            </w:r>
+          </w:p>
+        </w:tc>
+      </w:tr>
+      <w:tr>
+        <w:trPr>
+          <w:tblHeader w:val="false"/>
+        </w:trPr>
+        <w:tc>
+          <w:tcPr>
+            <w:tcW w:type="pct" w:w="50%"/>
+            <w:shd w:fill="FFFFFF"/>
+            <w:tcMar>
+              <w:top w:type="dxa" w:w="85"/>
+              <w:left w:type="dxa" w:w="100"/>
+              <w:bottom w:type="dxa" w:w="85"/>
+              <w:right w:type="dxa" w:w="100"/>
+            </w:tcMar>
+          </w:tcPr>
+          <w:p>
+            <w:pPr>
+              <w:pStyle w:val="TableText"/>
+              <w:spacing w:after="60"/>
+            </w:pPr>
+            <w:r>
+              <w:rPr>
+                <w:rFonts w:ascii="Calibri" w:cs="Calibri" w:eastAsia="Calibri" w:hAnsi="Calibri"/>
+                <w:b w:val="false"/>
+                <w:bCs w:val="false"/>
+              </w:rPr>
+              <w:t xml:space="preserve">Identita a väzby</w:t>
+            </w:r>
+          </w:p>
+        </w:tc>
+        <w:tc>
+          <w:tcPr>
+            <w:tcW w:type="pct" w:w="50%"/>
+            <w:shd w:fill="FFFFFF"/>
+            <w:tcMar>
+              <w:top w:type="dxa" w:w="85"/>
+              <w:left w:type="dxa" w:w="100"/>
+              <w:bottom w:type="dxa" w:w="85"/>
+              <w:right w:type="dxa" w:w="100"/>
+            </w:tcMar>
+          </w:tcPr>
+          <w:p>
+            <w:pPr>
+              <w:pStyle w:val="TableText"/>
+              <w:spacing w:after="60"/>
+            </w:pPr>
+            <w:r>
+              <w:rPr>
+                <w:rFonts w:ascii="Calibri" w:cs="Calibri" w:eastAsia="Calibri" w:hAnsi="Calibri"/>
+                <w:b w:val="false"/>
+                <w:bCs w:val="false"/>
+              </w:rPr>
+              <w:t xml:space="preserve">Jednoznačná legacy mapa; žiadna nevysvetlená duplicita ani neexistujúci povinný odkaz.</w:t>
+            </w:r>
+          </w:p>
+        </w:tc>
+      </w:tr>
+      <w:tr>
+        <w:trPr>
+          <w:tblHeader w:val="false"/>
+        </w:trPr>
+        <w:tc>
+          <w:tcPr>
+            <w:tcW w:type="pct" w:w="50%"/>
+            <w:shd w:fill="FFFFFF"/>
+            <w:tcMar>
+              <w:top w:type="dxa" w:w="85"/>
+              <w:left w:type="dxa" w:w="100"/>
+              <w:bottom w:type="dxa" w:w="85"/>
+              <w:right w:type="dxa" w:w="100"/>
+            </w:tcMar>
+          </w:tcPr>
+          <w:p>
+            <w:pPr>
+              <w:pStyle w:val="TableText"/>
+              <w:spacing w:after="60"/>
+            </w:pPr>
+            <w:r>
+              <w:rPr>
+                <w:rFonts w:ascii="Calibri" w:cs="Calibri" w:eastAsia="Calibri" w:hAnsi="Calibri"/>
+                <w:b w:val="false"/>
+                <w:bCs w:val="false"/>
+              </w:rPr>
+              <w:t xml:space="preserve">Financie</w:t>
+            </w:r>
+          </w:p>
+        </w:tc>
+        <w:tc>
+          <w:tcPr>
+            <w:tcW w:type="pct" w:w="50%"/>
+            <w:shd w:fill="FFFFFF"/>
+            <w:tcMar>
+              <w:top w:type="dxa" w:w="85"/>
+              <w:left w:type="dxa" w:w="100"/>
+              <w:bottom w:type="dxa" w:w="85"/>
+              <w:right w:type="dxa" w:w="100"/>
+            </w:tcMar>
+          </w:tcPr>
+          <w:p>
+            <w:pPr>
+              <w:pStyle w:val="TableText"/>
+              <w:spacing w:after="60"/>
+            </w:pPr>
+            <w:r>
+              <w:rPr>
+                <w:rFonts w:ascii="Calibri" w:cs="Calibri" w:eastAsia="Calibri" w:hAnsi="Calibri"/>
+                <w:b w:val="false"/>
+                <w:bCs w:val="false"/>
+              </w:rPr>
+              <w:t xml:space="preserve">Po krajinách a menách súhlasia základy, dane, celkové sumy, úhrady a otvorené zostatky; tolerancie zaokrúhlenia sú vopred schválené.</w:t>
+            </w:r>
+          </w:p>
+        </w:tc>
+      </w:tr>
+      <w:tr>
+        <w:trPr>
+          <w:tblHeader w:val="false"/>
+        </w:trPr>
+        <w:tc>
+          <w:tcPr>
+            <w:tcW w:type="pct" w:w="50%"/>
+            <w:shd w:fill="FFFFFF"/>
+            <w:tcMar>
+              <w:top w:type="dxa" w:w="85"/>
+              <w:left w:type="dxa" w:w="100"/>
+              <w:bottom w:type="dxa" w:w="85"/>
+              <w:right w:type="dxa" w:w="100"/>
+            </w:tcMar>
+          </w:tcPr>
+          <w:p>
+            <w:pPr>
+              <w:pStyle w:val="TableText"/>
+              <w:spacing w:after="60"/>
+            </w:pPr>
+            <w:r>
+              <w:rPr>
+                <w:rFonts w:ascii="Calibri" w:cs="Calibri" w:eastAsia="Calibri" w:hAnsi="Calibri"/>
+                <w:b w:val="false"/>
+                <w:bCs w:val="false"/>
+              </w:rPr>
+              <w:t xml:space="preserve">História</w:t>
+            </w:r>
+          </w:p>
+        </w:tc>
+        <w:tc>
+          <w:tcPr>
+            <w:tcW w:type="pct" w:w="50%"/>
+            <w:shd w:fill="FFFFFF"/>
+            <w:tcMar>
+              <w:top w:type="dxa" w:w="85"/>
+              <w:left w:type="dxa" w:w="100"/>
+              <w:bottom w:type="dxa" w:w="85"/>
+              <w:right w:type="dxa" w:w="100"/>
+            </w:tcMar>
+          </w:tcPr>
+          <w:p>
+            <w:pPr>
+              <w:pStyle w:val="TableText"/>
+              <w:spacing w:after="60"/>
+            </w:pPr>
+            <w:r>
+              <w:rPr>
+                <w:rFonts w:ascii="Calibri" w:cs="Calibri" w:eastAsia="Calibri" w:hAnsi="Calibri"/>
+                <w:b w:val="false"/>
+                <w:bCs w:val="false"/>
+              </w:rPr>
+              <w:t xml:space="preserve">Historická cena a vydaný doklad sa nemenia podľa súčasného V2; zachované sú pôvod a časové súvislosti.</w:t>
+            </w:r>
+          </w:p>
+        </w:tc>
+      </w:tr>
+      <w:tr>
+        <w:trPr>
+          <w:tblHeader w:val="false"/>
+        </w:trPr>
+        <w:tc>
+          <w:tcPr>
+            <w:tcW w:type="pct" w:w="50%"/>
+            <w:shd w:fill="FFFFFF"/>
+            <w:tcMar>
+              <w:top w:type="dxa" w:w="85"/>
+              <w:left w:type="dxa" w:w="100"/>
+              <w:bottom w:type="dxa" w:w="85"/>
+              <w:right w:type="dxa" w:w="100"/>
+            </w:tcMar>
+          </w:tcPr>
+          <w:p>
+            <w:pPr>
+              <w:pStyle w:val="TableText"/>
+              <w:spacing w:after="60"/>
+            </w:pPr>
+            <w:r>
+              <w:rPr>
+                <w:rFonts w:ascii="Calibri" w:cs="Calibri" w:eastAsia="Calibri" w:hAnsi="Calibri"/>
+                <w:b w:val="false"/>
+                <w:bCs w:val="false"/>
+              </w:rPr>
+              <w:t xml:space="preserve">Súbory a prístupy</w:t>
+            </w:r>
+          </w:p>
+        </w:tc>
+        <w:tc>
+          <w:tcPr>
+            <w:tcW w:type="pct" w:w="50%"/>
+            <w:shd w:fill="FFFFFF"/>
+            <w:tcMar>
+              <w:top w:type="dxa" w:w="85"/>
+              <w:left w:type="dxa" w:w="100"/>
+              <w:bottom w:type="dxa" w:w="85"/>
+              <w:right w:type="dxa" w:w="100"/>
+            </w:tcMar>
+          </w:tcPr>
+          <w:p>
+            <w:pPr>
+              <w:pStyle w:val="TableText"/>
+              <w:spacing w:after="60"/>
+            </w:pPr>
+            <w:r>
+              <w:rPr>
+                <w:rFonts w:ascii="Calibri" w:cs="Calibri" w:eastAsia="Calibri" w:hAnsi="Calibri"/>
+                <w:b w:val="false"/>
+                <w:bCs w:val="false"/>
+              </w:rPr>
+              <w:t xml:space="preserve">Kontrolné súčty, počet súborov, vlastníctvo, oprávnenia a otvorenie reprezentatívnych príloh sú overené.</w:t>
+            </w:r>
+          </w:p>
+        </w:tc>
+      </w:tr>
+      <w:tr>
+        <w:trPr>
+          <w:tblHeader w:val="false"/>
+        </w:trPr>
+        <w:tc>
+          <w:tcPr>
+            <w:tcW w:type="pct" w:w="50%"/>
+            <w:shd w:fill="FFFFFF"/>
+            <w:tcMar>
+              <w:top w:type="dxa" w:w="85"/>
+              <w:left w:type="dxa" w:w="100"/>
+              <w:bottom w:type="dxa" w:w="85"/>
+              <w:right w:type="dxa" w:w="100"/>
+            </w:tcMar>
+          </w:tcPr>
+          <w:p>
+            <w:pPr>
+              <w:pStyle w:val="TableText"/>
+              <w:spacing w:after="60"/>
+            </w:pPr>
+            <w:r>
+              <w:rPr>
+                <w:rFonts w:ascii="Calibri" w:cs="Calibri" w:eastAsia="Calibri" w:hAnsi="Calibri"/>
+                <w:b w:val="false"/>
+                <w:bCs w:val="false"/>
+              </w:rPr>
+              <w:t xml:space="preserve">Opakovateľnosť</w:t>
+            </w:r>
+          </w:p>
+        </w:tc>
+        <w:tc>
+          <w:tcPr>
+            <w:tcW w:type="pct" w:w="50%"/>
+            <w:shd w:fill="FFFFFF"/>
+            <w:tcMar>
+              <w:top w:type="dxa" w:w="85"/>
+              <w:left w:type="dxa" w:w="100"/>
+              <w:bottom w:type="dxa" w:w="85"/>
+              <w:right w:type="dxa" w:w="100"/>
+            </w:tcMar>
+          </w:tcPr>
+          <w:p>
+            <w:pPr>
+              <w:pStyle w:val="TableText"/>
+              <w:spacing w:after="60"/>
+            </w:pPr>
+            <w:r>
+              <w:rPr>
+                <w:rFonts w:ascii="Calibri" w:cs="Calibri" w:eastAsia="Calibri" w:hAnsi="Calibri"/>
+                <w:b w:val="false"/>
+                <w:bCs w:val="false"/>
+              </w:rPr>
+              <w:t xml:space="preserve">Reštart dávky nevytvorí duplicity ani neodošle správu alebo doklad druhýkrát.</w:t>
+            </w:r>
+          </w:p>
+        </w:tc>
+      </w:tr>
+      <w:tr>
+        <w:trPr>
+          <w:tblHeader w:val="false"/>
+        </w:trPr>
+        <w:tc>
+          <w:tcPr>
+            <w:tcW w:type="pct" w:w="50%"/>
+            <w:shd w:fill="FFFFFF"/>
+            <w:tcMar>
+              <w:top w:type="dxa" w:w="85"/>
+              <w:left w:type="dxa" w:w="100"/>
+              <w:bottom w:type="dxa" w:w="85"/>
+              <w:right w:type="dxa" w:w="100"/>
+            </w:tcMar>
+          </w:tcPr>
+          <w:p>
+            <w:pPr>
+              <w:pStyle w:val="TableText"/>
+              <w:spacing w:after="60"/>
+            </w:pPr>
+            <w:r>
+              <w:rPr>
+                <w:rFonts w:ascii="Calibri" w:cs="Calibri" w:eastAsia="Calibri" w:hAnsi="Calibri"/>
+                <w:b w:val="false"/>
+                <w:bCs w:val="false"/>
+              </w:rPr>
+              <w:t xml:space="preserve">Pokračovanie práce</w:t>
+            </w:r>
+          </w:p>
+        </w:tc>
+        <w:tc>
+          <w:tcPr>
+            <w:tcW w:type="pct" w:w="50%"/>
+            <w:shd w:fill="FFFFFF"/>
+            <w:tcMar>
+              <w:top w:type="dxa" w:w="85"/>
+              <w:left w:type="dxa" w:w="100"/>
+              <w:bottom w:type="dxa" w:w="85"/>
+              <w:right w:type="dxa" w:w="100"/>
+            </w:tcMar>
+          </w:tcPr>
+          <w:p>
+            <w:pPr>
+              <w:pStyle w:val="TableText"/>
+              <w:spacing w:after="60"/>
+            </w:pPr>
+            <w:r>
+              <w:rPr>
+                <w:rFonts w:ascii="Calibri" w:cs="Calibri" w:eastAsia="Calibri" w:hAnsi="Calibri"/>
+                <w:b w:val="false"/>
+                <w:bCs w:val="false"/>
+              </w:rPr>
+              <w:t xml:space="preserve">Migrovaný aj nový prípad úspešne prejdú procesom zmluva → odber → výsledok → faktúra → úhrada.</w:t>
+            </w:r>
+          </w:p>
+        </w:tc>
+      </w:tr>
+      <w:tr>
+        <w:trPr>
+          <w:tblHeader w:val="false"/>
+        </w:trPr>
+        <w:tc>
+          <w:tcPr>
+            <w:tcW w:type="pct" w:w="50%"/>
+            <w:shd w:fill="FFFFFF"/>
+            <w:tcMar>
+              <w:top w:type="dxa" w:w="85"/>
+              <w:left w:type="dxa" w:w="100"/>
+              <w:bottom w:type="dxa" w:w="85"/>
+              <w:right w:type="dxa" w:w="100"/>
+            </w:tcMar>
+          </w:tcPr>
+          <w:p>
+            <w:pPr>
+              <w:pStyle w:val="TableText"/>
+              <w:spacing w:after="60"/>
+            </w:pPr>
+            <w:r>
+              <w:rPr>
+                <w:rFonts w:ascii="Calibri" w:cs="Calibri" w:eastAsia="Calibri" w:hAnsi="Calibri"/>
+                <w:b w:val="false"/>
+                <w:bCs w:val="false"/>
+              </w:rPr>
+              <w:t xml:space="preserve">Obnova</w:t>
+            </w:r>
+          </w:p>
+        </w:tc>
+        <w:tc>
+          <w:tcPr>
+            <w:tcW w:type="pct" w:w="50%"/>
+            <w:shd w:fill="FFFFFF"/>
+            <w:tcMar>
+              <w:top w:type="dxa" w:w="85"/>
+              <w:left w:type="dxa" w:w="100"/>
+              <w:bottom w:type="dxa" w:w="85"/>
+              <w:right w:type="dxa" w:w="100"/>
+            </w:tcMar>
+          </w:tcPr>
+          <w:p>
+            <w:pPr>
+              <w:pStyle w:val="TableText"/>
+              <w:spacing w:after="60"/>
+            </w:pPr>
+            <w:r>
+              <w:rPr>
+                <w:rFonts w:ascii="Calibri" w:cs="Calibri" w:eastAsia="Calibri" w:hAnsi="Calibri"/>
+                <w:b w:val="false"/>
+                <w:bCs w:val="false"/>
+              </w:rPr>
+              <w:t xml:space="preserve">Nacvičený návrat, určený rozhodovateľ, maximálna prípustná strata dát a čas obnovy.</w:t>
+            </w:r>
+          </w:p>
+        </w:tc>
+      </w:tr>
+    </w:tbl>
+    <w:p>
+      <w:pPr>
+        <w:spacing w:after="90"/>
+      </w:pPr>
+    </w:p>
+    <w:p>
+      <w:pPr>
+        <w:spacing w:after="110" w:line="265"/>
+      </w:pPr>
+      <w:r>
+        <w:rPr>
+          <w:rFonts w:ascii="Calibri" w:cs="Calibri" w:eastAsia="Calibri" w:hAnsi="Calibri"/>
+          <w:b w:val="false"/>
+          <w:bCs w:val="false"/>
+        </w:rPr>
+        <w:t xml:space="preserve">Pred prepnutím možno chybný import v izolovanom cieli zahodiť a obnoviť zálohu. V živej zmiešanej databáze sa nesmie použiť plošné čistenie ani mazanie iba podľa data_source; mohli pribudnúť ručné úpravy a nové väzby. Ani čiastočný cleanup nie je automaticky bezpečný. Po prepnutí treba najprv zastaviť zápisy, zachovať všetky nové INDEXUS zmeny a schváliť ich spätné prenesenie alebo dočasný read-only režim. Samotné obnovenie starej zálohy bez zachovania týchto zmien by spôsobilo stratu dát.</w:t>
+      </w:r>
+    </w:p>
+    <w:p>
+      <w:pPr>
+        <w:pStyle w:val="Heading1"/>
+        <w:keepNext/>
+        <w:spacing w:after="130" w:before="260"/>
+      </w:pPr>
+      <w:r>
+        <w:t xml:space="preserve">12. Implementácie a testovacie rutiny — dôkazová mapa</w:t>
+      </w:r>
+    </w:p>
+    <w:p>
+      <w:pPr>
+        <w:pStyle w:val="Heading2"/>
+        <w:keepNext/>
+        <w:spacing w:after="130" w:before="260"/>
+      </w:pPr>
+      <w:r>
+        <w:t xml:space="preserve">12.1 Už vykonané cielené overenia</w:t>
+      </w:r>
+    </w:p>
+    <w:p>
+      <w:pPr>
+        <w:spacing w:after="110" w:line="265"/>
+      </w:pPr>
+      <w:r>
+        <w:rPr>
+          <w:rFonts w:ascii="Calibri" w:cs="Calibri" w:eastAsia="Calibri" w:hAnsi="Calibri"/>
+          <w:b w:val="false"/>
+          <w:bCs w:val="false"/>
+        </w:rPr>
+        <w:t xml:space="preserve">Nasledujúce výsledky pochádzajú z predchádzajúcich vývojových overení zaznamenaných pri realizácii zmien. Pri tejto dokumentačnej revízii sa testy znovu nespúšťali; nejde o nový produkčný test ani o výsledok celej testovacej sady na aktuálnej verzii.</w:t>
+      </w:r>
+    </w:p>
+    <w:tbl>
+      <w:tblPr>
+        <w:tblW w:type="pct" w:w="100%"/>
+        <w:tblBorders>
+          <w:top w:val="single" w:color="auto" w:sz="4"/>
+          <w:left w:val="single" w:color="auto" w:sz="4"/>
+          <w:bottom w:val="single" w:color="auto" w:sz="4"/>
+          <w:right w:val="single" w:color="auto" w:sz="4"/>
+          <w:insideH w:val="single" w:color="auto" w:sz="4"/>
+          <w:insideV w:val="single" w:color="auto" w:sz="4"/>
+        </w:tblBorders>
+      </w:tblPr>
+      <w:tblGrid>
+        <w:gridCol w:w="100"/>
+        <w:gridCol w:w="100"/>
+        <w:gridCol w:w="100"/>
+      </w:tblGrid>
+      <w:tr>
+        <w:trPr>
+          <w:tblHeader/>
+        </w:trPr>
+        <w:tc>
+          <w:tcPr>
+            <w:tcW w:type="pct" w:w="33.333333333333336%"/>
+            <w:shd w:fill="E2E8F0"/>
+            <w:tcMar>
+              <w:top w:type="dxa" w:w="85"/>
+              <w:left w:type="dxa" w:w="100"/>
+              <w:bottom w:type="dxa" w:w="85"/>
+              <w:right w:type="dxa" w:w="100"/>
+            </w:tcMar>
+          </w:tcPr>
+          <w:p>
+            <w:pPr>
+              <w:pStyle w:val="TableText"/>
+              <w:spacing w:after="60"/>
+            </w:pPr>
+            <w:r>
+              <w:rPr>
+                <w:rFonts w:ascii="Calibri" w:cs="Calibri" w:eastAsia="Calibri" w:hAnsi="Calibri"/>
+                <w:b w:val="false"/>
+                <w:bCs w:val="false"/>
+              </w:rPr>
+              <w:t xml:space="preserve">Implementácia</w:t>
+            </w:r>
+          </w:p>
+        </w:tc>
+        <w:tc>
+          <w:tcPr>
+            <w:tcW w:type="pct" w:w="33.333333333333336%"/>
+            <w:shd w:fill="E2E8F0"/>
+            <w:tcMar>
+              <w:top w:type="dxa" w:w="85"/>
+              <w:left w:type="dxa" w:w="100"/>
+              <w:bottom w:type="dxa" w:w="85"/>
+              <w:right w:type="dxa" w:w="100"/>
+            </w:tcMar>
+          </w:tcPr>
+          <w:p>
+            <w:pPr>
+              <w:pStyle w:val="TableText"/>
+              <w:spacing w:after="60"/>
+            </w:pPr>
+            <w:r>
+              <w:rPr>
+                <w:rFonts w:ascii="Calibri" w:cs="Calibri" w:eastAsia="Calibri" w:hAnsi="Calibri"/>
+                <w:b w:val="false"/>
+                <w:bCs w:val="false"/>
+              </w:rPr>
+              <w:t xml:space="preserve">Vykonané overenie</w:t>
+            </w:r>
+          </w:p>
+        </w:tc>
+        <w:tc>
+          <w:tcPr>
+            <w:tcW w:type="pct" w:w="33.333333333333336%"/>
+            <w:shd w:fill="E2E8F0"/>
+            <w:tcMar>
+              <w:top w:type="dxa" w:w="85"/>
+              <w:left w:type="dxa" w:w="100"/>
+              <w:bottom w:type="dxa" w:w="85"/>
+              <w:right w:type="dxa" w:w="100"/>
+            </w:tcMar>
+          </w:tcPr>
+          <w:p>
+            <w:pPr>
+              <w:pStyle w:val="TableText"/>
+              <w:spacing w:after="60"/>
+            </w:pPr>
+            <w:r>
+              <w:rPr>
+                <w:rFonts w:ascii="Calibri" w:cs="Calibri" w:eastAsia="Calibri" w:hAnsi="Calibri"/>
+                <w:b w:val="false"/>
+                <w:bCs w:val="false"/>
+              </w:rPr>
+              <w:t xml:space="preserve">Čo výsledok preukazuje</w:t>
+            </w:r>
+          </w:p>
+        </w:tc>
+      </w:tr>
+      <w:tr>
+        <w:trPr>
+          <w:tblHeader w:val="false"/>
+        </w:trPr>
+        <w:tc>
+          <w:tcPr>
+            <w:tcW w:type="pct" w:w="33.333333333333336%"/>
+            <w:shd w:fill="FFFFFF"/>
+            <w:tcMar>
+              <w:top w:type="dxa" w:w="85"/>
+              <w:left w:type="dxa" w:w="100"/>
+              <w:bottom w:type="dxa" w:w="85"/>
+              <w:right w:type="dxa" w:w="100"/>
+            </w:tcMar>
+          </w:tcPr>
+          <w:p>
+            <w:pPr>
+              <w:pStyle w:val="TableText"/>
+              <w:spacing w:after="60"/>
+            </w:pPr>
+            <w:r>
+              <w:rPr>
+                <w:rFonts w:ascii="Calibri" w:cs="Calibri" w:eastAsia="Calibri" w:hAnsi="Calibri"/>
+                <w:b w:val="false"/>
+                <w:bCs w:val="false"/>
+              </w:rPr>
+              <w:t xml:space="preserve">Pulse — opakovaná povinná kontrola po zmene prostredia</w:t>
+            </w:r>
+          </w:p>
+        </w:tc>
+        <w:tc>
+          <w:tcPr>
+            <w:tcW w:type="pct" w:w="33.333333333333336%"/>
+            <w:shd w:fill="FFFFFF"/>
+            <w:tcMar>
+              <w:top w:type="dxa" w:w="85"/>
+              <w:left w:type="dxa" w:w="100"/>
+              <w:bottom w:type="dxa" w:w="85"/>
+              <w:right w:type="dxa" w:w="100"/>
+            </w:tcMar>
+          </w:tcPr>
+          <w:p>
+            <w:pPr>
+              <w:pStyle w:val="TableText"/>
+              <w:spacing w:after="60"/>
+            </w:pPr>
+            <w:r>
+              <w:rPr>
+                <w:rFonts w:ascii="Calibri" w:cs="Calibri" w:eastAsia="Calibri" w:hAnsi="Calibri"/>
+                <w:b w:val="false"/>
+                <w:bCs w:val="false"/>
+              </w:rPr>
+              <w:t xml:space="preserve">3 browser scenáre a 25 Vitest testov prešli pri oprave; e2e/pulse-gate-invalidation.spec.ts a súvisiace pulse-gate fixtures/rutiny.</w:t>
+            </w:r>
+          </w:p>
+        </w:tc>
+        <w:tc>
+          <w:tcPr>
+            <w:tcW w:type="pct" w:w="33.333333333333336%"/>
+            <w:shd w:fill="FFFFFF"/>
+            <w:tcMar>
+              <w:top w:type="dxa" w:w="85"/>
+              <w:left w:type="dxa" w:w="100"/>
+              <w:bottom w:type="dxa" w:w="85"/>
+              <w:right w:type="dxa" w:w="100"/>
+            </w:tcMar>
+          </w:tcPr>
+          <w:p>
+            <w:pPr>
+              <w:pStyle w:val="TableText"/>
+              <w:spacing w:after="60"/>
+            </w:pPr>
+            <w:r>
+              <w:rPr>
+                <w:rFonts w:ascii="Calibri" w:cs="Calibri" w:eastAsia="Calibri" w:hAnsi="Calibri"/>
+                <w:b w:val="false"/>
+                <w:bCs w:val="false"/>
+              </w:rPr>
+              <w:t xml:space="preserve">Kontrola sa obnoví po zmene prostredia; súbežné invalidácie nespúšťajú cyklické reštarty a staré async dokončenie neuvoľní novú kontrolu.</w:t>
+            </w:r>
+          </w:p>
+        </w:tc>
+      </w:tr>
+      <w:tr>
+        <w:trPr>
+          <w:tblHeader w:val="false"/>
+        </w:trPr>
+        <w:tc>
+          <w:tcPr>
+            <w:tcW w:type="pct" w:w="33.333333333333336%"/>
+            <w:shd w:fill="FFFFFF"/>
+            <w:tcMar>
+              <w:top w:type="dxa" w:w="85"/>
+              <w:left w:type="dxa" w:w="100"/>
+              <w:bottom w:type="dxa" w:w="85"/>
+              <w:right w:type="dxa" w:w="100"/>
+            </w:tcMar>
+          </w:tcPr>
+          <w:p>
+            <w:pPr>
+              <w:pStyle w:val="TableText"/>
+              <w:spacing w:after="60"/>
+            </w:pPr>
+            <w:r>
+              <w:rPr>
+                <w:rFonts w:ascii="Calibri" w:cs="Calibri" w:eastAsia="Calibri" w:hAnsi="Calibri"/>
+                <w:b w:val="false"/>
+                <w:bCs w:val="false"/>
+              </w:rPr>
+              <w:t xml:space="preserve">Pulse — viditeľnosť latencie</w:t>
+            </w:r>
+          </w:p>
+        </w:tc>
+        <w:tc>
+          <w:tcPr>
+            <w:tcW w:type="pct" w:w="33.333333333333336%"/>
+            <w:shd w:fill="FFFFFF"/>
+            <w:tcMar>
+              <w:top w:type="dxa" w:w="85"/>
+              <w:left w:type="dxa" w:w="100"/>
+              <w:bottom w:type="dxa" w:w="85"/>
+              <w:right w:type="dxa" w:w="100"/>
+            </w:tcMar>
+          </w:tcPr>
+          <w:p>
+            <w:pPr>
+              <w:pStyle w:val="TableText"/>
+              <w:spacing w:after="60"/>
+            </w:pPr>
+            <w:r>
+              <w:rPr>
+                <w:rFonts w:ascii="Calibri" w:cs="Calibri" w:eastAsia="Calibri" w:hAnsi="Calibri"/>
+                <w:b w:val="false"/>
+                <w:bCs w:val="false"/>
+              </w:rPr>
+              <w:t xml:space="preserve">latency-result-visibility.node.test.ts prešiel po cielenej oprave.</w:t>
+            </w:r>
+          </w:p>
+        </w:tc>
+        <w:tc>
+          <w:tcPr>
+            <w:tcW w:type="pct" w:w="33.333333333333336%"/>
+            <w:shd w:fill="FFFFFF"/>
+            <w:tcMar>
+              <w:top w:type="dxa" w:w="85"/>
+              <w:left w:type="dxa" w:w="100"/>
+              <w:bottom w:type="dxa" w:w="85"/>
+              <w:right w:type="dxa" w:w="100"/>
+            </w:tcMar>
+          </w:tcPr>
+          <w:p>
+            <w:pPr>
+              <w:pStyle w:val="TableText"/>
+              <w:spacing w:after="60"/>
+            </w:pPr>
+            <w:r>
+              <w:rPr>
+                <w:rFonts w:ascii="Calibri" w:cs="Calibri" w:eastAsia="Calibri" w:hAnsi="Calibri"/>
+                <w:b w:val="false"/>
+                <w:bCs w:val="false"/>
+              </w:rPr>
+              <w:t xml:space="preserve">Latencia/jitter už nie sú nesprávne vylúčené z hlavného zobrazenia diagnostiky.</w:t>
+            </w:r>
+          </w:p>
+        </w:tc>
+      </w:tr>
+      <w:tr>
+        <w:trPr>
+          <w:tblHeader w:val="false"/>
+        </w:trPr>
+        <w:tc>
+          <w:tcPr>
+            <w:tcW w:type="pct" w:w="33.333333333333336%"/>
+            <w:shd w:fill="FFFFFF"/>
+            <w:tcMar>
+              <w:top w:type="dxa" w:w="85"/>
+              <w:left w:type="dxa" w:w="100"/>
+              <w:bottom w:type="dxa" w:w="85"/>
+              <w:right w:type="dxa" w:w="100"/>
+            </w:tcMar>
+          </w:tcPr>
+          <w:p>
+            <w:pPr>
+              <w:pStyle w:val="TableText"/>
+              <w:spacing w:after="60"/>
+            </w:pPr>
+            <w:r>
+              <w:rPr>
+                <w:rFonts w:ascii="Calibri" w:cs="Calibri" w:eastAsia="Calibri" w:hAnsi="Calibri"/>
+                <w:b w:val="false"/>
+                <w:bCs w:val="false"/>
+              </w:rPr>
+              <w:t xml:space="preserve">Priority Builder</w:t>
+            </w:r>
+          </w:p>
+        </w:tc>
+        <w:tc>
+          <w:tcPr>
+            <w:tcW w:type="pct" w:w="33.333333333333336%"/>
+            <w:shd w:fill="FFFFFF"/>
+            <w:tcMar>
+              <w:top w:type="dxa" w:w="85"/>
+              <w:left w:type="dxa" w:w="100"/>
+              <w:bottom w:type="dxa" w:w="85"/>
+              <w:right w:type="dxa" w:w="100"/>
+            </w:tcMar>
+          </w:tcPr>
+          <w:p>
+            <w:pPr>
+              <w:pStyle w:val="TableText"/>
+              <w:spacing w:after="60"/>
+            </w:pPr>
+            <w:r>
+              <w:rPr>
+                <w:rFonts w:ascii="Calibri" w:cs="Calibri" w:eastAsia="Calibri" w:hAnsi="Calibri"/>
+                <w:b w:val="false"/>
+                <w:bCs w:val="false"/>
+              </w:rPr>
+              <w:t xml:space="preserve">3 cielené browser scenáre v e2e/priority-builder.spec.ts prešli pri oprave.</w:t>
+            </w:r>
+          </w:p>
+        </w:tc>
+        <w:tc>
+          <w:tcPr>
+            <w:tcW w:type="pct" w:w="33.333333333333336%"/>
+            <w:shd w:fill="FFFFFF"/>
+            <w:tcMar>
+              <w:top w:type="dxa" w:w="85"/>
+              <w:left w:type="dxa" w:w="100"/>
+              <w:bottom w:type="dxa" w:w="85"/>
+              <w:right w:type="dxa" w:w="100"/>
+            </w:tcMar>
+          </w:tcPr>
+          <w:p>
+            <w:pPr>
+              <w:pStyle w:val="TableText"/>
+              <w:spacing w:after="60"/>
+            </w:pPr>
+            <w:r>
+              <w:rPr>
+                <w:rFonts w:ascii="Calibri" w:cs="Calibri" w:eastAsia="Calibri" w:hAnsi="Calibri"/>
+                <w:b w:val="false"/>
+                <w:bCs w:val="false"/>
+              </w:rPr>
+              <w:t xml:space="preserve">Uloženie referral_cities, explicitná reaktivácia a zachovanie požiadavky pri prepnutí pohľadu.</w:t>
+            </w:r>
+          </w:p>
+        </w:tc>
+      </w:tr>
+    </w:tbl>
+    <w:p>
+      <w:pPr>
+        <w:spacing w:after="90"/>
+      </w:pPr>
+    </w:p>
+    <w:p>
+      <w:pPr>
+        <w:spacing w:after="110" w:line="265"/>
+      </w:pPr>
+      <w:r>
+        <w:rPr>
+          <w:rFonts w:ascii="Calibri" w:cs="Calibri" w:eastAsia="Calibri" w:hAnsi="Calibri"/>
+          <w:b w:val="false"/>
+          <w:bCs w:val="false"/>
+        </w:rPr>
+        <w:t xml:space="preserve">Existujú aj manuálne formuláre komplexného testovania Pulse zo septembra 2026. Obsahujú úspešné, podmienené, neúspešné aj nevykonané scenáre. Preto sa nepoužívajú ako tvrdenie, že úplne všetky funkcie a prostredia prešli. Nálezy zo staršieho testu treba spárovať s následnou opravou a regresným scenárom; staré zlyhanie nie je automaticky dnešný stav a samotná oprava nie je univerzálnou akceptáciou.</w:t>
+      </w:r>
+    </w:p>
+    <w:p>
+      <w:pPr>
+        <w:pStyle w:val="Heading2"/>
+        <w:keepNext/>
+        <w:spacing w:after="130" w:before="260"/>
+      </w:pPr>
+      <w:r>
+        <w:t xml:space="preserve">12.2 Dostupné automatizované rutiny a rozsah</w:t>
+      </w:r>
+    </w:p>
+    <w:p>
+      <w:pPr>
+        <w:spacing w:after="110" w:line="265"/>
+      </w:pPr>
+      <w:r>
+        <w:rPr>
+          <w:rFonts w:ascii="Calibri" w:cs="Calibri" w:eastAsia="Calibri" w:hAnsi="Calibri"/>
+          <w:b w:val="false"/>
+          <w:bCs w:val="false"/>
+        </w:rPr>
+        <w:t xml:space="preserve">Táto tabuľka je katalóg existujúcich testov, nie dodatočne vytvorený zoznam úspešných behov. Kde nie je vyššie uvedený vykonaný výsledok, dokument potvrdzuje dostupnosť rutiny, nie jej dnešný PASS.</w:t>
+      </w:r>
+    </w:p>
+    <w:tbl>
+      <w:tblPr>
+        <w:tblW w:type="pct" w:w="100%"/>
+        <w:tblBorders>
+          <w:top w:val="single" w:color="auto" w:sz="4"/>
+          <w:left w:val="single" w:color="auto" w:sz="4"/>
+          <w:bottom w:val="single" w:color="auto" w:sz="4"/>
+          <w:right w:val="single" w:color="auto" w:sz="4"/>
+          <w:insideH w:val="single" w:color="auto" w:sz="4"/>
+          <w:insideV w:val="single" w:color="auto" w:sz="4"/>
+        </w:tblBorders>
+      </w:tblPr>
+      <w:tblGrid>
+        <w:gridCol w:w="100"/>
+        <w:gridCol w:w="100"/>
+        <w:gridCol w:w="100"/>
+      </w:tblGrid>
+      <w:tr>
+        <w:trPr>
+          <w:tblHeader/>
+        </w:trPr>
+        <w:tc>
+          <w:tcPr>
+            <w:tcW w:type="pct" w:w="33.333333333333336%"/>
+            <w:shd w:fill="E2E8F0"/>
+            <w:tcMar>
+              <w:top w:type="dxa" w:w="85"/>
+              <w:left w:type="dxa" w:w="100"/>
+              <w:bottom w:type="dxa" w:w="85"/>
+              <w:right w:type="dxa" w:w="100"/>
+            </w:tcMar>
+          </w:tcPr>
+          <w:p>
+            <w:pPr>
+              <w:pStyle w:val="TableText"/>
+              <w:spacing w:after="60"/>
+            </w:pPr>
+            <w:r>
+              <w:rPr>
+                <w:rFonts w:ascii="Calibri" w:cs="Calibri" w:eastAsia="Calibri" w:hAnsi="Calibri"/>
+                <w:b w:val="false"/>
+                <w:bCs w:val="false"/>
+              </w:rPr>
+              <w:t xml:space="preserve">Oblasť</w:t>
+            </w:r>
+          </w:p>
+        </w:tc>
+        <w:tc>
+          <w:tcPr>
+            <w:tcW w:type="pct" w:w="33.333333333333336%"/>
+            <w:shd w:fill="E2E8F0"/>
+            <w:tcMar>
+              <w:top w:type="dxa" w:w="85"/>
+              <w:left w:type="dxa" w:w="100"/>
+              <w:bottom w:type="dxa" w:w="85"/>
+              <w:right w:type="dxa" w:w="100"/>
+            </w:tcMar>
+          </w:tcPr>
+          <w:p>
+            <w:pPr>
+              <w:pStyle w:val="TableText"/>
+              <w:spacing w:after="60"/>
+            </w:pPr>
+            <w:r>
+              <w:rPr>
+                <w:rFonts w:ascii="Calibri" w:cs="Calibri" w:eastAsia="Calibri" w:hAnsi="Calibri"/>
+                <w:b w:val="false"/>
+                <w:bCs w:val="false"/>
+              </w:rPr>
+              <w:t xml:space="preserve">Konkrétne rutiny</w:t>
+            </w:r>
+          </w:p>
+        </w:tc>
+        <w:tc>
+          <w:tcPr>
+            <w:tcW w:type="pct" w:w="33.333333333333336%"/>
+            <w:shd w:fill="E2E8F0"/>
+            <w:tcMar>
+              <w:top w:type="dxa" w:w="85"/>
+              <w:left w:type="dxa" w:w="100"/>
+              <w:bottom w:type="dxa" w:w="85"/>
+              <w:right w:type="dxa" w:w="100"/>
+            </w:tcMar>
+          </w:tcPr>
+          <w:p>
+            <w:pPr>
+              <w:pStyle w:val="TableText"/>
+              <w:spacing w:after="60"/>
+            </w:pPr>
+            <w:r>
+              <w:rPr>
+                <w:rFonts w:ascii="Calibri" w:cs="Calibri" w:eastAsia="Calibri" w:hAnsi="Calibri"/>
+                <w:b w:val="false"/>
+                <w:bCs w:val="false"/>
+              </w:rPr>
+              <w:t xml:space="preserve">Rozsah a hranica</w:t>
+            </w:r>
+          </w:p>
+        </w:tc>
+      </w:tr>
+      <w:tr>
+        <w:trPr>
+          <w:tblHeader w:val="false"/>
+        </w:trPr>
+        <w:tc>
+          <w:tcPr>
+            <w:tcW w:type="pct" w:w="33.333333333333336%"/>
+            <w:shd w:fill="FFFFFF"/>
+            <w:tcMar>
+              <w:top w:type="dxa" w:w="85"/>
+              <w:left w:type="dxa" w:w="100"/>
+              <w:bottom w:type="dxa" w:w="85"/>
+              <w:right w:type="dxa" w:w="100"/>
+            </w:tcMar>
+          </w:tcPr>
+          <w:p>
+            <w:pPr>
+              <w:pStyle w:val="TableText"/>
+              <w:spacing w:after="60"/>
+            </w:pPr>
+            <w:r>
+              <w:rPr>
+                <w:rFonts w:ascii="Calibri" w:cs="Calibri" w:eastAsia="Calibri" w:hAnsi="Calibri"/>
+                <w:b w:val="false"/>
+                <w:bCs w:val="false"/>
+              </w:rPr>
+              <w:t xml:space="preserve">Readiness a volanie</w:t>
+            </w:r>
+          </w:p>
+        </w:tc>
+        <w:tc>
+          <w:tcPr>
+            <w:tcW w:type="pct" w:w="33.333333333333336%"/>
+            <w:shd w:fill="FFFFFF"/>
+            <w:tcMar>
+              <w:top w:type="dxa" w:w="85"/>
+              <w:left w:type="dxa" w:w="100"/>
+              <w:bottom w:type="dxa" w:w="85"/>
+              <w:right w:type="dxa" w:w="100"/>
+            </w:tcMar>
+          </w:tcPr>
+          <w:p>
+            <w:pPr>
+              <w:pStyle w:val="TableText"/>
+              <w:spacing w:after="60"/>
+            </w:pPr>
+            <w:r>
+              <w:rPr>
+                <w:rFonts w:ascii="Calibri" w:cs="Calibri" w:eastAsia="Calibri" w:hAnsi="Calibri"/>
+                <w:b w:val="false"/>
+                <w:bCs w:val="false"/>
+              </w:rPr>
+              <w:t xml:space="preserve">e2e/pulse-readiness.spec.ts; e2e/pulse-dial.spec.ts; client/src/features/nexus-pulse-preflight/diagnostics.test.ts, presentation-state.test.ts, recording-playback.test.ts.</w:t>
+            </w:r>
+          </w:p>
+        </w:tc>
+        <w:tc>
+          <w:tcPr>
+            <w:tcW w:type="pct" w:w="33.333333333333336%"/>
+            <w:shd w:fill="FFFFFF"/>
+            <w:tcMar>
+              <w:top w:type="dxa" w:w="85"/>
+              <w:left w:type="dxa" w:w="100"/>
+              <w:bottom w:type="dxa" w:w="85"/>
+              <w:right w:type="dxa" w:w="100"/>
+            </w:tcMar>
+          </w:tcPr>
+          <w:p>
+            <w:pPr>
+              <w:pStyle w:val="TableText"/>
+              <w:spacing w:after="60"/>
+            </w:pPr>
+            <w:r>
+              <w:rPr>
+                <w:rFonts w:ascii="Calibri" w:cs="Calibri" w:eastAsia="Calibri" w:hAnsi="Calibri"/>
+                <w:b w:val="false"/>
+                <w:bCs w:val="false"/>
+              </w:rPr>
+              <w:t xml:space="preserve">Prístup do pracoviska, diagnostika a spracovanie dial požiadaviek; browser fixture nie je živý operátorský hovor.</w:t>
+            </w:r>
+          </w:p>
+        </w:tc>
+      </w:tr>
+      <w:tr>
+        <w:trPr>
+          <w:tblHeader w:val="false"/>
+        </w:trPr>
+        <w:tc>
+          <w:tcPr>
+            <w:tcW w:type="pct" w:w="33.333333333333336%"/>
+            <w:shd w:fill="FFFFFF"/>
+            <w:tcMar>
+              <w:top w:type="dxa" w:w="85"/>
+              <w:left w:type="dxa" w:w="100"/>
+              <w:bottom w:type="dxa" w:w="85"/>
+              <w:right w:type="dxa" w:w="100"/>
+            </w:tcMar>
+          </w:tcPr>
+          <w:p>
+            <w:pPr>
+              <w:pStyle w:val="TableText"/>
+              <w:spacing w:after="60"/>
+            </w:pPr>
+            <w:r>
+              <w:rPr>
+                <w:rFonts w:ascii="Calibri" w:cs="Calibri" w:eastAsia="Calibri" w:hAnsi="Calibri"/>
+                <w:b w:val="false"/>
+                <w:bCs w:val="false"/>
+              </w:rPr>
+              <w:t xml:space="preserve">Mission FAQ a nahrávanie</w:t>
+            </w:r>
+          </w:p>
+        </w:tc>
+        <w:tc>
+          <w:tcPr>
+            <w:tcW w:type="pct" w:w="33.333333333333336%"/>
+            <w:shd w:fill="FFFFFF"/>
+            <w:tcMar>
+              <w:top w:type="dxa" w:w="85"/>
+              <w:left w:type="dxa" w:w="100"/>
+              <w:bottom w:type="dxa" w:w="85"/>
+              <w:right w:type="dxa" w:w="100"/>
+            </w:tcMar>
+          </w:tcPr>
+          <w:p>
+            <w:pPr>
+              <w:pStyle w:val="TableText"/>
+              <w:spacing w:after="60"/>
+            </w:pPr>
+            <w:r>
+              <w:rPr>
+                <w:rFonts w:ascii="Calibri" w:cs="Calibri" w:eastAsia="Calibri" w:hAnsi="Calibri"/>
+                <w:b w:val="false"/>
+                <w:bCs w:val="false"/>
+              </w:rPr>
+              <w:t xml:space="preserve">shared/mission-faq.test.ts; client/src/lib/mission-faq.test.ts; shared/mission-recording.test.ts; client/src/lib/mission-recording.test.ts.</w:t>
+            </w:r>
+          </w:p>
+        </w:tc>
+        <w:tc>
+          <w:tcPr>
+            <w:tcW w:type="pct" w:w="33.333333333333336%"/>
+            <w:shd w:fill="FFFFFF"/>
+            <w:tcMar>
+              <w:top w:type="dxa" w:w="85"/>
+              <w:left w:type="dxa" w:w="100"/>
+              <w:bottom w:type="dxa" w:w="85"/>
+              <w:right w:type="dxa" w:w="100"/>
+            </w:tcMar>
+          </w:tcPr>
+          <w:p>
+            <w:pPr>
+              <w:pStyle w:val="TableText"/>
+              <w:spacing w:after="60"/>
+            </w:pPr>
+            <w:r>
+              <w:rPr>
+                <w:rFonts w:ascii="Calibri" w:cs="Calibri" w:eastAsia="Calibri" w:hAnsi="Calibri"/>
+                <w:b w:val="false"/>
+                <w:bCs w:val="false"/>
+              </w:rPr>
+              <w:t xml:space="preserve">Pravidlá Mission, FAQ a nahrávania; samostatne treba prevádzkové overenie uloženia a prehratia konkrétneho hovoru.</w:t>
+            </w:r>
+          </w:p>
+        </w:tc>
+      </w:tr>
+      <w:tr>
+        <w:trPr>
+          <w:tblHeader w:val="false"/>
+        </w:trPr>
+        <w:tc>
+          <w:tcPr>
+            <w:tcW w:type="pct" w:w="33.333333333333336%"/>
+            <w:shd w:fill="FFFFFF"/>
+            <w:tcMar>
+              <w:top w:type="dxa" w:w="85"/>
+              <w:left w:type="dxa" w:w="100"/>
+              <w:bottom w:type="dxa" w:w="85"/>
+              <w:right w:type="dxa" w:w="100"/>
+            </w:tcMar>
+          </w:tcPr>
+          <w:p>
+            <w:pPr>
+              <w:pStyle w:val="TableText"/>
+              <w:spacing w:after="60"/>
+            </w:pPr>
+            <w:r>
+              <w:rPr>
+                <w:rFonts w:ascii="Calibri" w:cs="Calibri" w:eastAsia="Calibri" w:hAnsi="Calibri"/>
+                <w:b w:val="false"/>
+                <w:bCs w:val="false"/>
+              </w:rPr>
+              <w:t xml:space="preserve">Hlasové trasy a SMS</w:t>
+            </w:r>
+          </w:p>
+        </w:tc>
+        <w:tc>
+          <w:tcPr>
+            <w:tcW w:type="pct" w:w="33.333333333333336%"/>
+            <w:shd w:fill="FFFFFF"/>
+            <w:tcMar>
+              <w:top w:type="dxa" w:w="85"/>
+              <w:left w:type="dxa" w:w="100"/>
+              <w:bottom w:type="dxa" w:w="85"/>
+              <w:right w:type="dxa" w:w="100"/>
+            </w:tcMar>
+          </w:tcPr>
+          <w:p>
+            <w:pPr>
+              <w:pStyle w:val="TableText"/>
+              <w:spacing w:after="60"/>
+            </w:pPr>
+            <w:r>
+              <w:rPr>
+                <w:rFonts w:ascii="Calibri" w:cs="Calibri" w:eastAsia="Calibri" w:hAnsi="Calibri"/>
+                <w:b w:val="false"/>
+                <w:bCs w:val="false"/>
+              </w:rPr>
+              <w:t xml:space="preserve">shared/telephony-routing.test.ts; server/lib/inbound-did.test.ts; server/lib/smstools.test.ts.</w:t>
+            </w:r>
+          </w:p>
+        </w:tc>
+        <w:tc>
+          <w:tcPr>
+            <w:tcW w:type="pct" w:w="33.333333333333336%"/>
+            <w:shd w:fill="FFFFFF"/>
+            <w:tcMar>
+              <w:top w:type="dxa" w:w="85"/>
+              <w:left w:type="dxa" w:w="100"/>
+              <w:bottom w:type="dxa" w:w="85"/>
+              <w:right w:type="dxa" w:w="100"/>
+            </w:tcMar>
+          </w:tcPr>
+          <w:p>
+            <w:pPr>
+              <w:pStyle w:val="TableText"/>
+              <w:spacing w:after="60"/>
+            </w:pPr>
+            <w:r>
+              <w:rPr>
+                <w:rFonts w:ascii="Calibri" w:cs="Calibri" w:eastAsia="Calibri" w:hAnsi="Calibri"/>
+                <w:b w:val="false"/>
+                <w:bCs w:val="false"/>
+              </w:rPr>
+              <w:t xml:space="preserve">Validácia a spracovanie routingu/poskytovateľa; nie potvrdenie doručenia SMS alebo akceptácie každého Caller ID operátorom.</w:t>
+            </w:r>
+          </w:p>
+        </w:tc>
+      </w:tr>
+      <w:tr>
+        <w:trPr>
+          <w:tblHeader w:val="false"/>
+        </w:trPr>
+        <w:tc>
+          <w:tcPr>
+            <w:tcW w:type="pct" w:w="33.333333333333336%"/>
+            <w:shd w:fill="FFFFFF"/>
+            <w:tcMar>
+              <w:top w:type="dxa" w:w="85"/>
+              <w:left w:type="dxa" w:w="100"/>
+              <w:bottom w:type="dxa" w:w="85"/>
+              <w:right w:type="dxa" w:w="100"/>
+            </w:tcMar>
+          </w:tcPr>
+          <w:p>
+            <w:pPr>
+              <w:pStyle w:val="TableText"/>
+              <w:spacing w:after="60"/>
+            </w:pPr>
+            <w:r>
+              <w:rPr>
+                <w:rFonts w:ascii="Calibri" w:cs="Calibri" w:eastAsia="Calibri" w:hAnsi="Calibri"/>
+                <w:b w:val="false"/>
+                <w:bCs w:val="false"/>
+              </w:rPr>
+              <w:t xml:space="preserve">Inbound karta a callbacky</w:t>
+            </w:r>
+          </w:p>
+        </w:tc>
+        <w:tc>
+          <w:tcPr>
+            <w:tcW w:type="pct" w:w="33.333333333333336%"/>
+            <w:shd w:fill="FFFFFF"/>
+            <w:tcMar>
+              <w:top w:type="dxa" w:w="85"/>
+              <w:left w:type="dxa" w:w="100"/>
+              <w:bottom w:type="dxa" w:w="85"/>
+              <w:right w:type="dxa" w:w="100"/>
+            </w:tcMar>
+          </w:tcPr>
+          <w:p>
+            <w:pPr>
+              <w:pStyle w:val="TableText"/>
+              <w:spacing w:after="60"/>
+            </w:pPr>
+            <w:r>
+              <w:rPr>
+                <w:rFonts w:ascii="Calibri" w:cs="Calibri" w:eastAsia="Calibri" w:hAnsi="Calibri"/>
+                <w:b w:val="false"/>
+                <w:bCs w:val="false"/>
+              </w:rPr>
+              <w:t xml:space="preserve">client/src/lib/inbound-call-claim.test.ts; client/src/lib/repeated-inbound-card-flow.test.ts; shared/scheduled-callback.test.ts.</w:t>
+            </w:r>
+          </w:p>
+        </w:tc>
+        <w:tc>
+          <w:tcPr>
+            <w:tcW w:type="pct" w:w="33.333333333333336%"/>
+            <w:shd w:fill="FFFFFF"/>
+            <w:tcMar>
+              <w:top w:type="dxa" w:w="85"/>
+              <w:left w:type="dxa" w:w="100"/>
+              <w:bottom w:type="dxa" w:w="85"/>
+              <w:right w:type="dxa" w:w="100"/>
+            </w:tcMar>
+          </w:tcPr>
+          <w:p>
+            <w:pPr>
+              <w:pStyle w:val="TableText"/>
+              <w:spacing w:after="60"/>
+            </w:pPr>
+            <w:r>
+              <w:rPr>
+                <w:rFonts w:ascii="Calibri" w:cs="Calibri" w:eastAsia="Calibri" w:hAnsi="Calibri"/>
+                <w:b w:val="false"/>
+                <w:bCs w:val="false"/>
+              </w:rPr>
+              <w:t xml:space="preserve">Korelácia inbound udalosti, opakovaný výber karty a callback pravidlá.</w:t>
+            </w:r>
+          </w:p>
+        </w:tc>
+      </w:tr>
+      <w:tr>
+        <w:trPr>
+          <w:tblHeader w:val="false"/>
+        </w:trPr>
+        <w:tc>
+          <w:tcPr>
+            <w:tcW w:type="pct" w:w="33.333333333333336%"/>
+            <w:shd w:fill="FFFFFF"/>
+            <w:tcMar>
+              <w:top w:type="dxa" w:w="85"/>
+              <w:left w:type="dxa" w:w="100"/>
+              <w:bottom w:type="dxa" w:w="85"/>
+              <w:right w:type="dxa" w:w="100"/>
+            </w:tcMar>
+          </w:tcPr>
+          <w:p>
+            <w:pPr>
+              <w:pStyle w:val="TableText"/>
+              <w:spacing w:after="60"/>
+            </w:pPr>
+            <w:r>
+              <w:rPr>
+                <w:rFonts w:ascii="Calibri" w:cs="Calibri" w:eastAsia="Calibri" w:hAnsi="Calibri"/>
+                <w:b w:val="false"/>
+                <w:bCs w:val="false"/>
+              </w:rPr>
+              <w:t xml:space="preserve">Priority a mestá</w:t>
+            </w:r>
+          </w:p>
+        </w:tc>
+        <w:tc>
+          <w:tcPr>
+            <w:tcW w:type="pct" w:w="33.333333333333336%"/>
+            <w:shd w:fill="FFFFFF"/>
+            <w:tcMar>
+              <w:top w:type="dxa" w:w="85"/>
+              <w:left w:type="dxa" w:w="100"/>
+              <w:bottom w:type="dxa" w:w="85"/>
+              <w:right w:type="dxa" w:w="100"/>
+            </w:tcMar>
+          </w:tcPr>
+          <w:p>
+            <w:pPr>
+              <w:pStyle w:val="TableText"/>
+              <w:spacing w:after="60"/>
+            </w:pPr>
+            <w:r>
+              <w:rPr>
+                <w:rFonts w:ascii="Calibri" w:cs="Calibri" w:eastAsia="Calibri" w:hAnsi="Calibri"/>
+                <w:b w:val="false"/>
+                <w:bCs w:val="false"/>
+              </w:rPr>
+              <w:t xml:space="preserve">server/lib/priority-city-ranking.test.ts; server/lib/collaborator-priority-city.test.ts; shared/priority-city.test.ts; e2e/priority-builder.spec.ts.</w:t>
+            </w:r>
+          </w:p>
+        </w:tc>
+        <w:tc>
+          <w:tcPr>
+            <w:tcW w:type="pct" w:w="33.333333333333336%"/>
+            <w:shd w:fill="FFFFFF"/>
+            <w:tcMar>
+              <w:top w:type="dxa" w:w="85"/>
+              <w:left w:type="dxa" w:w="100"/>
+              <w:bottom w:type="dxa" w:w="85"/>
+              <w:right w:type="dxa" w:w="100"/>
+            </w:tcMar>
+          </w:tcPr>
+          <w:p>
+            <w:pPr>
+              <w:pStyle w:val="TableText"/>
+              <w:spacing w:after="60"/>
+            </w:pPr>
+            <w:r>
+              <w:rPr>
+                <w:rFonts w:ascii="Calibri" w:cs="Calibri" w:eastAsia="Calibri" w:hAnsi="Calibri"/>
+                <w:b w:val="false"/>
+                <w:bCs w:val="false"/>
+              </w:rPr>
+              <w:t xml:space="preserve">Pravidlá osobného poradia, referral miest a správanie editora vrátane chybových stavov.</w:t>
+            </w:r>
+          </w:p>
+        </w:tc>
+      </w:tr>
+      <w:tr>
+        <w:trPr>
+          <w:tblHeader w:val="false"/>
+        </w:trPr>
+        <w:tc>
+          <w:tcPr>
+            <w:tcW w:type="pct" w:w="33.333333333333336%"/>
+            <w:shd w:fill="FFFFFF"/>
+            <w:tcMar>
+              <w:top w:type="dxa" w:w="85"/>
+              <w:left w:type="dxa" w:w="100"/>
+              <w:bottom w:type="dxa" w:w="85"/>
+              <w:right w:type="dxa" w:w="100"/>
+            </w:tcMar>
+          </w:tcPr>
+          <w:p>
+            <w:pPr>
+              <w:pStyle w:val="TableText"/>
+              <w:spacing w:after="60"/>
+            </w:pPr>
+            <w:r>
+              <w:rPr>
+                <w:rFonts w:ascii="Calibri" w:cs="Calibri" w:eastAsia="Calibri" w:hAnsi="Calibri"/>
+                <w:b w:val="false"/>
+                <w:bCs w:val="false"/>
+              </w:rPr>
+              <w:t xml:space="preserve">Klonovanie Mission</w:t>
+            </w:r>
+          </w:p>
+        </w:tc>
+        <w:tc>
+          <w:tcPr>
+            <w:tcW w:type="pct" w:w="33.333333333333336%"/>
+            <w:shd w:fill="FFFFFF"/>
+            <w:tcMar>
+              <w:top w:type="dxa" w:w="85"/>
+              <w:left w:type="dxa" w:w="100"/>
+              <w:bottom w:type="dxa" w:w="85"/>
+              <w:right w:type="dxa" w:w="100"/>
+            </w:tcMar>
+          </w:tcPr>
+          <w:p>
+            <w:pPr>
+              <w:pStyle w:val="TableText"/>
+              <w:spacing w:after="60"/>
+            </w:pPr>
+            <w:r>
+              <w:rPr>
+                <w:rFonts w:ascii="Calibri" w:cs="Calibri" w:eastAsia="Calibri" w:hAnsi="Calibri"/>
+                <w:b w:val="false"/>
+                <w:bCs w:val="false"/>
+              </w:rPr>
+              <w:t xml:space="preserve">server/lib/clone-campaign.test.ts; server/lib/clone-campaign.integration.test.ts; script/test-clone-campaign.sh.</w:t>
+            </w:r>
+          </w:p>
+        </w:tc>
+        <w:tc>
+          <w:tcPr>
+            <w:tcW w:type="pct" w:w="33.333333333333336%"/>
+            <w:shd w:fill="FFFFFF"/>
+            <w:tcMar>
+              <w:top w:type="dxa" w:w="85"/>
+              <w:left w:type="dxa" w:w="100"/>
+              <w:bottom w:type="dxa" w:w="85"/>
+              <w:right w:type="dxa" w:w="100"/>
+            </w:tcMar>
+          </w:tcPr>
+          <w:p>
+            <w:pPr>
+              <w:pStyle w:val="TableText"/>
+              <w:spacing w:after="60"/>
+            </w:pPr>
+            <w:r>
+              <w:rPr>
+                <w:rFonts w:ascii="Calibri" w:cs="Calibri" w:eastAsia="Calibri" w:hAnsi="Calibri"/>
+                <w:b w:val="false"/>
+                <w:bCs w:val="false"/>
+              </w:rPr>
+              <w:t xml:space="preserve">Jednotkové a integračné porovnanie klonu, nových identít a väzieb. Integračný beh vyžaduje kontrolované testovacie dáta.</w:t>
+            </w:r>
+          </w:p>
+        </w:tc>
+      </w:tr>
+      <w:tr>
+        <w:trPr>
+          <w:tblHeader w:val="false"/>
+        </w:trPr>
+        <w:tc>
+          <w:tcPr>
+            <w:tcW w:type="pct" w:w="33.333333333333336%"/>
+            <w:shd w:fill="FFFFFF"/>
+            <w:tcMar>
+              <w:top w:type="dxa" w:w="85"/>
+              <w:left w:type="dxa" w:w="100"/>
+              <w:bottom w:type="dxa" w:w="85"/>
+              <w:right w:type="dxa" w:w="100"/>
+            </w:tcMar>
+          </w:tcPr>
+          <w:p>
+            <w:pPr>
+              <w:pStyle w:val="TableText"/>
+              <w:spacing w:after="60"/>
+            </w:pPr>
+            <w:r>
+              <w:rPr>
+                <w:rFonts w:ascii="Calibri" w:cs="Calibri" w:eastAsia="Calibri" w:hAnsi="Calibri"/>
+                <w:b w:val="false"/>
+                <w:bCs w:val="false"/>
+              </w:rPr>
+              <w:t xml:space="preserve">Back Office a partneri</w:t>
+            </w:r>
+          </w:p>
+        </w:tc>
+        <w:tc>
+          <w:tcPr>
+            <w:tcW w:type="pct" w:w="33.333333333333336%"/>
+            <w:shd w:fill="FFFFFF"/>
+            <w:tcMar>
+              <w:top w:type="dxa" w:w="85"/>
+              <w:left w:type="dxa" w:w="100"/>
+              <w:bottom w:type="dxa" w:w="85"/>
+              <w:right w:type="dxa" w:w="100"/>
+            </w:tcMar>
+          </w:tcPr>
+          <w:p>
+            <w:pPr>
+              <w:pStyle w:val="TableText"/>
+              <w:spacing w:after="60"/>
+            </w:pPr>
+            <w:r>
+              <w:rPr>
+                <w:rFonts w:ascii="Calibri" w:cs="Calibri" w:eastAsia="Calibri" w:hAnsi="Calibri"/>
+                <w:b w:val="false"/>
+                <w:bCs w:val="false"/>
+              </w:rPr>
+              <w:t xml:space="preserve">client/src/lib/back-office-alert.test.ts; shared/medical-partner-filter.test.ts.</w:t>
+            </w:r>
+          </w:p>
+        </w:tc>
+        <w:tc>
+          <w:tcPr>
+            <w:tcW w:type="pct" w:w="33.333333333333336%"/>
+            <w:shd w:fill="FFFFFF"/>
+            <w:tcMar>
+              <w:top w:type="dxa" w:w="85"/>
+              <w:left w:type="dxa" w:w="100"/>
+              <w:bottom w:type="dxa" w:w="85"/>
+              <w:right w:type="dxa" w:w="100"/>
+            </w:tcMar>
+          </w:tcPr>
+          <w:p>
+            <w:pPr>
+              <w:pStyle w:val="TableText"/>
+              <w:spacing w:after="60"/>
+            </w:pPr>
+            <w:r>
+              <w:rPr>
+                <w:rFonts w:ascii="Calibri" w:cs="Calibri" w:eastAsia="Calibri" w:hAnsi="Calibri"/>
+                <w:b w:val="false"/>
+                <w:bCs w:val="false"/>
+              </w:rPr>
+              <w:t xml:space="preserve">Spracovanie upozornení a zhodná logika filtrov; nenahrádza úplnú akceptáciu všetkých rolí a úkonov BO.</w:t>
+            </w:r>
+          </w:p>
+        </w:tc>
+      </w:tr>
+      <w:tr>
+        <w:trPr>
+          <w:tblHeader w:val="false"/>
+        </w:trPr>
+        <w:tc>
+          <w:tcPr>
+            <w:tcW w:type="pct" w:w="33.333333333333336%"/>
+            <w:shd w:fill="FFFFFF"/>
+            <w:tcMar>
+              <w:top w:type="dxa" w:w="85"/>
+              <w:left w:type="dxa" w:w="100"/>
+              <w:bottom w:type="dxa" w:w="85"/>
+              <w:right w:type="dxa" w:w="100"/>
+            </w:tcMar>
+          </w:tcPr>
+          <w:p>
+            <w:pPr>
+              <w:pStyle w:val="TableText"/>
+              <w:spacing w:after="60"/>
+            </w:pPr>
+            <w:r>
+              <w:rPr>
+                <w:rFonts w:ascii="Calibri" w:cs="Calibri" w:eastAsia="Calibri" w:hAnsi="Calibri"/>
+                <w:b w:val="false"/>
+                <w:bCs w:val="false"/>
+              </w:rPr>
+              <w:t xml:space="preserve">Migrácia</w:t>
+            </w:r>
+          </w:p>
+        </w:tc>
+        <w:tc>
+          <w:tcPr>
+            <w:tcW w:type="pct" w:w="33.333333333333336%"/>
+            <w:shd w:fill="FFFFFF"/>
+            <w:tcMar>
+              <w:top w:type="dxa" w:w="85"/>
+              <w:left w:type="dxa" w:w="100"/>
+              <w:bottom w:type="dxa" w:w="85"/>
+              <w:right w:type="dxa" w:w="100"/>
+            </w:tcMar>
+          </w:tcPr>
+          <w:p>
+            <w:pPr>
+              <w:pStyle w:val="TableText"/>
+              <w:spacing w:after="60"/>
+            </w:pPr>
+            <w:r>
+              <w:rPr>
+                <w:rFonts w:ascii="Calibri" w:cs="Calibri" w:eastAsia="Calibri" w:hAnsi="Calibri"/>
+                <w:b w:val="false"/>
+                <w:bCs w:val="false"/>
+              </w:rPr>
+              <w:t xml:space="preserve">script/migration/test-mssql-connection.cjs; test-migration-20.cjs; verify-migration.cjs.</w:t>
+            </w:r>
+          </w:p>
+        </w:tc>
+        <w:tc>
+          <w:tcPr>
+            <w:tcW w:type="pct" w:w="33.333333333333336%"/>
+            <w:shd w:fill="FFFFFF"/>
+            <w:tcMar>
+              <w:top w:type="dxa" w:w="85"/>
+              <w:left w:type="dxa" w:w="100"/>
+              <w:bottom w:type="dxa" w:w="85"/>
+              <w:right w:type="dxa" w:w="100"/>
+            </w:tcMar>
+          </w:tcPr>
+          <w:p>
+            <w:pPr>
+              <w:pStyle w:val="TableText"/>
+              <w:spacing w:after="60"/>
+            </w:pPr>
+            <w:r>
+              <w:rPr>
+                <w:rFonts w:ascii="Calibri" w:cs="Calibri" w:eastAsia="Calibri" w:hAnsi="Calibri"/>
+                <w:b w:val="false"/>
+                <w:bCs w:val="false"/>
+              </w:rPr>
+              <w:t xml:space="preserve">Spojenie, vykonateľný import a čiastkové porovnanie. Importná rutina zapisuje dáta; názov test nie je záruka bezpečného dry-run.</w:t>
+            </w:r>
+          </w:p>
+        </w:tc>
+      </w:tr>
+    </w:tbl>
+    <w:p>
+      <w:pPr>
+        <w:spacing w:after="90"/>
+      </w:pPr>
+    </w:p>
+    <w:p>
+      <w:pPr>
+        <w:pStyle w:val="Heading2"/>
+        <w:keepNext/>
+        <w:spacing w:after="130" w:before="260"/>
+      </w:pPr>
+      <w:r>
+        <w:t xml:space="preserve">12.3 Čo ešte musí pokryť finálna akceptácia</w:t>
+      </w:r>
+    </w:p>
+    <w:p>
+      <w:pPr>
+        <w:spacing w:after="110" w:line="265"/>
+      </w:pPr>
+      <w:r>
+        <w:rPr>
+          <w:rFonts w:ascii="Calibri" w:cs="Calibri" w:eastAsia="Calibri" w:hAnsi="Calibri"/>
+          <w:b w:val="false"/>
+          <w:bCs w:val="false"/>
+        </w:rPr>
+        <w:t xml:space="preserve">Pre Pricing V2, Contracts, Laboratory Connect a Invoicing existuje významná implementácia a stavová dokumentácia; v audite nebol doložený uzavretý úspešný end-to-end protokol celého reťazca. Cenový import so samokontrolou nie je náhradou nezávislých obchodných testov.</w:t>
+      </w:r>
+    </w:p>
+    <w:p>
+      <w:pPr>
+        <w:spacing w:after="110" w:line="265"/>
+      </w:pPr>
+      <w:r>
+        <w:rPr>
+          <w:rFonts w:ascii="Calibri" w:cs="Calibri" w:eastAsia="Calibri" w:hAnsi="Calibri"/>
+          <w:b w:val="false"/>
+          <w:bCs w:val="false"/>
+        </w:rPr>
+        <w:t xml:space="preserve">Pred úplným prechodom treba vykonať maticu: krajina × produkt × historická/nová cena × úplný/neúplný odber × zľava × splátka × oprava výsledku. Overiť aj odmietnutie neoprávneného zápisu, opakovanú správu laboratória, súbežnú fakturáciu, nedostupnú bránu a obnovu po prerušení. Pre migráciu pribudnú finančná reconciliácia, prílohy, delta prenos a rollback.</w:t>
+      </w:r>
+    </w:p>
+    <w:p>
+      <w:pPr>
+        <w:spacing w:after="110" w:line="265"/>
+      </w:pPr>
+      <w:r>
+        <w:rPr>
+          <w:rFonts w:ascii="Calibri" w:cs="Calibri" w:eastAsia="Calibri" w:hAnsi="Calibri"/>
+          <w:b w:val="false"/>
+          <w:bCs w:val="false"/>
+        </w:rPr>
+        <w:t xml:space="preserve">Každý finálny protokol má obsahovať verziu aplikácie, prostredie, dátum, použitú dátovú vzorku, príkaz alebo manuálny scenár, očakávaný/skutočný výsledok a otvorené výnimky. Tak možno stav „implementované a testované“ podložiť konkrétnym rozsahom namiesto všeobecného vyhlásenia.</w:t>
+      </w:r>
+    </w:p>
+    <w:p>
+      <w:r>
+        <w:br w:type="page"/>
+      </w:r>
+    </w:p>
+    <w:p>
+      <w:pPr>
+        <w:pStyle w:val="Heading1"/>
+        <w:keepNext/>
+        <w:spacing w:after="130" w:before="260"/>
+      </w:pPr>
+      <w:r>
+        <w:t xml:space="preserve">13. Záverečné resumé — čo presne dokončiť pre plnohodnotný INDEXUS CRM</w:t>
+      </w:r>
+    </w:p>
+    <w:p>
+      <w:pPr>
+        <w:spacing w:after="110" w:line="265"/>
+      </w:pPr>
+      <w:r>
+        <w:rPr>
+          <w:rFonts w:ascii="Calibri" w:cs="Calibri" w:eastAsia="Calibri" w:hAnsi="Calibri"/>
+          <w:b w:val="false"/>
+          <w:bCs w:val="false"/>
+        </w:rPr>
+        <w:t xml:space="preserve">INDEXUS už má implementované CRM evidencie, agentúrne pracovisko Nexus Pulse, Mission, hlasovú a SMS komunikáciu, Back Office, cenový engine, zmluvy, odbery, fakturačné funkcie a laboratórne API. Kľúčové opravy pracoviska boli cielene regresne otestované. Existuje aj rozsiahly migračný základ ISCBC. </w:t>
+      </w:r>
+      <w:r>
+        <w:rPr>
+          <w:rFonts w:ascii="Calibri" w:cs="Calibri" w:eastAsia="Calibri" w:hAnsi="Calibri"/>
+          <w:b/>
+          <w:bCs/>
+        </w:rPr>
+        <w:t xml:space="preserve">Zostávajúca práca je najmä integrácia, overenie dát a riadený prechod — nie výstavba CRM od začiatku.</w:t>
+      </w:r>
+    </w:p>
+    <w:p>
+      <w:pPr>
+        <w:spacing w:after="110" w:line="265"/>
+      </w:pPr>
+      <w:r>
+        <w:rPr>
+          <w:rFonts w:ascii="Calibri" w:cs="Calibri" w:eastAsia="Calibri" w:hAnsi="Calibri"/>
+          <w:b w:val="false"/>
+          <w:bCs w:val="false"/>
+        </w:rPr>
+        <w:t xml:space="preserve">1. </w:t>
+      </w:r>
+      <w:r>
+        <w:rPr>
+          <w:rFonts w:ascii="Calibri" w:cs="Calibri" w:eastAsia="Calibri" w:hAnsi="Calibri"/>
+          <w:b/>
+          <w:bCs/>
+        </w:rPr>
+        <w:t xml:space="preserve">Uzavrieť inventúru a rozhodnutia:</w:t>
+      </w:r>
+      <w:r>
+        <w:rPr>
+          <w:rFonts w:ascii="Calibri" w:cs="Calibri" w:eastAsia="Calibri" w:hAnsi="Calibri"/>
+          <w:b w:val="false"/>
+          <w:bCs w:val="false"/>
+        </w:rPr>
+        <w:t xml:space="preserve"> schváliť migračný katalóg, historické cenové pravidlá, otvorené domény a jednu autoritatívnu migračnú cestu. Získať aktuálne agregované údaje zo zdroja a cieľa.</w:t>
+      </w:r>
+    </w:p>
+    <w:p>
+      <w:pPr>
+        <w:spacing w:after="110" w:line="265"/>
+      </w:pPr>
+      <w:r>
+        <w:rPr>
+          <w:rFonts w:ascii="Calibri" w:cs="Calibri" w:eastAsia="Calibri" w:hAnsi="Calibri"/>
+          <w:b w:val="false"/>
+          <w:bCs w:val="false"/>
+        </w:rPr>
+        <w:t xml:space="preserve">2. </w:t>
+      </w:r>
+      <w:r>
+        <w:rPr>
+          <w:rFonts w:ascii="Calibri" w:cs="Calibri" w:eastAsia="Calibri" w:hAnsi="Calibri"/>
+          <w:b/>
+          <w:bCs/>
+        </w:rPr>
+        <w:t xml:space="preserve">Dokončiť obchodný základ:</w:t>
+      </w:r>
+      <w:r>
+        <w:rPr>
+          <w:rFonts w:ascii="Calibri" w:cs="Calibri" w:eastAsia="Calibri" w:hAnsi="Calibri"/>
+          <w:b w:val="false"/>
+          <w:bCs w:val="false"/>
+        </w:rPr>
+        <w:t xml:space="preserve"> priradiť V2 cenovú verziu zákazníkovi, uložiť záväzný cenový snapshot do zmluvy a zachovať historické ISCBC podmienky. Odstrániť závislosť nového predaja od legacy kalkulácie až po overení parity.</w:t>
+      </w:r>
+    </w:p>
+    <w:p>
+      <w:pPr>
+        <w:spacing w:after="110" w:line="265"/>
+      </w:pPr>
+      <w:r>
+        <w:rPr>
+          <w:rFonts w:ascii="Calibri" w:cs="Calibri" w:eastAsia="Calibri" w:hAnsi="Calibri"/>
+          <w:b w:val="false"/>
+          <w:bCs w:val="false"/>
+        </w:rPr>
+        <w:t xml:space="preserve">3. </w:t>
+      </w:r>
+      <w:r>
+        <w:rPr>
+          <w:rFonts w:ascii="Calibri" w:cs="Calibri" w:eastAsia="Calibri" w:hAnsi="Calibri"/>
+          <w:b/>
+          <w:bCs/>
+        </w:rPr>
+        <w:t xml:space="preserve">Prepojiť odber a laboratórium:</w:t>
+      </w:r>
+      <w:r>
+        <w:rPr>
+          <w:rFonts w:ascii="Calibri" w:cs="Calibri" w:eastAsia="Calibri" w:hAnsi="Calibri"/>
+          <w:b w:val="false"/>
+          <w:bCs w:val="false"/>
+        </w:rPr>
+        <w:t xml:space="preserve"> zjednotiť interné a externé spracovanie, identifikáciu odberu, autorizáciu, históriu a opravy výsledkov. Odovzdávať schválený výsledok do rovnakého cenového vyhodnotenia.</w:t>
+      </w:r>
+    </w:p>
+    <w:p>
+      <w:pPr>
+        <w:spacing w:after="110" w:line="265"/>
+      </w:pPr>
+      <w:r>
+        <w:rPr>
+          <w:rFonts w:ascii="Calibri" w:cs="Calibri" w:eastAsia="Calibri" w:hAnsi="Calibri"/>
+          <w:b w:val="false"/>
+          <w:bCs w:val="false"/>
+        </w:rPr>
+        <w:t xml:space="preserve">4. </w:t>
+      </w:r>
+      <w:r>
+        <w:rPr>
+          <w:rFonts w:ascii="Calibri" w:cs="Calibri" w:eastAsia="Calibri" w:hAnsi="Calibri"/>
+          <w:b/>
+          <w:bCs/>
+        </w:rPr>
+        <w:t xml:space="preserve">Dokončiť finančný cyklus:</w:t>
+      </w:r>
+      <w:r>
+        <w:rPr>
+          <w:rFonts w:ascii="Calibri" w:cs="Calibri" w:eastAsia="Calibri" w:hAnsi="Calibri"/>
+          <w:b w:val="false"/>
+          <w:bCs w:val="false"/>
+        </w:rPr>
+        <w:t xml:space="preserve"> vytvárať faktúry a položky zo schváleného zmluvného/výsledkového podkladu; zabezpečiť meny, dane, splátky, skladné, úhrady, opravné doklady a idempotenciu.</w:t>
+      </w:r>
+    </w:p>
+    <w:p>
+      <w:pPr>
+        <w:spacing w:after="110" w:line="265"/>
+      </w:pPr>
+      <w:r>
+        <w:rPr>
+          <w:rFonts w:ascii="Calibri" w:cs="Calibri" w:eastAsia="Calibri" w:hAnsi="Calibri"/>
+          <w:b w:val="false"/>
+          <w:bCs w:val="false"/>
+        </w:rPr>
+        <w:t xml:space="preserve">5. </w:t>
+      </w:r>
+      <w:r>
+        <w:rPr>
+          <w:rFonts w:ascii="Calibri" w:cs="Calibri" w:eastAsia="Calibri" w:hAnsi="Calibri"/>
+          <w:b/>
+          <w:bCs/>
+        </w:rPr>
+        <w:t xml:space="preserve">Dokončiť a nacvičiť migráciu:</w:t>
+      </w:r>
+      <w:r>
+        <w:rPr>
+          <w:rFonts w:ascii="Calibri" w:cs="Calibri" w:eastAsia="Calibri" w:hAnsi="Calibri"/>
+          <w:b w:val="false"/>
+          <w:bCs w:val="false"/>
+        </w:rPr>
+        <w:t xml:space="preserve"> preniesť schválené dáta aj súbory, doplniť väzby a chýbajúce mapovania, otestovať opakovanie importu a preukázať zhodu počtov, financií a historických podmienok.</w:t>
+      </w:r>
+    </w:p>
+    <w:p>
+      <w:pPr>
+        <w:spacing w:after="110" w:line="265"/>
+      </w:pPr>
+      <w:r>
+        <w:rPr>
+          <w:rFonts w:ascii="Calibri" w:cs="Calibri" w:eastAsia="Calibri" w:hAnsi="Calibri"/>
+          <w:b w:val="false"/>
+          <w:bCs w:val="false"/>
+        </w:rPr>
+        <w:t xml:space="preserve">6. </w:t>
+      </w:r>
+      <w:r>
+        <w:rPr>
+          <w:rFonts w:ascii="Calibri" w:cs="Calibri" w:eastAsia="Calibri" w:hAnsi="Calibri"/>
+          <w:b/>
+          <w:bCs/>
+        </w:rPr>
+        <w:t xml:space="preserve">Urobiť spoločný pilot:</w:t>
+      </w:r>
+      <w:r>
+        <w:rPr>
+          <w:rFonts w:ascii="Calibri" w:cs="Calibri" w:eastAsia="Calibri" w:hAnsi="Calibri"/>
+          <w:b w:val="false"/>
+          <w:bCs w:val="false"/>
+        </w:rPr>
+        <w:t xml:space="preserve"> overiť nový aj migrovaný prípad od kontaktu a hovoru cez zmluvu, odber a výsledok až po faktúru a úhradu. Uzavrieť blokujúce nálezy a odovzdať testovací protokol.</w:t>
+      </w:r>
+    </w:p>
+    <w:p>
+      <w:pPr>
+        <w:spacing w:after="110" w:line="265"/>
+      </w:pPr>
+      <w:r>
+        <w:rPr>
+          <w:rFonts w:ascii="Calibri" w:cs="Calibri" w:eastAsia="Calibri" w:hAnsi="Calibri"/>
+          <w:b w:val="false"/>
+          <w:bCs w:val="false"/>
+        </w:rPr>
+        <w:t xml:space="preserve">7. </w:t>
+      </w:r>
+      <w:r>
+        <w:rPr>
+          <w:rFonts w:ascii="Calibri" w:cs="Calibri" w:eastAsia="Calibri" w:hAnsi="Calibri"/>
+          <w:b/>
+          <w:bCs/>
+        </w:rPr>
+        <w:t xml:space="preserve">Riadené prepnutie a prevádzka:</w:t>
+      </w:r>
+      <w:r>
+        <w:rPr>
+          <w:rFonts w:ascii="Calibri" w:cs="Calibri" w:eastAsia="Calibri" w:hAnsi="Calibri"/>
+          <w:b w:val="false"/>
+          <w:bCs w:val="false"/>
+        </w:rPr>
+        <w:t xml:space="preserve"> vykonať finálny prenos zmien, povoliť jediný zapisujúci systém, pripraviť obnovu, monitoring, používateľské návody a dočasný read-only prístup k legacy archívu.</w:t>
+      </w:r>
+    </w:p>
+    <w:p>
+      <w:pPr>
+        <w:spacing w:after="110" w:line="265"/>
+      </w:pPr>
+      <w:r>
+        <w:rPr>
+          <w:rFonts w:ascii="Calibri" w:cs="Calibri" w:eastAsia="Calibri" w:hAnsi="Calibri"/>
+          <w:b/>
+          <w:bCs/>
+        </w:rPr>
+        <w:t xml:space="preserve">Cieľový stav:</w:t>
+      </w:r>
+      <w:r>
+        <w:rPr>
+          <w:rFonts w:ascii="Calibri" w:cs="Calibri" w:eastAsia="Calibri" w:hAnsi="Calibri"/>
+          <w:b w:val="false"/>
+          <w:bCs w:val="false"/>
+        </w:rPr>
+        <w:t xml:space="preserve"> nový aj historický zákazník sa obslúži v INDEXUS bez paralelného ručného prepisovania do ISCBC. Každá zmluva, odber, výsledok, faktúra a úhrada má dohľadateľný pôvod, správne väzby a kontrolovanú históriu. Až úspešná procesná akceptácia spolu s dátovou reconciliáciou a nacvičenou obnovou umožní označiť prechod za dokončený.</w:t>
       </w:r>
     </w:p>
     <w:sectPr>

</xml_diff>

<commit_message>
Update agent metadata and production documentation
Replit-Commit-Author: Agent
</commit_message>
<xml_diff>
--- a/indexus_overview.docx
+++ b/indexus_overview.docx
@@ -31,7 +31,7 @@
           <w:b w:val="false"/>
           <w:bCs w:val="false"/>
         </w:rPr>
-        <w:t xml:space="preserve"> 14. september 2026</w:t>
+        <w:t xml:space="preserve"> 16. september 2026</w:t>
       </w:r>
     </w:p>
     <w:p>
@@ -909,59 +909,59 @@
                 <w:b w:val="false"/>
                 <w:bCs w:val="false"/>
               </w:rPr>
-              <w:t xml:space="preserve">Healthcare Network / Back Office</w:t>
-            </w:r>
-          </w:p>
-        </w:tc>
-        <w:tc>
-          <w:tcPr>
-            <w:tcW w:type="pct" w:w="33.333333333333336%"/>
-            <w:shd w:fill="FFFFFF"/>
-            <w:tcMar>
-              <w:top w:type="dxa" w:w="85"/>
-              <w:left w:type="dxa" w:w="100"/>
-              <w:bottom w:type="dxa" w:w="85"/>
-              <w:right w:type="dxa" w:w="100"/>
-            </w:tcMar>
-          </w:tcPr>
-          <w:p>
-            <w:pPr>
-              <w:pStyle w:val="TableText"/>
-              <w:spacing w:after="60"/>
-            </w:pPr>
-            <w:r>
-              <w:rPr>
-                <w:rFonts w:ascii="Calibri" w:cs="Calibri" w:eastAsia="Calibri" w:hAnsi="Calibri"/>
-                <w:b w:val="false"/>
-                <w:bCs w:val="false"/>
-              </w:rPr>
-              <w:t xml:space="preserve">Implementované rozšírenia</w:t>
-            </w:r>
-          </w:p>
-        </w:tc>
-        <w:tc>
-          <w:tcPr>
-            <w:tcW w:type="pct" w:w="33.333333333333336%"/>
-            <w:shd w:fill="FFFFFF"/>
-            <w:tcMar>
-              <w:top w:type="dxa" w:w="85"/>
-              <w:left w:type="dxa" w:w="100"/>
-              <w:bottom w:type="dxa" w:w="85"/>
-              <w:right w:type="dxa" w:w="100"/>
-            </w:tcMar>
-          </w:tcPr>
-          <w:p>
-            <w:pPr>
-              <w:pStyle w:val="TableText"/>
-              <w:spacing w:after="60"/>
-            </w:pPr>
-            <w:r>
-              <w:rPr>
-                <w:rFonts w:ascii="Calibri" w:cs="Calibri" w:eastAsia="Calibri" w:hAnsi="Calibri"/>
-                <w:b w:val="false"/>
-                <w:bCs w:val="false"/>
-              </w:rPr>
-              <w:t xml:space="preserve">Samostatné menšie požiadavky zostávajú; nejde o blokovanie celého Pulse.</w:t>
+              <w:t xml:space="preserve">Customers + Healthcare Network / Back Office</w:t>
+            </w:r>
+          </w:p>
+        </w:tc>
+        <w:tc>
+          <w:tcPr>
+            <w:tcW w:type="pct" w:w="33.333333333333336%"/>
+            <w:shd w:fill="FFFFFF"/>
+            <w:tcMar>
+              <w:top w:type="dxa" w:w="85"/>
+              <w:left w:type="dxa" w:w="100"/>
+              <w:bottom w:type="dxa" w:w="85"/>
+              <w:right w:type="dxa" w:w="100"/>
+            </w:tcMar>
+          </w:tcPr>
+          <w:p>
+            <w:pPr>
+              <w:pStyle w:val="TableText"/>
+              <w:spacing w:after="60"/>
+            </w:pPr>
+            <w:r>
+              <w:rPr>
+                <w:rFonts w:ascii="Calibri" w:cs="Calibri" w:eastAsia="Calibri" w:hAnsi="Calibri"/>
+                <w:b w:val="false"/>
+                <w:bCs w:val="false"/>
+              </w:rPr>
+              <w:t xml:space="preserve">Implementované karty, evidencie, vzťahy a pracovné postupy; podrobnosti v kapitole 2</w:t>
+            </w:r>
+          </w:p>
+        </w:tc>
+        <w:tc>
+          <w:tcPr>
+            <w:tcW w:type="pct" w:w="33.333333333333336%"/>
+            <w:shd w:fill="FFFFFF"/>
+            <w:tcMar>
+              <w:top w:type="dxa" w:w="85"/>
+              <w:left w:type="dxa" w:w="100"/>
+              <w:bottom w:type="dxa" w:w="85"/>
+              <w:right w:type="dxa" w:w="100"/>
+            </w:tcMar>
+          </w:tcPr>
+          <w:p>
+            <w:pPr>
+              <w:pStyle w:val="TableText"/>
+              <w:spacing w:after="60"/>
+            </w:pPr>
+            <w:r>
+              <w:rPr>
+                <w:rFonts w:ascii="Calibri" w:cs="Calibri" w:eastAsia="Calibri" w:hAnsi="Calibri"/>
+                <w:b w:val="false"/>
+                <w:bCs w:val="false"/>
+              </w:rPr>
+              <w:t xml:space="preserve">Aktuálne produkčné počty a úplnosť väzieb treba získať z Ubuntu SQL výpisu; obchodné a finančné integrácie zostávajú samostatnou etapou.</w:t>
             </w:r>
           </w:p>
         </w:tc>
@@ -2361,6 +2361,618 @@
           <w:bCs w:val="false"/>
         </w:rPr>
         <w:t xml:space="preserve">Otvorené drobné požiadavky, napríklad ďalšie správanie reprezentanta pri vytváraní kariet, badge úloh alebo nastavenia automatizácií, nie sú týmto dokumentom označené za dokončené.</w:t>
+      </w:r>
+    </w:p>
+    <w:p>
+      <w:pPr>
+        <w:pStyle w:val="Heading2"/>
+        <w:keepNext/>
+        <w:spacing w:after="130" w:before="260"/>
+      </w:pPr>
+      <w:r>
+        <w:t xml:space="preserve">2.7 Customers — karta zákazníka a súvisiace evidencie</w:t>
+      </w:r>
+    </w:p>
+    <w:p>
+      <w:pPr>
+        <w:spacing w:after="110" w:line="265"/>
+      </w:pPr>
+      <w:r>
+        <w:rPr>
+          <w:rFonts w:ascii="Calibri" w:cs="Calibri" w:eastAsia="Calibri" w:hAnsi="Calibri"/>
+          <w:b w:val="false"/>
+          <w:bCs w:val="false"/>
+        </w:rPr>
+        <w:t xml:space="preserve">Karta </w:t>
+      </w:r>
+      <w:r>
+        <w:rPr>
+          <w:rFonts w:ascii="Calibri" w:cs="Calibri" w:eastAsia="Calibri" w:hAnsi="Calibri"/>
+          <w:b/>
+          <w:bCs/>
+        </w:rPr>
+        <w:t xml:space="preserve">Customers</w:t>
+      </w:r>
+      <w:r>
+        <w:rPr>
+          <w:rFonts w:ascii="Calibri" w:cs="Calibri" w:eastAsia="Calibri" w:hAnsi="Calibri"/>
+          <w:b w:val="false"/>
+          <w:bCs w:val="false"/>
+        </w:rPr>
+        <w:t xml:space="preserve"> je hlavná zákaznícka evidencia, nie iba zoznam mien. Implementovaný model a používateľské rozhranie pokrývajú tieto skupiny údajov:</w:t>
+      </w:r>
+    </w:p>
+    <w:p>
+      <w:pPr>
+        <w:pStyle w:val="ListParagraph"/>
+        <w:numPr>
+          <w:ilvl w:val="0"/>
+          <w:numId w:val="1"/>
+        </w:numPr>
+        <w:spacing w:after="110" w:line="265"/>
+      </w:pPr>
+      <w:r>
+        <w:rPr>
+          <w:rFonts w:ascii="Calibri" w:cs="Calibri" w:eastAsia="Calibri" w:hAnsi="Calibri"/>
+          <w:b/>
+          <w:bCs/>
+        </w:rPr>
+        <w:t xml:space="preserve">Identita a kontakty:</w:t>
+      </w:r>
+      <w:r>
+        <w:rPr>
+          <w:rFonts w:ascii="Calibri" w:cs="Calibri" w:eastAsia="Calibri" w:hAnsi="Calibri"/>
+          <w:b w:val="false"/>
+          <w:bCs w:val="false"/>
+        </w:rPr>
+        <w:t xml:space="preserve"> interné číslo, tituly, meno, priezvisko, rodné meno, telefón, mobil a ďalšie čísla, e-mailové adresy, rodné číslo, číslo občianskeho preukazu a dátum narodenia.</w:t>
+      </w:r>
+    </w:p>
+    <w:p>
+      <w:pPr>
+        <w:pStyle w:val="ListParagraph"/>
+        <w:numPr>
+          <w:ilvl w:val="0"/>
+          <w:numId w:val="1"/>
+        </w:numPr>
+        <w:spacing w:after="110" w:line="265"/>
+      </w:pPr>
+      <w:r>
+        <w:rPr>
+          <w:rFonts w:ascii="Calibri" w:cs="Calibri" w:eastAsia="Calibri" w:hAnsi="Calibri"/>
+          <w:b/>
+          <w:bCs/>
+        </w:rPr>
+        <w:t xml:space="preserve">Adresy:</w:t>
+      </w:r>
+      <w:r>
+        <w:rPr>
+          <w:rFonts w:ascii="Calibri" w:cs="Calibri" w:eastAsia="Calibri" w:hAnsi="Calibri"/>
+          <w:b w:val="false"/>
+          <w:bCs w:val="false"/>
+        </w:rPr>
+        <w:t xml:space="preserve"> trvalá adresa a voliteľná korešpondenčná adresa s krajinou, mestom, PSČ, regiónom a okresom.</w:t>
+      </w:r>
+    </w:p>
+    <w:p>
+      <w:pPr>
+        <w:pStyle w:val="ListParagraph"/>
+        <w:numPr>
+          <w:ilvl w:val="0"/>
+          <w:numId w:val="1"/>
+        </w:numPr>
+        <w:spacing w:after="110" w:line="265"/>
+      </w:pPr>
+      <w:r>
+        <w:rPr>
+          <w:rFonts w:ascii="Calibri" w:cs="Calibri" w:eastAsia="Calibri" w:hAnsi="Calibri"/>
+          <w:b/>
+          <w:bCs/>
+        </w:rPr>
+        <w:t xml:space="preserve">Stav a obchodný pipeline:</w:t>
+      </w:r>
+      <w:r>
+        <w:rPr>
+          <w:rFonts w:ascii="Calibri" w:cs="Calibri" w:eastAsia="Calibri" w:hAnsi="Calibri"/>
+          <w:b w:val="false"/>
+          <w:bCs w:val="false"/>
+        </w:rPr>
+        <w:t xml:space="preserve"> stav zákazníka </w:t>
+      </w:r>
+      <w:r>
+        <w:rPr>
+          <w:rFonts w:ascii="Consolas" w:cs="Consolas" w:eastAsia="Consolas" w:hAnsi="Consolas"/>
+          <w:b w:val="false"/>
+          <w:bCs w:val="false"/>
+        </w:rPr>
+        <w:t xml:space="preserve">potential / acquired / terminated</w:t>
+      </w:r>
+      <w:r>
+        <w:rPr>
+          <w:rFonts w:ascii="Calibri" w:cs="Calibri" w:eastAsia="Calibri" w:hAnsi="Calibri"/>
+          <w:b w:val="false"/>
+          <w:bCs w:val="false"/>
+        </w:rPr>
+        <w:t xml:space="preserve">, prevádzkový stav </w:t>
+      </w:r>
+      <w:r>
+        <w:rPr>
+          <w:rFonts w:ascii="Consolas" w:cs="Consolas" w:eastAsia="Consolas" w:hAnsi="Consolas"/>
+          <w:b w:val="false"/>
+          <w:bCs w:val="false"/>
+        </w:rPr>
+        <w:t xml:space="preserve">active / pending / inactive</w:t>
+      </w:r>
+      <w:r>
+        <w:rPr>
+          <w:rFonts w:ascii="Calibri" w:cs="Calibri" w:eastAsia="Calibri" w:hAnsi="Calibri"/>
+          <w:b w:val="false"/>
+          <w:bCs w:val="false"/>
+        </w:rPr>
+        <w:t xml:space="preserve">, lead status, lead score, dátum aktualizácie skóre, zdroj registrácie a dátum registrácie.</w:t>
+      </w:r>
+    </w:p>
+    <w:p>
+      <w:pPr>
+        <w:pStyle w:val="ListParagraph"/>
+        <w:numPr>
+          <w:ilvl w:val="0"/>
+          <w:numId w:val="1"/>
+        </w:numPr>
+        <w:spacing w:after="110" w:line="265"/>
+      </w:pPr>
+      <w:r>
+        <w:rPr>
+          <w:rFonts w:ascii="Calibri" w:cs="Calibri" w:eastAsia="Calibri" w:hAnsi="Calibri"/>
+          <w:b/>
+          <w:bCs/>
+        </w:rPr>
+        <w:t xml:space="preserve">Marketing a segmentácia:</w:t>
+      </w:r>
+      <w:r>
+        <w:rPr>
+          <w:rFonts w:ascii="Calibri" w:cs="Calibri" w:eastAsia="Calibri" w:hAnsi="Calibri"/>
+          <w:b w:val="false"/>
+          <w:bCs w:val="false"/>
+        </w:rPr>
+        <w:t xml:space="preserve"> newsletter, typ sťažnosti, typ spolupráce, VIP stav, tagy, poznámky, pridelený používateľ a zdroj leadu.</w:t>
+      </w:r>
+    </w:p>
+    <w:p>
+      <w:pPr>
+        <w:pStyle w:val="ListParagraph"/>
+        <w:numPr>
+          <w:ilvl w:val="0"/>
+          <w:numId w:val="1"/>
+        </w:numPr>
+        <w:spacing w:after="110" w:line="265"/>
+      </w:pPr>
+      <w:r>
+        <w:rPr>
+          <w:rFonts w:ascii="Calibri" w:cs="Calibri" w:eastAsia="Calibri" w:hAnsi="Calibri"/>
+          <w:b/>
+          <w:bCs/>
+        </w:rPr>
+        <w:t xml:space="preserve">Zdravotné a pôrodné väzby:</w:t>
+      </w:r>
+      <w:r>
+        <w:rPr>
+          <w:rFonts w:ascii="Calibri" w:cs="Calibri" w:eastAsia="Calibri" w:hAnsi="Calibri"/>
+          <w:b w:val="false"/>
+          <w:bCs w:val="false"/>
+        </w:rPr>
+        <w:t xml:space="preserve"> zdravotná poisťovňa, gynekológ, kontakt na gynekológa, predpokladaný termín pôrodu, nemocnica, vybraná klinika a konkrétny spolupracovník/lekár.</w:t>
+      </w:r>
+    </w:p>
+    <w:p>
+      <w:pPr>
+        <w:pStyle w:val="ListParagraph"/>
+        <w:numPr>
+          <w:ilvl w:val="0"/>
+          <w:numId w:val="1"/>
+        </w:numPr>
+        <w:spacing w:after="110" w:line="265"/>
+      </w:pPr>
+      <w:r>
+        <w:rPr>
+          <w:rFonts w:ascii="Calibri" w:cs="Calibri" w:eastAsia="Calibri" w:hAnsi="Calibri"/>
+          <w:b/>
+          <w:bCs/>
+        </w:rPr>
+        <w:t xml:space="preserve">Produkty a obchod:</w:t>
+      </w:r>
+      <w:r>
+        <w:rPr>
+          <w:rFonts w:ascii="Calibri" w:cs="Calibri" w:eastAsia="Calibri" w:hAnsi="Calibri"/>
+          <w:b w:val="false"/>
+          <w:bCs w:val="false"/>
+        </w:rPr>
+        <w:t xml:space="preserve"> zákaznícke produkty, stav služby, väzba na kampane a kontaktné entity, podklady pre zmluvu a faktúru. Táto existencia ešte neznamená, že každý predaj už prechádza výhradne cez Pricing Engine V2.</w:t>
+      </w:r>
+    </w:p>
+    <w:p>
+      <w:pPr>
+        <w:pStyle w:val="ListParagraph"/>
+        <w:numPr>
+          <w:ilvl w:val="0"/>
+          <w:numId w:val="1"/>
+        </w:numPr>
+        <w:spacing w:after="110" w:line="265"/>
+      </w:pPr>
+      <w:r>
+        <w:rPr>
+          <w:rFonts w:ascii="Calibri" w:cs="Calibri" w:eastAsia="Calibri" w:hAnsi="Calibri"/>
+          <w:b/>
+          <w:bCs/>
+        </w:rPr>
+        <w:t xml:space="preserve">Prevádzková história:</w:t>
+      </w:r>
+      <w:r>
+        <w:rPr>
+          <w:rFonts w:ascii="Calibri" w:cs="Calibri" w:eastAsia="Calibri" w:hAnsi="Calibri"/>
+          <w:b w:val="false"/>
+          <w:bCs w:val="false"/>
+        </w:rPr>
+        <w:t xml:space="preserve"> poznámky, súhlasy/GDPR, dokumenty, komunikácia, odbery, prípady, faktúry, úhrady, splátky a pohľadávky. Historické dáta treba odlíšiť od nových akcií agenta.</w:t>
+      </w:r>
+    </w:p>
+    <w:p>
+      <w:pPr>
+        <w:spacing w:after="110" w:line="265"/>
+      </w:pPr>
+      <w:r>
+        <w:rPr>
+          <w:rFonts w:ascii="Calibri" w:cs="Calibri" w:eastAsia="Calibri" w:hAnsi="Calibri"/>
+          <w:b w:val="false"/>
+          <w:bCs w:val="false"/>
+        </w:rPr>
+        <w:t xml:space="preserve">Pri migrácii ISCBC sa zákazník skladá z </w:t>
+      </w:r>
+      <w:r>
+        <w:rPr>
+          <w:rFonts w:ascii="Consolas" w:cs="Consolas" w:eastAsia="Consolas" w:hAnsi="Consolas"/>
+          <w:b w:val="false"/>
+          <w:bCs w:val="false"/>
+        </w:rPr>
+        <w:t xml:space="preserve">Clients</w:t>
+      </w:r>
+      <w:r>
+        <w:rPr>
+          <w:rFonts w:ascii="Calibri" w:cs="Calibri" w:eastAsia="Calibri" w:hAnsi="Calibri"/>
+          <w:b w:val="false"/>
+          <w:bCs w:val="false"/>
+        </w:rPr>
+        <w:t xml:space="preserve">, </w:t>
+      </w:r>
+      <w:r>
+        <w:rPr>
+          <w:rFonts w:ascii="Consolas" w:cs="Consolas" w:eastAsia="Consolas" w:hAnsi="Consolas"/>
+          <w:b w:val="false"/>
+          <w:bCs w:val="false"/>
+        </w:rPr>
+        <w:t xml:space="preserve">Persons</w:t>
+      </w:r>
+      <w:r>
+        <w:rPr>
+          <w:rFonts w:ascii="Calibri" w:cs="Calibri" w:eastAsia="Calibri" w:hAnsi="Calibri"/>
+          <w:b w:val="false"/>
+          <w:bCs w:val="false"/>
+        </w:rPr>
+        <w:t xml:space="preserve">, </w:t>
+      </w:r>
+      <w:r>
+        <w:rPr>
+          <w:rFonts w:ascii="Consolas" w:cs="Consolas" w:eastAsia="Consolas" w:hAnsi="Consolas"/>
+          <w:b w:val="false"/>
+          <w:bCs w:val="false"/>
+        </w:rPr>
+        <w:t xml:space="preserve">Contacts</w:t>
+      </w:r>
+      <w:r>
+        <w:rPr>
+          <w:rFonts w:ascii="Calibri" w:cs="Calibri" w:eastAsia="Calibri" w:hAnsi="Calibri"/>
+          <w:b w:val="false"/>
+          <w:bCs w:val="false"/>
+        </w:rPr>
+        <w:t xml:space="preserve"> a </w:t>
+      </w:r>
+      <w:r>
+        <w:rPr>
+          <w:rFonts w:ascii="Consolas" w:cs="Consolas" w:eastAsia="Consolas" w:hAnsi="Consolas"/>
+          <w:b w:val="false"/>
+          <w:bCs w:val="false"/>
+        </w:rPr>
+        <w:t xml:space="preserve">MailAddresses</w:t>
+      </w:r>
+      <w:r>
+        <w:rPr>
+          <w:rFonts w:ascii="Calibri" w:cs="Calibri" w:eastAsia="Calibri" w:hAnsi="Calibri"/>
+          <w:b w:val="false"/>
+          <w:bCs w:val="false"/>
+        </w:rPr>
+        <w:t xml:space="preserve">. Import zachováva </w:t>
+      </w:r>
+      <w:r>
+        <w:rPr>
+          <w:rFonts w:ascii="Consolas" w:cs="Consolas" w:eastAsia="Consolas" w:hAnsi="Consolas"/>
+          <w:b w:val="false"/>
+          <w:bCs w:val="false"/>
+        </w:rPr>
+        <w:t xml:space="preserve">internal_id</w:t>
+      </w:r>
+      <w:r>
+        <w:rPr>
+          <w:rFonts w:ascii="Calibri" w:cs="Calibri" w:eastAsia="Calibri" w:hAnsi="Calibri"/>
+          <w:b w:val="false"/>
+          <w:bCs w:val="false"/>
+        </w:rPr>
+        <w:t xml:space="preserve"> a </w:t>
+      </w:r>
+      <w:r>
+        <w:rPr>
+          <w:rFonts w:ascii="Consolas" w:cs="Consolas" w:eastAsia="Consolas" w:hAnsi="Consolas"/>
+          <w:b w:val="false"/>
+          <w:bCs w:val="false"/>
+        </w:rPr>
+        <w:t xml:space="preserve">data_source = 'iscbc'</w:t>
+      </w:r>
+      <w:r>
+        <w:rPr>
+          <w:rFonts w:ascii="Calibri" w:cs="Calibri" w:eastAsia="Calibri" w:hAnsi="Calibri"/>
+          <w:b w:val="false"/>
+          <w:bCs w:val="false"/>
+        </w:rPr>
+        <w:t xml:space="preserve">; potenciálni klienti sa mapujú ako </w:t>
+      </w:r>
+      <w:r>
+        <w:rPr>
+          <w:rFonts w:ascii="Consolas" w:cs="Consolas" w:eastAsia="Consolas" w:hAnsi="Consolas"/>
+          <w:b w:val="false"/>
+          <w:bCs w:val="false"/>
+        </w:rPr>
+        <w:t xml:space="preserve">client_status = 'potential'</w:t>
+      </w:r>
+      <w:r>
+        <w:rPr>
+          <w:rFonts w:ascii="Calibri" w:cs="Calibri" w:eastAsia="Calibri" w:hAnsi="Calibri"/>
+          <w:b w:val="false"/>
+          <w:bCs w:val="false"/>
+        </w:rPr>
+        <w:t xml:space="preserve">. Pred zlúčením duplicít je potrebné porovnať interné číslo, legacy ID, dátumy, adresy a existujúce väzby. Spoločný telefón alebo e-mail sám o sebe nie je bezpečný dôvod na zlúčenie.</w:t>
+      </w:r>
+    </w:p>
+    <w:p>
+      <w:pPr>
+        <w:pStyle w:val="Heading2"/>
+        <w:keepNext/>
+        <w:spacing w:after="130" w:before="260"/>
+      </w:pPr>
+      <w:r>
+        <w:t xml:space="preserve">2.8 Healthcare Network — kliniky, nemocnice a PZK/PZS sieť</w:t>
+      </w:r>
+    </w:p>
+    <w:p>
+      <w:pPr>
+        <w:spacing w:after="110" w:line="265"/>
+      </w:pPr>
+      <w:r>
+        <w:rPr>
+          <w:rFonts w:ascii="Calibri" w:cs="Calibri" w:eastAsia="Calibri" w:hAnsi="Calibri"/>
+          <w:b w:val="false"/>
+          <w:bCs w:val="false"/>
+        </w:rPr>
+        <w:t xml:space="preserve">Healthcare Network je samostatná doména pre zdravotníckych partnerov a ich kontaktnú sieť:</w:t>
+      </w:r>
+    </w:p>
+    <w:p>
+      <w:pPr>
+        <w:pStyle w:val="ListParagraph"/>
+        <w:numPr>
+          <w:ilvl w:val="0"/>
+          <w:numId w:val="1"/>
+        </w:numPr>
+        <w:spacing w:after="110" w:line="265"/>
+      </w:pPr>
+      <w:r>
+        <w:rPr>
+          <w:rFonts w:ascii="Calibri" w:cs="Calibri" w:eastAsia="Calibri" w:hAnsi="Calibri"/>
+          <w:b/>
+          <w:bCs/>
+        </w:rPr>
+        <w:t xml:space="preserve">Kliniky/ambulancie:</w:t>
+      </w:r>
+      <w:r>
+        <w:rPr>
+          <w:rFonts w:ascii="Calibri" w:cs="Calibri" w:eastAsia="Calibri" w:hAnsi="Calibri"/>
+          <w:b w:val="false"/>
+          <w:bCs w:val="false"/>
+        </w:rPr>
+        <w:t xml:space="preserve"> názov, lekár a titul, meno lekára, kategória pozície, identifikátor ZZ, kód a názov PZS/PZK podľa zdrojového označenia, IČO, úplná adresa, tri telefónne a tri e-mailové polia, web, GPS, krajina, región, okres, aktivita a poznámky.</w:t>
+      </w:r>
+    </w:p>
+    <w:p>
+      <w:pPr>
+        <w:pStyle w:val="ListParagraph"/>
+        <w:numPr>
+          <w:ilvl w:val="0"/>
+          <w:numId w:val="1"/>
+        </w:numPr>
+        <w:spacing w:after="110" w:line="265"/>
+      </w:pPr>
+      <w:r>
+        <w:rPr>
+          <w:rFonts w:ascii="Calibri" w:cs="Calibri" w:eastAsia="Calibri" w:hAnsi="Calibri"/>
+          <w:b/>
+          <w:bCs/>
+        </w:rPr>
+        <w:t xml:space="preserve">Obchodný stav kliniky:</w:t>
+      </w:r>
+      <w:r>
+        <w:rPr>
+          <w:rFonts w:ascii="Calibri" w:cs="Calibri" w:eastAsia="Calibri" w:hAnsi="Calibri"/>
+          <w:b w:val="false"/>
+          <w:bCs w:val="false"/>
+        </w:rPr>
+        <w:t xml:space="preserve"> zdroj leadu, odporúčanie lekárom, konferencia, počiatočný stav, záujem o spoluprácu, záujem o zmluvu, stav zmluvy, výsledok a poznámka posledného hovoru, ďalší kontakt, odoslanie/vrátenie zmluvy a stav letákov.</w:t>
+      </w:r>
+    </w:p>
+    <w:p>
+      <w:pPr>
+        <w:pStyle w:val="ListParagraph"/>
+        <w:numPr>
+          <w:ilvl w:val="0"/>
+          <w:numId w:val="1"/>
+        </w:numPr>
+        <w:spacing w:after="110" w:line="265"/>
+      </w:pPr>
+      <w:r>
+        <w:rPr>
+          <w:rFonts w:ascii="Calibri" w:cs="Calibri" w:eastAsia="Calibri" w:hAnsi="Calibri"/>
+          <w:b/>
+          <w:bCs/>
+        </w:rPr>
+        <w:t xml:space="preserve">Nemocnice:</w:t>
+      </w:r>
+      <w:r>
+        <w:rPr>
+          <w:rFonts w:ascii="Calibri" w:cs="Calibri" w:eastAsia="Calibri" w:hAnsi="Calibri"/>
+          <w:b w:val="false"/>
+          <w:bCs w:val="false"/>
+        </w:rPr>
+        <w:t xml:space="preserve"> aktívny stav, názov, adresa, krajina, laboratórium, GPS, zodpovedná osoba, reprezentant, kontaktná osoba, telefón, e-mail, regionálne údaje a väzby na spolupracovníkov.</w:t>
+      </w:r>
+    </w:p>
+    <w:p>
+      <w:pPr>
+        <w:pStyle w:val="ListParagraph"/>
+        <w:numPr>
+          <w:ilvl w:val="0"/>
+          <w:numId w:val="1"/>
+        </w:numPr>
+        <w:spacing w:after="110" w:line="265"/>
+      </w:pPr>
+      <w:r>
+        <w:rPr>
+          <w:rFonts w:ascii="Calibri" w:cs="Calibri" w:eastAsia="Calibri" w:hAnsi="Calibri"/>
+          <w:b/>
+          <w:bCs/>
+        </w:rPr>
+        <w:t xml:space="preserve">Reprezentanti:</w:t>
+      </w:r>
+      <w:r>
+        <w:rPr>
+          <w:rFonts w:ascii="Calibri" w:cs="Calibri" w:eastAsia="Calibri" w:hAnsi="Calibri"/>
+          <w:b w:val="false"/>
+          <w:bCs w:val="false"/>
+        </w:rPr>
+        <w:t xml:space="preserve"> aktuálne priradenie, história platnosti priradení, zmena reprezentanta a hromadné priradenie pre kliniky aj nemocnice. Hromadná operácia pracuje s úplným náhľadom filtrovaného výberu, nie iba s aktuálnou stránkou.</w:t>
+      </w:r>
+    </w:p>
+    <w:p>
+      <w:pPr>
+        <w:pStyle w:val="ListParagraph"/>
+        <w:numPr>
+          <w:ilvl w:val="0"/>
+          <w:numId w:val="1"/>
+        </w:numPr>
+        <w:spacing w:after="110" w:line="265"/>
+      </w:pPr>
+      <w:r>
+        <w:rPr>
+          <w:rFonts w:ascii="Calibri" w:cs="Calibri" w:eastAsia="Calibri" w:hAnsi="Calibri"/>
+          <w:b/>
+          <w:bCs/>
+        </w:rPr>
+        <w:t xml:space="preserve">Sieťové väzby:</w:t>
+      </w:r>
+      <w:r>
+        <w:rPr>
+          <w:rFonts w:ascii="Calibri" w:cs="Calibri" w:eastAsia="Calibri" w:hAnsi="Calibri"/>
+          <w:b w:val="false"/>
+          <w:bCs w:val="false"/>
+        </w:rPr>
+        <w:t xml:space="preserve"> referrals medzi klinikami, nemocničné siete a ich členovia, spolupracovníci/lekári naviazaní na kliniky alebo nemocnice, kategórie partnerov a udalosti kliniky.</w:t>
+      </w:r>
+    </w:p>
+    <w:p>
+      <w:pPr>
+        <w:pStyle w:val="ListParagraph"/>
+        <w:numPr>
+          <w:ilvl w:val="0"/>
+          <w:numId w:val="1"/>
+        </w:numPr>
+        <w:spacing w:after="110" w:line="265"/>
+      </w:pPr>
+      <w:r>
+        <w:rPr>
+          <w:rFonts w:ascii="Calibri" w:cs="Calibri" w:eastAsia="Calibri" w:hAnsi="Calibri"/>
+          <w:b/>
+          <w:bCs/>
+        </w:rPr>
+        <w:t xml:space="preserve">Stavy spolupráce:</w:t>
+      </w:r>
+      <w:r>
+        <w:rPr>
+          <w:rFonts w:ascii="Calibri" w:cs="Calibri" w:eastAsia="Calibri" w:hAnsi="Calibri"/>
+          <w:b w:val="false"/>
+          <w:bCs w:val="false"/>
+        </w:rPr>
+        <w:t xml:space="preserve"> stavové záznamy kliniky sú oddelené od všeobecného </w:t>
+      </w:r>
+      <w:r>
+        <w:rPr>
+          <w:rFonts w:ascii="Consolas" w:cs="Consolas" w:eastAsia="Consolas" w:hAnsi="Consolas"/>
+          <w:b w:val="false"/>
+          <w:bCs w:val="false"/>
+        </w:rPr>
+        <w:t xml:space="preserve">is_active</w:t>
+      </w:r>
+      <w:r>
+        <w:rPr>
+          <w:rFonts w:ascii="Calibri" w:cs="Calibri" w:eastAsia="Calibri" w:hAnsi="Calibri"/>
+          <w:b w:val="false"/>
+          <w:bCs w:val="false"/>
+        </w:rPr>
+        <w:t xml:space="preserve">; zachovávajú fázu, stavový kľúč a časovú históriu, aby sa obchodný proces neprepisoval jedným aktuálnym flagom.</w:t>
+      </w:r>
+    </w:p>
+    <w:p>
+      <w:pPr>
+        <w:pStyle w:val="ListParagraph"/>
+        <w:numPr>
+          <w:ilvl w:val="0"/>
+          <w:numId w:val="1"/>
+        </w:numPr>
+        <w:spacing w:after="110" w:line="265"/>
+      </w:pPr>
+      <w:r>
+        <w:rPr>
+          <w:rFonts w:ascii="Calibri" w:cs="Calibri" w:eastAsia="Calibri" w:hAnsi="Calibri"/>
+          <w:b/>
+          <w:bCs/>
+        </w:rPr>
+        <w:t xml:space="preserve">Filtrovanie a Back Office:</w:t>
+      </w:r>
+      <w:r>
+        <w:rPr>
+          <w:rFonts w:ascii="Calibri" w:cs="Calibri" w:eastAsia="Calibri" w:hAnsi="Calibri"/>
+          <w:b w:val="false"/>
+          <w:bCs w:val="false"/>
+        </w:rPr>
+        <w:t xml:space="preserve"> rovnaká logika filtrov pre zoznam a bulk operáciu, vyhľadávanie podľa zdravotníckeho partnera, mesta, reprezentanta, kontaktov, GPS, kategórie, stavu a ďalších polí. Oprávnenia a krajiny sa kontrolujú aj na serveri.</w:t>
+      </w:r>
+    </w:p>
+    <w:p>
+      <w:pPr>
+        <w:spacing w:after="110" w:line="265"/>
+      </w:pPr>
+      <w:r>
+        <w:rPr>
+          <w:rFonts w:ascii="Calibri" w:cs="Calibri" w:eastAsia="Calibri" w:hAnsi="Calibri"/>
+          <w:b w:val="false"/>
+          <w:bCs w:val="false"/>
+        </w:rPr>
+        <w:t xml:space="preserve">V produkčnom výpise potrebujeme osobitne zmerať počet všetkých kliník, aktívnych kliník, kliník s PZK/PZS kódom, kliník s ID ZZ, IČO, e-mailom, telefónom, GPS, zmluvným stavom a reprezentantom. Rovnakú maticu treba vyhodnotiť pre nemocnice. Výpis má obsahovať iba agregácie a rozdelenia podľa krajiny/stavu; nemá obsahovať mená lekárov, telefóny, e-maily ani kódy jednotlivých kliník.</w:t>
       </w:r>
     </w:p>
     <w:p>
@@ -3785,6 +4397,158 @@
         <w:spacing w:after="130" w:before="260"/>
       </w:pPr>
       <w:r>
+        <w:t xml:space="preserve">7.1 Zjednotený realizačný plán</w:t>
+      </w:r>
+    </w:p>
+    <w:p>
+      <w:pPr>
+        <w:spacing w:after="110" w:line="265"/>
+      </w:pPr>
+      <w:r>
+        <w:rPr>
+          <w:rFonts w:ascii="Calibri" w:cs="Calibri" w:eastAsia="Calibri" w:hAnsi="Calibri"/>
+          <w:b w:val="false"/>
+          <w:bCs w:val="false"/>
+        </w:rPr>
+        <w:t xml:space="preserve">Na rozdiel od technického poradia jednotlivých podúloh je manažérsky postup nasledovný:</w:t>
+      </w:r>
+    </w:p>
+    <w:p>
+      <w:pPr>
+        <w:spacing w:after="110" w:line="265"/>
+      </w:pPr>
+      <w:r>
+        <w:rPr>
+          <w:rFonts w:ascii="Calibri" w:cs="Calibri" w:eastAsia="Calibri" w:hAnsi="Calibri"/>
+          <w:b w:val="false"/>
+          <w:bCs w:val="false"/>
+        </w:rPr>
+        <w:t xml:space="preserve">1. </w:t>
+      </w:r>
+      <w:r>
+        <w:rPr>
+          <w:rFonts w:ascii="Calibri" w:cs="Calibri" w:eastAsia="Calibri" w:hAnsi="Calibri"/>
+          <w:b/>
+          <w:bCs/>
+        </w:rPr>
+        <w:t xml:space="preserve">Zjednotiť cenotvorbu a cenníkový modul.</w:t>
+      </w:r>
+      <w:r>
+        <w:rPr>
+          <w:rFonts w:ascii="Calibri" w:cs="Calibri" w:eastAsia="Calibri" w:hAnsi="Calibri"/>
+          <w:b w:val="false"/>
+          <w:bCs w:val="false"/>
+        </w:rPr>
+        <w:t xml:space="preserve"> Pricing Engine V2 sa stane jediným autoritatívnym výpočtom pre nové produkty, komponenty, odbery, skladné, zľavy, nekompletné odbery, meny a splátky. Zákazník a zmluva musia dostať konkrétnu cenovú verziu a nemenný položkový snapshot. Legacy Products/Configurator sa vypne až po porovnaní výsledkov.</w:t>
+      </w:r>
+    </w:p>
+    <w:p>
+      <w:pPr>
+        <w:spacing w:after="110" w:line="265"/>
+      </w:pPr>
+      <w:r>
+        <w:rPr>
+          <w:rFonts w:ascii="Calibri" w:cs="Calibri" w:eastAsia="Calibri" w:hAnsi="Calibri"/>
+          <w:b w:val="false"/>
+          <w:bCs w:val="false"/>
+        </w:rPr>
+        <w:t xml:space="preserve">2. </w:t>
+      </w:r>
+      <w:r>
+        <w:rPr>
+          <w:rFonts w:ascii="Calibri" w:cs="Calibri" w:eastAsia="Calibri" w:hAnsi="Calibri"/>
+          <w:b/>
+          <w:bCs/>
+        </w:rPr>
+        <w:t xml:space="preserve">Dopracovať fakturáciu a spoluprácu s ESO účtovým systémom.</w:t>
+      </w:r>
+      <w:r>
+        <w:rPr>
+          <w:rFonts w:ascii="Calibri" w:cs="Calibri" w:eastAsia="Calibri" w:hAnsi="Calibri"/>
+          <w:b w:val="false"/>
+          <w:bCs w:val="false"/>
+        </w:rPr>
+        <w:t xml:space="preserve"> Treba uzavrieť, či ESO dostáva faktúry cez API, exportný súbor alebo inú schválenú integračnú cestu. Dohodnúť mapovanie zákazníka, firmy, meny, DPH, číselných radov, účtov, položiek, úhrad, storna a dobropisov. Synchronizácia musí byť idempotentná, auditovateľná a nesmie vytvoriť druhý doklad pri opakovaní.</w:t>
+      </w:r>
+    </w:p>
+    <w:p>
+      <w:pPr>
+        <w:spacing w:after="110" w:line="265"/>
+      </w:pPr>
+      <w:r>
+        <w:rPr>
+          <w:rFonts w:ascii="Calibri" w:cs="Calibri" w:eastAsia="Calibri" w:hAnsi="Calibri"/>
+          <w:b w:val="false"/>
+          <w:bCs w:val="false"/>
+        </w:rPr>
+        <w:t xml:space="preserve">3. </w:t>
+      </w:r>
+      <w:r>
+        <w:rPr>
+          <w:rFonts w:ascii="Calibri" w:cs="Calibri" w:eastAsia="Calibri" w:hAnsi="Calibri"/>
+          <w:b/>
+          <w:bCs/>
+        </w:rPr>
+        <w:t xml:space="preserve">Dopracovať vytváranie zmlúv a templates pre zmluvy a fakturáciu.</w:t>
+      </w:r>
+      <w:r>
+        <w:rPr>
+          <w:rFonts w:ascii="Calibri" w:cs="Calibri" w:eastAsia="Calibri" w:hAnsi="Calibri"/>
+          <w:b w:val="false"/>
+          <w:bCs w:val="false"/>
+        </w:rPr>
+        <w:t xml:space="preserve"> Zmluva musí používať schválený V2 snapshot, správnu krajinu, menu, produkt, splátky a podpisovú verziu. Templates majú mať verziovanie, jazyk, krajinné pravidlá, placeholdery, audit generovania a väzbu na fakturačné podmienky. Podpísaná zmluva a vydaná faktúra sa nesmú spätne prepísať novým cenníkom.</w:t>
+      </w:r>
+    </w:p>
+    <w:p>
+      <w:pPr>
+        <w:spacing w:after="110" w:line="265"/>
+      </w:pPr>
+      <w:r>
+        <w:rPr>
+          <w:rFonts w:ascii="Calibri" w:cs="Calibri" w:eastAsia="Calibri" w:hAnsi="Calibri"/>
+          <w:b w:val="false"/>
+          <w:bCs w:val="false"/>
+        </w:rPr>
+        <w:t xml:space="preserve">4. </w:t>
+      </w:r>
+      <w:r>
+        <w:rPr>
+          <w:rFonts w:ascii="Calibri" w:cs="Calibri" w:eastAsia="Calibri" w:hAnsi="Calibri"/>
+          <w:b/>
+          <w:bCs/>
+        </w:rPr>
+        <w:t xml:space="preserve">Na konci prepojiť laboratórny modul.</w:t>
+      </w:r>
+      <w:r>
+        <w:rPr>
+          <w:rFonts w:ascii="Calibri" w:cs="Calibri" w:eastAsia="Calibri" w:hAnsi="Calibri"/>
+          <w:b w:val="false"/>
+          <w:bCs w:val="false"/>
+        </w:rPr>
+        <w:t xml:space="preserve"> Laboratory Connect má po autorizovanom výsledku spustiť vyhodnotenie skutočne dodanej služby cez rovnaký engine, vytvoriť schválený podklad pre fakturáciu a zachovať históriu opráv. Interné a externé cesty musia mať rovnaké validačné a bezpečnostné pravidlá.</w:t>
+      </w:r>
+    </w:p>
+    <w:p>
+      <w:pPr>
+        <w:spacing w:after="110" w:line="265"/>
+      </w:pPr>
+      <w:r>
+        <w:rPr>
+          <w:rFonts w:ascii="Calibri" w:cs="Calibri" w:eastAsia="Calibri" w:hAnsi="Calibri"/>
+          <w:b w:val="false"/>
+          <w:bCs w:val="false"/>
+        </w:rPr>
+        <w:t xml:space="preserve">ESO v tejto revízii označujeme ako plánovanú externú účtovú integráciu. V repozitári nebol nájdený dôkaz dokončenej produkčnej synchronizácie INDEXUS ↔ ESO; technické rozhranie, autentizácia, vlastníctvo číselných radov a pravidlá opráv treba potvrdiť samostatným integračným návrhom.</w:t>
+      </w:r>
+    </w:p>
+    <w:p>
+      <w:pPr>
+        <w:pStyle w:val="Heading2"/>
+        <w:keepNext/>
+        <w:spacing w:after="130" w:before="260"/>
+      </w:pPr>
+      <w:r>
         <w:t xml:space="preserve">Krok 0 — Potvrdiť východiskový stav</w:t>
       </w:r>
     </w:p>
@@ -4669,6 +5433,342 @@
           <w:bCs w:val="false"/>
         </w:rPr>
         <w:t xml:space="preserve">Pošlite výsledný TXT. Z neho sa doplní dátovo overená príloha: pokrytie cenníkov, priradenia zákazníkov, stavy zmlúv, väzby odberov, laboratórne výsledky a reálne používanie fakturácie. SELECTy nepotvrdzujú nasadenú verziu aplikácie, úspešnosť konkrétnych hovorov či doručenie SMS; to má samostatný prevádzkový dôkaz.</w:t>
+      </w:r>
+    </w:p>
+    <w:p>
+      <w:pPr>
+        <w:pStyle w:val="Heading2"/>
+        <w:keepNext/>
+        <w:spacing w:after="130" w:before="260"/>
+      </w:pPr>
+      <w:r>
+        <w:t xml:space="preserve">9.1 Prosba o aktuálny anonymizovaný výpis z Ubuntu</w:t>
+      </w:r>
+    </w:p>
+    <w:p>
+      <w:pPr>
+        <w:spacing w:after="110" w:line="265"/>
+      </w:pPr>
+      <w:r>
+        <w:rPr>
+          <w:rFonts w:ascii="Calibri" w:cs="Calibri" w:eastAsia="Calibri" w:hAnsi="Calibri"/>
+          <w:b w:val="false"/>
+          <w:bCs w:val="false"/>
+        </w:rPr>
+        <w:t xml:space="preserve">Prosím, spusti tento SQL súbor na Ubuntu serveri nad aktuálnou databázou a pošli späť iba výsledný TXT:</w:t>
+      </w:r>
+    </w:p>
+    <w:p>
+      <w:pPr>
+        <w:shd w:fill="F1F5F9"/>
+        <w:spacing w:after="30"/>
+      </w:pPr>
+      <w:r>
+        <w:rPr>
+          <w:rFonts w:ascii="Consolas" w:cs="Consolas" w:eastAsia="Consolas" w:hAnsi="Consolas"/>
+          <w:sz w:val="16"/>
+          <w:szCs w:val="16"/>
+        </w:rPr>
+        <w:t xml:space="preserve">psql -X -h localhost -U indexus -d indexus_crm -W -v ON_ERROR_STOP=1 \</w:t>
+      </w:r>
+    </w:p>
+    <w:p>
+      <w:pPr>
+        <w:shd w:fill="F1F5F9"/>
+        <w:spacing w:after="30"/>
+      </w:pPr>
+      <w:r>
+        <w:rPr>
+          <w:rFonts w:ascii="Consolas" w:cs="Consolas" w:eastAsia="Consolas" w:hAnsi="Consolas"/>
+          <w:sz w:val="16"/>
+          <w:szCs w:val="16"/>
+        </w:rPr>
+        <w:t xml:space="preserve">  -f indexus-overview-production-check.sql &gt; indexus-overview-production-check.txt</w:t>
+      </w:r>
+    </w:p>
+    <w:p>
+      <w:pPr>
+        <w:spacing w:after="110" w:line="265"/>
+      </w:pPr>
+      <w:r>
+        <w:rPr>
+          <w:rFonts w:ascii="Calibri" w:cs="Calibri" w:eastAsia="Calibri" w:hAnsi="Calibri"/>
+          <w:b w:val="false"/>
+          <w:bCs w:val="false"/>
+        </w:rPr>
+        <w:t xml:space="preserve">Ak súbor nie je v aktuálnom adresári, najprv ho bezpečne skopíruj na server. Heslo zadaj iba do interaktívnej výzvy psql; neposielaj ho do chatu, do príkazu ani do výstupu.</w:t>
+      </w:r>
+    </w:p>
+    <w:p>
+      <w:pPr>
+        <w:spacing w:after="110" w:line="265"/>
+      </w:pPr>
+      <w:r>
+        <w:rPr>
+          <w:rFonts w:ascii="Calibri" w:cs="Calibri" w:eastAsia="Calibri" w:hAnsi="Calibri"/>
+          <w:b w:val="false"/>
+          <w:bCs w:val="false"/>
+        </w:rPr>
+        <w:t xml:space="preserve">Výpis má obsahovať najmä:</w:t>
+      </w:r>
+    </w:p>
+    <w:p>
+      <w:pPr>
+        <w:pStyle w:val="ListParagraph"/>
+        <w:numPr>
+          <w:ilvl w:val="0"/>
+          <w:numId w:val="1"/>
+        </w:numPr>
+        <w:spacing w:after="110" w:line="265"/>
+      </w:pPr>
+      <w:r>
+        <w:rPr>
+          <w:rFonts w:ascii="Calibri" w:cs="Calibri" w:eastAsia="Calibri" w:hAnsi="Calibri"/>
+          <w:b w:val="false"/>
+          <w:bCs w:val="false"/>
+        </w:rPr>
+        <w:t xml:space="preserve">aktuálny celkový počet zákazníkov a rozdelenie podľa krajiny, </w:t>
+      </w:r>
+      <w:r>
+        <w:rPr>
+          <w:rFonts w:ascii="Consolas" w:cs="Consolas" w:eastAsia="Consolas" w:hAnsi="Consolas"/>
+          <w:b w:val="false"/>
+          <w:bCs w:val="false"/>
+        </w:rPr>
+        <w:t xml:space="preserve">status</w:t>
+      </w:r>
+      <w:r>
+        <w:rPr>
+          <w:rFonts w:ascii="Calibri" w:cs="Calibri" w:eastAsia="Calibri" w:hAnsi="Calibri"/>
+          <w:b w:val="false"/>
+          <w:bCs w:val="false"/>
+        </w:rPr>
+        <w:t xml:space="preserve">, </w:t>
+      </w:r>
+      <w:r>
+        <w:rPr>
+          <w:rFonts w:ascii="Consolas" w:cs="Consolas" w:eastAsia="Consolas" w:hAnsi="Consolas"/>
+          <w:b w:val="false"/>
+          <w:bCs w:val="false"/>
+        </w:rPr>
+        <w:t xml:space="preserve">client_status</w:t>
+      </w:r>
+      <w:r>
+        <w:rPr>
+          <w:rFonts w:ascii="Calibri" w:cs="Calibri" w:eastAsia="Calibri" w:hAnsi="Calibri"/>
+          <w:b w:val="false"/>
+          <w:bCs w:val="false"/>
+        </w:rPr>
+        <w:t xml:space="preserve"> a zdroja,</w:t>
+      </w:r>
+    </w:p>
+    <w:p>
+      <w:pPr>
+        <w:pStyle w:val="ListParagraph"/>
+        <w:numPr>
+          <w:ilvl w:val="0"/>
+          <w:numId w:val="1"/>
+        </w:numPr>
+        <w:spacing w:after="110" w:line="265"/>
+      </w:pPr>
+      <w:r>
+        <w:rPr>
+          <w:rFonts w:ascii="Calibri" w:cs="Calibri" w:eastAsia="Calibri" w:hAnsi="Calibri"/>
+          <w:b w:val="false"/>
+          <w:bCs w:val="false"/>
+        </w:rPr>
+        <w:t xml:space="preserve">počet zákazníkov s klinikou, spolupracovníkom, zdravotnou poisťovňou a prideleným používateľom,</w:t>
+      </w:r>
+    </w:p>
+    <w:p>
+      <w:pPr>
+        <w:pStyle w:val="ListParagraph"/>
+        <w:numPr>
+          <w:ilvl w:val="0"/>
+          <w:numId w:val="1"/>
+        </w:numPr>
+        <w:spacing w:after="110" w:line="265"/>
+      </w:pPr>
+      <w:r>
+        <w:rPr>
+          <w:rFonts w:ascii="Calibri" w:cs="Calibri" w:eastAsia="Calibri" w:hAnsi="Calibri"/>
+          <w:b w:val="false"/>
+          <w:bCs w:val="false"/>
+        </w:rPr>
+        <w:t xml:space="preserve">počet a stav zákazníckych produktov, poznámok, súhlasov, prípadov, dokumentov a pohľadávok,</w:t>
+      </w:r>
+    </w:p>
+    <w:p>
+      <w:pPr>
+        <w:pStyle w:val="ListParagraph"/>
+        <w:numPr>
+          <w:ilvl w:val="0"/>
+          <w:numId w:val="1"/>
+        </w:numPr>
+        <w:spacing w:after="110" w:line="265"/>
+      </w:pPr>
+      <w:r>
+        <w:rPr>
+          <w:rFonts w:ascii="Calibri" w:cs="Calibri" w:eastAsia="Calibri" w:hAnsi="Calibri"/>
+          <w:b w:val="false"/>
+          <w:bCs w:val="false"/>
+        </w:rPr>
+        <w:t xml:space="preserve">všetky kliniky agregovane podľa krajiny a aktivity,</w:t>
+      </w:r>
+    </w:p>
+    <w:p>
+      <w:pPr>
+        <w:pStyle w:val="ListParagraph"/>
+        <w:numPr>
+          <w:ilvl w:val="0"/>
+          <w:numId w:val="1"/>
+        </w:numPr>
+        <w:spacing w:after="110" w:line="265"/>
+      </w:pPr>
+      <w:r>
+        <w:rPr>
+          <w:rFonts w:ascii="Calibri" w:cs="Calibri" w:eastAsia="Calibri" w:hAnsi="Calibri"/>
+          <w:b w:val="false"/>
+          <w:bCs w:val="false"/>
+        </w:rPr>
+        <w:t xml:space="preserve">počet kliník s PZK/PZS kódom, ID ZZ, IČO, telefónom, e-mailom, GPS a reprezentantom,</w:t>
+      </w:r>
+    </w:p>
+    <w:p>
+      <w:pPr>
+        <w:pStyle w:val="ListParagraph"/>
+        <w:numPr>
+          <w:ilvl w:val="0"/>
+          <w:numId w:val="1"/>
+        </w:numPr>
+        <w:spacing w:after="110" w:line="265"/>
+      </w:pPr>
+      <w:r>
+        <w:rPr>
+          <w:rFonts w:ascii="Calibri" w:cs="Calibri" w:eastAsia="Calibri" w:hAnsi="Calibri"/>
+          <w:b w:val="false"/>
+          <w:bCs w:val="false"/>
+        </w:rPr>
+        <w:t xml:space="preserve">kliniky rozdelené podľa počiatočného stavu, záujmu o spoluprácu, záujmu o zmluvu a stavu zmluvy,</w:t>
+      </w:r>
+    </w:p>
+    <w:p>
+      <w:pPr>
+        <w:pStyle w:val="ListParagraph"/>
+        <w:numPr>
+          <w:ilvl w:val="0"/>
+          <w:numId w:val="1"/>
+        </w:numPr>
+        <w:spacing w:after="110" w:line="265"/>
+      </w:pPr>
+      <w:r>
+        <w:rPr>
+          <w:rFonts w:ascii="Calibri" w:cs="Calibri" w:eastAsia="Calibri" w:hAnsi="Calibri"/>
+          <w:b w:val="false"/>
+          <w:bCs w:val="false"/>
+        </w:rPr>
+        <w:t xml:space="preserve">nemocnice podľa krajiny/aktivity vrátane laboratória a reprezentanta,</w:t>
+      </w:r>
+    </w:p>
+    <w:p>
+      <w:pPr>
+        <w:pStyle w:val="ListParagraph"/>
+        <w:numPr>
+          <w:ilvl w:val="0"/>
+          <w:numId w:val="1"/>
+        </w:numPr>
+        <w:spacing w:after="110" w:line="265"/>
+      </w:pPr>
+      <w:r>
+        <w:rPr>
+          <w:rFonts w:ascii="Calibri" w:cs="Calibri" w:eastAsia="Calibri" w:hAnsi="Calibri"/>
+          <w:b w:val="false"/>
+          <w:bCs w:val="false"/>
+        </w:rPr>
+        <w:t xml:space="preserve">počet reprezentantských priradení, histórie, referrals, nemocničných sietí, členov sietí, udalostí a stavov spolupráce,</w:t>
+      </w:r>
+    </w:p>
+    <w:p>
+      <w:pPr>
+        <w:pStyle w:val="ListParagraph"/>
+        <w:numPr>
+          <w:ilvl w:val="0"/>
+          <w:numId w:val="1"/>
+        </w:numPr>
+        <w:spacing w:after="110" w:line="265"/>
+      </w:pPr>
+      <w:r>
+        <w:rPr>
+          <w:rFonts w:ascii="Calibri" w:cs="Calibri" w:eastAsia="Calibri" w:hAnsi="Calibri"/>
+          <w:b w:val="false"/>
+          <w:bCs w:val="false"/>
+        </w:rPr>
+        <w:t xml:space="preserve">spolupracovníkov podľa krajiny, aktivity a zdroja,</w:t>
+      </w:r>
+    </w:p>
+    <w:p>
+      <w:pPr>
+        <w:pStyle w:val="ListParagraph"/>
+        <w:numPr>
+          <w:ilvl w:val="0"/>
+          <w:numId w:val="1"/>
+        </w:numPr>
+        <w:spacing w:after="110" w:line="265"/>
+      </w:pPr>
+      <w:r>
+        <w:rPr>
+          <w:rFonts w:ascii="Calibri" w:cs="Calibri" w:eastAsia="Calibri" w:hAnsi="Calibri"/>
+          <w:b w:val="false"/>
+          <w:bCs w:val="false"/>
+        </w:rPr>
+        <w:t xml:space="preserve">cenníky, cenové priradenia, zmluvy, odbery, laboratórne výsledky, faktúry, položky, splátky a väzby,</w:t>
+      </w:r>
+    </w:p>
+    <w:p>
+      <w:pPr>
+        <w:pStyle w:val="ListParagraph"/>
+        <w:numPr>
+          <w:ilvl w:val="0"/>
+          <w:numId w:val="1"/>
+        </w:numPr>
+        <w:spacing w:after="110" w:line="265"/>
+      </w:pPr>
+      <w:r>
+        <w:rPr>
+          <w:rFonts w:ascii="Calibri" w:cs="Calibri" w:eastAsia="Calibri" w:hAnsi="Calibri"/>
+          <w:b w:val="false"/>
+          <w:bCs w:val="false"/>
+        </w:rPr>
+        <w:t xml:space="preserve">agregované počty záznamov označených ako import z ISCBC.</w:t>
+      </w:r>
+    </w:p>
+    <w:p>
+      <w:pPr>
+        <w:spacing w:after="110" w:line="265"/>
+      </w:pPr>
+      <w:r>
+        <w:rPr>
+          <w:rFonts w:ascii="Calibri" w:cs="Calibri" w:eastAsia="Calibri" w:hAnsi="Calibri"/>
+          <w:b w:val="false"/>
+          <w:bCs w:val="false"/>
+        </w:rPr>
+        <w:t xml:space="preserve">Skript nečíta mená, telefóny, e-maily, rodné čísla, bankové účty, texty poznámok, dokumentov, výsledkov, API kľúče ani heslá. </w:t>
+      </w:r>
+      <w:r>
+        <w:rPr>
+          <w:rFonts w:ascii="Consolas" w:cs="Consolas" w:eastAsia="Consolas" w:hAnsi="Consolas"/>
+          <w:b w:val="false"/>
+          <w:bCs w:val="false"/>
+        </w:rPr>
+        <w:t xml:space="preserve">SKIPPED</w:t>
+      </w:r>
+      <w:r>
+        <w:rPr>
+          <w:rFonts w:ascii="Calibri" w:cs="Calibri" w:eastAsia="Calibri" w:hAnsi="Calibri"/>
+          <w:b w:val="false"/>
+          <w:bCs w:val="false"/>
+        </w:rPr>
+        <w:t xml:space="preserve"> znamená chýbajúcu tabuľku alebo stĺpec, nie nulový počet. Po doručení TXT doplním do overview samostatnú dátovú prílohu s aktuálnymi počtami a zoznamom dátových medzier.</w:t>
       </w:r>
     </w:p>
     <w:p>
@@ -5356,6 +6456,328 @@
                 <w:bCs w:val="false"/>
               </w:rPr>
               <w:t xml:space="preserve">server/representative-routes.ts</w:t>
+            </w:r>
+            <w:r>
+              <w:rPr>
+                <w:rFonts w:ascii="Calibri" w:cs="Calibri" w:eastAsia="Calibri" w:hAnsi="Calibri"/>
+                <w:b w:val="false"/>
+                <w:bCs w:val="false"/>
+              </w:rPr>
+              <w:t xml:space="preserve">.</w:t>
+            </w:r>
+          </w:p>
+        </w:tc>
+      </w:tr>
+      <w:tr>
+        <w:trPr>
+          <w:tblHeader w:val="false"/>
+        </w:trPr>
+        <w:tc>
+          <w:tcPr>
+            <w:tcW w:type="pct" w:w="50%"/>
+            <w:shd w:fill="FFFFFF"/>
+            <w:tcMar>
+              <w:top w:type="dxa" w:w="85"/>
+              <w:left w:type="dxa" w:w="100"/>
+              <w:bottom w:type="dxa" w:w="85"/>
+              <w:right w:type="dxa" w:w="100"/>
+            </w:tcMar>
+          </w:tcPr>
+          <w:p>
+            <w:pPr>
+              <w:pStyle w:val="TableText"/>
+              <w:spacing w:after="60"/>
+            </w:pPr>
+            <w:r>
+              <w:rPr>
+                <w:rFonts w:ascii="Calibri" w:cs="Calibri" w:eastAsia="Calibri" w:hAnsi="Calibri"/>
+                <w:b w:val="false"/>
+                <w:bCs w:val="false"/>
+              </w:rPr>
+              <w:t xml:space="preserve">Customers</w:t>
+            </w:r>
+          </w:p>
+        </w:tc>
+        <w:tc>
+          <w:tcPr>
+            <w:tcW w:type="pct" w:w="50%"/>
+            <w:shd w:fill="FFFFFF"/>
+            <w:tcMar>
+              <w:top w:type="dxa" w:w="85"/>
+              <w:left w:type="dxa" w:w="100"/>
+              <w:bottom w:type="dxa" w:w="85"/>
+              <w:right w:type="dxa" w:w="100"/>
+            </w:tcMar>
+          </w:tcPr>
+          <w:p>
+            <w:pPr>
+              <w:pStyle w:val="TableText"/>
+              <w:spacing w:after="60"/>
+            </w:pPr>
+            <w:r>
+              <w:rPr>
+                <w:rFonts w:ascii="Consolas" w:cs="Consolas" w:eastAsia="Consolas" w:hAnsi="Consolas"/>
+                <w:b w:val="false"/>
+                <w:bCs w:val="false"/>
+              </w:rPr>
+              <w:t xml:space="preserve">client/src/pages/customers.tsx</w:t>
+            </w:r>
+            <w:r>
+              <w:rPr>
+                <w:rFonts w:ascii="Calibri" w:cs="Calibri" w:eastAsia="Calibri" w:hAnsi="Calibri"/>
+                <w:b w:val="false"/>
+                <w:bCs w:val="false"/>
+              </w:rPr>
+              <w:t xml:space="preserve">, </w:t>
+            </w:r>
+            <w:r>
+              <w:rPr>
+                <w:rFonts w:ascii="Consolas" w:cs="Consolas" w:eastAsia="Consolas" w:hAnsi="Consolas"/>
+                <w:b w:val="false"/>
+                <w:bCs w:val="false"/>
+              </w:rPr>
+              <w:t xml:space="preserve">client/src/components/customer-form.tsx</w:t>
+            </w:r>
+            <w:r>
+              <w:rPr>
+                <w:rFonts w:ascii="Calibri" w:cs="Calibri" w:eastAsia="Calibri" w:hAnsi="Calibri"/>
+                <w:b w:val="false"/>
+                <w:bCs w:val="false"/>
+              </w:rPr>
+              <w:t xml:space="preserve">, </w:t>
+            </w:r>
+            <w:r>
+              <w:rPr>
+                <w:rFonts w:ascii="Consolas" w:cs="Consolas" w:eastAsia="Consolas" w:hAnsi="Consolas"/>
+                <w:b w:val="false"/>
+                <w:bCs w:val="false"/>
+              </w:rPr>
+              <w:t xml:space="preserve">client/src/components/customer-form-wizard.tsx</w:t>
+            </w:r>
+            <w:r>
+              <w:rPr>
+                <w:rFonts w:ascii="Calibri" w:cs="Calibri" w:eastAsia="Calibri" w:hAnsi="Calibri"/>
+                <w:b w:val="false"/>
+                <w:bCs w:val="false"/>
+              </w:rPr>
+              <w:t xml:space="preserve">, zákaznícke endpointy v </w:t>
+            </w:r>
+            <w:r>
+              <w:rPr>
+                <w:rFonts w:ascii="Consolas" w:cs="Consolas" w:eastAsia="Consolas" w:hAnsi="Consolas"/>
+                <w:b w:val="false"/>
+                <w:bCs w:val="false"/>
+              </w:rPr>
+              <w:t xml:space="preserve">server/routes.ts</w:t>
+            </w:r>
+            <w:r>
+              <w:rPr>
+                <w:rFonts w:ascii="Calibri" w:cs="Calibri" w:eastAsia="Calibri" w:hAnsi="Calibri"/>
+                <w:b w:val="false"/>
+                <w:bCs w:val="false"/>
+              </w:rPr>
+              <w:t xml:space="preserve">, tabuľka </w:t>
+            </w:r>
+            <w:r>
+              <w:rPr>
+                <w:rFonts w:ascii="Consolas" w:cs="Consolas" w:eastAsia="Consolas" w:hAnsi="Consolas"/>
+                <w:b w:val="false"/>
+                <w:bCs w:val="false"/>
+              </w:rPr>
+              <w:t xml:space="preserve">customers</w:t>
+            </w:r>
+            <w:r>
+              <w:rPr>
+                <w:rFonts w:ascii="Calibri" w:cs="Calibri" w:eastAsia="Calibri" w:hAnsi="Calibri"/>
+                <w:b w:val="false"/>
+                <w:bCs w:val="false"/>
+              </w:rPr>
+              <w:t xml:space="preserve"> v </w:t>
+            </w:r>
+            <w:r>
+              <w:rPr>
+                <w:rFonts w:ascii="Consolas" w:cs="Consolas" w:eastAsia="Consolas" w:hAnsi="Consolas"/>
+                <w:b w:val="false"/>
+                <w:bCs w:val="false"/>
+              </w:rPr>
+              <w:t xml:space="preserve">shared/schema.ts</w:t>
+            </w:r>
+            <w:r>
+              <w:rPr>
+                <w:rFonts w:ascii="Calibri" w:cs="Calibri" w:eastAsia="Calibri" w:hAnsi="Calibri"/>
+                <w:b w:val="false"/>
+                <w:bCs w:val="false"/>
+              </w:rPr>
+              <w:t xml:space="preserve">.</w:t>
+            </w:r>
+          </w:p>
+        </w:tc>
+      </w:tr>
+      <w:tr>
+        <w:trPr>
+          <w:tblHeader w:val="false"/>
+        </w:trPr>
+        <w:tc>
+          <w:tcPr>
+            <w:tcW w:type="pct" w:w="50%"/>
+            <w:shd w:fill="FFFFFF"/>
+            <w:tcMar>
+              <w:top w:type="dxa" w:w="85"/>
+              <w:left w:type="dxa" w:w="100"/>
+              <w:bottom w:type="dxa" w:w="85"/>
+              <w:right w:type="dxa" w:w="100"/>
+            </w:tcMar>
+          </w:tcPr>
+          <w:p>
+            <w:pPr>
+              <w:pStyle w:val="TableText"/>
+              <w:spacing w:after="60"/>
+            </w:pPr>
+            <w:r>
+              <w:rPr>
+                <w:rFonts w:ascii="Calibri" w:cs="Calibri" w:eastAsia="Calibri" w:hAnsi="Calibri"/>
+                <w:b w:val="false"/>
+                <w:bCs w:val="false"/>
+              </w:rPr>
+              <w:t xml:space="preserve">Healthcare Network</w:t>
+            </w:r>
+          </w:p>
+        </w:tc>
+        <w:tc>
+          <w:tcPr>
+            <w:tcW w:type="pct" w:w="50%"/>
+            <w:shd w:fill="FFFFFF"/>
+            <w:tcMar>
+              <w:top w:type="dxa" w:w="85"/>
+              <w:left w:type="dxa" w:w="100"/>
+              <w:bottom w:type="dxa" w:w="85"/>
+              <w:right w:type="dxa" w:w="100"/>
+            </w:tcMar>
+          </w:tcPr>
+          <w:p>
+            <w:pPr>
+              <w:pStyle w:val="TableText"/>
+              <w:spacing w:after="60"/>
+            </w:pPr>
+            <w:r>
+              <w:rPr>
+                <w:rFonts w:ascii="Consolas" w:cs="Consolas" w:eastAsia="Consolas" w:hAnsi="Consolas"/>
+                <w:b w:val="false"/>
+                <w:bCs w:val="false"/>
+              </w:rPr>
+              <w:t xml:space="preserve">client/src/pages/medical-partner-network.tsx</w:t>
+            </w:r>
+            <w:r>
+              <w:rPr>
+                <w:rFonts w:ascii="Calibri" w:cs="Calibri" w:eastAsia="Calibri" w:hAnsi="Calibri"/>
+                <w:b w:val="false"/>
+                <w:bCs w:val="false"/>
+              </w:rPr>
+              <w:t xml:space="preserve">, </w:t>
+            </w:r>
+            <w:r>
+              <w:rPr>
+                <w:rFonts w:ascii="Consolas" w:cs="Consolas" w:eastAsia="Consolas" w:hAnsi="Consolas"/>
+                <w:b w:val="false"/>
+                <w:bCs w:val="false"/>
+              </w:rPr>
+              <w:t xml:space="preserve">client/src/pages/hospitals.tsx</w:t>
+            </w:r>
+            <w:r>
+              <w:rPr>
+                <w:rFonts w:ascii="Calibri" w:cs="Calibri" w:eastAsia="Calibri" w:hAnsi="Calibri"/>
+                <w:b w:val="false"/>
+                <w:bCs w:val="false"/>
+              </w:rPr>
+              <w:t xml:space="preserve">, </w:t>
+            </w:r>
+            <w:r>
+              <w:rPr>
+                <w:rFonts w:ascii="Consolas" w:cs="Consolas" w:eastAsia="Consolas" w:hAnsi="Consolas"/>
+                <w:b w:val="false"/>
+                <w:bCs w:val="false"/>
+              </w:rPr>
+              <w:t xml:space="preserve">client/src/pages/my-clinics.tsx</w:t>
+            </w:r>
+            <w:r>
+              <w:rPr>
+                <w:rFonts w:ascii="Calibri" w:cs="Calibri" w:eastAsia="Calibri" w:hAnsi="Calibri"/>
+                <w:b w:val="false"/>
+                <w:bCs w:val="false"/>
+              </w:rPr>
+              <w:t xml:space="preserve">, </w:t>
+            </w:r>
+            <w:r>
+              <w:rPr>
+                <w:rFonts w:ascii="Consolas" w:cs="Consolas" w:eastAsia="Consolas" w:hAnsi="Consolas"/>
+                <w:b w:val="false"/>
+                <w:bCs w:val="false"/>
+              </w:rPr>
+              <w:t xml:space="preserve">shared/medical-partner-filter.ts</w:t>
+            </w:r>
+            <w:r>
+              <w:rPr>
+                <w:rFonts w:ascii="Calibri" w:cs="Calibri" w:eastAsia="Calibri" w:hAnsi="Calibri"/>
+                <w:b w:val="false"/>
+                <w:bCs w:val="false"/>
+              </w:rPr>
+              <w:t xml:space="preserve">, </w:t>
+            </w:r>
+            <w:r>
+              <w:rPr>
+                <w:rFonts w:ascii="Consolas" w:cs="Consolas" w:eastAsia="Consolas" w:hAnsi="Consolas"/>
+                <w:b w:val="false"/>
+                <w:bCs w:val="false"/>
+              </w:rPr>
+              <w:t xml:space="preserve">server/representative-routes.ts</w:t>
+            </w:r>
+            <w:r>
+              <w:rPr>
+                <w:rFonts w:ascii="Calibri" w:cs="Calibri" w:eastAsia="Calibri" w:hAnsi="Calibri"/>
+                <w:b w:val="false"/>
+                <w:bCs w:val="false"/>
+              </w:rPr>
+              <w:t xml:space="preserve">, tabuľky </w:t>
+            </w:r>
+            <w:r>
+              <w:rPr>
+                <w:rFonts w:ascii="Consolas" w:cs="Consolas" w:eastAsia="Consolas" w:hAnsi="Consolas"/>
+                <w:b w:val="false"/>
+                <w:bCs w:val="false"/>
+              </w:rPr>
+              <w:t xml:space="preserve">clinics</w:t>
+            </w:r>
+            <w:r>
+              <w:rPr>
+                <w:rFonts w:ascii="Calibri" w:cs="Calibri" w:eastAsia="Calibri" w:hAnsi="Calibri"/>
+                <w:b w:val="false"/>
+                <w:bCs w:val="false"/>
+              </w:rPr>
+              <w:t xml:space="preserve">, </w:t>
+            </w:r>
+            <w:r>
+              <w:rPr>
+                <w:rFonts w:ascii="Consolas" w:cs="Consolas" w:eastAsia="Consolas" w:hAnsi="Consolas"/>
+                <w:b w:val="false"/>
+                <w:bCs w:val="false"/>
+              </w:rPr>
+              <w:t xml:space="preserve">hospitals</w:t>
+            </w:r>
+            <w:r>
+              <w:rPr>
+                <w:rFonts w:ascii="Calibri" w:cs="Calibri" w:eastAsia="Calibri" w:hAnsi="Calibri"/>
+                <w:b w:val="false"/>
+                <w:bCs w:val="false"/>
+              </w:rPr>
+              <w:t xml:space="preserve">, siete a stavové tabuľky v </w:t>
+            </w:r>
+            <w:r>
+              <w:rPr>
+                <w:rFonts w:ascii="Consolas" w:cs="Consolas" w:eastAsia="Consolas" w:hAnsi="Consolas"/>
+                <w:b w:val="false"/>
+                <w:bCs w:val="false"/>
+              </w:rPr>
+              <w:t xml:space="preserve">shared/schema.ts</w:t>
             </w:r>
             <w:r>
               <w:rPr>
@@ -9152,6 +10574,89 @@
                 <w:b w:val="false"/>
                 <w:bCs w:val="false"/>
               </w:rPr>
+              <w:t xml:space="preserve">Customers a Healthcare Network</w:t>
+            </w:r>
+          </w:p>
+        </w:tc>
+        <w:tc>
+          <w:tcPr>
+            <w:tcW w:type="pct" w:w="33.333333333333336%"/>
+            <w:shd w:fill="FFFFFF"/>
+            <w:tcMar>
+              <w:top w:type="dxa" w:w="85"/>
+              <w:left w:type="dxa" w:w="100"/>
+              <w:bottom w:type="dxa" w:w="85"/>
+              <w:right w:type="dxa" w:w="100"/>
+            </w:tcMar>
+          </w:tcPr>
+          <w:p>
+            <w:pPr>
+              <w:pStyle w:val="TableText"/>
+              <w:spacing w:after="60"/>
+            </w:pPr>
+            <w:r>
+              <w:rPr>
+                <w:rFonts w:ascii="Calibri" w:cs="Calibri" w:eastAsia="Calibri" w:hAnsi="Calibri"/>
+                <w:b w:val="false"/>
+                <w:bCs w:val="false"/>
+              </w:rPr>
+              <w:t xml:space="preserve">client/src/components/customer-form.tsx; client/src/pages/customers.tsx; shared/medical-partner-filter.test.ts; client/src/components/agent/priority-city-queue.node.test.ts; server/representative-routes.ts.</w:t>
+            </w:r>
+          </w:p>
+        </w:tc>
+        <w:tc>
+          <w:tcPr>
+            <w:tcW w:type="pct" w:w="33.333333333333336%"/>
+            <w:shd w:fill="FFFFFF"/>
+            <w:tcMar>
+              <w:top w:type="dxa" w:w="85"/>
+              <w:left w:type="dxa" w:w="100"/>
+              <w:bottom w:type="dxa" w:w="85"/>
+              <w:right w:type="dxa" w:w="100"/>
+            </w:tcMar>
+          </w:tcPr>
+          <w:p>
+            <w:pPr>
+              <w:pStyle w:val="TableText"/>
+              <w:spacing w:after="60"/>
+            </w:pPr>
+            <w:r>
+              <w:rPr>
+                <w:rFonts w:ascii="Calibri" w:cs="Calibri" w:eastAsia="Calibri" w:hAnsi="Calibri"/>
+                <w:b w:val="false"/>
+                <w:bCs w:val="false"/>
+              </w:rPr>
+              <w:t xml:space="preserve">Karta zákazníka, zdravotné/klinické väzby, spoločná logika filtrov a priradenie reprezentantov; aktuálna produkčná úplnosť sa overí agregovaným SQL výpisom.</w:t>
+            </w:r>
+          </w:p>
+        </w:tc>
+      </w:tr>
+      <w:tr>
+        <w:trPr>
+          <w:tblHeader w:val="false"/>
+        </w:trPr>
+        <w:tc>
+          <w:tcPr>
+            <w:tcW w:type="pct" w:w="33.333333333333336%"/>
+            <w:shd w:fill="FFFFFF"/>
+            <w:tcMar>
+              <w:top w:type="dxa" w:w="85"/>
+              <w:left w:type="dxa" w:w="100"/>
+              <w:bottom w:type="dxa" w:w="85"/>
+              <w:right w:type="dxa" w:w="100"/>
+            </w:tcMar>
+          </w:tcPr>
+          <w:p>
+            <w:pPr>
+              <w:pStyle w:val="TableText"/>
+              <w:spacing w:after="60"/>
+            </w:pPr>
+            <w:r>
+              <w:rPr>
+                <w:rFonts w:ascii="Calibri" w:cs="Calibri" w:eastAsia="Calibri" w:hAnsi="Calibri"/>
+                <w:b w:val="false"/>
+                <w:bCs w:val="false"/>
+              </w:rPr>
               <w:t xml:space="preserve">Migrácia</w:t>
             </w:r>
           </w:p>
@@ -9318,15 +10823,15 @@
           <w:b/>
           <w:bCs/>
         </w:rPr>
-        <w:t xml:space="preserve">Uzavrieť inventúru a rozhodnutia:</w:t>
-      </w:r>
-      <w:r>
-        <w:rPr>
-          <w:rFonts w:ascii="Calibri" w:cs="Calibri" w:eastAsia="Calibri" w:hAnsi="Calibri"/>
-          <w:b w:val="false"/>
-          <w:bCs w:val="false"/>
-        </w:rPr>
-        <w:t xml:space="preserve"> schváliť migračný katalóg, historické cenové pravidlá, otvorené domény a jednu autoritatívnu migračnú cestu. Získať aktuálne agregované údaje zo zdroja a cieľa.</w:t>
+        <w:t xml:space="preserve">Zjednotiť cenotvorbu a cenníkový modul:</w:t>
+      </w:r>
+      <w:r>
+        <w:rPr>
+          <w:rFonts w:ascii="Calibri" w:cs="Calibri" w:eastAsia="Calibri" w:hAnsi="Calibri"/>
+          <w:b w:val="false"/>
+          <w:bCs w:val="false"/>
+        </w:rPr>
+        <w:t xml:space="preserve"> dokončiť autoritatívny Pricing Engine V2 pre zákazníka, produkt, komponent, odber, skladné, zľavy, meny a splátky. Každá zmluva musí dostať konkrétnu cenovú verziu a nemenný položkový snapshot; až potom možno vypnúť legacy Products/Configurator.</w:t>
       </w:r>
     </w:p>
     <w:p>
@@ -9347,15 +10852,15 @@
           <w:b/>
           <w:bCs/>
         </w:rPr>
-        <w:t xml:space="preserve">Dokončiť obchodný základ:</w:t>
-      </w:r>
-      <w:r>
-        <w:rPr>
-          <w:rFonts w:ascii="Calibri" w:cs="Calibri" w:eastAsia="Calibri" w:hAnsi="Calibri"/>
-          <w:b w:val="false"/>
-          <w:bCs w:val="false"/>
-        </w:rPr>
-        <w:t xml:space="preserve"> priradiť V2 cenovú verziu zákazníkovi, uložiť záväzný cenový snapshot do zmluvy a zachovať historické ISCBC podmienky. Odstrániť závislosť nového predaja od legacy kalkulácie až po overení parity.</w:t>
+        <w:t xml:space="preserve">Dopracovať fakturáciu a spoluprácu s ESO:</w:t>
+      </w:r>
+      <w:r>
+        <w:rPr>
+          <w:rFonts w:ascii="Calibri" w:cs="Calibri" w:eastAsia="Calibri" w:hAnsi="Calibri"/>
+          <w:b w:val="false"/>
+          <w:bCs w:val="false"/>
+        </w:rPr>
+        <w:t xml:space="preserve"> uzavrieť API/exportnú cestu, mapovanie zákazníkov, firiem, DPH, účtov, číselných radov, položiek, úhrad, storna a dobropisov. Opakované odoslanie musí byť idempotentné a auditovateľné.</w:t>
       </w:r>
     </w:p>
     <w:p>
@@ -9376,15 +10881,15 @@
           <w:b/>
           <w:bCs/>
         </w:rPr>
-        <w:t xml:space="preserve">Prepojiť odber a laboratórium:</w:t>
-      </w:r>
-      <w:r>
-        <w:rPr>
-          <w:rFonts w:ascii="Calibri" w:cs="Calibri" w:eastAsia="Calibri" w:hAnsi="Calibri"/>
-          <w:b w:val="false"/>
-          <w:bCs w:val="false"/>
-        </w:rPr>
-        <w:t xml:space="preserve"> zjednotiť interné a externé spracovanie, identifikáciu odberu, autorizáciu, históriu a opravy výsledkov. Odovzdávať schválený výsledok do rovnakého cenového vyhodnotenia.</w:t>
+        <w:t xml:space="preserve">Dopracovať tvorbu zmlúv a templates:</w:t>
+      </w:r>
+      <w:r>
+        <w:rPr>
+          <w:rFonts w:ascii="Calibri" w:cs="Calibri" w:eastAsia="Calibri" w:hAnsi="Calibri"/>
+          <w:b w:val="false"/>
+          <w:bCs w:val="false"/>
+        </w:rPr>
+        <w:t xml:space="preserve"> vytváranie zmluvy, jazykové a krajinné šablóny, podpisová verzia, placeholdery a fakturačné podmienky musia používať schválený V2 snapshot. Podpísané zmluvy a vydané faktúry sa nesmú spätne prepisovať.</w:t>
       </w:r>
     </w:p>
     <w:p>
@@ -9405,15 +10910,15 @@
           <w:b/>
           <w:bCs/>
         </w:rPr>
-        <w:t xml:space="preserve">Dokončiť finančný cyklus:</w:t>
-      </w:r>
-      <w:r>
-        <w:rPr>
-          <w:rFonts w:ascii="Calibri" w:cs="Calibri" w:eastAsia="Calibri" w:hAnsi="Calibri"/>
-          <w:b w:val="false"/>
-          <w:bCs w:val="false"/>
-        </w:rPr>
-        <w:t xml:space="preserve"> vytvárať faktúry a položky zo schváleného zmluvného/výsledkového podkladu; zabezpečiť meny, dane, splátky, skladné, úhrady, opravné doklady a idempotenciu.</w:t>
+        <w:t xml:space="preserve">Prepojiť laboratórny modul:</w:t>
+      </w:r>
+      <w:r>
+        <w:rPr>
+          <w:rFonts w:ascii="Calibri" w:cs="Calibri" w:eastAsia="Calibri" w:hAnsi="Calibri"/>
+          <w:b w:val="false"/>
+          <w:bCs w:val="false"/>
+        </w:rPr>
+        <w:t xml:space="preserve"> po autorizovanom výsledku zjednotiť internú a externú validáciu, vyhodnotiť skutočne dodanú službu cez rovnaký engine a vytvoriť schválený fakturačný podklad s históriou opráv.</w:t>
       </w:r>
     </w:p>
     <w:p>
@@ -9434,15 +10939,15 @@
           <w:b/>
           <w:bCs/>
         </w:rPr>
-        <w:t xml:space="preserve">Dokončiť a nacvičiť migráciu:</w:t>
-      </w:r>
-      <w:r>
-        <w:rPr>
-          <w:rFonts w:ascii="Calibri" w:cs="Calibri" w:eastAsia="Calibri" w:hAnsi="Calibri"/>
-          <w:b w:val="false"/>
-          <w:bCs w:val="false"/>
-        </w:rPr>
-        <w:t xml:space="preserve"> preniesť schválené dáta aj súbory, doplniť väzby a chýbajúce mapovania, otestovať opakovanie importu a preukázať zhodu počtov, financií a historických podmienok.</w:t>
+        <w:t xml:space="preserve">Dokončiť a nacvičiť migráciu ISCBC:</w:t>
+      </w:r>
+      <w:r>
+        <w:rPr>
+          <w:rFonts w:ascii="Calibri" w:cs="Calibri" w:eastAsia="Calibri" w:hAnsi="Calibri"/>
+          <w:b w:val="false"/>
+          <w:bCs w:val="false"/>
+        </w:rPr>
+        <w:t xml:space="preserve"> schváliť katalóg, preniesť dáta aj prílohy, doplniť väzby a mapovania, otestovať opakovanie, vykonať zdrojovo-cieľovú reconciliáciu a pripraviť delta prenos.</w:t>
       </w:r>
     </w:p>
     <w:p>
@@ -9471,7 +10976,7 @@
           <w:b w:val="false"/>
           <w:bCs w:val="false"/>
         </w:rPr>
-        <w:t xml:space="preserve"> overiť nový aj migrovaný prípad od kontaktu a hovoru cez zmluvu, odber a výsledok až po faktúru a úhradu. Uzavrieť blokujúce nálezy a odovzdať testovací protokol.</w:t>
+        <w:t xml:space="preserve"> overiť nový aj migrovaný prípad od Customers/Healthcare Network cez komunikáciu, zmluvu, odber, výsledok, faktúru a úhradu. Uzavrieť blokujúce nálezy a odovzdať protokol.</w:t>
       </w:r>
     </w:p>
     <w:p>
@@ -9500,7 +11005,7 @@
           <w:b w:val="false"/>
           <w:bCs w:val="false"/>
         </w:rPr>
-        <w:t xml:space="preserve"> vykonať finálny prenos zmien, povoliť jediný zapisujúci systém, pripraviť obnovu, monitoring, používateľské návody a dočasný read-only prístup k legacy archívu.</w:t>
+        <w:t xml:space="preserve"> povoliť jediný zapisujúci systém, zachovať ISCBC dočasne read-only, monitorovať väzby a financie a mať nacvičený rollback bez straty nových INDEXUS zmien.</w:t>
       </w:r>
     </w:p>
     <w:p>
@@ -9588,7 +11093,7 @@
         <w:sz w:val="16"/>
         <w:szCs w:val="16"/>
       </w:rPr>
-      <w:t xml:space="preserve">INDEXUS • 14. 9. 2026 | </w:t>
+      <w:t xml:space="preserve">INDEXUS • 16. 9. 2026 | </w:t>
     </w:r>
     <w:r>
       <w:rPr>

</xml_diff>

<commit_message>
Update project overview documentation and metadata
Replit-Commit-Author: Agent
</commit_message>
<xml_diff>
--- a/indexus_overview.docx
+++ b/indexus_overview.docx
@@ -9,7 +9,7 @@
         <w:spacing w:after="130" w:before="100"/>
       </w:pPr>
       <w:r>
-        <w:t xml:space="preserve">INDEXUS CRM — Aktuálny prehľad a plán dokončenia</w:t>
+        <w:t xml:space="preserve">INDEXUS CRM — Manažérsky prehľad aktuálneho stavu</w:t>
       </w:r>
     </w:p>
     <w:p>
@@ -53,7 +53,7 @@
           <w:b w:val="false"/>
           <w:bCs w:val="false"/>
         </w:rPr>
-        <w:t xml:space="preserve"> revízia oproti májovému prehľadu; aktuálna implementácia CRM, Nexus Pulse, Mission, obchodno-laboratórneho procesu a kompletný plán migrácie ISCBC.</w:t>
+        <w:t xml:space="preserve"> stav CRM, agentúrneho pracoviska, Healthcare Network, obchodno-laboratórneho reťazca a migrácie ISCBC → INDEXUS.</w:t>
       </w:r>
     </w:p>
     <w:p>
@@ -75,7 +75,7 @@
           <w:b w:val="false"/>
           <w:bCs w:val="false"/>
         </w:rPr>
-        <w:t xml:space="preserve"> aktuálny zdrojový kód, vykonané cielené regresné overenia a existujúce testovacie rutiny, stavový dokument Pricing Engine V2 a dokumentácia migrácie ISCBC → INDEXUS.</w:t>
+        <w:t xml:space="preserve"> aktuálny zdrojový kód, cielené regresné overenia, testovacie rutiny, migračná dokumentácia a anonymizovaný read-only výpis z produkcie.</w:t>
       </w:r>
     </w:p>
     <w:p>
@@ -89,15 +89,31 @@
           <w:b/>
           <w:bCs/>
         </w:rPr>
-        <w:t xml:space="preserve">Produkčné dáta:</w:t>
-      </w:r>
-      <w:r>
-        <w:rPr>
-          <w:rFonts w:ascii="Calibri" w:cs="Calibri" w:eastAsia="Calibri" w:hAnsi="Calibri"/>
-          <w:b w:val="false"/>
-          <w:bCs w:val="false"/>
-        </w:rPr>
-        <w:t xml:space="preserve"> v tejto revízii nebol vykonaný prístup na CORPCRM01 ani SQL dotazy proti produkcii. Staré počty nie sú aktuálnym stavom.</w:t>
+        <w:t xml:space="preserve">Produkčný stav:</w:t>
+      </w:r>
+      <w:r>
+        <w:rPr>
+          <w:rFonts w:ascii="Calibri" w:cs="Calibri" w:eastAsia="Calibri" w:hAnsi="Calibri"/>
+          <w:b w:val="false"/>
+          <w:bCs w:val="false"/>
+        </w:rPr>
+        <w:t xml:space="preserve"> agregovaný výpis bol vykonaný 16. 9. 2026 o 09:22:11 UTC; databáza bola v režime </w:t>
+      </w:r>
+      <w:r>
+        <w:rPr>
+          <w:rFonts w:ascii="Consolas" w:cs="Consolas" w:eastAsia="Consolas" w:hAnsi="Consolas"/>
+          <w:b w:val="false"/>
+          <w:bCs w:val="false"/>
+        </w:rPr>
+        <w:t xml:space="preserve">read_only = on</w:t>
+      </w:r>
+      <w:r>
+        <w:rPr>
+          <w:rFonts w:ascii="Calibri" w:cs="Calibri" w:eastAsia="Calibri" w:hAnsi="Calibri"/>
+          <w:b w:val="false"/>
+          <w:bCs w:val="false"/>
+        </w:rPr>
+        <w:t xml:space="preserve">.</w:t>
       </w:r>
     </w:p>
     <w:p>
@@ -120,75 +136,93 @@
           <w:b w:val="false"/>
           <w:bCs w:val="false"/>
         </w:rPr>
-        <w:t xml:space="preserve">INDEXUS už nie je iba evidencia zákazníkov a historických zmlúv. Obsahuje funkčné agentúrne pracovisko Nexus Pulse, riadenie práce cez Mission, prichádzajúce aj odchádzajúce volania, fronty, callbacky, nahrávanie a nadväzujúcu komunikáciu. </w:t>
-      </w:r>
+        <w:t xml:space="preserve">INDEXUS je funkčne rozsiahly CRM systém, nie iba evidencia historických zákazníkov. Má agentúrne pracovisko Nexus Pulse a Mission, telefonickú a SMS komunikáciu, Customers, Healthcare Network, Back Office, Pricing Engine V2, zmluvy, odbery, laboratórne výsledky a základ fakturácie. Kľúčové mechanizmy pracoviska a Priority Builder boli overené cielenými regresnými rutinami.</w:t>
+      </w:r>
+    </w:p>
+    <w:p>
+      <w:pPr>
+        <w:spacing w:after="110" w:line="265"/>
+      </w:pPr>
       <w:r>
         <w:rPr>
           <w:rFonts w:ascii="Calibri" w:cs="Calibri" w:eastAsia="Calibri" w:hAnsi="Calibri"/>
           <w:b/>
           <w:bCs/>
         </w:rPr>
-        <w:t xml:space="preserve">Nexus Pulse a Mission boli implementované; ich kľúčové mechanizmy boli overované sadou testovacích rutín.</w:t>
-      </w:r>
-      <w:r>
-        <w:rPr>
-          <w:rFonts w:ascii="Calibri" w:cs="Calibri" w:eastAsia="Calibri" w:hAnsi="Calibri"/>
-          <w:b w:val="false"/>
-          <w:bCs w:val="false"/>
-        </w:rPr>
-        <w:t xml:space="preserve"> Cielené vykonané regresné overenia, rozsah automatizovaných scenárov a limity testov sú uvedené v kapitole 12. Implementácia bola porovnaná s aktuálnym kódom.</w:t>
-      </w:r>
-    </w:p>
-    <w:p>
-      <w:pPr>
-        <w:spacing w:after="110" w:line="265"/>
-      </w:pPr>
-      <w:r>
-        <w:rPr>
-          <w:rFonts w:ascii="Calibri" w:cs="Calibri" w:eastAsia="Calibri" w:hAnsi="Calibri"/>
-          <w:b w:val="false"/>
-          <w:bCs w:val="false"/>
-        </w:rPr>
-        <w:t xml:space="preserve">Najnovšie opravy v repozitári však nie sú automaticky dôkazom ich nasadenia na produkciu. Tento dokument nie je záznamom nového produkčného akceptačného testu a neoznačuje všetky krajiny, brány či externých partnerov za nezávisle otestovaných.</w:t>
-      </w:r>
-    </w:p>
-    <w:p>
-      <w:pPr>
-        <w:spacing w:after="110" w:line="265"/>
-      </w:pPr>
+        <w:t xml:space="preserve">Celkový stav k dnešnému dňu:</w:t>
+      </w:r>
+      <w:r>
+        <w:rPr>
+          <w:rFonts w:ascii="Calibri" w:cs="Calibri" w:eastAsia="Calibri" w:hAnsi="Calibri"/>
+          <w:b w:val="false"/>
+          <w:bCs w:val="false"/>
+        </w:rPr>
+        <w:t xml:space="preserve"> prevádzkové CRM a komunikačné jadro je implementované. Obchodno-finančný reťazec však ešte nie je uzavretý ako jeden auditovateľný proces. Najväčšia medzera je medzi cenou, zmluvou, odberom, výsledkom a faktúrou. Migrácia ISCBC má pripravené skripty a rozsah, ale nie je produkčne dokončená bez zdrojovo-cieľovej reconciliácie.</w:t>
+      </w:r>
+    </w:p>
+    <w:p>
+      <w:pPr>
+        <w:spacing w:after="110" w:line="265"/>
+      </w:pPr>
+      <w:r>
+        <w:rPr>
+          <w:rFonts w:ascii="Calibri" w:cs="Calibri" w:eastAsia="Calibri" w:hAnsi="Calibri"/>
+          <w:b w:val="false"/>
+          <w:bCs w:val="false"/>
+        </w:rPr>
+        <w:t xml:space="preserve">Z produkčných agregácií vyplýva, že databáza obsahuje rozsiahlu historickú bázu, ale aj otvorené väzby: 165 463 zákazníkov, 10 080 kliník, 1 213 nemocníc, 198 167 odberov, 197 850 laboratórnych výsledkov, 236 935 zmlúv a 0 faktúr. Pricing V2 má cenníky a pravidlá, ale zatiaľ nemá priradenia zákazníkov.</w:t>
+      </w:r>
+    </w:p>
+    <w:p>
+      <w:pPr>
+        <w:pStyle w:val="Heading2"/>
+        <w:keepNext/>
+        <w:spacing w:after="130" w:before="260"/>
+      </w:pPr>
+      <w:r>
+        <w:t xml:space="preserve">Priorita dokončenia</w:t>
+      </w:r>
+    </w:p>
+    <w:p>
+      <w:pPr>
+        <w:spacing w:after="110" w:line="265"/>
+      </w:pPr>
+      <w:r>
+        <w:rPr>
+          <w:rFonts w:ascii="Calibri" w:cs="Calibri" w:eastAsia="Calibri" w:hAnsi="Calibri"/>
+          <w:b w:val="false"/>
+          <w:bCs w:val="false"/>
+        </w:rPr>
+        <w:t xml:space="preserve">1. </w:t>
+      </w:r>
       <w:r>
         <w:rPr>
           <w:rFonts w:ascii="Calibri" w:cs="Calibri" w:eastAsia="Calibri" w:hAnsi="Calibri"/>
           <w:b/>
           <w:bCs/>
         </w:rPr>
-        <w:t xml:space="preserve">Nasledujúca hlavná etapa je obchodný a laboratórny reťazec:</w:t>
-      </w:r>
-    </w:p>
-    <w:p>
-      <w:pPr>
-        <w:spacing w:after="110" w:line="265"/>
-      </w:pPr>
-      <w:r>
-        <w:rPr>
-          <w:rFonts w:ascii="Calibri" w:cs="Calibri" w:eastAsia="Calibri" w:hAnsi="Calibri"/>
-          <w:b w:val="false"/>
-          <w:bCs w:val="false"/>
-        </w:rPr>
-        <w:t xml:space="preserve">Nový cenník produktov a služieb → pridelenie verzie cenníka zákazníkovi → zmluva s uloženou cenou → odber → laboratórny výsledok → vyhodnotenie skutočne dodaných služieb → faktúra/splátky/skladné → úhrada a kontrola.</w:t>
-      </w:r>
-    </w:p>
-    <w:p>
-      <w:pPr>
-        <w:spacing w:after="110" w:line="265"/>
-      </w:pPr>
-      <w:r>
-        <w:rPr>
-          <w:rFonts w:ascii="Calibri" w:cs="Calibri" w:eastAsia="Calibri" w:hAnsi="Calibri"/>
-          <w:b w:val="false"/>
-          <w:bCs w:val="false"/>
-        </w:rPr>
-        <w:t xml:space="preserve">Nový Pricing Engine V2, zmluvný modul, fakturačný modul a Laboratory Connect už majú implementované významné časti. </w:t>
+        <w:t xml:space="preserve">Zjednotiť cenotvorbu:</w:t>
+      </w:r>
+      <w:r>
+        <w:rPr>
+          <w:rFonts w:ascii="Calibri" w:cs="Calibri" w:eastAsia="Calibri" w:hAnsi="Calibri"/>
+          <w:b w:val="false"/>
+          <w:bCs w:val="false"/>
+        </w:rPr>
+        <w:t xml:space="preserve"> Pricing Engine V2 musí byť autoritatívnym zdrojom ceny pre zákazníka, produkt, odber, zmluvu a faktúru; podpísané dokumenty musia mať nemenný cenový snapshot.</w:t>
+      </w:r>
+    </w:p>
+    <w:p>
+      <w:pPr>
+        <w:spacing w:after="110" w:line="265"/>
+      </w:pPr>
+      <w:r>
+        <w:rPr>
+          <w:rFonts w:ascii="Calibri" w:cs="Calibri" w:eastAsia="Calibri" w:hAnsi="Calibri"/>
+          <w:b w:val="false"/>
+          <w:bCs w:val="false"/>
+        </w:rPr>
+        <w:t xml:space="preserve">2. </w:t>
       </w:r>
       <w:r>
         <w:rPr>
@@ -196,15 +230,152 @@
           <w:b/>
           <w:bCs/>
         </w:rPr>
-        <w:t xml:space="preserve">Ešte však nejde o jeden dokončený automatizovaný proces.</w:t>
-      </w:r>
-      <w:r>
-        <w:rPr>
-          <w:rFonts w:ascii="Calibri" w:cs="Calibri" w:eastAsia="Calibri" w:hAnsi="Calibri"/>
-          <w:b w:val="false"/>
-          <w:bCs w:val="false"/>
-        </w:rPr>
-        <w:t xml:space="preserve"> Prioritou nie je vytvoriť ďalšiu kalkulačku, ale prepojiť existujúce moduly tak, aby používali rovnaké identifikátory, pravidlá a nemenné cenové podklady.</w:t>
+        <w:t xml:space="preserve">Uzavrieť obchodný reťazec:</w:t>
+      </w:r>
+      <w:r>
+        <w:rPr>
+          <w:rFonts w:ascii="Calibri" w:cs="Calibri" w:eastAsia="Calibri" w:hAnsi="Calibri"/>
+          <w:b w:val="false"/>
+          <w:bCs w:val="false"/>
+        </w:rPr>
+        <w:t xml:space="preserve"> prepojiť Customers, Contracts, Collections, Laboratory Connect a Invoicing na rovnaké identifikátory a pravidlá.</w:t>
+      </w:r>
+    </w:p>
+    <w:p>
+      <w:pPr>
+        <w:spacing w:after="110" w:line="265"/>
+      </w:pPr>
+      <w:r>
+        <w:rPr>
+          <w:rFonts w:ascii="Calibri" w:cs="Calibri" w:eastAsia="Calibri" w:hAnsi="Calibri"/>
+          <w:b w:val="false"/>
+          <w:bCs w:val="false"/>
+        </w:rPr>
+        <w:t xml:space="preserve">3. </w:t>
+      </w:r>
+      <w:r>
+        <w:rPr>
+          <w:rFonts w:ascii="Calibri" w:cs="Calibri" w:eastAsia="Calibri" w:hAnsi="Calibri"/>
+          <w:b/>
+          <w:bCs/>
+        </w:rPr>
+        <w:t xml:space="preserve">Dopracovať fakturáciu a ESO:</w:t>
+      </w:r>
+      <w:r>
+        <w:rPr>
+          <w:rFonts w:ascii="Calibri" w:cs="Calibri" w:eastAsia="Calibri" w:hAnsi="Calibri"/>
+          <w:b w:val="false"/>
+          <w:bCs w:val="false"/>
+        </w:rPr>
+        <w:t xml:space="preserve"> dokončiť export/API, DPH, položky, úhrady, storno, dobropisy a idempotentné opakovanie.</w:t>
+      </w:r>
+    </w:p>
+    <w:p>
+      <w:pPr>
+        <w:spacing w:after="110" w:line="265"/>
+      </w:pPr>
+      <w:r>
+        <w:rPr>
+          <w:rFonts w:ascii="Calibri" w:cs="Calibri" w:eastAsia="Calibri" w:hAnsi="Calibri"/>
+          <w:b w:val="false"/>
+          <w:bCs w:val="false"/>
+        </w:rPr>
+        <w:t xml:space="preserve">4. </w:t>
+      </w:r>
+      <w:r>
+        <w:rPr>
+          <w:rFonts w:ascii="Calibri" w:cs="Calibri" w:eastAsia="Calibri" w:hAnsi="Calibri"/>
+          <w:b/>
+          <w:bCs/>
+        </w:rPr>
+        <w:t xml:space="preserve">Dokončiť zmluvy a templates:</w:t>
+      </w:r>
+      <w:r>
+        <w:rPr>
+          <w:rFonts w:ascii="Calibri" w:cs="Calibri" w:eastAsia="Calibri" w:hAnsi="Calibri"/>
+          <w:b w:val="false"/>
+          <w:bCs w:val="false"/>
+        </w:rPr>
+        <w:t xml:space="preserve"> schválené krajinné a jazykové šablóny musia používať V2 snapshot.</w:t>
+      </w:r>
+    </w:p>
+    <w:p>
+      <w:pPr>
+        <w:spacing w:after="110" w:line="265"/>
+      </w:pPr>
+      <w:r>
+        <w:rPr>
+          <w:rFonts w:ascii="Calibri" w:cs="Calibri" w:eastAsia="Calibri" w:hAnsi="Calibri"/>
+          <w:b w:val="false"/>
+          <w:bCs w:val="false"/>
+        </w:rPr>
+        <w:t xml:space="preserve">5. </w:t>
+      </w:r>
+      <w:r>
+        <w:rPr>
+          <w:rFonts w:ascii="Calibri" w:cs="Calibri" w:eastAsia="Calibri" w:hAnsi="Calibri"/>
+          <w:b/>
+          <w:bCs/>
+        </w:rPr>
+        <w:t xml:space="preserve">Reconciliovať a riadiť migráciu ISCBC:</w:t>
+      </w:r>
+      <w:r>
+        <w:rPr>
+          <w:rFonts w:ascii="Calibri" w:cs="Calibri" w:eastAsia="Calibri" w:hAnsi="Calibri"/>
+          <w:b w:val="false"/>
+          <w:bCs w:val="false"/>
+        </w:rPr>
+        <w:t xml:space="preserve"> potvrdiť identity, historické väzby, prílohy, delta prenos, rollback a finančnú kontrolu.</w:t>
+      </w:r>
+    </w:p>
+    <w:p>
+      <w:pPr>
+        <w:spacing w:after="110" w:line="265"/>
+      </w:pPr>
+      <w:r>
+        <w:rPr>
+          <w:rFonts w:ascii="Calibri" w:cs="Calibri" w:eastAsia="Calibri" w:hAnsi="Calibri"/>
+          <w:b w:val="false"/>
+          <w:bCs w:val="false"/>
+        </w:rPr>
+        <w:t xml:space="preserve">6. </w:t>
+      </w:r>
+      <w:r>
+        <w:rPr>
+          <w:rFonts w:ascii="Calibri" w:cs="Calibri" w:eastAsia="Calibri" w:hAnsi="Calibri"/>
+          <w:b/>
+          <w:bCs/>
+        </w:rPr>
+        <w:t xml:space="preserve">Pilot a prepnutie:</w:t>
+      </w:r>
+      <w:r>
+        <w:rPr>
+          <w:rFonts w:ascii="Calibri" w:cs="Calibri" w:eastAsia="Calibri" w:hAnsi="Calibri"/>
+          <w:b w:val="false"/>
+          <w:bCs w:val="false"/>
+        </w:rPr>
+        <w:t xml:space="preserve"> overiť nový aj migrovaný prípad od zákazníka po úhradu, potom zaviesť riadený prechod s dočasným read-only režimom ISCBC.</w:t>
+      </w:r>
+    </w:p>
+    <w:p>
+      <w:pPr>
+        <w:spacing w:after="110" w:line="265"/>
+      </w:pPr>
+      <w:r>
+        <w:rPr>
+          <w:rFonts w:ascii="Calibri" w:cs="Calibri" w:eastAsia="Calibri" w:hAnsi="Calibri"/>
+          <w:b/>
+          <w:bCs/>
+        </w:rPr>
+        <w:t xml:space="preserve">Manažérsky záver:</w:t>
+      </w:r>
+      <w:r>
+        <w:rPr>
+          <w:rFonts w:ascii="Calibri" w:cs="Calibri" w:eastAsia="Calibri" w:hAnsi="Calibri"/>
+          <w:b w:val="false"/>
+          <w:bCs w:val="false"/>
+        </w:rPr>
+        <w:t xml:space="preserve"> projekt nie je pred novým vývojom CRM od začiatku. Je v etape integrácie, dátového čistenia, finančného napojenia a riadeného prechodu do plnej prevádzky. Za dokončený ho možno označiť až po úspešnom end-to-end pilote, reconciliácii a nacvičenej obnove.</w:t>
       </w:r>
     </w:p>
     <w:p>
@@ -342,7 +513,7 @@
                 <w:b w:val="false"/>
                 <w:bCs w:val="false"/>
               </w:rPr>
-              <w:t xml:space="preserve">Funkcia existuje a jej konkrétne scenáre boli overené vykonanými testami; rozsah a výsledky sú uvedené v kapitole 12. Neznamená to univerzálnu produkčnú akceptáciu.</w:t>
+              <w:t xml:space="preserve">Funkcia existuje a jej konkrétne scenáre boli overené; nejde o univerzálnu produkčnú akceptáciu.</w:t>
             </w:r>
           </w:p>
         </w:tc>
@@ -686,33 +857,33 @@
                 <w:b w:val="false"/>
                 <w:bCs w:val="false"/>
               </w:rPr>
-              <w:t xml:space="preserve">Implementované a cielene testované; podrobnosti v kapitole 12</w:t>
-            </w:r>
-          </w:p>
-        </w:tc>
-        <w:tc>
-          <w:tcPr>
-            <w:tcW w:type="pct" w:w="33.333333333333336%"/>
-            <w:shd w:fill="FFFFFF"/>
-            <w:tcMar>
-              <w:top w:type="dxa" w:w="85"/>
-              <w:left w:type="dxa" w:w="100"/>
-              <w:bottom w:type="dxa" w:w="85"/>
-              <w:right w:type="dxa" w:w="100"/>
-            </w:tcMar>
-          </w:tcPr>
-          <w:p>
-            <w:pPr>
-              <w:pStyle w:val="TableText"/>
-              <w:spacing w:after="60"/>
-            </w:pPr>
-            <w:r>
-              <w:rPr>
-                <w:rFonts w:ascii="Calibri" w:cs="Calibri" w:eastAsia="Calibri" w:hAnsi="Calibri"/>
-                <w:b w:val="false"/>
-                <w:bCs w:val="false"/>
-              </w:rPr>
-              <w:t xml:space="preserve">Prevádzkové monitorovanie, priebežné opravy, potvrdenie nasadenia posledných zmien.</w:t>
+              <w:t xml:space="preserve">Implementované a cielene testované</w:t>
+            </w:r>
+          </w:p>
+        </w:tc>
+        <w:tc>
+          <w:tcPr>
+            <w:tcW w:type="pct" w:w="33.333333333333336%"/>
+            <w:shd w:fill="FFFFFF"/>
+            <w:tcMar>
+              <w:top w:type="dxa" w:w="85"/>
+              <w:left w:type="dxa" w:w="100"/>
+              <w:bottom w:type="dxa" w:w="85"/>
+              <w:right w:type="dxa" w:w="100"/>
+            </w:tcMar>
+          </w:tcPr>
+          <w:p>
+            <w:pPr>
+              <w:pStyle w:val="TableText"/>
+              <w:spacing w:after="60"/>
+            </w:pPr>
+            <w:r>
+              <w:rPr>
+                <w:rFonts w:ascii="Calibri" w:cs="Calibri" w:eastAsia="Calibri" w:hAnsi="Calibri"/>
+                <w:b w:val="false"/>
+                <w:bCs w:val="false"/>
+              </w:rPr>
+              <w:t xml:space="preserve">Prevádzkové monitorovanie a potvrdenie nasadenia posledných zmien.</w:t>
             </w:r>
           </w:p>
         </w:tc>
@@ -935,33 +1106,33 @@
                 <w:b w:val="false"/>
                 <w:bCs w:val="false"/>
               </w:rPr>
-              <w:t xml:space="preserve">Implementované karty, evidencie, vzťahy a pracovné postupy; podrobnosti v kapitole 2</w:t>
-            </w:r>
-          </w:p>
-        </w:tc>
-        <w:tc>
-          <w:tcPr>
-            <w:tcW w:type="pct" w:w="33.333333333333336%"/>
-            <w:shd w:fill="FFFFFF"/>
-            <w:tcMar>
-              <w:top w:type="dxa" w:w="85"/>
-              <w:left w:type="dxa" w:w="100"/>
-              <w:bottom w:type="dxa" w:w="85"/>
-              <w:right w:type="dxa" w:w="100"/>
-            </w:tcMar>
-          </w:tcPr>
-          <w:p>
-            <w:pPr>
-              <w:pStyle w:val="TableText"/>
-              <w:spacing w:after="60"/>
-            </w:pPr>
-            <w:r>
-              <w:rPr>
-                <w:rFonts w:ascii="Calibri" w:cs="Calibri" w:eastAsia="Calibri" w:hAnsi="Calibri"/>
-                <w:b w:val="false"/>
-                <w:bCs w:val="false"/>
-              </w:rPr>
-              <w:t xml:space="preserve">Aktuálne produkčné počty a úplnosť väzieb treba získať z Ubuntu SQL výpisu; obchodné a finančné integrácie zostávajú samostatnou etapou.</w:t>
+              <w:t xml:space="preserve">Implementované karty, evidencie, vzťahy a pracovné postupy</w:t>
+            </w:r>
+          </w:p>
+        </w:tc>
+        <w:tc>
+          <w:tcPr>
+            <w:tcW w:type="pct" w:w="33.333333333333336%"/>
+            <w:shd w:fill="FFFFFF"/>
+            <w:tcMar>
+              <w:top w:type="dxa" w:w="85"/>
+              <w:left w:type="dxa" w:w="100"/>
+              <w:bottom w:type="dxa" w:w="85"/>
+              <w:right w:type="dxa" w:w="100"/>
+            </w:tcMar>
+          </w:tcPr>
+          <w:p>
+            <w:pPr>
+              <w:pStyle w:val="TableText"/>
+              <w:spacing w:after="60"/>
+            </w:pPr>
+            <w:r>
+              <w:rPr>
+                <w:rFonts w:ascii="Calibri" w:cs="Calibri" w:eastAsia="Calibri" w:hAnsi="Calibri"/>
+                <w:b w:val="false"/>
+                <w:bCs w:val="false"/>
+              </w:rPr>
+              <w:t xml:space="preserve">Úplnosť väzieb a reprezentantskej histórie je v produkcii nízka; treba dokončiť obchodné integrácie.</w:t>
             </w:r>
           </w:p>
         </w:tc>
@@ -1350,33 +1521,33 @@
                 <w:b w:val="false"/>
                 <w:bCs w:val="false"/>
               </w:rPr>
-              <w:t xml:space="preserve">Implementované migračné skripty a mapovania; rozsah v kapitole 11</w:t>
-            </w:r>
-          </w:p>
-        </w:tc>
-        <w:tc>
-          <w:tcPr>
-            <w:tcW w:type="pct" w:w="33.333333333333336%"/>
-            <w:shd w:fill="FFFFFF"/>
-            <w:tcMar>
-              <w:top w:type="dxa" w:w="85"/>
-              <w:left w:type="dxa" w:w="100"/>
-              <w:bottom w:type="dxa" w:w="85"/>
-              <w:right w:type="dxa" w:w="100"/>
-            </w:tcMar>
-          </w:tcPr>
-          <w:p>
-            <w:pPr>
-              <w:pStyle w:val="TableText"/>
-              <w:spacing w:after="60"/>
-            </w:pPr>
-            <w:r>
-              <w:rPr>
-                <w:rFonts w:ascii="Calibri" w:cs="Calibri" w:eastAsia="Calibri" w:hAnsi="Calibri"/>
-                <w:b w:val="false"/>
-                <w:bCs w:val="false"/>
-              </w:rPr>
-              <w:t xml:space="preserve">Zjednotiť migračnú cestu, doplniť otvorené domény, vykonať reconciliáciu a riadené prepnutie.</w:t>
+              <w:t xml:space="preserve">Implementované migračné skripty a mapovania</w:t>
+            </w:r>
+          </w:p>
+        </w:tc>
+        <w:tc>
+          <w:tcPr>
+            <w:tcW w:type="pct" w:w="33.333333333333336%"/>
+            <w:shd w:fill="FFFFFF"/>
+            <w:tcMar>
+              <w:top w:type="dxa" w:w="85"/>
+              <w:left w:type="dxa" w:w="100"/>
+              <w:bottom w:type="dxa" w:w="85"/>
+              <w:right w:type="dxa" w:w="100"/>
+            </w:tcMar>
+          </w:tcPr>
+          <w:p>
+            <w:pPr>
+              <w:pStyle w:val="TableText"/>
+              <w:spacing w:after="60"/>
+            </w:pPr>
+            <w:r>
+              <w:rPr>
+                <w:rFonts w:ascii="Calibri" w:cs="Calibri" w:eastAsia="Calibri" w:hAnsi="Calibri"/>
+                <w:b w:val="false"/>
+                <w:bCs w:val="false"/>
+              </w:rPr>
+              <w:t xml:space="preserve">Reconciliácia, otvorené domény, delta prenos a riadené prepnutie.</w:t>
             </w:r>
           </w:p>
         </w:tc>
@@ -1505,7 +1676,7 @@
           <w:b w:val="false"/>
           <w:bCs w:val="false"/>
         </w:rPr>
-        <w:t xml:space="preserve">Samostatné pracovisko agenta naviazané na prístupové práva, Mission a oprávnené kontakty.</w:t>
+        <w:t xml:space="preserve">Agentúrne pracovisko je napojené na Mission, oprávnenia, kontakty a readiness kontrolu.</w:t>
       </w:r>
     </w:p>
     <w:p>
@@ -1523,7 +1694,7 @@
           <w:b w:val="false"/>
           <w:bCs w:val="false"/>
         </w:rPr>
-        <w:t xml:space="preserve">Vstupná kontrola podporovaného prehliadača, bezpečného spojenia, siete, mikrofónu, reproduktora, SIP/ICE a pripojeného účtu Microsoft 365.</w:t>
+        <w:t xml:space="preserve">Readiness overuje prehliadač, sieť, mikrofón, reproduktor, SIP/ICE, latenciu, účet Microsoft 365 a zmenu prostredia.</w:t>
       </w:r>
     </w:p>
     <w:p>
@@ -1541,7 +1712,7 @@
           <w:b w:val="false"/>
           <w:bCs w:val="false"/>
         </w:rPr>
-        <w:t xml:space="preserve">Mikrofónová skúška s kalibráciou okolitého hluku a detekciou reči; interaktívne potvrdenie reproduktora.</w:t>
+        <w:t xml:space="preserve">Pri zmene siete alebo zariadenia vyžaduje novú kontrolu; chráni aktívny hovor, prácu po hovore a návrat do INDEXUS.</w:t>
       </w:r>
     </w:p>
     <w:p>
@@ -1559,7 +1730,17 @@
           <w:b w:val="false"/>
           <w:bCs w:val="false"/>
         </w:rPr>
-        <w:t xml:space="preserve">Meranie latencie a jitteru; hodnoty v milisekundách sú opäť súčasťou výsledkov kontroly.</w:t>
+        <w:t xml:space="preserve">Kľúčové mechanizmy boli pokryté cielenými regresnými rutinami; produkčné nasadenie každej kombinácie prostredia treba prevádzkovo monitorovať.</w:t>
+      </w:r>
+    </w:p>
+    <w:p>
+      <w:pPr>
+        <w:pStyle w:val="Heading2"/>
+        <w:keepNext/>
+        <w:spacing w:after="130" w:before="260"/>
+      </w:pPr>
+      <w:r>
+        <w:t xml:space="preserve">2.2 Mission — nastavenie a vykonávanie práce</w:t>
       </w:r>
     </w:p>
     <w:p>
@@ -1577,7 +1758,7 @@
           <w:b w:val="false"/>
           <w:bCs w:val="false"/>
         </w:rPr>
-        <w:t xml:space="preserve">Rýchla opätovná kontrola iba pri stále platnej pripravenosti; začatý úplný test nemožno obísť rýchlou cestou.</w:t>
+        <w:t xml:space="preserve">Mission riadi kontakty, agentov, pracovný postup, skripty, stavové zoznamy, automatizácie a FAQ.</w:t>
       </w:r>
     </w:p>
     <w:p>
@@ -1595,7 +1776,7 @@
           <w:b w:val="false"/>
           <w:bCs w:val="false"/>
         </w:rPr>
-        <w:t xml:space="preserve">Zmena siete alebo zariadenia vyvolá povinnú opätovnú kontrolu. Predošlý výsledok nesmie oprávniť vstup po zmene prostredia. Opakované hlásenia tej istej zmeny nesmú cyklicky rušiť a spúšťať test.</w:t>
+        <w:t xml:space="preserve">Podporuje callbacky, Back Office úlohy, e-mail/SMS akcie, verzie, klonovanie a audit pracovnej relácie.</w:t>
       </w:r>
     </w:p>
     <w:p>
@@ -1613,7 +1794,17 @@
           <w:b w:val="false"/>
           <w:bCs w:val="false"/>
         </w:rPr>
-        <w:t xml:space="preserve">Ochrana rozpracovaného hovoru, práce po hovore a prehrávania nahrávky; potrebná kontrola sa odkladá tak, aby pracovisko ani zákaznícka karta nezanikli. Dostupný zostáva návrat do INDEXUS.</w:t>
+        <w:t xml:space="preserve">Klonovanie a obnova chránia nastavenia iných modulov; pripojený Microsoft 365 účet je súčasťou readiness.</w:t>
+      </w:r>
+    </w:p>
+    <w:p>
+      <w:pPr>
+        <w:pStyle w:val="Heading2"/>
+        <w:keepNext/>
+        <w:spacing w:after="130" w:before="260"/>
+      </w:pPr>
+      <w:r>
+        <w:t xml:space="preserve">2.3 Celý tok volania a výber hlasovej trasy</w:t>
       </w:r>
     </w:p>
     <w:p>
@@ -1631,17 +1822,7 @@
           <w:b w:val="false"/>
           <w:bCs w:val="false"/>
         </w:rPr>
-        <w:t xml:space="preserve">Opravy zobrazovania úvodu, výsledkov a záverečnej obrazovky pripravenosti vrátane desktopového a mobilného zobrazenia.</w:t>
-      </w:r>
-    </w:p>
-    <w:p>
-      <w:pPr>
-        <w:pStyle w:val="Heading2"/>
-        <w:keepNext/>
-        <w:spacing w:after="130" w:before="260"/>
-      </w:pPr>
-      <w:r>
-        <w:t xml:space="preserve">2.2 Mission — nastavenie a vykonávanie práce</w:t>
+        <w:t xml:space="preserve">Odchádzajúce hovory používajú serverom povolenú trasu a Caller ID; vstupný kontakt a Mission sa zachovajú v histórii.</w:t>
       </w:r>
     </w:p>
     <w:p>
@@ -1659,7 +1840,7 @@
           <w:b w:val="false"/>
           <w:bCs w:val="false"/>
         </w:rPr>
-        <w:t xml:space="preserve">Nastavenie Mission, kontaktov, agentov, pracovného postupu, skriptov a stavov; nadväzujúce voľby a automatizácie.</w:t>
+        <w:t xml:space="preserve">Prichádzajúce hovory sa smerujú cez DID, IVR/frontu, dostupnosť agenta a pravidlá overflow alebo forward.</w:t>
       </w:r>
     </w:p>
     <w:p>
@@ -1677,7 +1858,7 @@
           <w:b w:val="false"/>
           <w:bCs w:val="false"/>
         </w:rPr>
-        <w:t xml:space="preserve">Stavové zoznamy a ich akcie: zmena výsledku kontaktu, callback, úloha Back Office, email alebo SMS podľa nakonfigurovaného pravidla.</w:t>
+        <w:t xml:space="preserve">Hovorový tok zahŕňa SIP registráciu, ICE/TURN/DTLS, nahrávanie odvodené zo serverového kontextu, ukončenie a jednotnú históriu.</w:t>
       </w:r>
     </w:p>
     <w:p>
@@ -1695,7 +1876,17 @@
           <w:b w:val="false"/>
           <w:bCs w:val="false"/>
         </w:rPr>
-        <w:t xml:space="preserve">FAQ spravované na úrovni Mission a používané v agentúrnom pracovisku.</w:t>
+        <w:t xml:space="preserve">Výsledok hovoru môže vytvoriť callback, komunikáciu alebo Back Office úlohu; čas callbacku sa riadi časovým pásmom Europe/Bratislava.</w:t>
+      </w:r>
+    </w:p>
+    <w:p>
+      <w:pPr>
+        <w:pStyle w:val="Heading2"/>
+        <w:keepNext/>
+        <w:spacing w:after="130" w:before="260"/>
+      </w:pPr>
+      <w:r>
+        <w:t xml:space="preserve">2.4 SMS brány a komunikačný kontext</w:t>
       </w:r>
     </w:p>
     <w:p>
@@ -1713,7 +1904,7 @@
           <w:b w:val="false"/>
           <w:bCs w:val="false"/>
         </w:rPr>
-        <w:t xml:space="preserve">Verzie a klonovanie nastavení Mission. Pri obnove sa majú meniť iba nastavenia patriace danému modulu, nie cudzia konfigurácia. Klonovanie má regresné pokrytie zachovania obsahu a nových identít.</w:t>
+        <w:t xml:space="preserve">Výber SMS brány je viazaný na Mission a krajinu; podporované sú BulkGate a SMSTOOLS podľa konfigurácie.</w:t>
       </w:r>
     </w:p>
     <w:p>
@@ -1731,7 +1922,7 @@
           <w:b w:val="false"/>
           <w:bCs w:val="false"/>
         </w:rPr>
-        <w:t xml:space="preserve">Emailové šablóny, podpisy a Microsoft 365 integračné časti; pripojený účet agenta je súčasťou readiness. Konkrétne automatické odosielateľské pravidlá podľa krajiny zostávajú predmetom samostatných požiadaviek, nie dôkazom dokončenia každého emailového scenára.</w:t>
+        <w:t xml:space="preserve">Server overuje pracovnú reláciu, príslušnosť príjemcu a povinnú bránu; pri chýbajúcej konfigurácii vráti chybu.</w:t>
       </w:r>
     </w:p>
     <w:p>
@@ -1749,7 +1940,7 @@
           <w:b w:val="false"/>
           <w:bCs w:val="false"/>
         </w:rPr>
-        <w:t xml:space="preserve">Pracovná relácia, história komunikácie a počítadlá aktivity; relácia sa odlišuje od denných limitov a celodenných štatistík.</w:t>
+        <w:t xml:space="preserve">Implementované odoslanie neznamená automaticky produkčne potvrdené doručenie každej správy.</w:t>
       </w:r>
     </w:p>
     <w:p>
@@ -1759,221 +1950,7 @@
         <w:spacing w:after="130" w:before="260"/>
       </w:pPr>
       <w:r>
-        <w:t xml:space="preserve">2.3 Celý tok volania a výber hlasovej trasy</w:t>
-      </w:r>
-    </w:p>
-    <w:p>
-      <w:pPr>
-        <w:spacing w:after="110" w:line="265"/>
-      </w:pPr>
-      <w:r>
-        <w:rPr>
-          <w:rFonts w:ascii="Calibri" w:cs="Calibri" w:eastAsia="Calibri" w:hAnsi="Calibri"/>
-          <w:b w:val="false"/>
-          <w:bCs w:val="false"/>
-        </w:rPr>
-        <w:t xml:space="preserve">1. Manažér nastaví Mission, dostupné kontakty, agentov, pracovný postup a hlasové parametre.</w:t>
-      </w:r>
-    </w:p>
-    <w:p>
-      <w:pPr>
-        <w:spacing w:after="110" w:line="265"/>
-      </w:pPr>
-      <w:r>
-        <w:rPr>
-          <w:rFonts w:ascii="Calibri" w:cs="Calibri" w:eastAsia="Calibri" w:hAnsi="Calibri"/>
-          <w:b w:val="false"/>
-          <w:bCs w:val="false"/>
-        </w:rPr>
-        <w:t xml:space="preserve">2. Pre odchádzajúci hovor vyberie </w:t>
-      </w:r>
-      <w:r>
-        <w:rPr>
-          <w:rFonts w:ascii="Calibri" w:cs="Calibri" w:eastAsia="Calibri" w:hAnsi="Calibri"/>
-          <w:b/>
-          <w:bCs/>
-        </w:rPr>
-        <w:t xml:space="preserve">globálnu trasu</w:t>
-      </w:r>
-      <w:r>
-        <w:rPr>
-          <w:rFonts w:ascii="Calibri" w:cs="Calibri" w:eastAsia="Calibri" w:hAnsi="Calibri"/>
-          <w:b w:val="false"/>
-          <w:bCs w:val="false"/>
-        </w:rPr>
-        <w:t xml:space="preserve">, </w:t>
-      </w:r>
-      <w:r>
-        <w:rPr>
-          <w:rFonts w:ascii="Calibri" w:cs="Calibri" w:eastAsia="Calibri" w:hAnsi="Calibri"/>
-          <w:b/>
-          <w:bCs/>
-        </w:rPr>
-        <w:t xml:space="preserve">existujúcu SK trasu</w:t>
-      </w:r>
-      <w:r>
-        <w:rPr>
-          <w:rFonts w:ascii="Calibri" w:cs="Calibri" w:eastAsia="Calibri" w:hAnsi="Calibri"/>
-          <w:b w:val="false"/>
-          <w:bCs w:val="false"/>
-        </w:rPr>
-        <w:t xml:space="preserve"> alebo </w:t>
-      </w:r>
-      <w:r>
-        <w:rPr>
-          <w:rFonts w:ascii="Calibri" w:cs="Calibri" w:eastAsia="Calibri" w:hAnsi="Calibri"/>
-          <w:b/>
-          <w:bCs/>
-        </w:rPr>
-        <w:t xml:space="preserve">O2 IMS</w:t>
-      </w:r>
-      <w:r>
-        <w:rPr>
-          <w:rFonts w:ascii="Calibri" w:cs="Calibri" w:eastAsia="Calibri" w:hAnsi="Calibri"/>
-          <w:b w:val="false"/>
-          <w:bCs w:val="false"/>
-        </w:rPr>
-        <w:t xml:space="preserve">; pri O2 vyberie povolené odchádzajúce Caller ID. Toto je výber operátorskej/SIP trasy, nie automatické zisťovanie mobilného operátora volaného čísla.</w:t>
-      </w:r>
-    </w:p>
-    <w:p>
-      <w:pPr>
-        <w:spacing w:after="110" w:line="265"/>
-      </w:pPr>
-      <w:r>
-        <w:rPr>
-          <w:rFonts w:ascii="Calibri" w:cs="Calibri" w:eastAsia="Calibri" w:hAnsi="Calibri"/>
-          <w:b w:val="false"/>
-          <w:bCs w:val="false"/>
-        </w:rPr>
-        <w:t xml:space="preserve">3. Agent vstúpi cez readiness kontrolu. Zobrazí sa iba oprávnený výber Mission a kontaktov.</w:t>
-      </w:r>
-    </w:p>
-    <w:p>
-      <w:pPr>
-        <w:spacing w:after="110" w:line="265"/>
-      </w:pPr>
-      <w:r>
-        <w:rPr>
-          <w:rFonts w:ascii="Calibri" w:cs="Calibri" w:eastAsia="Calibri" w:hAnsi="Calibri"/>
-          <w:b w:val="false"/>
-          <w:bCs w:val="false"/>
-        </w:rPr>
-        <w:t xml:space="preserve">4. Kontakt sa otvorí manuálne alebo cez spoločné poradie Contacts / Auto / Next. Presná identita kontaktu a Mission sa prenesie do vytáčania a histórie hovoru.</w:t>
-      </w:r>
-    </w:p>
-    <w:p>
-      <w:pPr>
-        <w:spacing w:after="110" w:line="265"/>
-      </w:pPr>
-      <w:r>
-        <w:rPr>
-          <w:rFonts w:ascii="Calibri" w:cs="Calibri" w:eastAsia="Calibri" w:hAnsi="Calibri"/>
-          <w:b w:val="false"/>
-          <w:bCs w:val="false"/>
-        </w:rPr>
-        <w:t xml:space="preserve">5. SIP registrácia a príprava médií riešia pripojenie; nevydarená registrácia musí mať viditeľný výsledok. Odchádzajúce zvonenie rešpektuje nastavený časový limit.</w:t>
-      </w:r>
-    </w:p>
-    <w:p>
-      <w:pPr>
-        <w:spacing w:after="110" w:line="265"/>
-      </w:pPr>
-      <w:r>
-        <w:rPr>
-          <w:rFonts w:ascii="Calibri" w:cs="Calibri" w:eastAsia="Calibri" w:hAnsi="Calibri"/>
-          <w:b w:val="false"/>
-          <w:bCs w:val="false"/>
-        </w:rPr>
-        <w:t xml:space="preserve">6. Prichádzajúci hovor sa podľa DID/trasy priradí do príslušného smerovania, IVR alebo fronty. Následne sa použijú členovia fronty, dostupnosť agentov a nastavené pravidlá overflow/no-agent/standing-forward.</w:t>
-      </w:r>
-    </w:p>
-    <w:p>
-      <w:pPr>
-        <w:spacing w:after="110" w:line="265"/>
-      </w:pPr>
-      <w:r>
-        <w:rPr>
-          <w:rFonts w:ascii="Calibri" w:cs="Calibri" w:eastAsia="Calibri" w:hAnsi="Calibri"/>
-          <w:b w:val="false"/>
-          <w:bCs w:val="false"/>
-        </w:rPr>
-        <w:t xml:space="preserve">7. Agent vidí identitu volajúceho a vhodnú kontaktnú kartu. Zapamätanie výberu karty pri opakovanom čísle je súkromné pre agenta; neprepisuje automaticky identitu hovoru.</w:t>
-      </w:r>
-    </w:p>
-    <w:p>
-      <w:pPr>
-        <w:spacing w:after="110" w:line="265"/>
-      </w:pPr>
-      <w:r>
-        <w:rPr>
-          <w:rFonts w:ascii="Calibri" w:cs="Calibri" w:eastAsia="Calibri" w:hAnsi="Calibri"/>
-          <w:b w:val="false"/>
-          <w:bCs w:val="false"/>
-        </w:rPr>
-        <w:t xml:space="preserve">8. Pri odpovedaní sa používa spoločná príprava ICE/TURN/DTLS; hovor má ovládanie ukončenia, podržania a príslušné možnosti smerovania. Stav médií a obnovovanie pripojenia rešpektujú bezpečnosť aktívneho hovoru.</w:t>
-      </w:r>
-    </w:p>
-    <w:p>
-      <w:pPr>
-        <w:spacing w:after="110" w:line="265"/>
-      </w:pPr>
-      <w:r>
-        <w:rPr>
-          <w:rFonts w:ascii="Calibri" w:cs="Calibri" w:eastAsia="Calibri" w:hAnsi="Calibri"/>
-          <w:b w:val="false"/>
-          <w:bCs w:val="false"/>
-        </w:rPr>
-        <w:t xml:space="preserve">9. Povolenie nahrávania sa odvodzuje zo serverového kontextu Mission a konkrétneho hovoru. Ukončenie, história a nahrávanie sa finalizujú raz, aj keď príde viac udalostí ukončenia.</w:t>
-      </w:r>
-    </w:p>
-    <w:p>
-      <w:pPr>
-        <w:spacing w:after="110" w:line="265"/>
-      </w:pPr>
-      <w:r>
-        <w:rPr>
-          <w:rFonts w:ascii="Calibri" w:cs="Calibri" w:eastAsia="Calibri" w:hAnsi="Calibri"/>
-          <w:b w:val="false"/>
-          <w:bCs w:val="false"/>
-        </w:rPr>
-        <w:t xml:space="preserve">10. Agent vyplní výsledok, požadované kroky a prípadný callback. Automatizácie môžu vytvoriť nadväzujúcu komunikáciu alebo Back Office úlohu.</w:t>
-      </w:r>
-    </w:p>
-    <w:p>
-      <w:pPr>
-        <w:spacing w:after="110" w:line="265"/>
-      </w:pPr>
-      <w:r>
-        <w:rPr>
-          <w:rFonts w:ascii="Calibri" w:cs="Calibri" w:eastAsia="Calibri" w:hAnsi="Calibri"/>
-          <w:b w:val="false"/>
-          <w:bCs w:val="false"/>
-        </w:rPr>
-        <w:t xml:space="preserve">11. Callback sa vráti do plánovanej fronty podľa času Europe/Bratislava; nesmie sa stratiť len preto, že bol vytvorený v skorší deň.</w:t>
-      </w:r>
-    </w:p>
-    <w:p>
-      <w:pPr>
-        <w:spacing w:after="110" w:line="265"/>
-      </w:pPr>
-      <w:r>
-        <w:rPr>
-          <w:rFonts w:ascii="Calibri" w:cs="Calibri" w:eastAsia="Calibri" w:hAnsi="Calibri"/>
-          <w:b w:val="false"/>
-          <w:bCs w:val="false"/>
-        </w:rPr>
-        <w:t xml:space="preserve">Výber trasy je previazaný s Mission a serverovým rozhodnutím o Caller ID. O2 identita sa nemá opierať o ľubovoľný údaj dodaný prehliadačom. Pri smerovaní na pracovný telefón alebo mobil sa zohľadňuje registrácia a živá prítomnosť agenta.</w:t>
-      </w:r>
-    </w:p>
-    <w:p>
-      <w:pPr>
-        <w:pStyle w:val="Heading2"/>
-        <w:keepNext/>
-        <w:spacing w:after="130" w:before="260"/>
-      </w:pPr>
-      <w:r>
-        <w:t xml:space="preserve">2.4 SMS brány a komunikačný kontext</w:t>
+        <w:t xml:space="preserve">2.5 Priority Builder, referrals, mestá a Queue</w:t>
       </w:r>
     </w:p>
     <w:p>
@@ -1991,39 +1968,7 @@
           <w:b w:val="false"/>
           <w:bCs w:val="false"/>
         </w:rPr>
-        <w:t xml:space="preserve">Implementovaný výber medzi </w:t>
-      </w:r>
-      <w:r>
-        <w:rPr>
-          <w:rFonts w:ascii="Calibri" w:cs="Calibri" w:eastAsia="Calibri" w:hAnsi="Calibri"/>
-          <w:b/>
-          <w:bCs/>
-        </w:rPr>
-        <w:t xml:space="preserve">BulkGate</w:t>
-      </w:r>
-      <w:r>
-        <w:rPr>
-          <w:rFonts w:ascii="Calibri" w:cs="Calibri" w:eastAsia="Calibri" w:hAnsi="Calibri"/>
-          <w:b w:val="false"/>
-          <w:bCs w:val="false"/>
-        </w:rPr>
-        <w:t xml:space="preserve"> a </w:t>
-      </w:r>
-      <w:r>
-        <w:rPr>
-          <w:rFonts w:ascii="Calibri" w:cs="Calibri" w:eastAsia="Calibri" w:hAnsi="Calibri"/>
-          <w:b/>
-          <w:bCs/>
-        </w:rPr>
-        <w:t xml:space="preserve">SMSTOOLS</w:t>
-      </w:r>
-      <w:r>
-        <w:rPr>
-          <w:rFonts w:ascii="Calibri" w:cs="Calibri" w:eastAsia="Calibri" w:hAnsi="Calibri"/>
-          <w:b w:val="false"/>
-          <w:bCs w:val="false"/>
-        </w:rPr>
-        <w:t xml:space="preserve"> podľa dostupnej konfigurácie a krajiny; SMSTOOLS je v aktuálnej implementácii obmedzený na SK.</w:t>
+        <w:t xml:space="preserve">Priority Builder určuje osobné poradie podľa skupiny, mesta a voliteľnej priority referral kontaktov.</w:t>
       </w:r>
     </w:p>
     <w:p>
@@ -2041,7 +1986,7 @@
           <w:b w:val="false"/>
           <w:bCs w:val="false"/>
         </w:rPr>
-        <w:t xml:space="preserve">Mission môže určiť povinnú SMS bránu. Server kontroluje kontext Mission a nepovoľuje tiché obídenie tejto voľby inou bránou.</w:t>
+        <w:t xml:space="preserve">Autoritatívna fronta je spoločná pre desktop, mobil, Auto a Next; prázdny alebo chybný výber nesmie rozšíriť frontu.</w:t>
       </w:r>
     </w:p>
     <w:p>
@@ -2059,7 +2004,17 @@
           <w:b w:val="false"/>
           <w:bCs w:val="false"/>
         </w:rPr>
-        <w:t xml:space="preserve">Pri manuálnom odosielaní sa overuje pracovná relácia a príslušnosť príjemcu ku kontextu, z ktorého sa odosiela.</w:t>
+        <w:t xml:space="preserve">Referral pôvod, mesto a uložený pohľad zostávajú viditeľné; cielené browser testy pokrývajú uloženie a reaktiváciu pohľadu.</w:t>
+      </w:r>
+    </w:p>
+    <w:p>
+      <w:pPr>
+        <w:pStyle w:val="Heading2"/>
+        <w:keepNext/>
+        <w:spacing w:after="130" w:before="260"/>
+      </w:pPr>
+      <w:r>
+        <w:t xml:space="preserve">2.6 Back Office a Healthcare Network</w:t>
       </w:r>
     </w:p>
     <w:p>
@@ -2077,7 +2032,7 @@
           <w:b w:val="false"/>
           <w:bCs w:val="false"/>
         </w:rPr>
-        <w:t xml:space="preserve">Neznáma, vypnutá alebo nenakonfigurovaná brána má viesť k zrozumiteľnej chybe; nie k nepozorovanému odoslaniu cez inú službu.</w:t>
+        <w:t xml:space="preserve">Back Office spracúva úlohy zo stavových automatizácií, odpovede agentov a odovzdanie práce s ochranou proti súbežnému dokončeniu.</w:t>
       </w:r>
     </w:p>
     <w:p>
@@ -2095,17 +2050,7 @@
           <w:b w:val="false"/>
           <w:bCs w:val="false"/>
         </w:rPr>
-        <w:t xml:space="preserve">Zostáva rozlišovať technicky implementované odosielanie, prijatie správy poskytovateľom a skutočné doručenie príjemcovi. Aktuálne doručenie na produkcii nebolo počas tejto revízie opätovne testované.</w:t>
-      </w:r>
-    </w:p>
-    <w:p>
-      <w:pPr>
-        <w:pStyle w:val="Heading2"/>
-        <w:keepNext/>
-        <w:spacing w:after="130" w:before="260"/>
-      </w:pPr>
-      <w:r>
-        <w:t xml:space="preserve">2.5 Priority Builder, referrals, mestá a Queue</w:t>
+        <w:t xml:space="preserve">Viditeľnosť je riadená krajinou a oprávneniami; dokončenie sa pripisuje skutočnému riešiteľovi.</w:t>
       </w:r>
     </w:p>
     <w:p>
@@ -2123,231 +2068,7 @@
           <w:b w:val="false"/>
           <w:bCs w:val="false"/>
         </w:rPr>
-        <w:t xml:space="preserve">Osobné uložené pohľady a predvoľby vrátane </w:t>
-      </w:r>
-      <w:r>
-        <w:rPr>
-          <w:rFonts w:ascii="Calibri" w:cs="Calibri" w:eastAsia="Calibri" w:hAnsi="Calibri"/>
-          <w:b/>
-          <w:bCs/>
-        </w:rPr>
-        <w:t xml:space="preserve">Referral + cities</w:t>
-      </w:r>
-      <w:r>
-        <w:rPr>
-          <w:rFonts w:ascii="Calibri" w:cs="Calibri" w:eastAsia="Calibri" w:hAnsi="Calibri"/>
-          <w:b w:val="false"/>
-          <w:bCs w:val="false"/>
-        </w:rPr>
-        <w:t xml:space="preserve"> ako počiatočného pohľadu pre nových agentov s dostupnými mestami Mission. Existujúce osobné nastavenia sa plošne neprepisujú.</w:t>
-      </w:r>
-    </w:p>
-    <w:p>
-      <w:pPr>
-        <w:pStyle w:val="ListParagraph"/>
-        <w:numPr>
-          <w:ilvl w:val="0"/>
-          <w:numId w:val="1"/>
-        </w:numPr>
-        <w:spacing w:after="110" w:line="265"/>
-      </w:pPr>
-      <w:r>
-        <w:rPr>
-          <w:rFonts w:ascii="Calibri" w:cs="Calibri" w:eastAsia="Calibri" w:hAnsi="Calibri"/>
-          <w:b w:val="false"/>
-          <w:bCs w:val="false"/>
-        </w:rPr>
-        <w:t xml:space="preserve">Poradie: prvá vyhovujúca skupina → mesto → voliteľné uprednostnenie referral kontaktov → triedenie v skupine. Kontakt sa nezaraďuje duplicitne do viacerých skupín.</w:t>
-      </w:r>
-    </w:p>
-    <w:p>
-      <w:pPr>
-        <w:pStyle w:val="ListParagraph"/>
-        <w:numPr>
-          <w:ilvl w:val="0"/>
-          <w:numId w:val="1"/>
-        </w:numPr>
-        <w:spacing w:after="110" w:line="265"/>
-      </w:pPr>
-      <w:r>
-        <w:rPr>
-          <w:rFonts w:ascii="Calibri" w:cs="Calibri" w:eastAsia="Calibri" w:hAnsi="Calibri"/>
-          <w:b w:val="false"/>
-          <w:bCs w:val="false"/>
-        </w:rPr>
-        <w:t xml:space="preserve">Nové referrals znamenajú nevolané odporúčania bez callbacku. Referral pôvod zostáva viditeľný aj po hovore alebo preplánovaní.</w:t>
-      </w:r>
-    </w:p>
-    <w:p>
-      <w:pPr>
-        <w:pStyle w:val="ListParagraph"/>
-        <w:numPr>
-          <w:ilvl w:val="0"/>
-          <w:numId w:val="1"/>
-        </w:numPr>
-        <w:spacing w:after="110" w:line="265"/>
-      </w:pPr>
-      <w:r>
-        <w:rPr>
-          <w:rFonts w:ascii="Calibri" w:cs="Calibri" w:eastAsia="Calibri" w:hAnsi="Calibri"/>
-          <w:b w:val="false"/>
-          <w:bCs w:val="false"/>
-        </w:rPr>
-        <w:t xml:space="preserve">Voľba uprednostnenia referral kontaktov pre každú skupinu; badge Referral a badge mesta v zobrazeniach kontaktov a preplánovanej Queue.</w:t>
-      </w:r>
-    </w:p>
-    <w:p>
-      <w:pPr>
-        <w:pStyle w:val="ListParagraph"/>
-        <w:numPr>
-          <w:ilvl w:val="0"/>
-          <w:numId w:val="1"/>
-        </w:numPr>
-        <w:spacing w:after="110" w:line="265"/>
-      </w:pPr>
-      <w:r>
-        <w:rPr>
-          <w:rFonts w:ascii="Calibri" w:cs="Calibri" w:eastAsia="Calibri" w:hAnsi="Calibri"/>
-          <w:b w:val="false"/>
-          <w:bCs w:val="false"/>
-        </w:rPr>
-        <w:t xml:space="preserve">Všetky mestá alebo explicitný výber miest; prázdny výber nesmie rozšíriť frontu na všetky kontakty. AI poradie miest je uložený orientačný snapshot, nie aktuálna štatistika obyvateľstva.</w:t>
-      </w:r>
-    </w:p>
-    <w:p>
-      <w:pPr>
-        <w:pStyle w:val="ListParagraph"/>
-        <w:numPr>
-          <w:ilvl w:val="0"/>
-          <w:numId w:val="1"/>
-        </w:numPr>
-        <w:spacing w:after="110" w:line="265"/>
-      </w:pPr>
-      <w:r>
-        <w:rPr>
-          <w:rFonts w:ascii="Calibri" w:cs="Calibri" w:eastAsia="Calibri" w:hAnsi="Calibri"/>
-          <w:b w:val="false"/>
-          <w:bCs w:val="false"/>
-        </w:rPr>
-        <w:t xml:space="preserve">Desktop, mobil, Auto a Next používajú spoločnú autoritatívnu frontu. Neuložený alebo chybný pohľad nesmie potichu spustiť širší výber.</w:t>
-      </w:r>
-    </w:p>
-    <w:p>
-      <w:pPr>
-        <w:pStyle w:val="ListParagraph"/>
-        <w:numPr>
-          <w:ilvl w:val="0"/>
-          <w:numId w:val="1"/>
-        </w:numPr>
-        <w:spacing w:after="110" w:line="265"/>
-      </w:pPr>
-      <w:r>
-        <w:rPr>
-          <w:rFonts w:ascii="Calibri" w:cs="Calibri" w:eastAsia="Calibri" w:hAnsi="Calibri"/>
-          <w:b w:val="false"/>
-          <w:bCs w:val="false"/>
-        </w:rPr>
-        <w:t xml:space="preserve">Najnovšia oprava: návrat na Referral + cities a Save view aktivujú a uložia existujúci pohľad bez duplikátu. Opravené aj rušenie požiadavky pri samotnom prepnutí na tento pohľad.</w:t>
-      </w:r>
-    </w:p>
-    <w:p>
-      <w:pPr>
-        <w:pStyle w:val="Heading2"/>
-        <w:keepNext/>
-        <w:spacing w:after="130" w:before="260"/>
-      </w:pPr>
-      <w:r>
-        <w:t xml:space="preserve">2.6 Back Office a Healthcare Network</w:t>
-      </w:r>
-    </w:p>
-    <w:p>
-      <w:pPr>
-        <w:pStyle w:val="ListParagraph"/>
-        <w:numPr>
-          <w:ilvl w:val="0"/>
-          <w:numId w:val="1"/>
-        </w:numPr>
-        <w:spacing w:after="110" w:line="265"/>
-      </w:pPr>
-      <w:r>
-        <w:rPr>
-          <w:rFonts w:ascii="Calibri" w:cs="Calibri" w:eastAsia="Calibri" w:hAnsi="Calibri"/>
-          <w:b w:val="false"/>
-          <w:bCs w:val="false"/>
-        </w:rPr>
-        <w:t xml:space="preserve">Back Office úlohy zo stavových automatizácií, spracovanie a odpovede agentov, odovzdanie úloh a ochrana proti súbežnému dokončeniu.</w:t>
-      </w:r>
-    </w:p>
-    <w:p>
-      <w:pPr>
-        <w:pStyle w:val="ListParagraph"/>
-        <w:numPr>
-          <w:ilvl w:val="0"/>
-          <w:numId w:val="1"/>
-        </w:numPr>
-        <w:spacing w:after="110" w:line="265"/>
-      </w:pPr>
-      <w:r>
-        <w:rPr>
-          <w:rFonts w:ascii="Calibri" w:cs="Calibri" w:eastAsia="Calibri" w:hAnsi="Calibri"/>
-          <w:b w:val="false"/>
-          <w:bCs w:val="false"/>
-        </w:rPr>
-        <w:t xml:space="preserve">Viditeľnosť podľa krajiny a oprávnení; správne priradenie dokončenej práce riešiteľovi, nie automaticky pôvodnému adresátovi úlohy.</w:t>
-      </w:r>
-    </w:p>
-    <w:p>
-      <w:pPr>
-        <w:pStyle w:val="ListParagraph"/>
-        <w:numPr>
-          <w:ilvl w:val="0"/>
-          <w:numId w:val="1"/>
-        </w:numPr>
-        <w:spacing w:after="110" w:line="265"/>
-      </w:pPr>
-      <w:r>
-        <w:rPr>
-          <w:rFonts w:ascii="Calibri" w:cs="Calibri" w:eastAsia="Calibri" w:hAnsi="Calibri"/>
-          <w:b w:val="false"/>
-          <w:bCs w:val="false"/>
-        </w:rPr>
-        <w:t xml:space="preserve">Otváranie plných kariet zákazníka, kliniky či nemocnice z nadväzujúcej práce; opravy obnovovania uložených údajov a opakovaných notifikácií.</w:t>
-      </w:r>
-    </w:p>
-    <w:p>
-      <w:pPr>
-        <w:pStyle w:val="ListParagraph"/>
-        <w:numPr>
-          <w:ilvl w:val="0"/>
-          <w:numId w:val="1"/>
-        </w:numPr>
-        <w:spacing w:after="110" w:line="265"/>
-      </w:pPr>
-      <w:r>
-        <w:rPr>
-          <w:rFonts w:ascii="Calibri" w:cs="Calibri" w:eastAsia="Calibri" w:hAnsi="Calibri"/>
-          <w:b w:val="false"/>
-          <w:bCs w:val="false"/>
-        </w:rPr>
-        <w:t xml:space="preserve">Hromadné prideľovanie reprezentantov pre Clinics a Hospitals používa spoločné polia a filtre s AND/OR, rýchle filtre a uložené pohľady.</w:t>
-      </w:r>
-    </w:p>
-    <w:p>
-      <w:pPr>
-        <w:pStyle w:val="ListParagraph"/>
-        <w:numPr>
-          <w:ilvl w:val="0"/>
-          <w:numId w:val="1"/>
-        </w:numPr>
-        <w:spacing w:after="110" w:line="265"/>
-      </w:pPr>
-      <w:r>
-        <w:rPr>
-          <w:rFonts w:ascii="Calibri" w:cs="Calibri" w:eastAsia="Calibri" w:hAnsi="Calibri"/>
-          <w:b w:val="false"/>
-          <w:bCs w:val="false"/>
-        </w:rPr>
-        <w:t xml:space="preserve">Náhľad aj potvrdenie pracujú s celým výberom, nie len stránkou. Zmena filtra, typu, režimu či reprezentanta zneplatní starý náhľad; potvrdenie je previazané s výberom a cieľom.</w:t>
+        <w:t xml:space="preserve">Healthcare Network a bulk priradenie reprezentantov používajú spoločné filtre a úplný náhľad výberu, nie iba aktuálnu stránku.</w:t>
       </w:r>
     </w:p>
     <w:p>
@@ -5256,33 +4977,20 @@
         <w:spacing w:after="130" w:before="260"/>
       </w:pPr>
       <w:r>
-        <w:t xml:space="preserve">8. Ostatné moduly a pôvodné kontrolné nálezy</w:t>
-      </w:r>
-    </w:p>
-    <w:p>
-      <w:pPr>
-        <w:spacing w:after="110" w:line="265"/>
-      </w:pPr>
-      <w:r>
-        <w:rPr>
-          <w:rFonts w:ascii="Calibri" w:cs="Calibri" w:eastAsia="Calibri" w:hAnsi="Calibri"/>
-          <w:b w:val="false"/>
-          <w:bCs w:val="false"/>
-        </w:rPr>
-        <w:t xml:space="preserve">Zákazníci, kliniky, nemocnice, spolupracovníci, komunikácia, zmluvy, odbery, oprávnenia, NexusPoint/SharePoint, AI/Lead Intelligence a web formuláre zostávajú súčasťou INDEXUS. Táto revízia ich neodstraňuje ani ich historický import neoznačuje za nový úspech posledného obdobia.</w:t>
-      </w:r>
-    </w:p>
-    <w:p>
-      <w:pPr>
-        <w:spacing w:after="110" w:line="265"/>
-      </w:pPr>
-      <w:r>
-        <w:rPr>
-          <w:rFonts w:ascii="Calibri" w:cs="Calibri" w:eastAsia="Calibri" w:hAnsi="Calibri"/>
-          <w:b w:val="false"/>
-          <w:bCs w:val="false"/>
-        </w:rPr>
-        <w:t xml:space="preserve">Pôvodné údaje z mája boli: 205 tabuliek, 165 462 zákazníkov, 236 935 zmlúv, 198 066 odberov, 1 163 268 komunikačných správ, 0 faktúr a 15 fakturačných položiek. </w:t>
+        <w:t xml:space="preserve">8. Súčasný stav projektu — produkčné agregácie</w:t>
+      </w:r>
+    </w:p>
+    <w:p>
+      <w:pPr>
+        <w:spacing w:after="110" w:line="265"/>
+      </w:pPr>
+      <w:r>
+        <w:rPr>
+          <w:rFonts w:ascii="Calibri" w:cs="Calibri" w:eastAsia="Calibri" w:hAnsi="Calibri"/>
+          <w:b w:val="false"/>
+          <w:bCs w:val="false"/>
+        </w:rPr>
+        <w:t xml:space="preserve">Výpis bol vykonaný </w:t>
       </w:r>
       <w:r>
         <w:rPr>
@@ -5290,41 +4998,15 @@
           <w:b/>
           <w:bCs/>
         </w:rPr>
-        <w:t xml:space="preserve">Ide výhradne o historický snapshot.</w:t>
-      </w:r>
-      <w:r>
-        <w:rPr>
-          <w:rFonts w:ascii="Calibri" w:cs="Calibri" w:eastAsia="Calibri" w:hAnsi="Calibri"/>
-          <w:b w:val="false"/>
-          <w:bCs w:val="false"/>
-        </w:rPr>
-        <w:t xml:space="preserve"> Aktuálne počty, chýbajúce poisťovne, používateľské roly a väzby odberov treba znovu overiť. Ani počet prázdnych väzieb sám osebe neurčuje, že sa majú doplniť automaticky alebo záznamy zmazať.</w:t>
-      </w:r>
-    </w:p>
-    <w:p>
-      <w:pPr>
-        <w:spacing w:after="110" w:line="265"/>
-      </w:pPr>
-      <w:r>
-        <w:rPr>
-          <w:rFonts w:ascii="Calibri" w:cs="Calibri" w:eastAsia="Calibri" w:hAnsi="Calibri"/>
-          <w:b w:val="false"/>
-          <w:bCs w:val="false"/>
-        </w:rPr>
-        <w:t xml:space="preserve">Staré tvrdenie o nefunkčnom ARI/telefónii sa nepoužíva ako aktuálny stav: nahrádza ho aktuálny popis implementácie Pulse/Mission a konkrétne regresné overenia v kapitole 12. Staré plány obsahujú aj rozhodnutia, ktoré sa odvtedy implementovali; nepreberajú sa bez porovnania.</w:t>
-      </w:r>
-    </w:p>
-    <w:p>
-      <w:pPr>
-        <w:spacing w:after="110" w:line="265"/>
-      </w:pPr>
-      <w:r>
-        <w:rPr>
-          <w:rFonts w:ascii="Calibri" w:cs="Calibri" w:eastAsia="Calibri" w:hAnsi="Calibri"/>
-          <w:b w:val="false"/>
-          <w:bCs w:val="false"/>
-        </w:rPr>
-        <w:t xml:space="preserve">Úplný pôvodný text je zachovaný ako historická príloha v </w:t>
+        <w:t xml:space="preserve">16. 9. 2026 o 09:22:11 UTC</w:t>
+      </w:r>
+      <w:r>
+        <w:rPr>
+          <w:rFonts w:ascii="Calibri" w:cs="Calibri" w:eastAsia="Calibri" w:hAnsi="Calibri"/>
+          <w:b w:val="false"/>
+          <w:bCs w:val="false"/>
+        </w:rPr>
+        <w:t xml:space="preserve"> v read-only transakcii. Všetkých 42 kontrolovaných tabuliek existuje. Ide o agregovaný stav databázy </w:t>
       </w:r>
       <w:r>
         <w:rPr>
@@ -5332,489 +5014,6 @@
           <w:b w:val="false"/>
           <w:bCs w:val="false"/>
         </w:rPr>
-        <w:t xml:space="preserve">docs/indexus-overview-2026-05-archive.md</w:t>
-      </w:r>
-      <w:r>
-        <w:rPr>
-          <w:rFonts w:ascii="Calibri" w:cs="Calibri" w:eastAsia="Calibri" w:hAnsi="Calibri"/>
-          <w:b w:val="false"/>
-          <w:bCs w:val="false"/>
-        </w:rPr>
-        <w:t xml:space="preserve">, s odstráneným heslom z pôvodného prihlasovacieho príkazu. Archív nie je prevádzkový návod ani aktuálny backlog.</w:t>
-      </w:r>
-    </w:p>
-    <w:p>
-      <w:pPr>
-        <w:pStyle w:val="Heading1"/>
-        <w:keepNext/>
-        <w:spacing w:after="130" w:before="260"/>
-      </w:pPr>
-      <w:r>
-        <w:t xml:space="preserve">9. Produkčné overenie — čo poslať späť</w:t>
-      </w:r>
-    </w:p>
-    <w:p>
-      <w:pPr>
-        <w:spacing w:after="110" w:line="265"/>
-      </w:pPr>
-      <w:r>
-        <w:rPr>
-          <w:rFonts w:ascii="Calibri" w:cs="Calibri" w:eastAsia="Calibri" w:hAnsi="Calibri"/>
-          <w:b w:val="false"/>
-          <w:bCs w:val="false"/>
-        </w:rPr>
-        <w:t xml:space="preserve">Pripravený súbor: </w:t>
-      </w:r>
-      <w:r>
-        <w:rPr>
-          <w:rFonts w:ascii="Consolas" w:cs="Consolas" w:eastAsia="Consolas" w:hAnsi="Consolas"/>
-          <w:b w:val="false"/>
-          <w:bCs w:val="false"/>
-        </w:rPr>
-        <w:t xml:space="preserve">docs/sql/indexus-overview-production-check.sql</w:t>
-      </w:r>
-      <w:r>
-        <w:rPr>
-          <w:rFonts w:ascii="Calibri" w:cs="Calibri" w:eastAsia="Calibri" w:hAnsi="Calibri"/>
-          <w:b w:val="false"/>
-          <w:bCs w:val="false"/>
-        </w:rPr>
-        <w:t xml:space="preserve">. Používa iba read-only transakciu, SELECTy a klientské príkazy psql. Nevypisuje mená zákazníkov, kontakty, bankové účty, texty zmlúv, SMS, heslá ani kľúče. Chýbajúce tabuľky alebo stĺpce označí ako SKIPPED namiesto vykonania neplatného dotazu.</w:t>
-      </w:r>
-    </w:p>
-    <w:p>
-      <w:pPr>
-        <w:spacing w:after="110" w:line="265"/>
-      </w:pPr>
-      <w:r>
-        <w:rPr>
-          <w:rFonts w:ascii="Calibri" w:cs="Calibri" w:eastAsia="Calibri" w:hAnsi="Calibri"/>
-          <w:b w:val="false"/>
-          <w:bCs w:val="false"/>
-        </w:rPr>
-        <w:t xml:space="preserve">Na Ubuntu produkcii použite schválené existujúce prihlásenie do databázy. Príklad s databázovým účtom a interaktívnym zadaním hesla, ak ho konfigurácia vyžaduje:</w:t>
-      </w:r>
-    </w:p>
-    <w:p>
-      <w:pPr>
-        <w:shd w:fill="F1F5F9"/>
-        <w:spacing w:after="30"/>
-      </w:pPr>
-      <w:r>
-        <w:rPr>
-          <w:rFonts w:ascii="Consolas" w:cs="Consolas" w:eastAsia="Consolas" w:hAnsi="Consolas"/>
-          <w:sz w:val="16"/>
-          <w:szCs w:val="16"/>
-        </w:rPr>
-        <w:t xml:space="preserve">psql -X -h localhost -U indexus -d indexus_crm -W -v ON_ERROR_STOP=1 -f indexus-overview-production-check.sql &gt; indexus-overview-production-check.txt</w:t>
-      </w:r>
-    </w:p>
-    <w:p>
-      <w:pPr>
-        <w:spacing w:after="110" w:line="265"/>
-      </w:pPr>
-      <w:r>
-        <w:rPr>
-          <w:rFonts w:ascii="Calibri" w:cs="Calibri" w:eastAsia="Calibri" w:hAnsi="Calibri"/>
-          <w:b w:val="false"/>
-          <w:bCs w:val="false"/>
-        </w:rPr>
-        <w:t xml:space="preserve">Súbor SQL musí byť najprv skopírovaný na server. Heslo zadajte iba do lokálnej výzvy psql; neposielajte ho do chatu ani do príkazu. Ak máte iný schválený read-only účet alebo existujúci bezpečný prihlasovací profil, použite ten. Skript nevyžaduje zmenu práv, schémy ani konfigurácie.</w:t>
-      </w:r>
-    </w:p>
-    <w:p>
-      <w:pPr>
-        <w:spacing w:after="110" w:line="265"/>
-      </w:pPr>
-      <w:r>
-        <w:rPr>
-          <w:rFonts w:ascii="Calibri" w:cs="Calibri" w:eastAsia="Calibri" w:hAnsi="Calibri"/>
-          <w:b w:val="false"/>
-          <w:bCs w:val="false"/>
-        </w:rPr>
-        <w:t xml:space="preserve">Pošlite výsledný TXT. Z neho sa doplní dátovo overená príloha: pokrytie cenníkov, priradenia zákazníkov, stavy zmlúv, väzby odberov, laboratórne výsledky a reálne používanie fakturácie. SELECTy nepotvrdzujú nasadenú verziu aplikácie, úspešnosť konkrétnych hovorov či doručenie SMS; to má samostatný prevádzkový dôkaz.</w:t>
-      </w:r>
-    </w:p>
-    <w:p>
-      <w:pPr>
-        <w:pStyle w:val="Heading2"/>
-        <w:keepNext/>
-        <w:spacing w:after="130" w:before="260"/>
-      </w:pPr>
-      <w:r>
-        <w:t xml:space="preserve">9.1 Prosba o aktuálny anonymizovaný výpis z Ubuntu</w:t>
-      </w:r>
-    </w:p>
-    <w:p>
-      <w:pPr>
-        <w:spacing w:after="110" w:line="265"/>
-      </w:pPr>
-      <w:r>
-        <w:rPr>
-          <w:rFonts w:ascii="Calibri" w:cs="Calibri" w:eastAsia="Calibri" w:hAnsi="Calibri"/>
-          <w:b w:val="false"/>
-          <w:bCs w:val="false"/>
-        </w:rPr>
-        <w:t xml:space="preserve">Prosím, spusti tento SQL súbor na Ubuntu serveri nad aktuálnou databázou a pošli späť iba výsledný TXT:</w:t>
-      </w:r>
-    </w:p>
-    <w:p>
-      <w:pPr>
-        <w:shd w:fill="F1F5F9"/>
-        <w:spacing w:after="30"/>
-      </w:pPr>
-      <w:r>
-        <w:rPr>
-          <w:rFonts w:ascii="Consolas" w:cs="Consolas" w:eastAsia="Consolas" w:hAnsi="Consolas"/>
-          <w:sz w:val="16"/>
-          <w:szCs w:val="16"/>
-        </w:rPr>
-        <w:t xml:space="preserve">psql -X -h localhost -U indexus -d indexus_crm -W -v ON_ERROR_STOP=1 \</w:t>
-      </w:r>
-    </w:p>
-    <w:p>
-      <w:pPr>
-        <w:shd w:fill="F1F5F9"/>
-        <w:spacing w:after="30"/>
-      </w:pPr>
-      <w:r>
-        <w:rPr>
-          <w:rFonts w:ascii="Consolas" w:cs="Consolas" w:eastAsia="Consolas" w:hAnsi="Consolas"/>
-          <w:sz w:val="16"/>
-          <w:szCs w:val="16"/>
-        </w:rPr>
-        <w:t xml:space="preserve">  -f indexus-overview-production-check.sql &gt; indexus-overview-production-check.txt</w:t>
-      </w:r>
-    </w:p>
-    <w:p>
-      <w:pPr>
-        <w:spacing w:after="110" w:line="265"/>
-      </w:pPr>
-      <w:r>
-        <w:rPr>
-          <w:rFonts w:ascii="Calibri" w:cs="Calibri" w:eastAsia="Calibri" w:hAnsi="Calibri"/>
-          <w:b w:val="false"/>
-          <w:bCs w:val="false"/>
-        </w:rPr>
-        <w:t xml:space="preserve">Ak súbor nie je v aktuálnom adresári, najprv ho bezpečne skopíruj na server. Heslo zadaj iba do interaktívnej výzvy psql; neposielaj ho do chatu, do príkazu ani do výstupu.</w:t>
-      </w:r>
-    </w:p>
-    <w:p>
-      <w:pPr>
-        <w:spacing w:after="110" w:line="265"/>
-      </w:pPr>
-      <w:r>
-        <w:rPr>
-          <w:rFonts w:ascii="Calibri" w:cs="Calibri" w:eastAsia="Calibri" w:hAnsi="Calibri"/>
-          <w:b w:val="false"/>
-          <w:bCs w:val="false"/>
-        </w:rPr>
-        <w:t xml:space="preserve">Výpis má obsahovať najmä:</w:t>
-      </w:r>
-    </w:p>
-    <w:p>
-      <w:pPr>
-        <w:pStyle w:val="ListParagraph"/>
-        <w:numPr>
-          <w:ilvl w:val="0"/>
-          <w:numId w:val="1"/>
-        </w:numPr>
-        <w:spacing w:after="110" w:line="265"/>
-      </w:pPr>
-      <w:r>
-        <w:rPr>
-          <w:rFonts w:ascii="Calibri" w:cs="Calibri" w:eastAsia="Calibri" w:hAnsi="Calibri"/>
-          <w:b w:val="false"/>
-          <w:bCs w:val="false"/>
-        </w:rPr>
-        <w:t xml:space="preserve">aktuálny celkový počet zákazníkov a rozdelenie podľa krajiny, </w:t>
-      </w:r>
-      <w:r>
-        <w:rPr>
-          <w:rFonts w:ascii="Consolas" w:cs="Consolas" w:eastAsia="Consolas" w:hAnsi="Consolas"/>
-          <w:b w:val="false"/>
-          <w:bCs w:val="false"/>
-        </w:rPr>
-        <w:t xml:space="preserve">status</w:t>
-      </w:r>
-      <w:r>
-        <w:rPr>
-          <w:rFonts w:ascii="Calibri" w:cs="Calibri" w:eastAsia="Calibri" w:hAnsi="Calibri"/>
-          <w:b w:val="false"/>
-          <w:bCs w:val="false"/>
-        </w:rPr>
-        <w:t xml:space="preserve">, </w:t>
-      </w:r>
-      <w:r>
-        <w:rPr>
-          <w:rFonts w:ascii="Consolas" w:cs="Consolas" w:eastAsia="Consolas" w:hAnsi="Consolas"/>
-          <w:b w:val="false"/>
-          <w:bCs w:val="false"/>
-        </w:rPr>
-        <w:t xml:space="preserve">client_status</w:t>
-      </w:r>
-      <w:r>
-        <w:rPr>
-          <w:rFonts w:ascii="Calibri" w:cs="Calibri" w:eastAsia="Calibri" w:hAnsi="Calibri"/>
-          <w:b w:val="false"/>
-          <w:bCs w:val="false"/>
-        </w:rPr>
-        <w:t xml:space="preserve"> a zdroja,</w:t>
-      </w:r>
-    </w:p>
-    <w:p>
-      <w:pPr>
-        <w:pStyle w:val="ListParagraph"/>
-        <w:numPr>
-          <w:ilvl w:val="0"/>
-          <w:numId w:val="1"/>
-        </w:numPr>
-        <w:spacing w:after="110" w:line="265"/>
-      </w:pPr>
-      <w:r>
-        <w:rPr>
-          <w:rFonts w:ascii="Calibri" w:cs="Calibri" w:eastAsia="Calibri" w:hAnsi="Calibri"/>
-          <w:b w:val="false"/>
-          <w:bCs w:val="false"/>
-        </w:rPr>
-        <w:t xml:space="preserve">počet zákazníkov s klinikou, spolupracovníkom, zdravotnou poisťovňou a prideleným používateľom,</w:t>
-      </w:r>
-    </w:p>
-    <w:p>
-      <w:pPr>
-        <w:pStyle w:val="ListParagraph"/>
-        <w:numPr>
-          <w:ilvl w:val="0"/>
-          <w:numId w:val="1"/>
-        </w:numPr>
-        <w:spacing w:after="110" w:line="265"/>
-      </w:pPr>
-      <w:r>
-        <w:rPr>
-          <w:rFonts w:ascii="Calibri" w:cs="Calibri" w:eastAsia="Calibri" w:hAnsi="Calibri"/>
-          <w:b w:val="false"/>
-          <w:bCs w:val="false"/>
-        </w:rPr>
-        <w:t xml:space="preserve">počet a stav zákazníckych produktov, poznámok, súhlasov, prípadov, dokumentov a pohľadávok,</w:t>
-      </w:r>
-    </w:p>
-    <w:p>
-      <w:pPr>
-        <w:pStyle w:val="ListParagraph"/>
-        <w:numPr>
-          <w:ilvl w:val="0"/>
-          <w:numId w:val="1"/>
-        </w:numPr>
-        <w:spacing w:after="110" w:line="265"/>
-      </w:pPr>
-      <w:r>
-        <w:rPr>
-          <w:rFonts w:ascii="Calibri" w:cs="Calibri" w:eastAsia="Calibri" w:hAnsi="Calibri"/>
-          <w:b w:val="false"/>
-          <w:bCs w:val="false"/>
-        </w:rPr>
-        <w:t xml:space="preserve">všetky kliniky agregovane podľa krajiny a aktivity,</w:t>
-      </w:r>
-    </w:p>
-    <w:p>
-      <w:pPr>
-        <w:pStyle w:val="ListParagraph"/>
-        <w:numPr>
-          <w:ilvl w:val="0"/>
-          <w:numId w:val="1"/>
-        </w:numPr>
-        <w:spacing w:after="110" w:line="265"/>
-      </w:pPr>
-      <w:r>
-        <w:rPr>
-          <w:rFonts w:ascii="Calibri" w:cs="Calibri" w:eastAsia="Calibri" w:hAnsi="Calibri"/>
-          <w:b w:val="false"/>
-          <w:bCs w:val="false"/>
-        </w:rPr>
-        <w:t xml:space="preserve">počet kliník s PZK/PZS kódom, ID ZZ, IČO, telefónom, e-mailom, GPS a reprezentantom,</w:t>
-      </w:r>
-    </w:p>
-    <w:p>
-      <w:pPr>
-        <w:pStyle w:val="ListParagraph"/>
-        <w:numPr>
-          <w:ilvl w:val="0"/>
-          <w:numId w:val="1"/>
-        </w:numPr>
-        <w:spacing w:after="110" w:line="265"/>
-      </w:pPr>
-      <w:r>
-        <w:rPr>
-          <w:rFonts w:ascii="Calibri" w:cs="Calibri" w:eastAsia="Calibri" w:hAnsi="Calibri"/>
-          <w:b w:val="false"/>
-          <w:bCs w:val="false"/>
-        </w:rPr>
-        <w:t xml:space="preserve">kliniky rozdelené podľa počiatočného stavu, záujmu o spoluprácu, záujmu o zmluvu a stavu zmluvy,</w:t>
-      </w:r>
-    </w:p>
-    <w:p>
-      <w:pPr>
-        <w:pStyle w:val="ListParagraph"/>
-        <w:numPr>
-          <w:ilvl w:val="0"/>
-          <w:numId w:val="1"/>
-        </w:numPr>
-        <w:spacing w:after="110" w:line="265"/>
-      </w:pPr>
-      <w:r>
-        <w:rPr>
-          <w:rFonts w:ascii="Calibri" w:cs="Calibri" w:eastAsia="Calibri" w:hAnsi="Calibri"/>
-          <w:b w:val="false"/>
-          <w:bCs w:val="false"/>
-        </w:rPr>
-        <w:t xml:space="preserve">nemocnice podľa krajiny/aktivity vrátane laboratória a reprezentanta,</w:t>
-      </w:r>
-    </w:p>
-    <w:p>
-      <w:pPr>
-        <w:pStyle w:val="ListParagraph"/>
-        <w:numPr>
-          <w:ilvl w:val="0"/>
-          <w:numId w:val="1"/>
-        </w:numPr>
-        <w:spacing w:after="110" w:line="265"/>
-      </w:pPr>
-      <w:r>
-        <w:rPr>
-          <w:rFonts w:ascii="Calibri" w:cs="Calibri" w:eastAsia="Calibri" w:hAnsi="Calibri"/>
-          <w:b w:val="false"/>
-          <w:bCs w:val="false"/>
-        </w:rPr>
-        <w:t xml:space="preserve">počet reprezentantských priradení, histórie, referrals, nemocničných sietí, členov sietí, udalostí a stavov spolupráce,</w:t>
-      </w:r>
-    </w:p>
-    <w:p>
-      <w:pPr>
-        <w:pStyle w:val="ListParagraph"/>
-        <w:numPr>
-          <w:ilvl w:val="0"/>
-          <w:numId w:val="1"/>
-        </w:numPr>
-        <w:spacing w:after="110" w:line="265"/>
-      </w:pPr>
-      <w:r>
-        <w:rPr>
-          <w:rFonts w:ascii="Calibri" w:cs="Calibri" w:eastAsia="Calibri" w:hAnsi="Calibri"/>
-          <w:b w:val="false"/>
-          <w:bCs w:val="false"/>
-        </w:rPr>
-        <w:t xml:space="preserve">spolupracovníkov podľa krajiny, aktivity a zdroja,</w:t>
-      </w:r>
-    </w:p>
-    <w:p>
-      <w:pPr>
-        <w:pStyle w:val="ListParagraph"/>
-        <w:numPr>
-          <w:ilvl w:val="0"/>
-          <w:numId w:val="1"/>
-        </w:numPr>
-        <w:spacing w:after="110" w:line="265"/>
-      </w:pPr>
-      <w:r>
-        <w:rPr>
-          <w:rFonts w:ascii="Calibri" w:cs="Calibri" w:eastAsia="Calibri" w:hAnsi="Calibri"/>
-          <w:b w:val="false"/>
-          <w:bCs w:val="false"/>
-        </w:rPr>
-        <w:t xml:space="preserve">cenníky, cenové priradenia, zmluvy, odbery, laboratórne výsledky, faktúry, položky, splátky a väzby,</w:t>
-      </w:r>
-    </w:p>
-    <w:p>
-      <w:pPr>
-        <w:pStyle w:val="ListParagraph"/>
-        <w:numPr>
-          <w:ilvl w:val="0"/>
-          <w:numId w:val="1"/>
-        </w:numPr>
-        <w:spacing w:after="110" w:line="265"/>
-      </w:pPr>
-      <w:r>
-        <w:rPr>
-          <w:rFonts w:ascii="Calibri" w:cs="Calibri" w:eastAsia="Calibri" w:hAnsi="Calibri"/>
-          <w:b w:val="false"/>
-          <w:bCs w:val="false"/>
-        </w:rPr>
-        <w:t xml:space="preserve">agregované počty záznamov označených ako import z ISCBC.</w:t>
-      </w:r>
-    </w:p>
-    <w:p>
-      <w:pPr>
-        <w:spacing w:after="110" w:line="265"/>
-      </w:pPr>
-      <w:r>
-        <w:rPr>
-          <w:rFonts w:ascii="Calibri" w:cs="Calibri" w:eastAsia="Calibri" w:hAnsi="Calibri"/>
-          <w:b w:val="false"/>
-          <w:bCs w:val="false"/>
-        </w:rPr>
-        <w:t xml:space="preserve">Skript nečíta mená, telefóny, e-maily, rodné čísla, bankové účty, texty poznámok, dokumentov, výsledkov, API kľúče ani heslá. </w:t>
-      </w:r>
-      <w:r>
-        <w:rPr>
-          <w:rFonts w:ascii="Consolas" w:cs="Consolas" w:eastAsia="Consolas" w:hAnsi="Consolas"/>
-          <w:b w:val="false"/>
-          <w:bCs w:val="false"/>
-        </w:rPr>
-        <w:t xml:space="preserve">SKIPPED</w:t>
-      </w:r>
-      <w:r>
-        <w:rPr>
-          <w:rFonts w:ascii="Calibri" w:cs="Calibri" w:eastAsia="Calibri" w:hAnsi="Calibri"/>
-          <w:b w:val="false"/>
-          <w:bCs w:val="false"/>
-        </w:rPr>
-        <w:t xml:space="preserve"> znamená chýbajúcu tabuľku alebo stĺpec, nie nulový počet. Po doručení TXT doplním do overview samostatnú dátovú prílohu s aktuálnymi počtami a zoznamom dátových medzier.</w:t>
-      </w:r>
-    </w:p>
-    <w:p>
-      <w:pPr>
-        <w:pStyle w:val="Heading2"/>
-        <w:keepNext/>
-        <w:spacing w:after="130" w:before="260"/>
-      </w:pPr>
-      <w:r>
-        <w:t xml:space="preserve">9.2 Aktuálna produkčná dátová príloha — 16. september 2026</w:t>
-      </w:r>
-    </w:p>
-    <w:p>
-      <w:pPr>
-        <w:spacing w:after="110" w:line="265"/>
-      </w:pPr>
-      <w:r>
-        <w:rPr>
-          <w:rFonts w:ascii="Calibri" w:cs="Calibri" w:eastAsia="Calibri" w:hAnsi="Calibri"/>
-          <w:b w:val="false"/>
-          <w:bCs w:val="false"/>
-        </w:rPr>
-        <w:t xml:space="preserve">Výpis bol vykonaný </w:t>
-      </w:r>
-      <w:r>
-        <w:rPr>
-          <w:rFonts w:ascii="Calibri" w:cs="Calibri" w:eastAsia="Calibri" w:hAnsi="Calibri"/>
-          <w:b/>
-          <w:bCs/>
-        </w:rPr>
-        <w:t xml:space="preserve">16. 9. 2026 o 09:22:11 UTC</w:t>
-      </w:r>
-      <w:r>
-        <w:rPr>
-          <w:rFonts w:ascii="Calibri" w:cs="Calibri" w:eastAsia="Calibri" w:hAnsi="Calibri"/>
-          <w:b w:val="false"/>
-          <w:bCs w:val="false"/>
-        </w:rPr>
-        <w:t xml:space="preserve"> v read-only transakcii. Všetkých 42 kontrolovaných tabuliek existuje. Nasledujúce čísla sú aktuálny agregovaný stav databázy </w:t>
-      </w:r>
-      <w:r>
-        <w:rPr>
-          <w:rFonts w:ascii="Consolas" w:cs="Consolas" w:eastAsia="Consolas" w:hAnsi="Consolas"/>
-          <w:b w:val="false"/>
-          <w:bCs w:val="false"/>
-        </w:rPr>
         <w:t xml:space="preserve">indexus_crm</w:t>
       </w:r>
       <w:r>
@@ -5823,7 +5022,7 @@
           <w:b w:val="false"/>
           <w:bCs w:val="false"/>
         </w:rPr>
-        <w:t xml:space="preserve">, nie historický májový odhad.</w:t>
+        <w:t xml:space="preserve">, nie o produkčný akceptačný test aplikácie.</w:t>
       </w:r>
     </w:p>
     <w:tbl>
@@ -5894,7 +5093,7 @@
                 <w:b w:val="false"/>
                 <w:bCs w:val="false"/>
               </w:rPr>
-              <w:t xml:space="preserve">Aktuálny stav</w:t>
+              <w:t xml:space="preserve">Stav</w:t>
             </w:r>
           </w:p>
         </w:tc>
@@ -5925,7 +5124,7 @@
                 <w:b w:val="false"/>
                 <w:bCs w:val="false"/>
               </w:rPr>
-              <w:t xml:space="preserve">Zákazníci</w:t>
+              <w:t xml:space="preserve">Zákazníci / ISCBC zdroj</w:t>
             </w:r>
           </w:p>
         </w:tc>
@@ -5951,7 +5150,7 @@
                 <w:b w:val="false"/>
                 <w:bCs w:val="false"/>
               </w:rPr>
-              <w:t xml:space="preserve">165 463</w:t>
+              <w:t xml:space="preserve">165 463 / 165 448</w:t>
             </w:r>
           </w:p>
         </w:tc>
@@ -5982,15 +5181,7 @@
                 <w:b w:val="false"/>
                 <w:bCs w:val="false"/>
               </w:rPr>
-              <w:t xml:space="preserve">Zákazníci s </w:t>
-            </w:r>
-            <w:r>
-              <w:rPr>
-                <w:rFonts w:ascii="Consolas" w:cs="Consolas" w:eastAsia="Consolas" w:hAnsi="Consolas"/>
-                <w:b w:val="false"/>
-                <w:bCs w:val="false"/>
-              </w:rPr>
-              <w:t xml:space="preserve">data_source = 'iscbc'</w:t>
+              <w:t xml:space="preserve">Kliniky / aktívne</w:t>
             </w:r>
           </w:p>
         </w:tc>
@@ -6016,7 +5207,7 @@
                 <w:b w:val="false"/>
                 <w:bCs w:val="false"/>
               </w:rPr>
-              <w:t xml:space="preserve">165 448</w:t>
+              <w:t xml:space="preserve">10 080 / 10 079</w:t>
             </w:r>
           </w:p>
         </w:tc>
@@ -6047,7 +5238,7 @@
                 <w:b w:val="false"/>
                 <w:bCs w:val="false"/>
               </w:rPr>
-              <w:t xml:space="preserve">Kliniky</w:t>
+              <w:t xml:space="preserve">Kliniky s PZK/PZS, ID ZZ a IČO</w:t>
             </w:r>
           </w:p>
         </w:tc>
@@ -6073,7 +5264,7 @@
                 <w:b w:val="false"/>
                 <w:bCs w:val="false"/>
               </w:rPr>
-              <w:t xml:space="preserve">10 080, z toho 10 079 aktívnych</w:t>
+              <w:t xml:space="preserve">753</w:t>
             </w:r>
           </w:p>
         </w:tc>
@@ -6104,7 +5295,7 @@
                 <w:b w:val="false"/>
                 <w:bCs w:val="false"/>
               </w:rPr>
-              <w:t xml:space="preserve">Kliniky s PZK/PZS kódom, ID ZZ a IČO</w:t>
+              <w:t xml:space="preserve">Nemocnice / aktívne</w:t>
             </w:r>
           </w:p>
         </w:tc>
@@ -6130,7 +5321,7 @@
                 <w:b w:val="false"/>
                 <w:bCs w:val="false"/>
               </w:rPr>
-              <w:t xml:space="preserve">753</w:t>
+              <w:t xml:space="preserve">1 213 / 1 142</w:t>
             </w:r>
           </w:p>
         </w:tc>
@@ -6161,7 +5352,7 @@
                 <w:b w:val="false"/>
                 <w:bCs w:val="false"/>
               </w:rPr>
-              <w:t xml:space="preserve">Kliniky s e-mailom / telefónom / GPS</w:t>
+              <w:t xml:space="preserve">Spolupracovníci</w:t>
             </w:r>
           </w:p>
         </w:tc>
@@ -6187,7 +5378,7 @@
                 <w:b w:val="false"/>
                 <w:bCs w:val="false"/>
               </w:rPr>
-              <w:t xml:space="preserve">2 143 / 5 160 / 8 363</w:t>
+              <w:t xml:space="preserve">20 136</w:t>
             </w:r>
           </w:p>
         </w:tc>
@@ -6218,7 +5409,7 @@
                 <w:b w:val="false"/>
                 <w:bCs w:val="false"/>
               </w:rPr>
-              <w:t xml:space="preserve">Nemocnice</w:t>
+              <w:t xml:space="preserve">Odbery / laboratórne výsledky</w:t>
             </w:r>
           </w:p>
         </w:tc>
@@ -6244,7 +5435,7 @@
                 <w:b w:val="false"/>
                 <w:bCs w:val="false"/>
               </w:rPr>
-              <w:t xml:space="preserve">1 213, z toho 1 142 aktívnych</w:t>
+              <w:t xml:space="preserve">198 167 / 197 850</w:t>
             </w:r>
           </w:p>
         </w:tc>
@@ -6275,7 +5466,7 @@
                 <w:b w:val="false"/>
                 <w:bCs w:val="false"/>
               </w:rPr>
-              <w:t xml:space="preserve">Nemocnice s priradeným laboratóriom</w:t>
+              <w:t xml:space="preserve">Zmluvy / faktúry</w:t>
             </w:r>
           </w:p>
         </w:tc>
@@ -6301,7 +5492,7 @@
                 <w:b w:val="false"/>
                 <w:bCs w:val="false"/>
               </w:rPr>
-              <w:t xml:space="preserve">848</w:t>
+              <w:t xml:space="preserve">236 935 / 0</w:t>
             </w:r>
           </w:p>
         </w:tc>
@@ -6332,7 +5523,7 @@
                 <w:b w:val="false"/>
                 <w:bCs w:val="false"/>
               </w:rPr>
-              <w:t xml:space="preserve">Spolupracovníci</w:t>
+              <w:t xml:space="preserve">Komunikačné správy</w:t>
             </w:r>
           </w:p>
         </w:tc>
@@ -6358,7 +5549,7 @@
                 <w:b w:val="false"/>
                 <w:bCs w:val="false"/>
               </w:rPr>
-              <w:t xml:space="preserve">20 136</w:t>
+              <w:t xml:space="preserve">1 163 531</w:t>
             </w:r>
           </w:p>
         </w:tc>
@@ -6389,7 +5580,7 @@
                 <w:b w:val="false"/>
                 <w:bCs w:val="false"/>
               </w:rPr>
-              <w:t xml:space="preserve">Aktivity spolupracovníkov</w:t>
+              <w:t xml:space="preserve">Zákaznícke poznámky / dokumenty</w:t>
             </w:r>
           </w:p>
         </w:tc>
@@ -6415,577 +5606,7 @@
                 <w:b w:val="false"/>
                 <w:bCs w:val="false"/>
               </w:rPr>
-              <w:t xml:space="preserve">344 756</w:t>
-            </w:r>
-          </w:p>
-        </w:tc>
-      </w:tr>
-      <w:tr>
-        <w:trPr>
-          <w:tblHeader w:val="false"/>
-        </w:trPr>
-        <w:tc>
-          <w:tcPr>
-            <w:tcW w:type="pct" w:w="50%"/>
-            <w:shd w:fill="FFFFFF"/>
-            <w:tcMar>
-              <w:top w:type="dxa" w:w="85"/>
-              <w:left w:type="dxa" w:w="100"/>
-              <w:bottom w:type="dxa" w:w="85"/>
-              <w:right w:type="dxa" w:w="100"/>
-            </w:tcMar>
-          </w:tcPr>
-          <w:p>
-            <w:pPr>
-              <w:pStyle w:val="TableText"/>
-              <w:spacing w:after="60"/>
-            </w:pPr>
-            <w:r>
-              <w:rPr>
-                <w:rFonts w:ascii="Calibri" w:cs="Calibri" w:eastAsia="Calibri" w:hAnsi="Calibri"/>
-                <w:b w:val="false"/>
-                <w:bCs w:val="false"/>
-              </w:rPr>
-              <w:t xml:space="preserve">Dohody spolupracovníkov</w:t>
-            </w:r>
-          </w:p>
-        </w:tc>
-        <w:tc>
-          <w:tcPr>
-            <w:tcW w:type="pct" w:w="50%"/>
-            <w:shd w:fill="FFFFFF"/>
-            <w:tcMar>
-              <w:top w:type="dxa" w:w="85"/>
-              <w:left w:type="dxa" w:w="100"/>
-              <w:bottom w:type="dxa" w:w="85"/>
-              <w:right w:type="dxa" w:w="100"/>
-            </w:tcMar>
-          </w:tcPr>
-          <w:p>
-            <w:pPr>
-              <w:pStyle w:val="TableText"/>
-              <w:spacing w:after="60"/>
-            </w:pPr>
-            <w:r>
-              <w:rPr>
-                <w:rFonts w:ascii="Calibri" w:cs="Calibri" w:eastAsia="Calibri" w:hAnsi="Calibri"/>
-                <w:b w:val="false"/>
-                <w:bCs w:val="false"/>
-              </w:rPr>
-              <w:t xml:space="preserve">59 549</w:t>
-            </w:r>
-          </w:p>
-        </w:tc>
-      </w:tr>
-      <w:tr>
-        <w:trPr>
-          <w:tblHeader w:val="false"/>
-        </w:trPr>
-        <w:tc>
-          <w:tcPr>
-            <w:tcW w:type="pct" w:w="50%"/>
-            <w:shd w:fill="FFFFFF"/>
-            <w:tcMar>
-              <w:top w:type="dxa" w:w="85"/>
-              <w:left w:type="dxa" w:w="100"/>
-              <w:bottom w:type="dxa" w:w="85"/>
-              <w:right w:type="dxa" w:w="100"/>
-            </w:tcMar>
-          </w:tcPr>
-          <w:p>
-            <w:pPr>
-              <w:pStyle w:val="TableText"/>
-              <w:spacing w:after="60"/>
-            </w:pPr>
-            <w:r>
-              <w:rPr>
-                <w:rFonts w:ascii="Calibri" w:cs="Calibri" w:eastAsia="Calibri" w:hAnsi="Calibri"/>
-                <w:b w:val="false"/>
-                <w:bCs w:val="false"/>
-              </w:rPr>
-              <w:t xml:space="preserve">Komunikačné správy</w:t>
-            </w:r>
-          </w:p>
-        </w:tc>
-        <w:tc>
-          <w:tcPr>
-            <w:tcW w:type="pct" w:w="50%"/>
-            <w:shd w:fill="FFFFFF"/>
-            <w:tcMar>
-              <w:top w:type="dxa" w:w="85"/>
-              <w:left w:type="dxa" w:w="100"/>
-              <w:bottom w:type="dxa" w:w="85"/>
-              <w:right w:type="dxa" w:w="100"/>
-            </w:tcMar>
-          </w:tcPr>
-          <w:p>
-            <w:pPr>
-              <w:pStyle w:val="TableText"/>
-              <w:spacing w:after="60"/>
-            </w:pPr>
-            <w:r>
-              <w:rPr>
-                <w:rFonts w:ascii="Calibri" w:cs="Calibri" w:eastAsia="Calibri" w:hAnsi="Calibri"/>
-                <w:b w:val="false"/>
-                <w:bCs w:val="false"/>
-              </w:rPr>
-              <w:t xml:space="preserve">1 163 531</w:t>
-            </w:r>
-          </w:p>
-        </w:tc>
-      </w:tr>
-      <w:tr>
-        <w:trPr>
-          <w:tblHeader w:val="false"/>
-        </w:trPr>
-        <w:tc>
-          <w:tcPr>
-            <w:tcW w:type="pct" w:w="50%"/>
-            <w:shd w:fill="FFFFFF"/>
-            <w:tcMar>
-              <w:top w:type="dxa" w:w="85"/>
-              <w:left w:type="dxa" w:w="100"/>
-              <w:bottom w:type="dxa" w:w="85"/>
-              <w:right w:type="dxa" w:w="100"/>
-            </w:tcMar>
-          </w:tcPr>
-          <w:p>
-            <w:pPr>
-              <w:pStyle w:val="TableText"/>
-              <w:spacing w:after="60"/>
-            </w:pPr>
-            <w:r>
-              <w:rPr>
-                <w:rFonts w:ascii="Calibri" w:cs="Calibri" w:eastAsia="Calibri" w:hAnsi="Calibri"/>
-                <w:b w:val="false"/>
-                <w:bCs w:val="false"/>
-              </w:rPr>
-              <w:t xml:space="preserve">Zákaznícke poznámky</w:t>
-            </w:r>
-          </w:p>
-        </w:tc>
-        <w:tc>
-          <w:tcPr>
-            <w:tcW w:type="pct" w:w="50%"/>
-            <w:shd w:fill="FFFFFF"/>
-            <w:tcMar>
-              <w:top w:type="dxa" w:w="85"/>
-              <w:left w:type="dxa" w:w="100"/>
-              <w:bottom w:type="dxa" w:w="85"/>
-              <w:right w:type="dxa" w:w="100"/>
-            </w:tcMar>
-          </w:tcPr>
-          <w:p>
-            <w:pPr>
-              <w:pStyle w:val="TableText"/>
-              <w:spacing w:after="60"/>
-            </w:pPr>
-            <w:r>
-              <w:rPr>
-                <w:rFonts w:ascii="Calibri" w:cs="Calibri" w:eastAsia="Calibri" w:hAnsi="Calibri"/>
-                <w:b w:val="false"/>
-                <w:bCs w:val="false"/>
-              </w:rPr>
-              <w:t xml:space="preserve">2 404 177</w:t>
-            </w:r>
-          </w:p>
-        </w:tc>
-      </w:tr>
-      <w:tr>
-        <w:trPr>
-          <w:tblHeader w:val="false"/>
-        </w:trPr>
-        <w:tc>
-          <w:tcPr>
-            <w:tcW w:type="pct" w:w="50%"/>
-            <w:shd w:fill="FFFFFF"/>
-            <w:tcMar>
-              <w:top w:type="dxa" w:w="85"/>
-              <w:left w:type="dxa" w:w="100"/>
-              <w:bottom w:type="dxa" w:w="85"/>
-              <w:right w:type="dxa" w:w="100"/>
-            </w:tcMar>
-          </w:tcPr>
-          <w:p>
-            <w:pPr>
-              <w:pStyle w:val="TableText"/>
-              <w:spacing w:after="60"/>
-            </w:pPr>
-            <w:r>
-              <w:rPr>
-                <w:rFonts w:ascii="Calibri" w:cs="Calibri" w:eastAsia="Calibri" w:hAnsi="Calibri"/>
-                <w:b w:val="false"/>
-                <w:bCs w:val="false"/>
-              </w:rPr>
-              <w:t xml:space="preserve">Zákaznícke dokumenty</w:t>
-            </w:r>
-          </w:p>
-        </w:tc>
-        <w:tc>
-          <w:tcPr>
-            <w:tcW w:type="pct" w:w="50%"/>
-            <w:shd w:fill="FFFFFF"/>
-            <w:tcMar>
-              <w:top w:type="dxa" w:w="85"/>
-              <w:left w:type="dxa" w:w="100"/>
-              <w:bottom w:type="dxa" w:w="85"/>
-              <w:right w:type="dxa" w:w="100"/>
-            </w:tcMar>
-          </w:tcPr>
-          <w:p>
-            <w:pPr>
-              <w:pStyle w:val="TableText"/>
-              <w:spacing w:after="60"/>
-            </w:pPr>
-            <w:r>
-              <w:rPr>
-                <w:rFonts w:ascii="Calibri" w:cs="Calibri" w:eastAsia="Calibri" w:hAnsi="Calibri"/>
-                <w:b w:val="false"/>
-                <w:bCs w:val="false"/>
-              </w:rPr>
-              <w:t xml:space="preserve">3 013 370</w:t>
-            </w:r>
-          </w:p>
-        </w:tc>
-      </w:tr>
-      <w:tr>
-        <w:trPr>
-          <w:tblHeader w:val="false"/>
-        </w:trPr>
-        <w:tc>
-          <w:tcPr>
-            <w:tcW w:type="pct" w:w="50%"/>
-            <w:shd w:fill="FFFFFF"/>
-            <w:tcMar>
-              <w:top w:type="dxa" w:w="85"/>
-              <w:left w:type="dxa" w:w="100"/>
-              <w:bottom w:type="dxa" w:w="85"/>
-              <w:right w:type="dxa" w:w="100"/>
-            </w:tcMar>
-          </w:tcPr>
-          <w:p>
-            <w:pPr>
-              <w:pStyle w:val="TableText"/>
-              <w:spacing w:after="60"/>
-            </w:pPr>
-            <w:r>
-              <w:rPr>
-                <w:rFonts w:ascii="Calibri" w:cs="Calibri" w:eastAsia="Calibri" w:hAnsi="Calibri"/>
-                <w:b w:val="false"/>
-                <w:bCs w:val="false"/>
-              </w:rPr>
-              <w:t xml:space="preserve">Potenciálne prípady</w:t>
-            </w:r>
-          </w:p>
-        </w:tc>
-        <w:tc>
-          <w:tcPr>
-            <w:tcW w:type="pct" w:w="50%"/>
-            <w:shd w:fill="FFFFFF"/>
-            <w:tcMar>
-              <w:top w:type="dxa" w:w="85"/>
-              <w:left w:type="dxa" w:w="100"/>
-              <w:bottom w:type="dxa" w:w="85"/>
-              <w:right w:type="dxa" w:w="100"/>
-            </w:tcMar>
-          </w:tcPr>
-          <w:p>
-            <w:pPr>
-              <w:pStyle w:val="TableText"/>
-              <w:spacing w:after="60"/>
-            </w:pPr>
-            <w:r>
-              <w:rPr>
-                <w:rFonts w:ascii="Calibri" w:cs="Calibri" w:eastAsia="Calibri" w:hAnsi="Calibri"/>
-                <w:b w:val="false"/>
-                <w:bCs w:val="false"/>
-              </w:rPr>
-              <w:t xml:space="preserve">165 647</w:t>
-            </w:r>
-          </w:p>
-        </w:tc>
-      </w:tr>
-      <w:tr>
-        <w:trPr>
-          <w:tblHeader w:val="false"/>
-        </w:trPr>
-        <w:tc>
-          <w:tcPr>
-            <w:tcW w:type="pct" w:w="50%"/>
-            <w:shd w:fill="FFFFFF"/>
-            <w:tcMar>
-              <w:top w:type="dxa" w:w="85"/>
-              <w:left w:type="dxa" w:w="100"/>
-              <w:bottom w:type="dxa" w:w="85"/>
-              <w:right w:type="dxa" w:w="100"/>
-            </w:tcMar>
-          </w:tcPr>
-          <w:p>
-            <w:pPr>
-              <w:pStyle w:val="TableText"/>
-              <w:spacing w:after="60"/>
-            </w:pPr>
-            <w:r>
-              <w:rPr>
-                <w:rFonts w:ascii="Calibri" w:cs="Calibri" w:eastAsia="Calibri" w:hAnsi="Calibri"/>
-                <w:b w:val="false"/>
-                <w:bCs w:val="false"/>
-              </w:rPr>
-              <w:t xml:space="preserve">Pohľadávkové záznamy</w:t>
-            </w:r>
-          </w:p>
-        </w:tc>
-        <w:tc>
-          <w:tcPr>
-            <w:tcW w:type="pct" w:w="50%"/>
-            <w:shd w:fill="FFFFFF"/>
-            <w:tcMar>
-              <w:top w:type="dxa" w:w="85"/>
-              <w:left w:type="dxa" w:w="100"/>
-              <w:bottom w:type="dxa" w:w="85"/>
-              <w:right w:type="dxa" w:w="100"/>
-            </w:tcMar>
-          </w:tcPr>
-          <w:p>
-            <w:pPr>
-              <w:pStyle w:val="TableText"/>
-              <w:spacing w:after="60"/>
-            </w:pPr>
-            <w:r>
-              <w:rPr>
-                <w:rFonts w:ascii="Calibri" w:cs="Calibri" w:eastAsia="Calibri" w:hAnsi="Calibri"/>
-                <w:b w:val="false"/>
-                <w:bCs w:val="false"/>
-              </w:rPr>
-              <w:t xml:space="preserve">183 778</w:t>
-            </w:r>
-          </w:p>
-        </w:tc>
-      </w:tr>
-      <w:tr>
-        <w:trPr>
-          <w:tblHeader w:val="false"/>
-        </w:trPr>
-        <w:tc>
-          <w:tcPr>
-            <w:tcW w:type="pct" w:w="50%"/>
-            <w:shd w:fill="FFFFFF"/>
-            <w:tcMar>
-              <w:top w:type="dxa" w:w="85"/>
-              <w:left w:type="dxa" w:w="100"/>
-              <w:bottom w:type="dxa" w:w="85"/>
-              <w:right w:type="dxa" w:w="100"/>
-            </w:tcMar>
-          </w:tcPr>
-          <w:p>
-            <w:pPr>
-              <w:pStyle w:val="TableText"/>
-              <w:spacing w:after="60"/>
-            </w:pPr>
-            <w:r>
-              <w:rPr>
-                <w:rFonts w:ascii="Calibri" w:cs="Calibri" w:eastAsia="Calibri" w:hAnsi="Calibri"/>
-                <w:b w:val="false"/>
-                <w:bCs w:val="false"/>
-              </w:rPr>
-              <w:t xml:space="preserve">Odbery</w:t>
-            </w:r>
-          </w:p>
-        </w:tc>
-        <w:tc>
-          <w:tcPr>
-            <w:tcW w:type="pct" w:w="50%"/>
-            <w:shd w:fill="FFFFFF"/>
-            <w:tcMar>
-              <w:top w:type="dxa" w:w="85"/>
-              <w:left w:type="dxa" w:w="100"/>
-              <w:bottom w:type="dxa" w:w="85"/>
-              <w:right w:type="dxa" w:w="100"/>
-            </w:tcMar>
-          </w:tcPr>
-          <w:p>
-            <w:pPr>
-              <w:pStyle w:val="TableText"/>
-              <w:spacing w:after="60"/>
-            </w:pPr>
-            <w:r>
-              <w:rPr>
-                <w:rFonts w:ascii="Calibri" w:cs="Calibri" w:eastAsia="Calibri" w:hAnsi="Calibri"/>
-                <w:b w:val="false"/>
-                <w:bCs w:val="false"/>
-              </w:rPr>
-              <w:t xml:space="preserve">198 167</w:t>
-            </w:r>
-          </w:p>
-        </w:tc>
-      </w:tr>
-      <w:tr>
-        <w:trPr>
-          <w:tblHeader w:val="false"/>
-        </w:trPr>
-        <w:tc>
-          <w:tcPr>
-            <w:tcW w:type="pct" w:w="50%"/>
-            <w:shd w:fill="FFFFFF"/>
-            <w:tcMar>
-              <w:top w:type="dxa" w:w="85"/>
-              <w:left w:type="dxa" w:w="100"/>
-              <w:bottom w:type="dxa" w:w="85"/>
-              <w:right w:type="dxa" w:w="100"/>
-            </w:tcMar>
-          </w:tcPr>
-          <w:p>
-            <w:pPr>
-              <w:pStyle w:val="TableText"/>
-              <w:spacing w:after="60"/>
-            </w:pPr>
-            <w:r>
-              <w:rPr>
-                <w:rFonts w:ascii="Calibri" w:cs="Calibri" w:eastAsia="Calibri" w:hAnsi="Calibri"/>
-                <w:b w:val="false"/>
-                <w:bCs w:val="false"/>
-              </w:rPr>
-              <w:t xml:space="preserve">Laboratórne výsledky</w:t>
-            </w:r>
-          </w:p>
-        </w:tc>
-        <w:tc>
-          <w:tcPr>
-            <w:tcW w:type="pct" w:w="50%"/>
-            <w:shd w:fill="FFFFFF"/>
-            <w:tcMar>
-              <w:top w:type="dxa" w:w="85"/>
-              <w:left w:type="dxa" w:w="100"/>
-              <w:bottom w:type="dxa" w:w="85"/>
-              <w:right w:type="dxa" w:w="100"/>
-            </w:tcMar>
-          </w:tcPr>
-          <w:p>
-            <w:pPr>
-              <w:pStyle w:val="TableText"/>
-              <w:spacing w:after="60"/>
-            </w:pPr>
-            <w:r>
-              <w:rPr>
-                <w:rFonts w:ascii="Calibri" w:cs="Calibri" w:eastAsia="Calibri" w:hAnsi="Calibri"/>
-                <w:b w:val="false"/>
-                <w:bCs w:val="false"/>
-              </w:rPr>
-              <w:t xml:space="preserve">197 850</w:t>
-            </w:r>
-          </w:p>
-        </w:tc>
-      </w:tr>
-      <w:tr>
-        <w:trPr>
-          <w:tblHeader w:val="false"/>
-        </w:trPr>
-        <w:tc>
-          <w:tcPr>
-            <w:tcW w:type="pct" w:w="50%"/>
-            <w:shd w:fill="FFFFFF"/>
-            <w:tcMar>
-              <w:top w:type="dxa" w:w="85"/>
-              <w:left w:type="dxa" w:w="100"/>
-              <w:bottom w:type="dxa" w:w="85"/>
-              <w:right w:type="dxa" w:w="100"/>
-            </w:tcMar>
-          </w:tcPr>
-          <w:p>
-            <w:pPr>
-              <w:pStyle w:val="TableText"/>
-              <w:spacing w:after="60"/>
-            </w:pPr>
-            <w:r>
-              <w:rPr>
-                <w:rFonts w:ascii="Calibri" w:cs="Calibri" w:eastAsia="Calibri" w:hAnsi="Calibri"/>
-                <w:b w:val="false"/>
-                <w:bCs w:val="false"/>
-              </w:rPr>
-              <w:t xml:space="preserve">Zmluvy</w:t>
-            </w:r>
-          </w:p>
-        </w:tc>
-        <w:tc>
-          <w:tcPr>
-            <w:tcW w:type="pct" w:w="50%"/>
-            <w:shd w:fill="FFFFFF"/>
-            <w:tcMar>
-              <w:top w:type="dxa" w:w="85"/>
-              <w:left w:type="dxa" w:w="100"/>
-              <w:bottom w:type="dxa" w:w="85"/>
-              <w:right w:type="dxa" w:w="100"/>
-            </w:tcMar>
-          </w:tcPr>
-          <w:p>
-            <w:pPr>
-              <w:pStyle w:val="TableText"/>
-              <w:spacing w:after="60"/>
-            </w:pPr>
-            <w:r>
-              <w:rPr>
-                <w:rFonts w:ascii="Calibri" w:cs="Calibri" w:eastAsia="Calibri" w:hAnsi="Calibri"/>
-                <w:b w:val="false"/>
-                <w:bCs w:val="false"/>
-              </w:rPr>
-              <w:t xml:space="preserve">236 935</w:t>
-            </w:r>
-          </w:p>
-        </w:tc>
-      </w:tr>
-      <w:tr>
-        <w:trPr>
-          <w:tblHeader w:val="false"/>
-        </w:trPr>
-        <w:tc>
-          <w:tcPr>
-            <w:tcW w:type="pct" w:w="50%"/>
-            <w:shd w:fill="FFFFFF"/>
-            <w:tcMar>
-              <w:top w:type="dxa" w:w="85"/>
-              <w:left w:type="dxa" w:w="100"/>
-              <w:bottom w:type="dxa" w:w="85"/>
-              <w:right w:type="dxa" w:w="100"/>
-            </w:tcMar>
-          </w:tcPr>
-          <w:p>
-            <w:pPr>
-              <w:pStyle w:val="TableText"/>
-              <w:spacing w:after="60"/>
-            </w:pPr>
-            <w:r>
-              <w:rPr>
-                <w:rFonts w:ascii="Calibri" w:cs="Calibri" w:eastAsia="Calibri" w:hAnsi="Calibri"/>
-                <w:b w:val="false"/>
-                <w:bCs w:val="false"/>
-              </w:rPr>
-              <w:t xml:space="preserve">Faktúry</w:t>
-            </w:r>
-          </w:p>
-        </w:tc>
-        <w:tc>
-          <w:tcPr>
-            <w:tcW w:type="pct" w:w="50%"/>
-            <w:shd w:fill="FFFFFF"/>
-            <w:tcMar>
-              <w:top w:type="dxa" w:w="85"/>
-              <w:left w:type="dxa" w:w="100"/>
-              <w:bottom w:type="dxa" w:w="85"/>
-              <w:right w:type="dxa" w:w="100"/>
-            </w:tcMar>
-          </w:tcPr>
-          <w:p>
-            <w:pPr>
-              <w:pStyle w:val="TableText"/>
-              <w:spacing w:after="60"/>
-            </w:pPr>
-            <w:r>
-              <w:rPr>
-                <w:rFonts w:ascii="Calibri" w:cs="Calibri" w:eastAsia="Calibri" w:hAnsi="Calibri"/>
-                <w:b w:val="false"/>
-                <w:bCs w:val="false"/>
-              </w:rPr>
-              <w:t xml:space="preserve">0</w:t>
+              <w:t xml:space="preserve">2 404 177 / 3 013 370</w:t>
             </w:r>
           </w:p>
         </w:tc>
@@ -6998,28 +5619,30 @@
     </w:p>
     <w:p>
       <w:pPr>
-        <w:spacing w:after="110" w:line="265"/>
-      </w:pPr>
-      <w:r>
-        <w:rPr>
-          <w:rFonts w:ascii="Calibri" w:cs="Calibri" w:eastAsia="Calibri" w:hAnsi="Calibri"/>
-          <w:b w:val="false"/>
-          <w:bCs w:val="false"/>
-        </w:rPr>
-        <w:t xml:space="preserve">#### Dátové medzery, ktoré treba riešiť pred plnohodnotným CRM</w:t>
-      </w:r>
-    </w:p>
-    <w:p>
-      <w:pPr>
-        <w:spacing w:after="110" w:line="265"/>
-      </w:pPr>
-      <w:r>
-        <w:rPr>
-          <w:rFonts w:ascii="Calibri" w:cs="Calibri" w:eastAsia="Calibri" w:hAnsi="Calibri"/>
-          <w:b w:val="false"/>
-          <w:bCs w:val="false"/>
-        </w:rPr>
-        <w:t xml:space="preserve">1. </w:t>
+        <w:pStyle w:val="Heading2"/>
+        <w:keepNext/>
+        <w:spacing w:after="130" w:before="260"/>
+      </w:pPr>
+      <w:r>
+        <w:t xml:space="preserve">Manažérske implikácie</w:t>
+      </w:r>
+    </w:p>
+    <w:p>
+      <w:pPr>
+        <w:pStyle w:val="ListParagraph"/>
+        <w:numPr>
+          <w:ilvl w:val="0"/>
+          <w:numId w:val="1"/>
+        </w:numPr>
+        <w:spacing w:after="110" w:line="265"/>
+      </w:pPr>
+      <w:r>
+        <w:rPr>
+          <w:rFonts w:ascii="Calibri" w:cs="Calibri" w:eastAsia="Calibri" w:hAnsi="Calibri"/>
+          <w:b w:val="false"/>
+          <w:bCs w:val="false"/>
+        </w:rPr>
+        <w:t xml:space="preserve">Pricing V2 má 12 cenových verzií a pravidlá, ale </w:t>
       </w:r>
       <w:r>
         <w:rPr>
@@ -7027,76 +5650,41 @@
           <w:b/>
           <w:bCs/>
         </w:rPr>
-        <w:t xml:space="preserve">Pricing V2 ešte nie je priradený zákazníkom:</w:t>
-      </w:r>
-      <w:r>
-        <w:rPr>
-          <w:rFonts w:ascii="Calibri" w:cs="Calibri" w:eastAsia="Calibri" w:hAnsi="Calibri"/>
-          <w:b w:val="false"/>
-          <w:bCs w:val="false"/>
-        </w:rPr>
-        <w:t xml:space="preserve"> existuje 12 cenových verzií, 82 cien odberov, 109 skladovacích cien, 131 pravidiel nekompletných odberov a 18 splátkových plánov, ale </w:t>
-      </w:r>
-      <w:r>
-        <w:rPr>
-          <w:rFonts w:ascii="Consolas" w:cs="Consolas" w:eastAsia="Consolas" w:hAnsi="Consolas"/>
-          <w:b w:val="false"/>
-          <w:bCs w:val="false"/>
-        </w:rPr>
-        <w:t xml:space="preserve">pricing_customer_price_lists</w:t>
-      </w:r>
-      <w:r>
-        <w:rPr>
-          <w:rFonts w:ascii="Calibri" w:cs="Calibri" w:eastAsia="Calibri" w:hAnsi="Calibri"/>
-          <w:b w:val="false"/>
-          <w:bCs w:val="false"/>
-        </w:rPr>
-        <w:t xml:space="preserve"> má 0 priradení. </w:t>
-      </w:r>
-      <w:r>
-        <w:rPr>
-          <w:rFonts w:ascii="Consolas" w:cs="Consolas" w:eastAsia="Consolas" w:hAnsi="Consolas"/>
-          <w:b w:val="false"/>
-          <w:bCs w:val="false"/>
-        </w:rPr>
-        <w:t xml:space="preserve">customer_products</w:t>
-      </w:r>
-      <w:r>
-        <w:rPr>
-          <w:rFonts w:ascii="Calibri" w:cs="Calibri" w:eastAsia="Calibri" w:hAnsi="Calibri"/>
-          <w:b w:val="false"/>
-          <w:bCs w:val="false"/>
-        </w:rPr>
-        <w:t xml:space="preserve"> má iba 12 záznamov.</w:t>
-      </w:r>
-    </w:p>
-    <w:p>
-      <w:pPr>
-        <w:spacing w:after="110" w:line="265"/>
-      </w:pPr>
-      <w:r>
-        <w:rPr>
-          <w:rFonts w:ascii="Calibri" w:cs="Calibri" w:eastAsia="Calibri" w:hAnsi="Calibri"/>
-          <w:b w:val="false"/>
-          <w:bCs w:val="false"/>
-        </w:rPr>
-        <w:t xml:space="preserve">2. </w:t>
-      </w:r>
+        <w:t xml:space="preserve">0 priradení zákazníkov</w:t>
+      </w:r>
+      <w:r>
+        <w:rPr>
+          <w:rFonts w:ascii="Calibri" w:cs="Calibri" w:eastAsia="Calibri" w:hAnsi="Calibri"/>
+          <w:b w:val="false"/>
+          <w:bCs w:val="false"/>
+        </w:rPr>
+        <w:t xml:space="preserve">.</w:t>
+      </w:r>
+    </w:p>
+    <w:p>
+      <w:pPr>
+        <w:pStyle w:val="ListParagraph"/>
+        <w:numPr>
+          <w:ilvl w:val="0"/>
+          <w:numId w:val="1"/>
+        </w:numPr>
+        <w:spacing w:after="110" w:line="265"/>
+      </w:pPr>
       <w:r>
         <w:rPr>
           <w:rFonts w:ascii="Calibri" w:cs="Calibri" w:eastAsia="Calibri" w:hAnsi="Calibri"/>
           <w:b/>
           <w:bCs/>
         </w:rPr>
-        <w:t xml:space="preserve">Fakturácia nie je naplnená:</w:t>
-      </w:r>
-      <w:r>
-        <w:rPr>
-          <w:rFonts w:ascii="Calibri" w:cs="Calibri" w:eastAsia="Calibri" w:hAnsi="Calibri"/>
-          <w:b w:val="false"/>
-          <w:bCs w:val="false"/>
-        </w:rPr>
-        <w:t xml:space="preserve"> </w:t>
+        <w:t xml:space="preserve">197 718 odberov nemá produkt</w:t>
+      </w:r>
+      <w:r>
+        <w:rPr>
+          <w:rFonts w:ascii="Calibri" w:cs="Calibri" w:eastAsia="Calibri" w:hAnsi="Calibri"/>
+          <w:b w:val="false"/>
+          <w:bCs w:val="false"/>
+        </w:rPr>
+        <w:t xml:space="preserve"> a 198 079 odberových </w:t>
       </w:r>
       <w:r>
         <w:rPr>
@@ -7104,15 +5692,15 @@
           <w:b w:val="false"/>
           <w:bCs w:val="false"/>
         </w:rPr>
-        <w:t xml:space="preserve">invoices</w:t>
-      </w:r>
-      <w:r>
-        <w:rPr>
-          <w:rFonts w:ascii="Calibri" w:cs="Calibri" w:eastAsia="Calibri" w:hAnsi="Calibri"/>
-          <w:b w:val="false"/>
-          <w:bCs w:val="false"/>
-        </w:rPr>
-        <w:t xml:space="preserve"> má 0 záznamov a </w:t>
+        <w:t xml:space="preserve">contract_id</w:t>
+      </w:r>
+      <w:r>
+        <w:rPr>
+          <w:rFonts w:ascii="Calibri" w:cs="Calibri" w:eastAsia="Calibri" w:hAnsi="Calibri"/>
+          <w:b w:val="false"/>
+          <w:bCs w:val="false"/>
+        </w:rPr>
+        <w:t xml:space="preserve"> nemá zhodu v </w:t>
       </w:r>
       <w:r>
         <w:rPr>
@@ -7120,121 +5708,85 @@
           <w:b w:val="false"/>
           <w:bCs w:val="false"/>
         </w:rPr>
-        <w:t xml:space="preserve">scheduled_invoices</w:t>
-      </w:r>
-      <w:r>
-        <w:rPr>
-          <w:rFonts w:ascii="Calibri" w:cs="Calibri" w:eastAsia="Calibri" w:hAnsi="Calibri"/>
-          <w:b w:val="false"/>
-          <w:bCs w:val="false"/>
-        </w:rPr>
-        <w:t xml:space="preserve"> tiež 0. Súčasne existuje 15 </w:t>
-      </w:r>
-      <w:r>
-        <w:rPr>
-          <w:rFonts w:ascii="Consolas" w:cs="Consolas" w:eastAsia="Consolas" w:hAnsi="Consolas"/>
-          <w:b w:val="false"/>
-          <w:bCs w:val="false"/>
-        </w:rPr>
-        <w:t xml:space="preserve">invoice_items</w:t>
-      </w:r>
-      <w:r>
-        <w:rPr>
-          <w:rFonts w:ascii="Calibri" w:cs="Calibri" w:eastAsia="Calibri" w:hAnsi="Calibri"/>
-          <w:b w:val="false"/>
-          <w:bCs w:val="false"/>
-        </w:rPr>
-        <w:t xml:space="preserve"> bez nadradenej faktúry. Pred ESO integráciou treba rozhodnúť, či ide o historické siroty, testovacie dáta alebo chybné importné zvyšky.</w:t>
-      </w:r>
-    </w:p>
-    <w:p>
-      <w:pPr>
-        <w:spacing w:after="110" w:line="265"/>
-      </w:pPr>
-      <w:r>
-        <w:rPr>
-          <w:rFonts w:ascii="Calibri" w:cs="Calibri" w:eastAsia="Calibri" w:hAnsi="Calibri"/>
-          <w:b w:val="false"/>
-          <w:bCs w:val="false"/>
-        </w:rPr>
-        <w:t xml:space="preserve">3. </w:t>
-      </w:r>
+        <w:t xml:space="preserve">contract_instances</w:t>
+      </w:r>
+      <w:r>
+        <w:rPr>
+          <w:rFonts w:ascii="Calibri" w:cs="Calibri" w:eastAsia="Calibri" w:hAnsi="Calibri"/>
+          <w:b w:val="false"/>
+          <w:bCs w:val="false"/>
+        </w:rPr>
+        <w:t xml:space="preserve">.</w:t>
+      </w:r>
+    </w:p>
+    <w:p>
+      <w:pPr>
+        <w:pStyle w:val="ListParagraph"/>
+        <w:numPr>
+          <w:ilvl w:val="0"/>
+          <w:numId w:val="1"/>
+        </w:numPr>
+        <w:spacing w:after="110" w:line="265"/>
+      </w:pPr>
       <w:r>
         <w:rPr>
           <w:rFonts w:ascii="Calibri" w:cs="Calibri" w:eastAsia="Calibri" w:hAnsi="Calibri"/>
           <w:b/>
           <w:bCs/>
         </w:rPr>
-        <w:t xml:space="preserve">Odbery nemajú použiteľnú produktovú väzbu:</w:t>
-      </w:r>
-      <w:r>
-        <w:rPr>
-          <w:rFonts w:ascii="Calibri" w:cs="Calibri" w:eastAsia="Calibri" w:hAnsi="Calibri"/>
-          <w:b w:val="false"/>
-          <w:bCs w:val="false"/>
-        </w:rPr>
-        <w:t xml:space="preserve"> z 198 167 odberov je 197 718 bez </w:t>
-      </w:r>
-      <w:r>
-        <w:rPr>
-          <w:rFonts w:ascii="Consolas" w:cs="Consolas" w:eastAsia="Consolas" w:hAnsi="Consolas"/>
-          <w:b w:val="false"/>
-          <w:bCs w:val="false"/>
-        </w:rPr>
-        <w:t xml:space="preserve">product_id</w:t>
-      </w:r>
-      <w:r>
-        <w:rPr>
-          <w:rFonts w:ascii="Calibri" w:cs="Calibri" w:eastAsia="Calibri" w:hAnsi="Calibri"/>
-          <w:b w:val="false"/>
-          <w:bCs w:val="false"/>
-        </w:rPr>
-        <w:t xml:space="preserve"> a 88 bez </w:t>
-      </w:r>
-      <w:r>
-        <w:rPr>
-          <w:rFonts w:ascii="Consolas" w:cs="Consolas" w:eastAsia="Consolas" w:hAnsi="Consolas"/>
-          <w:b w:val="false"/>
-          <w:bCs w:val="false"/>
-        </w:rPr>
-        <w:t xml:space="preserve">contract_id</w:t>
-      </w:r>
-      <w:r>
-        <w:rPr>
-          <w:rFonts w:ascii="Calibri" w:cs="Calibri" w:eastAsia="Calibri" w:hAnsi="Calibri"/>
-          <w:b w:val="false"/>
-          <w:bCs w:val="false"/>
-        </w:rPr>
-        <w:t xml:space="preserve">.</w:t>
-      </w:r>
-    </w:p>
-    <w:p>
-      <w:pPr>
-        <w:spacing w:after="110" w:line="265"/>
-      </w:pPr>
-      <w:r>
-        <w:rPr>
-          <w:rFonts w:ascii="Calibri" w:cs="Calibri" w:eastAsia="Calibri" w:hAnsi="Calibri"/>
-          <w:b w:val="false"/>
-          <w:bCs w:val="false"/>
-        </w:rPr>
-        <w:t xml:space="preserve">4. </w:t>
-      </w:r>
+        <w:t xml:space="preserve">Fakturácia ešte nie je naplnená</w:t>
+      </w:r>
+      <w:r>
+        <w:rPr>
+          <w:rFonts w:ascii="Calibri" w:cs="Calibri" w:eastAsia="Calibri" w:hAnsi="Calibri"/>
+          <w:b w:val="false"/>
+          <w:bCs w:val="false"/>
+        </w:rPr>
+        <w:t xml:space="preserve">; existuje 0 faktúr a 15 fakturačných položiek bez nadradenej faktúry.</w:t>
+      </w:r>
+    </w:p>
+    <w:p>
+      <w:pPr>
+        <w:pStyle w:val="ListParagraph"/>
+        <w:numPr>
+          <w:ilvl w:val="0"/>
+          <w:numId w:val="1"/>
+        </w:numPr>
+        <w:spacing w:after="110" w:line="265"/>
+      </w:pPr>
       <w:r>
         <w:rPr>
           <w:rFonts w:ascii="Calibri" w:cs="Calibri" w:eastAsia="Calibri" w:hAnsi="Calibri"/>
           <w:b/>
           <w:bCs/>
         </w:rPr>
-        <w:t xml:space="preserve">Zmluvné ID treba reconciliovať:</w:t>
-      </w:r>
-      <w:r>
-        <w:rPr>
-          <w:rFonts w:ascii="Calibri" w:cs="Calibri" w:eastAsia="Calibri" w:hAnsi="Calibri"/>
-          <w:b w:val="false"/>
-          <w:bCs w:val="false"/>
-        </w:rPr>
-        <w:t xml:space="preserve"> SQL našiel 198 079 odberov s </w:t>
+        <w:t xml:space="preserve">55 výsledkov nemá existujúci odber</w:t>
+      </w:r>
+      <w:r>
+        <w:rPr>
+          <w:rFonts w:ascii="Calibri" w:cs="Calibri" w:eastAsia="Calibri" w:hAnsi="Calibri"/>
+          <w:b w:val="false"/>
+          <w:bCs w:val="false"/>
+        </w:rPr>
+        <w:t xml:space="preserve">; pri 209 odberoch existuje viac výsledkov, čo treba rozlíšiť ako aktuálny výsledok alebo históriu.</w:t>
+      </w:r>
+    </w:p>
+    <w:p>
+      <w:pPr>
+        <w:pStyle w:val="ListParagraph"/>
+        <w:numPr>
+          <w:ilvl w:val="0"/>
+          <w:numId w:val="1"/>
+        </w:numPr>
+        <w:spacing w:after="110" w:line="265"/>
+      </w:pPr>
+      <w:r>
+        <w:rPr>
+          <w:rFonts w:ascii="Calibri" w:cs="Calibri" w:eastAsia="Calibri" w:hAnsi="Calibri"/>
+          <w:b w:val="false"/>
+          <w:bCs w:val="false"/>
+        </w:rPr>
+        <w:t xml:space="preserve">Kliniky nemajú </w:t>
       </w:r>
       <w:r>
         <w:rPr>
@@ -7242,157 +5794,6 @@
           <w:b w:val="false"/>
           <w:bCs w:val="false"/>
         </w:rPr>
-        <w:t xml:space="preserve">contract_id</w:t>
-      </w:r>
-      <w:r>
-        <w:rPr>
-          <w:rFonts w:ascii="Calibri" w:cs="Calibri" w:eastAsia="Calibri" w:hAnsi="Calibri"/>
-          <w:b w:val="false"/>
-          <w:bCs w:val="false"/>
-        </w:rPr>
-        <w:t xml:space="preserve">, ktorý sa nenachádza v </w:t>
-      </w:r>
-      <w:r>
-        <w:rPr>
-          <w:rFonts w:ascii="Consolas" w:cs="Consolas" w:eastAsia="Consolas" w:hAnsi="Consolas"/>
-          <w:b w:val="false"/>
-          <w:bCs w:val="false"/>
-        </w:rPr>
-        <w:t xml:space="preserve">contract_instances</w:t>
-      </w:r>
-      <w:r>
-        <w:rPr>
-          <w:rFonts w:ascii="Calibri" w:cs="Calibri" w:eastAsia="Calibri" w:hAnsi="Calibri"/>
-          <w:b w:val="false"/>
-          <w:bCs w:val="false"/>
-        </w:rPr>
-        <w:t xml:space="preserve">. Ide o kritickú kontrolu pred prepojením odber → zmluva → cena → faktúra; nemusí ísť o fyzicky chýbajúce historické zmluvy, ale o nesúlad ID alebo importných väzieb.</w:t>
-      </w:r>
-    </w:p>
-    <w:p>
-      <w:pPr>
-        <w:spacing w:after="110" w:line="265"/>
-      </w:pPr>
-      <w:r>
-        <w:rPr>
-          <w:rFonts w:ascii="Calibri" w:cs="Calibri" w:eastAsia="Calibri" w:hAnsi="Calibri"/>
-          <w:b w:val="false"/>
-          <w:bCs w:val="false"/>
-        </w:rPr>
-        <w:t xml:space="preserve">5. </w:t>
-      </w:r>
-      <w:r>
-        <w:rPr>
-          <w:rFonts w:ascii="Calibri" w:cs="Calibri" w:eastAsia="Calibri" w:hAnsi="Calibri"/>
-          <w:b/>
-          <w:bCs/>
-        </w:rPr>
-        <w:t xml:space="preserve">Laboratórna história má otvorené väzby:</w:t>
-      </w:r>
-      <w:r>
-        <w:rPr>
-          <w:rFonts w:ascii="Calibri" w:cs="Calibri" w:eastAsia="Calibri" w:hAnsi="Calibri"/>
-          <w:b w:val="false"/>
-          <w:bCs w:val="false"/>
-        </w:rPr>
-        <w:t xml:space="preserve"> 55 výsledkov nemá existujúci odber. Pri 209 odberoch existuje viac výsledkov; to môže byť legitímna história opráv, ale musí sa označiť aktuálna verzia a auditná história.</w:t>
-      </w:r>
-    </w:p>
-    <w:p>
-      <w:pPr>
-        <w:spacing w:after="110" w:line="265"/>
-      </w:pPr>
-      <w:r>
-        <w:rPr>
-          <w:rFonts w:ascii="Calibri" w:cs="Calibri" w:eastAsia="Calibri" w:hAnsi="Calibri"/>
-          <w:b w:val="false"/>
-          <w:bCs w:val="false"/>
-        </w:rPr>
-        <w:t xml:space="preserve">6. </w:t>
-      </w:r>
-      <w:r>
-        <w:rPr>
-          <w:rFonts w:ascii="Calibri" w:cs="Calibri" w:eastAsia="Calibri" w:hAnsi="Calibri"/>
-          <w:b/>
-          <w:bCs/>
-        </w:rPr>
-        <w:t xml:space="preserve">Healthcare Network nemá aktívnu históriu reprezentantov:</w:t>
-      </w:r>
-      <w:r>
-        <w:rPr>
-          <w:rFonts w:ascii="Calibri" w:cs="Calibri" w:eastAsia="Calibri" w:hAnsi="Calibri"/>
-          <w:b w:val="false"/>
-          <w:bCs w:val="false"/>
-        </w:rPr>
-        <w:t xml:space="preserve"> tabuľky </w:t>
-      </w:r>
-      <w:r>
-        <w:rPr>
-          <w:rFonts w:ascii="Consolas" w:cs="Consolas" w:eastAsia="Consolas" w:hAnsi="Consolas"/>
-          <w:b w:val="false"/>
-          <w:bCs w:val="false"/>
-        </w:rPr>
-        <w:t xml:space="preserve">clinic_representative_assignments</w:t>
-      </w:r>
-      <w:r>
-        <w:rPr>
-          <w:rFonts w:ascii="Calibri" w:cs="Calibri" w:eastAsia="Calibri" w:hAnsi="Calibri"/>
-          <w:b w:val="false"/>
-          <w:bCs w:val="false"/>
-        </w:rPr>
-        <w:t xml:space="preserve"> a </w:t>
-      </w:r>
-      <w:r>
-        <w:rPr>
-          <w:rFonts w:ascii="Consolas" w:cs="Consolas" w:eastAsia="Consolas" w:hAnsi="Consolas"/>
-          <w:b w:val="false"/>
-          <w:bCs w:val="false"/>
-        </w:rPr>
-        <w:t xml:space="preserve">hospital_representative_assignments</w:t>
-      </w:r>
-      <w:r>
-        <w:rPr>
-          <w:rFonts w:ascii="Calibri" w:cs="Calibri" w:eastAsia="Calibri" w:hAnsi="Calibri"/>
-          <w:b w:val="false"/>
-          <w:bCs w:val="false"/>
-        </w:rPr>
-        <w:t xml:space="preserve"> majú 0 riadkov. Na samotných nemocniciach sú pritom 2 denormalizované reprezentantské väzby a na klinikách 0. Treba rozhodnúť, či sa majú tieto existujúce väzby spätne zapísať do historických assignment tabuliek.</w:t>
-      </w:r>
-    </w:p>
-    <w:p>
-      <w:pPr>
-        <w:spacing w:after="110" w:line="265"/>
-      </w:pPr>
-      <w:r>
-        <w:rPr>
-          <w:rFonts w:ascii="Calibri" w:cs="Calibri" w:eastAsia="Calibri" w:hAnsi="Calibri"/>
-          <w:b w:val="false"/>
-          <w:bCs w:val="false"/>
-        </w:rPr>
-        <w:t xml:space="preserve">7. </w:t>
-      </w:r>
-      <w:r>
-        <w:rPr>
-          <w:rFonts w:ascii="Calibri" w:cs="Calibri" w:eastAsia="Calibri" w:hAnsi="Calibri"/>
-          <w:b/>
-          <w:bCs/>
-        </w:rPr>
-        <w:t xml:space="preserve">Kliniky nie sú označené legacy ID:</w:t>
-      </w:r>
-      <w:r>
-        <w:rPr>
-          <w:rFonts w:ascii="Calibri" w:cs="Calibri" w:eastAsia="Calibri" w:hAnsi="Calibri"/>
-          <w:b w:val="false"/>
-          <w:bCs w:val="false"/>
-        </w:rPr>
-        <w:t xml:space="preserve"> všetkých 10 080 kliník má </w:t>
-      </w:r>
-      <w:r>
-        <w:rPr>
-          <w:rFonts w:ascii="Consolas" w:cs="Consolas" w:eastAsia="Consolas" w:hAnsi="Consolas"/>
-          <w:b w:val="false"/>
-          <w:bCs w:val="false"/>
-        </w:rPr>
         <w:t xml:space="preserve">legacy_id</w:t>
       </w:r>
       <w:r>
@@ -7401,113 +5802,20 @@
           <w:b w:val="false"/>
           <w:bCs w:val="false"/>
         </w:rPr>
-        <w:t xml:space="preserve"> NULL. Ak kliniky pochádzajú z ISCBC alebo iného starého zdroja, treba doplniť zdrojové mapovanie; bez neho sa nedá bezpečne vykonať idempotentná migrácia a reconciliácia kliník.</w:t>
-      </w:r>
-    </w:p>
-    <w:p>
-      <w:pPr>
-        <w:spacing w:after="110" w:line="265"/>
-      </w:pPr>
-      <w:r>
-        <w:rPr>
-          <w:rFonts w:ascii="Calibri" w:cs="Calibri" w:eastAsia="Calibri" w:hAnsi="Calibri"/>
-          <w:b w:val="false"/>
-          <w:bCs w:val="false"/>
-        </w:rPr>
-        <w:t xml:space="preserve">8. </w:t>
-      </w:r>
-      <w:r>
-        <w:rPr>
-          <w:rFonts w:ascii="Calibri" w:cs="Calibri" w:eastAsia="Calibri" w:hAnsi="Calibri"/>
-          <w:b/>
-          <w:bCs/>
-        </w:rPr>
-        <w:t xml:space="preserve">Customers má minimum nových väzieb:</w:t>
-      </w:r>
-      <w:r>
-        <w:rPr>
-          <w:rFonts w:ascii="Calibri" w:cs="Calibri" w:eastAsia="Calibri" w:hAnsi="Calibri"/>
-          <w:b w:val="false"/>
-          <w:bCs w:val="false"/>
-        </w:rPr>
-        <w:t xml:space="preserve"> iba 1 zákazník má </w:t>
-      </w:r>
-      <w:r>
-        <w:rPr>
-          <w:rFonts w:ascii="Consolas" w:cs="Consolas" w:eastAsia="Consolas" w:hAnsi="Consolas"/>
-          <w:b w:val="false"/>
-          <w:bCs w:val="false"/>
-        </w:rPr>
-        <w:t xml:space="preserve">clinic_id</w:t>
-      </w:r>
-      <w:r>
-        <w:rPr>
-          <w:rFonts w:ascii="Calibri" w:cs="Calibri" w:eastAsia="Calibri" w:hAnsi="Calibri"/>
-          <w:b w:val="false"/>
-          <w:bCs w:val="false"/>
-        </w:rPr>
-        <w:t xml:space="preserve">, 1 </w:t>
-      </w:r>
-      <w:r>
-        <w:rPr>
-          <w:rFonts w:ascii="Consolas" w:cs="Consolas" w:eastAsia="Consolas" w:hAnsi="Consolas"/>
-          <w:b w:val="false"/>
-          <w:bCs w:val="false"/>
-        </w:rPr>
-        <w:t xml:space="preserve">collaborator_id</w:t>
-      </w:r>
-      <w:r>
-        <w:rPr>
-          <w:rFonts w:ascii="Calibri" w:cs="Calibri" w:eastAsia="Calibri" w:hAnsi="Calibri"/>
-          <w:b w:val="false"/>
-          <w:bCs w:val="false"/>
-        </w:rPr>
-        <w:t xml:space="preserve">, 17 </w:t>
-      </w:r>
-      <w:r>
-        <w:rPr>
-          <w:rFonts w:ascii="Consolas" w:cs="Consolas" w:eastAsia="Consolas" w:hAnsi="Consolas"/>
-          <w:b w:val="false"/>
-          <w:bCs w:val="false"/>
-        </w:rPr>
-        <w:t xml:space="preserve">health_insurance_id</w:t>
-      </w:r>
-      <w:r>
-        <w:rPr>
-          <w:rFonts w:ascii="Calibri" w:cs="Calibri" w:eastAsia="Calibri" w:hAnsi="Calibri"/>
-          <w:b w:val="false"/>
-          <w:bCs w:val="false"/>
-        </w:rPr>
-        <w:t xml:space="preserve"> a 0 </w:t>
-      </w:r>
-      <w:r>
-        <w:rPr>
-          <w:rFonts w:ascii="Consolas" w:cs="Consolas" w:eastAsia="Consolas" w:hAnsi="Consolas"/>
-          <w:b w:val="false"/>
-          <w:bCs w:val="false"/>
-        </w:rPr>
-        <w:t xml:space="preserve">assigned_user_id</w:t>
-      </w:r>
-      <w:r>
-        <w:rPr>
-          <w:rFonts w:ascii="Calibri" w:cs="Calibri" w:eastAsia="Calibri" w:hAnsi="Calibri"/>
-          <w:b w:val="false"/>
-          <w:bCs w:val="false"/>
-        </w:rPr>
-        <w:t xml:space="preserve">. To môže byť zámer pre historický import, ale pred novým predajom treba určiť, ktoré väzby sú povinné a ktoré sa dopĺňajú až počas procesu.</w:t>
-      </w:r>
-    </w:p>
-    <w:p>
-      <w:pPr>
-        <w:spacing w:after="110" w:line="265"/>
-      </w:pPr>
-      <w:r>
-        <w:rPr>
-          <w:rFonts w:ascii="Calibri" w:cs="Calibri" w:eastAsia="Calibri" w:hAnsi="Calibri"/>
-          <w:b w:val="false"/>
-          <w:bCs w:val="false"/>
-        </w:rPr>
-        <w:t xml:space="preserve">Tieto výsledky menia prioritu: najprv treba uzavrieť mapovanie historických zmlúv, produktov a kliník, potom zaviesť cenové priradenia a až následne bezpečne napojiť fakturáciu na ESO. Laboratórne výsledky už v databáze vo veľkom objeme existujú, ale ich obchodný následok zatiaľ nie je spojený s V2 cenou a fakturáciou.</w:t>
+        <w:t xml:space="preserve"> a reprezentantská assignment história kliník aj nemocníc je prázdna.</w:t>
+      </w:r>
+    </w:p>
+    <w:p>
+      <w:pPr>
+        <w:spacing w:after="110" w:line="265"/>
+      </w:pPr>
+      <w:r>
+        <w:rPr>
+          <w:rFonts w:ascii="Calibri" w:cs="Calibri" w:eastAsia="Calibri" w:hAnsi="Calibri"/>
+          <w:b w:val="false"/>
+          <w:bCs w:val="false"/>
+        </w:rPr>
+        <w:t xml:space="preserve">Tieto údaje potvrdzujú, že ďalšia etapa je dátová a integračná: najprv uzavrieť identity a väzby, potom priradiť cenové verzie a až následne spustiť fakturačný a ESO proces.</w:t>
       </w:r>
     </w:p>
     <w:p>
@@ -7517,7 +5825,7 @@
         <w:spacing w:after="130" w:before="260"/>
       </w:pPr>
       <w:r>
-        <w:t xml:space="preserve">10. Technické podklady revízie</w:t>
+        <w:t xml:space="preserve">9. Technické podklady revízie</w:t>
       </w:r>
     </w:p>
     <w:tbl>
@@ -8918,7 +7226,7 @@
         <w:spacing w:after="130" w:before="260"/>
       </w:pPr>
       <w:r>
-        <w:t xml:space="preserve">11. Migrácia ISCBC → INDEXUS — rozsah a realizačný plán</w:t>
+        <w:t xml:space="preserve">10. Migrácia ISCBC → INDEXUS — rozsah a realizačný plán</w:t>
       </w:r>
     </w:p>
     <w:p>
@@ -8928,7 +7236,7 @@
         <w:spacing w:after="130" w:before="260"/>
       </w:pPr>
       <w:r>
-        <w:t xml:space="preserve">11.1 Čo už máme pripravené</w:t>
+        <w:t xml:space="preserve">10.1 Čo už máme pripravené</w:t>
       </w:r>
     </w:p>
     <w:p>
@@ -8985,7 +7293,7 @@
         <w:spacing w:after="130" w:before="260"/>
       </w:pPr>
       <w:r>
-        <w:t xml:space="preserve">11.2 Migračný katalóg — čo vieme preniesť</w:t>
+        <w:t xml:space="preserve">10.2 Migračný katalóg — čo vieme preniesť</w:t>
       </w:r>
     </w:p>
     <w:tbl>
@@ -10201,7 +8509,7 @@
         <w:spacing w:after="130" w:before="260"/>
       </w:pPr>
       <w:r>
-        <w:t xml:space="preserve">11.3 Otvorené alebo samostatne riešené domény</w:t>
+        <w:t xml:space="preserve">10.3 Otvorené alebo samostatne riešené domény</w:t>
       </w:r>
     </w:p>
     <w:p>
@@ -10367,7 +8675,7 @@
         <w:spacing w:after="130" w:before="260"/>
       </w:pPr>
       <w:r>
-        <w:t xml:space="preserve">11.4 Použiteľné nástroje a ich hranice</w:t>
+        <w:t xml:space="preserve">10.4 Použiteľné nástroje a ich hranice</w:t>
       </w:r>
     </w:p>
     <w:p>
@@ -10432,7 +8740,7 @@
         <w:spacing w:after="130" w:before="260"/>
       </w:pPr>
       <w:r>
-        <w:t xml:space="preserve">11.5 Etapy riadenej migrácie</w:t>
+        <w:t xml:space="preserve">10.5 Etapy riadenej migrácie</w:t>
       </w:r>
     </w:p>
     <w:p>
@@ -10631,7 +8939,7 @@
         <w:spacing w:after="130" w:before="260"/>
       </w:pPr>
       <w:r>
-        <w:t xml:space="preserve">11.6 Akceptačné podmienky a návrat</w:t>
+        <w:t xml:space="preserve">10.6 Akceptačné podmienky a návrat</w:t>
       </w:r>
     </w:p>
     <w:tbl>
@@ -11189,7 +9497,7 @@
         <w:spacing w:after="130" w:before="260"/>
       </w:pPr>
       <w:r>
-        <w:t xml:space="preserve">12. Implementácie a testovacie rutiny — dôkazová mapa</w:t>
+        <w:t xml:space="preserve">11. Implementácie a testovacie rutiny — dôkazová mapa</w:t>
       </w:r>
     </w:p>
     <w:p>
@@ -11199,7 +9507,7 @@
         <w:spacing w:after="130" w:before="260"/>
       </w:pPr>
       <w:r>
-        <w:t xml:space="preserve">12.1 Už vykonané cielené overenia</w:t>
+        <w:t xml:space="preserve">11.1 Už vykonané cielené overenia</w:t>
       </w:r>
     </w:p>
     <w:p>
@@ -11590,7 +9898,7 @@
         <w:spacing w:after="130" w:before="260"/>
       </w:pPr>
       <w:r>
-        <w:t xml:space="preserve">12.2 Dostupné automatizované rutiny a rozsah</w:t>
+        <w:t xml:space="preserve">11.2 Dostupné automatizované rutiny a rozsah</w:t>
       </w:r>
     </w:p>
     <w:p>
@@ -12466,7 +10774,7 @@
         <w:spacing w:after="130" w:before="260"/>
       </w:pPr>
       <w:r>
-        <w:t xml:space="preserve">12.3 Čo ešte musí pokryť finálna akceptácia</w:t>
+        <w:t xml:space="preserve">11.3 Čo ešte musí pokryť finálna akceptácia</w:t>
       </w:r>
     </w:p>
     <w:p>
@@ -12506,266 +10814,6 @@
           <w:bCs w:val="false"/>
         </w:rPr>
         <w:t xml:space="preserve">Každý finálny protokol má obsahovať verziu aplikácie, prostredie, dátum, použitú dátovú vzorku, príkaz alebo manuálny scenár, očakávaný/skutočný výsledok a otvorené výnimky. Tak možno stav „implementované a testované“ podložiť konkrétnym rozsahom namiesto všeobecného vyhlásenia.</w:t>
-      </w:r>
-    </w:p>
-    <w:p>
-      <w:r>
-        <w:br w:type="page"/>
-      </w:r>
-    </w:p>
-    <w:p>
-      <w:pPr>
-        <w:pStyle w:val="Heading1"/>
-        <w:keepNext/>
-        <w:spacing w:after="130" w:before="260"/>
-      </w:pPr>
-      <w:r>
-        <w:t xml:space="preserve">13. Záverečné resumé — čo presne dokončiť pre plnohodnotný INDEXUS CRM</w:t>
-      </w:r>
-    </w:p>
-    <w:p>
-      <w:pPr>
-        <w:spacing w:after="110" w:line="265"/>
-      </w:pPr>
-      <w:r>
-        <w:rPr>
-          <w:rFonts w:ascii="Calibri" w:cs="Calibri" w:eastAsia="Calibri" w:hAnsi="Calibri"/>
-          <w:b w:val="false"/>
-          <w:bCs w:val="false"/>
-        </w:rPr>
-        <w:t xml:space="preserve">INDEXUS už má implementované CRM evidencie, agentúrne pracovisko Nexus Pulse, Mission, hlasovú a SMS komunikáciu, Back Office, cenový engine, zmluvy, odbery, fakturačné funkcie a laboratórne API. Kľúčové opravy pracoviska boli cielene regresne otestované. Existuje aj rozsiahly migračný základ ISCBC. </w:t>
-      </w:r>
-      <w:r>
-        <w:rPr>
-          <w:rFonts w:ascii="Calibri" w:cs="Calibri" w:eastAsia="Calibri" w:hAnsi="Calibri"/>
-          <w:b/>
-          <w:bCs/>
-        </w:rPr>
-        <w:t xml:space="preserve">Zostávajúca práca je najmä integrácia, overenie dát a riadený prechod — nie výstavba CRM od začiatku.</w:t>
-      </w:r>
-    </w:p>
-    <w:p>
-      <w:pPr>
-        <w:spacing w:after="110" w:line="265"/>
-      </w:pPr>
-      <w:r>
-        <w:rPr>
-          <w:rFonts w:ascii="Calibri" w:cs="Calibri" w:eastAsia="Calibri" w:hAnsi="Calibri"/>
-          <w:b w:val="false"/>
-          <w:bCs w:val="false"/>
-        </w:rPr>
-        <w:t xml:space="preserve">1. </w:t>
-      </w:r>
-      <w:r>
-        <w:rPr>
-          <w:rFonts w:ascii="Calibri" w:cs="Calibri" w:eastAsia="Calibri" w:hAnsi="Calibri"/>
-          <w:b/>
-          <w:bCs/>
-        </w:rPr>
-        <w:t xml:space="preserve">Zjednotiť cenotvorbu a cenníkový modul:</w:t>
-      </w:r>
-      <w:r>
-        <w:rPr>
-          <w:rFonts w:ascii="Calibri" w:cs="Calibri" w:eastAsia="Calibri" w:hAnsi="Calibri"/>
-          <w:b w:val="false"/>
-          <w:bCs w:val="false"/>
-        </w:rPr>
-        <w:t xml:space="preserve"> dokončiť autoritatívny Pricing Engine V2 pre zákazníka, produkt, komponent, odber, skladné, zľavy, meny a splátky. Každá zmluva musí dostať konkrétnu cenovú verziu a nemenný položkový snapshot; až potom možno vypnúť legacy Products/Configurator.</w:t>
-      </w:r>
-    </w:p>
-    <w:p>
-      <w:pPr>
-        <w:spacing w:after="110" w:line="265"/>
-      </w:pPr>
-      <w:r>
-        <w:rPr>
-          <w:rFonts w:ascii="Calibri" w:cs="Calibri" w:eastAsia="Calibri" w:hAnsi="Calibri"/>
-          <w:b w:val="false"/>
-          <w:bCs w:val="false"/>
-        </w:rPr>
-        <w:t xml:space="preserve">2. </w:t>
-      </w:r>
-      <w:r>
-        <w:rPr>
-          <w:rFonts w:ascii="Calibri" w:cs="Calibri" w:eastAsia="Calibri" w:hAnsi="Calibri"/>
-          <w:b/>
-          <w:bCs/>
-        </w:rPr>
-        <w:t xml:space="preserve">Dopracovať fakturáciu a spoluprácu s ESO:</w:t>
-      </w:r>
-      <w:r>
-        <w:rPr>
-          <w:rFonts w:ascii="Calibri" w:cs="Calibri" w:eastAsia="Calibri" w:hAnsi="Calibri"/>
-          <w:b w:val="false"/>
-          <w:bCs w:val="false"/>
-        </w:rPr>
-        <w:t xml:space="preserve"> uzavrieť API/exportnú cestu, mapovanie zákazníkov, firiem, DPH, účtov, číselných radov, položiek, úhrad, storna a dobropisov. Opakované odoslanie musí byť idempotentné a auditovateľné.</w:t>
-      </w:r>
-    </w:p>
-    <w:p>
-      <w:pPr>
-        <w:spacing w:after="110" w:line="265"/>
-      </w:pPr>
-      <w:r>
-        <w:rPr>
-          <w:rFonts w:ascii="Calibri" w:cs="Calibri" w:eastAsia="Calibri" w:hAnsi="Calibri"/>
-          <w:b w:val="false"/>
-          <w:bCs w:val="false"/>
-        </w:rPr>
-        <w:t xml:space="preserve">3. </w:t>
-      </w:r>
-      <w:r>
-        <w:rPr>
-          <w:rFonts w:ascii="Calibri" w:cs="Calibri" w:eastAsia="Calibri" w:hAnsi="Calibri"/>
-          <w:b/>
-          <w:bCs/>
-        </w:rPr>
-        <w:t xml:space="preserve">Dopracovať tvorbu zmlúv a templates:</w:t>
-      </w:r>
-      <w:r>
-        <w:rPr>
-          <w:rFonts w:ascii="Calibri" w:cs="Calibri" w:eastAsia="Calibri" w:hAnsi="Calibri"/>
-          <w:b w:val="false"/>
-          <w:bCs w:val="false"/>
-        </w:rPr>
-        <w:t xml:space="preserve"> vytváranie zmluvy, jazykové a krajinné šablóny, podpisová verzia, placeholdery a fakturačné podmienky musia používať schválený V2 snapshot. Podpísané zmluvy a vydané faktúry sa nesmú spätne prepisovať.</w:t>
-      </w:r>
-    </w:p>
-    <w:p>
-      <w:pPr>
-        <w:spacing w:after="110" w:line="265"/>
-      </w:pPr>
-      <w:r>
-        <w:rPr>
-          <w:rFonts w:ascii="Calibri" w:cs="Calibri" w:eastAsia="Calibri" w:hAnsi="Calibri"/>
-          <w:b w:val="false"/>
-          <w:bCs w:val="false"/>
-        </w:rPr>
-        <w:t xml:space="preserve">4. </w:t>
-      </w:r>
-      <w:r>
-        <w:rPr>
-          <w:rFonts w:ascii="Calibri" w:cs="Calibri" w:eastAsia="Calibri" w:hAnsi="Calibri"/>
-          <w:b/>
-          <w:bCs/>
-        </w:rPr>
-        <w:t xml:space="preserve">Prepojiť laboratórny modul:</w:t>
-      </w:r>
-      <w:r>
-        <w:rPr>
-          <w:rFonts w:ascii="Calibri" w:cs="Calibri" w:eastAsia="Calibri" w:hAnsi="Calibri"/>
-          <w:b w:val="false"/>
-          <w:bCs w:val="false"/>
-        </w:rPr>
-        <w:t xml:space="preserve"> po autorizovanom výsledku zjednotiť internú a externú validáciu, vyhodnotiť skutočne dodanú službu cez rovnaký engine a vytvoriť schválený fakturačný podklad s históriou opráv.</w:t>
-      </w:r>
-    </w:p>
-    <w:p>
-      <w:pPr>
-        <w:spacing w:after="110" w:line="265"/>
-      </w:pPr>
-      <w:r>
-        <w:rPr>
-          <w:rFonts w:ascii="Calibri" w:cs="Calibri" w:eastAsia="Calibri" w:hAnsi="Calibri"/>
-          <w:b w:val="false"/>
-          <w:bCs w:val="false"/>
-        </w:rPr>
-        <w:t xml:space="preserve">5. </w:t>
-      </w:r>
-      <w:r>
-        <w:rPr>
-          <w:rFonts w:ascii="Calibri" w:cs="Calibri" w:eastAsia="Calibri" w:hAnsi="Calibri"/>
-          <w:b/>
-          <w:bCs/>
-        </w:rPr>
-        <w:t xml:space="preserve">Dokončiť a nacvičiť migráciu ISCBC:</w:t>
-      </w:r>
-      <w:r>
-        <w:rPr>
-          <w:rFonts w:ascii="Calibri" w:cs="Calibri" w:eastAsia="Calibri" w:hAnsi="Calibri"/>
-          <w:b w:val="false"/>
-          <w:bCs w:val="false"/>
-        </w:rPr>
-        <w:t xml:space="preserve"> schváliť katalóg, preniesť dáta aj prílohy, doplniť väzby a mapovania, otestovať opakovanie, vykonať zdrojovo-cieľovú reconciliáciu a pripraviť delta prenos.</w:t>
-      </w:r>
-    </w:p>
-    <w:p>
-      <w:pPr>
-        <w:spacing w:after="110" w:line="265"/>
-      </w:pPr>
-      <w:r>
-        <w:rPr>
-          <w:rFonts w:ascii="Calibri" w:cs="Calibri" w:eastAsia="Calibri" w:hAnsi="Calibri"/>
-          <w:b w:val="false"/>
-          <w:bCs w:val="false"/>
-        </w:rPr>
-        <w:t xml:space="preserve">6. </w:t>
-      </w:r>
-      <w:r>
-        <w:rPr>
-          <w:rFonts w:ascii="Calibri" w:cs="Calibri" w:eastAsia="Calibri" w:hAnsi="Calibri"/>
-          <w:b/>
-          <w:bCs/>
-        </w:rPr>
-        <w:t xml:space="preserve">Urobiť spoločný pilot:</w:t>
-      </w:r>
-      <w:r>
-        <w:rPr>
-          <w:rFonts w:ascii="Calibri" w:cs="Calibri" w:eastAsia="Calibri" w:hAnsi="Calibri"/>
-          <w:b w:val="false"/>
-          <w:bCs w:val="false"/>
-        </w:rPr>
-        <w:t xml:space="preserve"> overiť nový aj migrovaný prípad od Customers/Healthcare Network cez komunikáciu, zmluvu, odber, výsledok, faktúru a úhradu. Uzavrieť blokujúce nálezy a odovzdať protokol.</w:t>
-      </w:r>
-    </w:p>
-    <w:p>
-      <w:pPr>
-        <w:spacing w:after="110" w:line="265"/>
-      </w:pPr>
-      <w:r>
-        <w:rPr>
-          <w:rFonts w:ascii="Calibri" w:cs="Calibri" w:eastAsia="Calibri" w:hAnsi="Calibri"/>
-          <w:b w:val="false"/>
-          <w:bCs w:val="false"/>
-        </w:rPr>
-        <w:t xml:space="preserve">7. </w:t>
-      </w:r>
-      <w:r>
-        <w:rPr>
-          <w:rFonts w:ascii="Calibri" w:cs="Calibri" w:eastAsia="Calibri" w:hAnsi="Calibri"/>
-          <w:b/>
-          <w:bCs/>
-        </w:rPr>
-        <w:t xml:space="preserve">Riadené prepnutie a prevádzka:</w:t>
-      </w:r>
-      <w:r>
-        <w:rPr>
-          <w:rFonts w:ascii="Calibri" w:cs="Calibri" w:eastAsia="Calibri" w:hAnsi="Calibri"/>
-          <w:b w:val="false"/>
-          <w:bCs w:val="false"/>
-        </w:rPr>
-        <w:t xml:space="preserve"> povoliť jediný zapisujúci systém, zachovať ISCBC dočasne read-only, monitorovať väzby a financie a mať nacvičený rollback bez straty nových INDEXUS zmien.</w:t>
-      </w:r>
-    </w:p>
-    <w:p>
-      <w:pPr>
-        <w:spacing w:after="110" w:line="265"/>
-      </w:pPr>
-      <w:r>
-        <w:rPr>
-          <w:rFonts w:ascii="Calibri" w:cs="Calibri" w:eastAsia="Calibri" w:hAnsi="Calibri"/>
-          <w:b/>
-          <w:bCs/>
-        </w:rPr>
-        <w:t xml:space="preserve">Cieľový stav:</w:t>
-      </w:r>
-      <w:r>
-        <w:rPr>
-          <w:rFonts w:ascii="Calibri" w:cs="Calibri" w:eastAsia="Calibri" w:hAnsi="Calibri"/>
-          <w:b w:val="false"/>
-          <w:bCs w:val="false"/>
-        </w:rPr>
-        <w:t xml:space="preserve"> nový aj historický zákazník sa obslúži v INDEXUS bez paralelného ručného prepisovania do ISCBC. Každá zmluva, odber, výsledok, faktúra a úhrada má dohľadateľný pôvod, správne väzby a kontrolovanú históriu. Až úspešná procesná akceptácia spolu s dátovou reconciliáciou a nacvičenou obnovou umožní označiť prechod za dokončený.</w:t>
       </w:r>
     </w:p>
     <w:sectPr>

</xml_diff>

<commit_message>
Update indexus overview documentation and add supporting asset
Replit-Commit-Author: Agent
</commit_message>
<xml_diff>
--- a/indexus_overview.docx
+++ b/indexus_overview.docx
@@ -259,15 +259,15 @@
           <w:b/>
           <w:bCs/>
         </w:rPr>
-        <w:t xml:space="preserve">Dopracovať fakturáciu a ESO:</w:t>
-      </w:r>
-      <w:r>
-        <w:rPr>
-          <w:rFonts w:ascii="Calibri" w:cs="Calibri" w:eastAsia="Calibri" w:hAnsi="Calibri"/>
-          <w:b w:val="false"/>
-          <w:bCs w:val="false"/>
-        </w:rPr>
-        <w:t xml:space="preserve"> dokončiť export/API, DPH, položky, úhrady, storno, dobropisy a idempotentné opakovanie.</w:t>
+        <w:t xml:space="preserve">Dopracovať ESO a elektronickú fakturáciu:</w:t>
+      </w:r>
+      <w:r>
+        <w:rPr>
+          <w:rFonts w:ascii="Calibri" w:cs="Calibri" w:eastAsia="Calibri" w:hAnsi="Calibri"/>
+          <w:b w:val="false"/>
+          <w:bCs w:val="false"/>
+        </w:rPr>
+        <w:t xml:space="preserve"> dokončiť cieľové napojenie na účtovnú platformu, štruktúrované e-faktúry, API/export, DPH, položky, úhrady, storno, dobropisy a idempotentné opakovanie.</w:t>
       </w:r>
     </w:p>
     <w:p>
@@ -3292,6 +3292,258 @@
     </w:p>
     <w:p>
       <w:pPr>
+        <w:pStyle w:val="Heading2"/>
+        <w:keepNext/>
+        <w:spacing w:after="130" w:before="260"/>
+      </w:pPr>
+      <w:r>
+        <w:t xml:space="preserve">ESO a elektronická fakturácia — podmienka dokončenia</w:t>
+      </w:r>
+    </w:p>
+    <w:p>
+      <w:pPr>
+        <w:spacing w:after="110" w:line="265"/>
+      </w:pPr>
+      <w:r>
+        <w:rPr>
+          <w:rFonts w:ascii="Calibri" w:cs="Calibri" w:eastAsia="Calibri" w:hAnsi="Calibri"/>
+          <w:b w:val="false"/>
+          <w:bCs w:val="false"/>
+        </w:rPr>
+        <w:t xml:space="preserve">ESO je cieľová elektronická účtovná platforma pre účtovné spracovanie faktúr, platieb a opravných dokladov. V aktuálnej revízii nebol potvrdený hotový produkčný konektor; preto ESO nemožno považovať za dokončenú časť len na základe existujúceho fakturačného UI.</w:t>
+      </w:r>
+    </w:p>
+    <w:p>
+      <w:pPr>
+        <w:spacing w:after="110" w:line="265"/>
+      </w:pPr>
+      <w:r>
+        <w:rPr>
+          <w:rFonts w:ascii="Calibri" w:cs="Calibri" w:eastAsia="Calibri" w:hAnsi="Calibri"/>
+          <w:b w:val="false"/>
+          <w:bCs w:val="false"/>
+        </w:rPr>
+        <w:t xml:space="preserve">Pre dokončenie projektu treba vykonať tieto kroky:</w:t>
+      </w:r>
+    </w:p>
+    <w:p>
+      <w:pPr>
+        <w:spacing w:after="110" w:line="265"/>
+      </w:pPr>
+      <w:r>
+        <w:rPr>
+          <w:rFonts w:ascii="Calibri" w:cs="Calibri" w:eastAsia="Calibri" w:hAnsi="Calibri"/>
+          <w:b w:val="false"/>
+          <w:bCs w:val="false"/>
+        </w:rPr>
+        <w:t xml:space="preserve">1. </w:t>
+      </w:r>
+      <w:r>
+        <w:rPr>
+          <w:rFonts w:ascii="Calibri" w:cs="Calibri" w:eastAsia="Calibri" w:hAnsi="Calibri"/>
+          <w:b/>
+          <w:bCs/>
+        </w:rPr>
+        <w:t xml:space="preserve">Potvrdiť cieľové rozhranie ESO:</w:t>
+      </w:r>
+      <w:r>
+        <w:rPr>
+          <w:rFonts w:ascii="Calibri" w:cs="Calibri" w:eastAsia="Calibri" w:hAnsi="Calibri"/>
+          <w:b w:val="false"/>
+          <w:bCs w:val="false"/>
+        </w:rPr>
+        <w:t xml:space="preserve"> rozhodnúť medzi API a bezpečným exportom, určiť vlastníka integrácie, krajiny, účtovné subjekty a testovacie prostredie.</w:t>
+      </w:r>
+    </w:p>
+    <w:p>
+      <w:pPr>
+        <w:spacing w:after="110" w:line="265"/>
+      </w:pPr>
+      <w:r>
+        <w:rPr>
+          <w:rFonts w:ascii="Calibri" w:cs="Calibri" w:eastAsia="Calibri" w:hAnsi="Calibri"/>
+          <w:b w:val="false"/>
+          <w:bCs w:val="false"/>
+        </w:rPr>
+        <w:t xml:space="preserve">2. </w:t>
+      </w:r>
+      <w:r>
+        <w:rPr>
+          <w:rFonts w:ascii="Calibri" w:cs="Calibri" w:eastAsia="Calibri" w:hAnsi="Calibri"/>
+          <w:b/>
+          <w:bCs/>
+        </w:rPr>
+        <w:t xml:space="preserve">Zjednotiť dátové mapovanie:</w:t>
+      </w:r>
+      <w:r>
+        <w:rPr>
+          <w:rFonts w:ascii="Calibri" w:cs="Calibri" w:eastAsia="Calibri" w:hAnsi="Calibri"/>
+          <w:b w:val="false"/>
+          <w:bCs w:val="false"/>
+        </w:rPr>
+        <w:t xml:space="preserve"> zákazník, fakturačný subjekt, IČ DPH, mena, číselný rad, položky, daň, splatnosť, platba, storno a dobropis musia mať jednoznačné mapovanie INDEXUS ↔ ESO.</w:t>
+      </w:r>
+    </w:p>
+    <w:p>
+      <w:pPr>
+        <w:spacing w:after="110" w:line="265"/>
+      </w:pPr>
+      <w:r>
+        <w:rPr>
+          <w:rFonts w:ascii="Calibri" w:cs="Calibri" w:eastAsia="Calibri" w:hAnsi="Calibri"/>
+          <w:b w:val="false"/>
+          <w:bCs w:val="false"/>
+        </w:rPr>
+        <w:t xml:space="preserve">3. </w:t>
+      </w:r>
+      <w:r>
+        <w:rPr>
+          <w:rFonts w:ascii="Calibri" w:cs="Calibri" w:eastAsia="Calibri" w:hAnsi="Calibri"/>
+          <w:b/>
+          <w:bCs/>
+        </w:rPr>
+        <w:t xml:space="preserve">Zaviesť elektronickú faktúru:</w:t>
+      </w:r>
+      <w:r>
+        <w:rPr>
+          <w:rFonts w:ascii="Calibri" w:cs="Calibri" w:eastAsia="Calibri" w:hAnsi="Calibri"/>
+          <w:b w:val="false"/>
+          <w:bCs w:val="false"/>
+        </w:rPr>
+        <w:t xml:space="preserve"> faktúra musí byť dostupná v právne a technicky požadovanom štruktúrovanom formáte, napríklad UBL/XML; samotné PDF nestačí. Požiadavky sa musia potvrdiť podľa príslušnej krajiny a aktuálneho režimu elektronickej fakturácie.</w:t>
+      </w:r>
+    </w:p>
+    <w:p>
+      <w:pPr>
+        <w:spacing w:after="110" w:line="265"/>
+      </w:pPr>
+      <w:r>
+        <w:rPr>
+          <w:rFonts w:ascii="Calibri" w:cs="Calibri" w:eastAsia="Calibri" w:hAnsi="Calibri"/>
+          <w:b w:val="false"/>
+          <w:bCs w:val="false"/>
+        </w:rPr>
+        <w:t xml:space="preserve">4. </w:t>
+      </w:r>
+      <w:r>
+        <w:rPr>
+          <w:rFonts w:ascii="Calibri" w:cs="Calibri" w:eastAsia="Calibri" w:hAnsi="Calibri"/>
+          <w:b/>
+          <w:bCs/>
+        </w:rPr>
+        <w:t xml:space="preserve">Pripojiť odoslanie a stavový cyklus:</w:t>
+      </w:r>
+      <w:r>
+        <w:rPr>
+          <w:rFonts w:ascii="Calibri" w:cs="Calibri" w:eastAsia="Calibri" w:hAnsi="Calibri"/>
+          <w:b w:val="false"/>
+          <w:bCs w:val="false"/>
+        </w:rPr>
+        <w:t xml:space="preserve"> odoslanie, prijatie, odmietnutie, doručenie, úhrada a chyba musia mať stav v INDEXUS; opakovanie nesmie vytvoriť duplicitný doklad.</w:t>
+      </w:r>
+    </w:p>
+    <w:p>
+      <w:pPr>
+        <w:spacing w:after="110" w:line="265"/>
+      </w:pPr>
+      <w:r>
+        <w:rPr>
+          <w:rFonts w:ascii="Calibri" w:cs="Calibri" w:eastAsia="Calibri" w:hAnsi="Calibri"/>
+          <w:b w:val="false"/>
+          <w:bCs w:val="false"/>
+        </w:rPr>
+        <w:t xml:space="preserve">5. </w:t>
+      </w:r>
+      <w:r>
+        <w:rPr>
+          <w:rFonts w:ascii="Calibri" w:cs="Calibri" w:eastAsia="Calibri" w:hAnsi="Calibri"/>
+          <w:b/>
+          <w:bCs/>
+        </w:rPr>
+        <w:t xml:space="preserve">Zabezpečiť audit a bezpečnosť:</w:t>
+      </w:r>
+      <w:r>
+        <w:rPr>
+          <w:rFonts w:ascii="Calibri" w:cs="Calibri" w:eastAsia="Calibri" w:hAnsi="Calibri"/>
+          <w:b w:val="false"/>
+          <w:bCs w:val="false"/>
+        </w:rPr>
+        <w:t xml:space="preserve"> ukladať odkaz na pôvodný cenový snapshot, XML/export, odpoveď ESO, čas odoslania, používateľa alebo automatizáciu a dôvod každej opravy.</w:t>
+      </w:r>
+    </w:p>
+    <w:p>
+      <w:pPr>
+        <w:spacing w:after="110" w:line="265"/>
+      </w:pPr>
+      <w:r>
+        <w:rPr>
+          <w:rFonts w:ascii="Calibri" w:cs="Calibri" w:eastAsia="Calibri" w:hAnsi="Calibri"/>
+          <w:b w:val="false"/>
+          <w:bCs w:val="false"/>
+        </w:rPr>
+        <w:t xml:space="preserve">6. </w:t>
+      </w:r>
+      <w:r>
+        <w:rPr>
+          <w:rFonts w:ascii="Calibri" w:cs="Calibri" w:eastAsia="Calibri" w:hAnsi="Calibri"/>
+          <w:b/>
+          <w:bCs/>
+        </w:rPr>
+        <w:t xml:space="preserve">Reconciliovať účtovníctvo:</w:t>
+      </w:r>
+      <w:r>
+        <w:rPr>
+          <w:rFonts w:ascii="Calibri" w:cs="Calibri" w:eastAsia="Calibri" w:hAnsi="Calibri"/>
+          <w:b w:val="false"/>
+          <w:bCs w:val="false"/>
+        </w:rPr>
+        <w:t xml:space="preserve"> pravidelne porovnávať faktúry, dobropisy, úhrady, otvorené zostatky a chyby medzi INDEXUS a ESO. Rozdiel nesmie zostať iba v manuálnej tabuľke.</w:t>
+      </w:r>
+    </w:p>
+    <w:p>
+      <w:pPr>
+        <w:spacing w:after="110" w:line="265"/>
+      </w:pPr>
+      <w:r>
+        <w:rPr>
+          <w:rFonts w:ascii="Calibri" w:cs="Calibri" w:eastAsia="Calibri" w:hAnsi="Calibri"/>
+          <w:b w:val="false"/>
+          <w:bCs w:val="false"/>
+        </w:rPr>
+        <w:t xml:space="preserve">7. </w:t>
+      </w:r>
+      <w:r>
+        <w:rPr>
+          <w:rFonts w:ascii="Calibri" w:cs="Calibri" w:eastAsia="Calibri" w:hAnsi="Calibri"/>
+          <w:b/>
+          <w:bCs/>
+        </w:rPr>
+        <w:t xml:space="preserve">Spustiť pilot:</w:t>
+      </w:r>
+      <w:r>
+        <w:rPr>
+          <w:rFonts w:ascii="Calibri" w:cs="Calibri" w:eastAsia="Calibri" w:hAnsi="Calibri"/>
+          <w:b w:val="false"/>
+          <w:bCs w:val="false"/>
+        </w:rPr>
+        <w:t xml:space="preserve"> overiť nový predaj, historickú cenu, splátku, skladné, čiastočný odber, opravu výsledku, storno, dobropis, odmietnutú e-faktúru a opakované odoslanie.</w:t>
+      </w:r>
+    </w:p>
+    <w:p>
+      <w:pPr>
+        <w:spacing w:after="110" w:line="265"/>
+      </w:pPr>
+      <w:r>
+        <w:rPr>
+          <w:rFonts w:ascii="Calibri" w:cs="Calibri" w:eastAsia="Calibri" w:hAnsi="Calibri"/>
+          <w:b w:val="false"/>
+          <w:bCs w:val="false"/>
+        </w:rPr>
+        <w:t xml:space="preserve">Elektronická fakturácia preto nie je samostatný výstup na konci projektu. Je to kontrolný bod celého reťazca: cena → zmluva → odber → výsledok → faktúra → ESO → úhrada.</w:t>
+      </w:r>
+    </w:p>
+    <w:p>
+      <w:pPr>
         <w:pStyle w:val="Heading1"/>
         <w:keepNext/>
         <w:spacing w:after="130" w:before="260"/>
@@ -4808,17 +5060,7 @@
           <w:b w:val="false"/>
           <w:bCs w:val="false"/>
         </w:rPr>
-        <w:t xml:space="preserve">Akceptácia: opakované potvrdenie nevytvorí druhú faktúru; súčet položiek sedí s dokladom a odsúhlaseným podkladom.</w:t>
-      </w:r>
-    </w:p>
-    <w:p>
-      <w:pPr>
-        <w:pStyle w:val="Heading2"/>
-        <w:keepNext/>
-        <w:spacing w:after="130" w:before="260"/>
-      </w:pPr>
-      <w:r>
-        <w:t xml:space="preserve">Krok 8 — Splátky, skladné, úhrady a opravy</w:t>
+        <w:t xml:space="preserve">Pripraviť štruktúrovaný e-fakturačný formát a napojenie na ESO vrátane stavov odoslania a odmietnutia.</w:t>
       </w:r>
     </w:p>
     <w:p>
@@ -4836,7 +5078,17 @@
           <w:b w:val="false"/>
           <w:bCs w:val="false"/>
         </w:rPr>
-        <w:t xml:space="preserve">Prepojiť harmonogramy na rovnakú fakturačnú službu a explicitné pravidlá splatnosti, zrušenia a opakovania.</w:t>
+        <w:t xml:space="preserve">Akceptácia: opakované potvrdenie nevytvorí druhú faktúru; súčet položiek sedí s dokladom a odsúhlaseným podkladom; ESO prijme alebo jasne odmietne doklad.</w:t>
+      </w:r>
+    </w:p>
+    <w:p>
+      <w:pPr>
+        <w:pStyle w:val="Heading2"/>
+        <w:keepNext/>
+        <w:spacing w:after="130" w:before="260"/>
+      </w:pPr>
+      <w:r>
+        <w:t xml:space="preserve">Krok 8 — Splátky, skladné, úhrady a opravy</w:t>
       </w:r>
     </w:p>
     <w:p>
@@ -4854,7 +5106,7 @@
           <w:b w:val="false"/>
           <w:bCs w:val="false"/>
         </w:rPr>
-        <w:t xml:space="preserve">Schváliť spracovanie platieb a opravných dokladov; existujúce vydané doklady neprepisovať podľa neskoršieho laboratórneho výsledku.</w:t>
+        <w:t xml:space="preserve">Prepojiť harmonogramy na rovnakú fakturačnú službu a explicitné pravidlá splatnosti, zrušenia a opakovania.</w:t>
       </w:r>
     </w:p>
     <w:p>
@@ -4872,7 +5124,43 @@
           <w:b w:val="false"/>
           <w:bCs w:val="false"/>
         </w:rPr>
-        <w:t xml:space="preserve">Akceptácia: splátka vznikne presne raz, úhrada má správny doklad a zostatok, oprava má auditnú väzbu.</w:t>
+        <w:t xml:space="preserve">Schváliť spracovanie platieb a opravných dokladov; existujúce vydané doklady neprepisovať podľa neskoršieho laboratórneho výsledku.</w:t>
+      </w:r>
+    </w:p>
+    <w:p>
+      <w:pPr>
+        <w:pStyle w:val="ListParagraph"/>
+        <w:numPr>
+          <w:ilvl w:val="0"/>
+          <w:numId w:val="1"/>
+        </w:numPr>
+        <w:spacing w:after="110" w:line="265"/>
+      </w:pPr>
+      <w:r>
+        <w:rPr>
+          <w:rFonts w:ascii="Calibri" w:cs="Calibri" w:eastAsia="Calibri" w:hAnsi="Calibri"/>
+          <w:b w:val="false"/>
+          <w:bCs w:val="false"/>
+        </w:rPr>
+        <w:t xml:space="preserve">Odosielať do ESO aj splátky, úhrady, storno a dobropisy a pravidelne reconciliovať otvorené zostatky.</w:t>
+      </w:r>
+    </w:p>
+    <w:p>
+      <w:pPr>
+        <w:pStyle w:val="ListParagraph"/>
+        <w:numPr>
+          <w:ilvl w:val="0"/>
+          <w:numId w:val="1"/>
+        </w:numPr>
+        <w:spacing w:after="110" w:line="265"/>
+      </w:pPr>
+      <w:r>
+        <w:rPr>
+          <w:rFonts w:ascii="Calibri" w:cs="Calibri" w:eastAsia="Calibri" w:hAnsi="Calibri"/>
+          <w:b w:val="false"/>
+          <w:bCs w:val="false"/>
+        </w:rPr>
+        <w:t xml:space="preserve">Akceptácia: splátka vznikne presne raz, úhrada má správny doklad a zostatok, oprava má auditnú väzbu a opakované odoslanie do ESO nevytvorí duplicitu.</w:t>
       </w:r>
     </w:p>
     <w:p>

</xml_diff>